<commit_message>
chore(reports): VPS full report 2026-06-29 00:21 UTC (0 settled, WR 50.0%, PF ?, grade D)
</commit_message>
<xml_diff>
--- a/vps_full_reports/latest/report.docx
+++ b/vps_full_reports/latest/report.docx
@@ -20,7 +20,7 @@
           <w:color w:val="666666"/>
           <w:sz w:val="20"/>
         </w:rPr>
-        <w:t>PAPER ONLY  ·  reconciled=True  ·  ticks=367</w:t>
+        <w:t>PAPER ONLY  ·  reconciled=True  ·  ticks=655</w:t>
       </w:r>
     </w:p>
     <w:p>
@@ -33,7 +33,7 @@
     </w:p>
     <w:p>
       <w:r>
-        <w:t>Overall score: 74.1 / 100  (Grade: C)</w:t>
+        <w:t>Overall score: 63.3 / 100  (Grade: D)</w:t>
       </w:r>
     </w:p>
     <w:tbl>
@@ -107,7 +107,7 @@
           </w:tcPr>
           <w:p>
             <w:r>
-              <w:t>80.6</w:t>
+              <w:t>66.4</w:t>
             </w:r>
           </w:p>
         </w:tc>
@@ -117,7 +117,7 @@
           </w:tcPr>
           <w:p>
             <w:r>
-              <w:t>B</w:t>
+              <w:t>D</w:t>
             </w:r>
           </w:p>
         </w:tc>
@@ -149,7 +149,7 @@
           </w:tcPr>
           <w:p>
             <w:r>
-              <w:t>88.3</w:t>
+              <w:t>70.9</w:t>
             </w:r>
           </w:p>
         </w:tc>
@@ -159,7 +159,7 @@
           </w:tcPr>
           <w:p>
             <w:r>
-              <w:t>B+</w:t>
+              <w:t>C</w:t>
             </w:r>
           </w:p>
         </w:tc>
@@ -191,7 +191,7 @@
           </w:tcPr>
           <w:p>
             <w:r>
-              <w:t>47.0</w:t>
+              <w:t>49.4</w:t>
             </w:r>
           </w:p>
         </w:tc>
@@ -319,7 +319,7 @@
           </w:tcPr>
           <w:p>
             <w:r>
-              <w:t>2026-06-28 12:46:26</w:t>
+              <w:t>2026-06-28 19:00:08</w:t>
             </w:r>
           </w:p>
         </w:tc>
@@ -328,8 +328,16 @@
             <w:tcW w:type="dxa" w:w="1234"/>
           </w:tcPr>
           <w:p>
+            <w:r/>
+          </w:p>
+        </w:tc>
+        <w:tc>
+          <w:tcPr>
+            <w:tcW w:type="dxa" w:w="1234"/>
+          </w:tcPr>
+          <w:p>
             <w:r>
-              <w:t>117</w:t>
+              <w:t>52.5</w:t>
             </w:r>
           </w:p>
         </w:tc>
@@ -339,7 +347,7 @@
           </w:tcPr>
           <w:p>
             <w:r>
-              <w:t>74.6</w:t>
+              <w:t>82.0</w:t>
             </w:r>
           </w:p>
         </w:tc>
@@ -349,7 +357,7 @@
           </w:tcPr>
           <w:p>
             <w:r>
-              <w:t>89.3</w:t>
+              <w:t>37.0</w:t>
             </w:r>
           </w:p>
         </w:tc>
@@ -359,7 +367,7 @@
           </w:tcPr>
           <w:p>
             <w:r>
-              <w:t>47.0</w:t>
+              <w:t>56.0</w:t>
             </w:r>
           </w:p>
         </w:tc>
@@ -369,17 +377,7 @@
           </w:tcPr>
           <w:p>
             <w:r>
-              <w:t>71.4</w:t>
-            </w:r>
-          </w:p>
-        </w:tc>
-        <w:tc>
-          <w:tcPr>
-            <w:tcW w:type="dxa" w:w="1234"/>
-          </w:tcPr>
-          <w:p>
-            <w:r>
-              <w:t>43</w:t>
+              <w:t>1</w:t>
             </w:r>
           </w:p>
         </w:tc>
@@ -391,7 +389,7 @@
           </w:tcPr>
           <w:p>
             <w:r>
-              <w:t>2026-06-28 13:16:26</w:t>
+              <w:t>2026-06-28 19:04:25</w:t>
             </w:r>
           </w:p>
         </w:tc>
@@ -400,8 +398,16 @@
             <w:tcW w:type="dxa" w:w="1234"/>
           </w:tcPr>
           <w:p>
+            <w:r/>
+          </w:p>
+        </w:tc>
+        <w:tc>
+          <w:tcPr>
+            <w:tcW w:type="dxa" w:w="1234"/>
+          </w:tcPr>
+          <w:p>
             <w:r>
-              <w:t>117</w:t>
+              <w:t>52.5</w:t>
             </w:r>
           </w:p>
         </w:tc>
@@ -411,7 +417,7 @@
           </w:tcPr>
           <w:p>
             <w:r>
-              <w:t>74.6</w:t>
+              <w:t>67.1</w:t>
             </w:r>
           </w:p>
         </w:tc>
@@ -421,7 +427,7 @@
           </w:tcPr>
           <w:p>
             <w:r>
-              <w:t>89.2</w:t>
+              <w:t>37.0</w:t>
             </w:r>
           </w:p>
         </w:tc>
@@ -431,7 +437,7 @@
           </w:tcPr>
           <w:p>
             <w:r>
-              <w:t>47.0</w:t>
+              <w:t>52.3</w:t>
             </w:r>
           </w:p>
         </w:tc>
@@ -441,17 +447,7 @@
           </w:tcPr>
           <w:p>
             <w:r>
-              <w:t>71.3</w:t>
-            </w:r>
-          </w:p>
-        </w:tc>
-        <w:tc>
-          <w:tcPr>
-            <w:tcW w:type="dxa" w:w="1234"/>
-          </w:tcPr>
-          <w:p>
-            <w:r>
-              <w:t>163</w:t>
+              <w:t>18</w:t>
             </w:r>
           </w:p>
         </w:tc>
@@ -463,7 +459,7 @@
           </w:tcPr>
           <w:p>
             <w:r>
-              <w:t>2026-06-28 13:33:11</w:t>
+              <w:t>2026-06-28 19:15:10</w:t>
             </w:r>
           </w:p>
         </w:tc>
@@ -472,8 +468,16 @@
             <w:tcW w:type="dxa" w:w="1234"/>
           </w:tcPr>
           <w:p>
+            <w:r/>
+          </w:p>
+        </w:tc>
+        <w:tc>
+          <w:tcPr>
+            <w:tcW w:type="dxa" w:w="1234"/>
+          </w:tcPr>
+          <w:p>
             <w:r>
-              <w:t>118</w:t>
+              <w:t>55.0</w:t>
             </w:r>
           </w:p>
         </w:tc>
@@ -483,7 +487,7 @@
           </w:tcPr>
           <w:p>
             <w:r>
-              <w:t>76.1</w:t>
+              <w:t>67.2</w:t>
             </w:r>
           </w:p>
         </w:tc>
@@ -493,7 +497,7 @@
           </w:tcPr>
           <w:p>
             <w:r>
-              <w:t>89.2</w:t>
+              <w:t>37.0</w:t>
             </w:r>
           </w:p>
         </w:tc>
@@ -503,7 +507,7 @@
           </w:tcPr>
           <w:p>
             <w:r>
-              <w:t>47.0</w:t>
+              <w:t>53.5</w:t>
             </w:r>
           </w:p>
         </w:tc>
@@ -513,17 +517,7 @@
           </w:tcPr>
           <w:p>
             <w:r>
-              <w:t>72.1</w:t>
-            </w:r>
-          </w:p>
-        </w:tc>
-        <w:tc>
-          <w:tcPr>
-            <w:tcW w:type="dxa" w:w="1234"/>
-          </w:tcPr>
-          <w:p>
-            <w:r>
-              <w:t>230</w:t>
+              <w:t>61</w:t>
             </w:r>
           </w:p>
         </w:tc>
@@ -535,7 +529,7 @@
           </w:tcPr>
           <w:p>
             <w:r>
-              <w:t>2026-06-28 14:02:41</w:t>
+              <w:t>2026-06-28 19:30:10</w:t>
             </w:r>
           </w:p>
         </w:tc>
@@ -544,8 +538,16 @@
             <w:tcW w:type="dxa" w:w="1234"/>
           </w:tcPr>
           <w:p>
+            <w:r/>
+          </w:p>
+        </w:tc>
+        <w:tc>
+          <w:tcPr>
+            <w:tcW w:type="dxa" w:w="1234"/>
+          </w:tcPr>
+          <w:p>
             <w:r>
-              <w:t>119</w:t>
+              <w:t>55.0</w:t>
             </w:r>
           </w:p>
         </w:tc>
@@ -555,7 +557,7 @@
           </w:tcPr>
           <w:p>
             <w:r>
-              <w:t>76.5</w:t>
+              <w:t>67.4</w:t>
             </w:r>
           </w:p>
         </w:tc>
@@ -565,7 +567,7 @@
           </w:tcPr>
           <w:p>
             <w:r>
-              <w:t>89.1</w:t>
+              <w:t>41.9</w:t>
             </w:r>
           </w:p>
         </w:tc>
@@ -575,183 +577,7 @@
           </w:tcPr>
           <w:p>
             <w:r>
-              <w:t>47.0</w:t>
-            </w:r>
-          </w:p>
-        </w:tc>
-        <w:tc>
-          <w:tcPr>
-            <w:tcW w:type="dxa" w:w="1234"/>
-          </w:tcPr>
-          <w:p>
-            <w:r>
-              <w:t>72.3</w:t>
-            </w:r>
-          </w:p>
-        </w:tc>
-        <w:tc>
-          <w:tcPr>
-            <w:tcW w:type="dxa" w:w="1234"/>
-          </w:tcPr>
-          <w:p>
-            <w:r>
-              <w:t>348</w:t>
-            </w:r>
-          </w:p>
-        </w:tc>
-      </w:tr>
-      <w:tr>
-        <w:tc>
-          <w:tcPr>
-            <w:tcW w:type="dxa" w:w="1234"/>
-          </w:tcPr>
-          <w:p>
-            <w:r>
-              <w:t>2026-06-28 14:16:37</w:t>
-            </w:r>
-          </w:p>
-        </w:tc>
-        <w:tc>
-          <w:tcPr>
-            <w:tcW w:type="dxa" w:w="1234"/>
-          </w:tcPr>
-          <w:p>
-            <w:r>
-              <w:t>120</w:t>
-            </w:r>
-          </w:p>
-        </w:tc>
-        <w:tc>
-          <w:tcPr>
-            <w:tcW w:type="dxa" w:w="1234"/>
-          </w:tcPr>
-          <w:p>
-            <w:r>
-              <w:t>74.9</w:t>
-            </w:r>
-          </w:p>
-        </w:tc>
-        <w:tc>
-          <w:tcPr>
-            <w:tcW w:type="dxa" w:w="1234"/>
-          </w:tcPr>
-          <w:p>
-            <w:r>
-              <w:t>89.1</w:t>
-            </w:r>
-          </w:p>
-        </w:tc>
-        <w:tc>
-          <w:tcPr>
-            <w:tcW w:type="dxa" w:w="1234"/>
-          </w:tcPr>
-          <w:p>
-            <w:r>
-              <w:t>47.0</w:t>
-            </w:r>
-          </w:p>
-        </w:tc>
-        <w:tc>
-          <w:tcPr>
-            <w:tcW w:type="dxa" w:w="1234"/>
-          </w:tcPr>
-          <w:p>
-            <w:r>
-              <w:t>71.5</w:t>
-            </w:r>
-          </w:p>
-        </w:tc>
-        <w:tc>
-          <w:tcPr>
-            <w:tcW w:type="dxa" w:w="1234"/>
-          </w:tcPr>
-          <w:p>
-            <w:r>
-              <w:t>55</w:t>
-            </w:r>
-          </w:p>
-        </w:tc>
-      </w:tr>
-      <w:tr>
-        <w:tc>
-          <w:tcPr>
-            <w:tcW w:type="dxa" w:w="1234"/>
-          </w:tcPr>
-          <w:p>
-            <w:r>
-              <w:t>2026-06-28 14:46:37</w:t>
-            </w:r>
-          </w:p>
-        </w:tc>
-        <w:tc>
-          <w:tcPr>
-            <w:tcW w:type="dxa" w:w="1234"/>
-          </w:tcPr>
-          <w:p>
-            <w:r>
-              <w:t>120</w:t>
-            </w:r>
-          </w:p>
-        </w:tc>
-        <w:tc>
-          <w:tcPr>
-            <w:tcW w:type="dxa" w:w="1234"/>
-          </w:tcPr>
-          <w:p>
-            <w:r>
-              <w:t>74.9</w:t>
-            </w:r>
-          </w:p>
-        </w:tc>
-        <w:tc>
-          <w:tcPr>
-            <w:tcW w:type="dxa" w:w="1234"/>
-          </w:tcPr>
-          <w:p>
-            <w:r>
-              <w:t>88.9</w:t>
-            </w:r>
-          </w:p>
-        </w:tc>
-        <w:tc>
-          <w:tcPr>
-            <w:tcW w:type="dxa" w:w="1234"/>
-          </w:tcPr>
-          <w:p>
-            <w:r>
-              <w:t>47.0</w:t>
-            </w:r>
-          </w:p>
-        </w:tc>
-        <w:tc>
-          <w:tcPr>
-            <w:tcW w:type="dxa" w:w="1234"/>
-          </w:tcPr>
-          <w:p>
-            <w:r>
-              <w:t>71.4</w:t>
-            </w:r>
-          </w:p>
-        </w:tc>
-        <w:tc>
-          <w:tcPr>
-            <w:tcW w:type="dxa" w:w="1234"/>
-          </w:tcPr>
-          <w:p>
-            <w:r>
-              <w:t>175</w:t>
-            </w:r>
-          </w:p>
-        </w:tc>
-      </w:tr>
-      <w:tr>
-        <w:tc>
-          <w:tcPr>
-            <w:tcW w:type="dxa" w:w="1234"/>
-          </w:tcPr>
-          <w:p>
-            <w:r>
-              <w:t>2026-06-28 15:00:37</w:t>
+              <w:t>54.8</w:t>
             </w:r>
           </w:p>
         </w:tc>
@@ -765,56 +591,6 @@
             </w:r>
           </w:p>
         </w:tc>
-        <w:tc>
-          <w:tcPr>
-            <w:tcW w:type="dxa" w:w="1234"/>
-          </w:tcPr>
-          <w:p>
-            <w:r>
-              <w:t>76.3</w:t>
-            </w:r>
-          </w:p>
-        </w:tc>
-        <w:tc>
-          <w:tcPr>
-            <w:tcW w:type="dxa" w:w="1234"/>
-          </w:tcPr>
-          <w:p>
-            <w:r>
-              <w:t>88.9</w:t>
-            </w:r>
-          </w:p>
-        </w:tc>
-        <w:tc>
-          <w:tcPr>
-            <w:tcW w:type="dxa" w:w="1234"/>
-          </w:tcPr>
-          <w:p>
-            <w:r>
-              <w:t>47.0</w:t>
-            </w:r>
-          </w:p>
-        </w:tc>
-        <w:tc>
-          <w:tcPr>
-            <w:tcW w:type="dxa" w:w="1234"/>
-          </w:tcPr>
-          <w:p>
-            <w:r>
-              <w:t>72.1</w:t>
-            </w:r>
-          </w:p>
-        </w:tc>
-        <w:tc>
-          <w:tcPr>
-            <w:tcW w:type="dxa" w:w="1234"/>
-          </w:tcPr>
-          <w:p>
-            <w:r>
-              <w:t>231</w:t>
-            </w:r>
-          </w:p>
-        </w:tc>
       </w:tr>
       <w:tr>
         <w:tc>
@@ -823,7 +599,7 @@
           </w:tcPr>
           <w:p>
             <w:r>
-              <w:t>2026-06-28 15:30:37</w:t>
+              <w:t>2026-06-28 20:00:10</w:t>
             </w:r>
           </w:p>
         </w:tc>
@@ -832,8 +608,16 @@
             <w:tcW w:type="dxa" w:w="1234"/>
           </w:tcPr>
           <w:p>
+            <w:r/>
+          </w:p>
+        </w:tc>
+        <w:tc>
+          <w:tcPr>
+            <w:tcW w:type="dxa" w:w="1234"/>
+          </w:tcPr>
+          <w:p>
             <w:r>
-              <w:t>121</w:t>
+              <w:t>55.1</w:t>
             </w:r>
           </w:p>
         </w:tc>
@@ -843,7 +627,7 @@
           </w:tcPr>
           <w:p>
             <w:r>
-              <w:t>76.3</w:t>
+              <w:t>67.7</w:t>
             </w:r>
           </w:p>
         </w:tc>
@@ -853,7 +637,7 @@
           </w:tcPr>
           <w:p>
             <w:r>
-              <w:t>88.8</w:t>
+              <w:t>41.9</w:t>
             </w:r>
           </w:p>
         </w:tc>
@@ -863,7 +647,7 @@
           </w:tcPr>
           <w:p>
             <w:r>
-              <w:t>47.0</w:t>
+              <w:t>55.0</w:t>
             </w:r>
           </w:p>
         </w:tc>
@@ -873,17 +657,7 @@
           </w:tcPr>
           <w:p>
             <w:r>
-              <w:t>72.1</w:t>
-            </w:r>
-          </w:p>
-        </w:tc>
-        <w:tc>
-          <w:tcPr>
-            <w:tcW w:type="dxa" w:w="1234"/>
-          </w:tcPr>
-          <w:p>
-            <w:r>
-              <w:t>351</w:t>
+              <w:t>241</w:t>
             </w:r>
           </w:p>
         </w:tc>
@@ -895,7 +669,7 @@
           </w:tcPr>
           <w:p>
             <w:r>
-              <w:t>2026-06-28 15:30:52</w:t>
+              <w:t>2026-06-28 20:30:25</w:t>
             </w:r>
           </w:p>
         </w:tc>
@@ -904,8 +678,16 @@
             <w:tcW w:type="dxa" w:w="1234"/>
           </w:tcPr>
           <w:p>
+            <w:r/>
+          </w:p>
+        </w:tc>
+        <w:tc>
+          <w:tcPr>
+            <w:tcW w:type="dxa" w:w="1234"/>
+          </w:tcPr>
+          <w:p>
             <w:r>
-              <w:t>122</w:t>
+              <w:t>55.3</w:t>
             </w:r>
           </w:p>
         </w:tc>
@@ -915,7 +697,7 @@
           </w:tcPr>
           <w:p>
             <w:r>
-              <w:t>76.8</w:t>
+              <w:t>68.1</w:t>
             </w:r>
           </w:p>
         </w:tc>
@@ -925,7 +707,7 @@
           </w:tcPr>
           <w:p>
             <w:r>
-              <w:t>88.8</w:t>
+              <w:t>41.9</w:t>
             </w:r>
           </w:p>
         </w:tc>
@@ -935,7 +717,7 @@
           </w:tcPr>
           <w:p>
             <w:r>
-              <w:t>47.0</w:t>
+              <w:t>55.1</w:t>
             </w:r>
           </w:p>
         </w:tc>
@@ -945,17 +727,7 @@
           </w:tcPr>
           <w:p>
             <w:r>
-              <w:t>72.3</w:t>
-            </w:r>
-          </w:p>
-        </w:tc>
-        <w:tc>
-          <w:tcPr>
-            <w:tcW w:type="dxa" w:w="1234"/>
-          </w:tcPr>
-          <w:p>
-            <w:r>
-              <w:t>352</w:t>
+              <w:t>362</w:t>
             </w:r>
           </w:p>
         </w:tc>
@@ -967,7 +739,7 @@
           </w:tcPr>
           <w:p>
             <w:r>
-              <w:t>2026-06-28 16:00:52</w:t>
+              <w:t>2026-06-28 20:45:07</w:t>
             </w:r>
           </w:p>
         </w:tc>
@@ -976,8 +748,16 @@
             <w:tcW w:type="dxa" w:w="1234"/>
           </w:tcPr>
           <w:p>
+            <w:r/>
+          </w:p>
+        </w:tc>
+        <w:tc>
+          <w:tcPr>
+            <w:tcW w:type="dxa" w:w="1234"/>
+          </w:tcPr>
+          <w:p>
             <w:r>
-              <w:t>122</w:t>
+              <w:t>55.7</w:t>
             </w:r>
           </w:p>
         </w:tc>
@@ -987,7 +767,7 @@
           </w:tcPr>
           <w:p>
             <w:r>
-              <w:t>76.8</w:t>
+              <w:t>68.3</w:t>
             </w:r>
           </w:p>
         </w:tc>
@@ -997,7 +777,7 @@
           </w:tcPr>
           <w:p>
             <w:r>
-              <w:t>88.6</w:t>
+              <w:t>31.2</w:t>
             </w:r>
           </w:p>
         </w:tc>
@@ -1007,7 +787,7 @@
           </w:tcPr>
           <w:p>
             <w:r>
-              <w:t>47.0</w:t>
+              <w:t>52.7</w:t>
             </w:r>
           </w:p>
         </w:tc>
@@ -1017,17 +797,7 @@
           </w:tcPr>
           <w:p>
             <w:r>
-              <w:t>72.3</w:t>
-            </w:r>
-          </w:p>
-        </w:tc>
-        <w:tc>
-          <w:tcPr>
-            <w:tcW w:type="dxa" w:w="1234"/>
-          </w:tcPr>
-          <w:p>
-            <w:r>
-              <w:t>472</w:t>
+              <w:t>45</w:t>
             </w:r>
           </w:p>
         </w:tc>
@@ -1039,7 +809,7 @@
           </w:tcPr>
           <w:p>
             <w:r>
-              <w:t>2026-06-28 16:01:07</w:t>
+              <w:t>2026-06-28 21:15:07</w:t>
             </w:r>
           </w:p>
         </w:tc>
@@ -1048,8 +818,16 @@
             <w:tcW w:type="dxa" w:w="1234"/>
           </w:tcPr>
           <w:p>
+            <w:r/>
+          </w:p>
+        </w:tc>
+        <w:tc>
+          <w:tcPr>
+            <w:tcW w:type="dxa" w:w="1234"/>
+          </w:tcPr>
+          <w:p>
             <w:r>
-              <w:t>123</w:t>
+              <w:t>55.7</w:t>
             </w:r>
           </w:p>
         </w:tc>
@@ -1059,7 +837,7 @@
           </w:tcPr>
           <w:p>
             <w:r>
-              <w:t>77.3</w:t>
+              <w:t>68.6</w:t>
             </w:r>
           </w:p>
         </w:tc>
@@ -1069,7 +847,7 @@
           </w:tcPr>
           <w:p>
             <w:r>
-              <w:t>88.6</w:t>
+              <w:t>32.1</w:t>
             </w:r>
           </w:p>
         </w:tc>
@@ -1079,7 +857,7 @@
           </w:tcPr>
           <w:p>
             <w:r>
-              <w:t>47.0</w:t>
+              <w:t>53.0</w:t>
             </w:r>
           </w:p>
         </w:tc>
@@ -1089,17 +867,7 @@
           </w:tcPr>
           <w:p>
             <w:r>
-              <w:t>72.5</w:t>
-            </w:r>
-          </w:p>
-        </w:tc>
-        <w:tc>
-          <w:tcPr>
-            <w:tcW w:type="dxa" w:w="1234"/>
-          </w:tcPr>
-          <w:p>
-            <w:r>
-              <w:t>473</w:t>
+              <w:t>165</w:t>
             </w:r>
           </w:p>
         </w:tc>
@@ -1111,7 +879,7 @@
           </w:tcPr>
           <w:p>
             <w:r>
-              <w:t>2026-06-28 16:16:22</w:t>
+              <w:t>2026-06-28 21:30:04</w:t>
             </w:r>
           </w:p>
         </w:tc>
@@ -1120,8 +888,16 @@
             <w:tcW w:type="dxa" w:w="1234"/>
           </w:tcPr>
           <w:p>
+            <w:r/>
+          </w:p>
+        </w:tc>
+        <w:tc>
+          <w:tcPr>
+            <w:tcW w:type="dxa" w:w="1234"/>
+          </w:tcPr>
+          <w:p>
             <w:r>
-              <w:t>124</w:t>
+              <w:t>55.8</w:t>
             </w:r>
           </w:p>
         </w:tc>
@@ -1131,7 +907,7 @@
           </w:tcPr>
           <w:p>
             <w:r>
-              <w:t>78.0</w:t>
+              <w:t>68.8</w:t>
             </w:r>
           </w:p>
         </w:tc>
@@ -1141,7 +917,7 @@
           </w:tcPr>
           <w:p>
             <w:r>
-              <w:t>88.6</w:t>
+              <w:t>36.2</w:t>
             </w:r>
           </w:p>
         </w:tc>
@@ -1151,7 +927,7 @@
           </w:tcPr>
           <w:p>
             <w:r>
-              <w:t>47.0</w:t>
+              <w:t>54.1</w:t>
             </w:r>
           </w:p>
         </w:tc>
@@ -1161,17 +937,7 @@
           </w:tcPr>
           <w:p>
             <w:r>
-              <w:t>72.9</w:t>
-            </w:r>
-          </w:p>
-        </w:tc>
-        <w:tc>
-          <w:tcPr>
-            <w:tcW w:type="dxa" w:w="1234"/>
-          </w:tcPr>
-          <w:p>
-            <w:r>
-              <w:t>534</w:t>
+              <w:t>14</w:t>
             </w:r>
           </w:p>
         </w:tc>
@@ -1183,7 +949,7 @@
           </w:tcPr>
           <w:p>
             <w:r>
-              <w:t>2026-06-28 16:46:22</w:t>
+              <w:t>2026-06-28 22:00:10</w:t>
             </w:r>
           </w:p>
         </w:tc>
@@ -1192,8 +958,16 @@
             <w:tcW w:type="dxa" w:w="1234"/>
           </w:tcPr>
           <w:p>
+            <w:r/>
+          </w:p>
+        </w:tc>
+        <w:tc>
+          <w:tcPr>
+            <w:tcW w:type="dxa" w:w="1234"/>
+          </w:tcPr>
+          <w:p>
             <w:r>
-              <w:t>124</w:t>
+              <w:t>57.1</w:t>
             </w:r>
           </w:p>
         </w:tc>
@@ -1203,7 +977,7 @@
           </w:tcPr>
           <w:p>
             <w:r>
-              <w:t>78.0</w:t>
+              <w:t>69.2</w:t>
             </w:r>
           </w:p>
         </w:tc>
@@ -1213,7 +987,7 @@
           </w:tcPr>
           <w:p>
             <w:r>
-              <w:t>88.5</w:t>
+              <w:t>37.1</w:t>
             </w:r>
           </w:p>
         </w:tc>
@@ -1223,7 +997,7 @@
           </w:tcPr>
           <w:p>
             <w:r>
-              <w:t>47.0</w:t>
+              <w:t>55.1</w:t>
             </w:r>
           </w:p>
         </w:tc>
@@ -1233,17 +1007,7 @@
           </w:tcPr>
           <w:p>
             <w:r>
-              <w:t>72.9</w:t>
-            </w:r>
-          </w:p>
-        </w:tc>
-        <w:tc>
-          <w:tcPr>
-            <w:tcW w:type="dxa" w:w="1234"/>
-          </w:tcPr>
-          <w:p>
-            <w:r>
-              <w:t>654</w:t>
+              <w:t>91</w:t>
             </w:r>
           </w:p>
         </w:tc>
@@ -1255,7 +1019,7 @@
           </w:tcPr>
           <w:p>
             <w:r>
-              <w:t>2026-06-28 16:46:37</w:t>
+              <w:t>2026-06-28 22:15:10</w:t>
             </w:r>
           </w:p>
         </w:tc>
@@ -1264,8 +1028,16 @@
             <w:tcW w:type="dxa" w:w="1234"/>
           </w:tcPr>
           <w:p>
+            <w:r/>
+          </w:p>
+        </w:tc>
+        <w:tc>
+          <w:tcPr>
+            <w:tcW w:type="dxa" w:w="1234"/>
+          </w:tcPr>
+          <w:p>
             <w:r>
-              <w:t>125</w:t>
+              <w:t>58.9</w:t>
             </w:r>
           </w:p>
         </w:tc>
@@ -1275,7 +1047,7 @@
           </w:tcPr>
           <w:p>
             <w:r>
-              <w:t>78.5</w:t>
+              <w:t>69.3</w:t>
             </w:r>
           </w:p>
         </w:tc>
@@ -1285,7 +1057,7 @@
           </w:tcPr>
           <w:p>
             <w:r>
-              <w:t>88.5</w:t>
+              <w:t>37.3</w:t>
             </w:r>
           </w:p>
         </w:tc>
@@ -1295,7 +1067,7 @@
           </w:tcPr>
           <w:p>
             <w:r>
-              <w:t>47.0</w:t>
+              <w:t>56.1</w:t>
             </w:r>
           </w:p>
         </w:tc>
@@ -1305,17 +1077,7 @@
           </w:tcPr>
           <w:p>
             <w:r>
-              <w:t>73.1</w:t>
-            </w:r>
-          </w:p>
-        </w:tc>
-        <w:tc>
-          <w:tcPr>
-            <w:tcW w:type="dxa" w:w="1234"/>
-          </w:tcPr>
-          <w:p>
-            <w:r>
-              <w:t>655</w:t>
+              <w:t>151</w:t>
             </w:r>
           </w:p>
         </w:tc>
@@ -1327,7 +1089,7 @@
           </w:tcPr>
           <w:p>
             <w:r>
-              <w:t>2026-06-28 17:16:41</w:t>
+              <w:t>2026-06-28 22:16:10</w:t>
             </w:r>
           </w:p>
         </w:tc>
@@ -1336,8 +1098,16 @@
             <w:tcW w:type="dxa" w:w="1234"/>
           </w:tcPr>
           <w:p>
+            <w:r/>
+          </w:p>
+        </w:tc>
+        <w:tc>
+          <w:tcPr>
+            <w:tcW w:type="dxa" w:w="1234"/>
+          </w:tcPr>
+          <w:p>
             <w:r>
-              <w:t>125</w:t>
+              <w:t>58.9</w:t>
             </w:r>
           </w:p>
         </w:tc>
@@ -1347,7 +1117,7 @@
           </w:tcPr>
           <w:p>
             <w:r>
-              <w:t>78.5</w:t>
+              <w:t>69.4</w:t>
             </w:r>
           </w:p>
         </w:tc>
@@ -1357,7 +1127,7 @@
           </w:tcPr>
           <w:p>
             <w:r>
-              <w:t>88.5</w:t>
+              <w:t>49.4</w:t>
             </w:r>
           </w:p>
         </w:tc>
@@ -1367,7 +1137,7 @@
           </w:tcPr>
           <w:p>
             <w:r>
-              <w:t>47.0</w:t>
+              <w:t>59.1</w:t>
             </w:r>
           </w:p>
         </w:tc>
@@ -1377,17 +1147,7 @@
           </w:tcPr>
           <w:p>
             <w:r>
-              <w:t>73.1</w:t>
-            </w:r>
-          </w:p>
-        </w:tc>
-        <w:tc>
-          <w:tcPr>
-            <w:tcW w:type="dxa" w:w="1234"/>
-          </w:tcPr>
-          <w:p>
-            <w:r>
-              <w:t>58</w:t>
+              <w:t>155</w:t>
             </w:r>
           </w:p>
         </w:tc>
@@ -1399,7 +1159,7 @@
           </w:tcPr>
           <w:p>
             <w:r>
-              <w:t>2026-06-28 17:16:56</w:t>
+              <w:t>2026-06-28 22:46:25</w:t>
             </w:r>
           </w:p>
         </w:tc>
@@ -1408,8 +1168,16 @@
             <w:tcW w:type="dxa" w:w="1234"/>
           </w:tcPr>
           <w:p>
+            <w:r/>
+          </w:p>
+        </w:tc>
+        <w:tc>
+          <w:tcPr>
+            <w:tcW w:type="dxa" w:w="1234"/>
+          </w:tcPr>
+          <w:p>
             <w:r>
-              <w:t>126</w:t>
+              <w:t>60.3</w:t>
             </w:r>
           </w:p>
         </w:tc>
@@ -1419,7 +1187,7 @@
           </w:tcPr>
           <w:p>
             <w:r>
-              <w:t>79.1</w:t>
+              <w:t>69.7</w:t>
             </w:r>
           </w:p>
         </w:tc>
@@ -1429,7 +1197,7 @@
           </w:tcPr>
           <w:p>
             <w:r>
-              <w:t>88.5</w:t>
+              <w:t>49.4</w:t>
             </w:r>
           </w:p>
         </w:tc>
@@ -1439,7 +1207,7 @@
           </w:tcPr>
           <w:p>
             <w:r>
-              <w:t>47.0</w:t>
+              <w:t>59.9</w:t>
             </w:r>
           </w:p>
         </w:tc>
@@ -1449,17 +1217,7 @@
           </w:tcPr>
           <w:p>
             <w:r>
-              <w:t>73.4</w:t>
-            </w:r>
-          </w:p>
-        </w:tc>
-        <w:tc>
-          <w:tcPr>
-            <w:tcW w:type="dxa" w:w="1234"/>
-          </w:tcPr>
-          <w:p>
-            <w:r>
-              <w:t>59</w:t>
+              <w:t>276</w:t>
             </w:r>
           </w:p>
         </w:tc>
@@ -1471,7 +1229,7 @@
           </w:tcPr>
           <w:p>
             <w:r>
-              <w:t>2026-06-28 17:31:56</w:t>
+              <w:t>2026-06-28 23:15:10</w:t>
             </w:r>
           </w:p>
         </w:tc>
@@ -1480,8 +1238,16 @@
             <w:tcW w:type="dxa" w:w="1234"/>
           </w:tcPr>
           <w:p>
+            <w:r/>
+          </w:p>
+        </w:tc>
+        <w:tc>
+          <w:tcPr>
+            <w:tcW w:type="dxa" w:w="1234"/>
+          </w:tcPr>
+          <w:p>
             <w:r>
-              <w:t>127</w:t>
+              <w:t>63.1</w:t>
             </w:r>
           </w:p>
         </w:tc>
@@ -1491,7 +1257,7 @@
           </w:tcPr>
           <w:p>
             <w:r>
-              <w:t>79.7</w:t>
+              <w:t>70.1</w:t>
             </w:r>
           </w:p>
         </w:tc>
@@ -1501,7 +1267,7 @@
           </w:tcPr>
           <w:p>
             <w:r>
-              <w:t>88.5</w:t>
+              <w:t>49.4</w:t>
             </w:r>
           </w:p>
         </w:tc>
@@ -1511,7 +1277,7 @@
           </w:tcPr>
           <w:p>
             <w:r>
-              <w:t>47.0</w:t>
+              <w:t>61.4</w:t>
             </w:r>
           </w:p>
         </w:tc>
@@ -1521,17 +1287,7 @@
           </w:tcPr>
           <w:p>
             <w:r>
-              <w:t>73.7</w:t>
-            </w:r>
-          </w:p>
-        </w:tc>
-        <w:tc>
-          <w:tcPr>
-            <w:tcW w:type="dxa" w:w="1234"/>
-          </w:tcPr>
-          <w:p>
-            <w:r>
-              <w:t>119</w:t>
+              <w:t>391</w:t>
             </w:r>
           </w:p>
         </w:tc>
@@ -1543,7 +1299,7 @@
           </w:tcPr>
           <w:p>
             <w:r>
-              <w:t>2026-06-28 17:47:11</w:t>
+              <w:t>2026-06-28 23:45:11</w:t>
             </w:r>
           </w:p>
         </w:tc>
@@ -1552,8 +1308,16 @@
             <w:tcW w:type="dxa" w:w="1234"/>
           </w:tcPr>
           <w:p>
+            <w:r/>
+          </w:p>
+        </w:tc>
+        <w:tc>
+          <w:tcPr>
+            <w:tcW w:type="dxa" w:w="1234"/>
+          </w:tcPr>
+          <w:p>
             <w:r>
-              <w:t>128</w:t>
+              <w:t>64.3</w:t>
             </w:r>
           </w:p>
         </w:tc>
@@ -1563,7 +1327,7 @@
           </w:tcPr>
           <w:p>
             <w:r>
-              <w:t>80.1</w:t>
+              <w:t>70.4</w:t>
             </w:r>
           </w:p>
         </w:tc>
@@ -1573,7 +1337,7 @@
           </w:tcPr>
           <w:p>
             <w:r>
-              <w:t>88.4</w:t>
+              <w:t>49.4</w:t>
             </w:r>
           </w:p>
         </w:tc>
@@ -1583,7 +1347,7 @@
           </w:tcPr>
           <w:p>
             <w:r>
-              <w:t>47.0</w:t>
+              <w:t>62.1</w:t>
             </w:r>
           </w:p>
         </w:tc>
@@ -1593,17 +1357,7 @@
           </w:tcPr>
           <w:p>
             <w:r>
-              <w:t>73.9</w:t>
-            </w:r>
-          </w:p>
-        </w:tc>
-        <w:tc>
-          <w:tcPr>
-            <w:tcW w:type="dxa" w:w="1234"/>
-          </w:tcPr>
-          <w:p>
-            <w:r>
-              <w:t>180</w:t>
+              <w:t>511</w:t>
             </w:r>
           </w:p>
         </w:tc>
@@ -1615,7 +1369,7 @@
           </w:tcPr>
           <w:p>
             <w:r>
-              <w:t>2026-06-28 18:17:11</w:t>
+              <w:t>2026-06-29 00:15:10</w:t>
             </w:r>
           </w:p>
         </w:tc>
@@ -1624,8 +1378,16 @@
             <w:tcW w:type="dxa" w:w="1234"/>
           </w:tcPr>
           <w:p>
+            <w:r/>
+          </w:p>
+        </w:tc>
+        <w:tc>
+          <w:tcPr>
+            <w:tcW w:type="dxa" w:w="1234"/>
+          </w:tcPr>
+          <w:p>
             <w:r>
-              <w:t>128</w:t>
+              <w:t>66.4</w:t>
             </w:r>
           </w:p>
         </w:tc>
@@ -1635,7 +1397,7 @@
           </w:tcPr>
           <w:p>
             <w:r>
-              <w:t>80.1</w:t>
+              <w:t>70.8</w:t>
             </w:r>
           </w:p>
         </w:tc>
@@ -1645,7 +1407,7 @@
           </w:tcPr>
           <w:p>
             <w:r>
-              <w:t>88.3</w:t>
+              <w:t>49.4</w:t>
             </w:r>
           </w:p>
         </w:tc>
@@ -1655,7 +1417,7 @@
           </w:tcPr>
           <w:p>
             <w:r>
-              <w:t>47.0</w:t>
+              <w:t>63.3</w:t>
             </w:r>
           </w:p>
         </w:tc>
@@ -1665,89 +1427,7 @@
           </w:tcPr>
           <w:p>
             <w:r>
-              <w:t>73.9</w:t>
-            </w:r>
-          </w:p>
-        </w:tc>
-        <w:tc>
-          <w:tcPr>
-            <w:tcW w:type="dxa" w:w="1234"/>
-          </w:tcPr>
-          <w:p>
-            <w:r>
-              <w:t>300</w:t>
-            </w:r>
-          </w:p>
-        </w:tc>
-      </w:tr>
-      <w:tr>
-        <w:tc>
-          <w:tcPr>
-            <w:tcW w:type="dxa" w:w="1234"/>
-          </w:tcPr>
-          <w:p>
-            <w:r>
-              <w:t>2026-06-28 18:31:11</w:t>
-            </w:r>
-          </w:p>
-        </w:tc>
-        <w:tc>
-          <w:tcPr>
-            <w:tcW w:type="dxa" w:w="1234"/>
-          </w:tcPr>
-          <w:p>
-            <w:r>
-              <w:t>129</w:t>
-            </w:r>
-          </w:p>
-        </w:tc>
-        <w:tc>
-          <w:tcPr>
-            <w:tcW w:type="dxa" w:w="1234"/>
-          </w:tcPr>
-          <w:p>
-            <w:r>
-              <w:t>80.6</w:t>
-            </w:r>
-          </w:p>
-        </w:tc>
-        <w:tc>
-          <w:tcPr>
-            <w:tcW w:type="dxa" w:w="1234"/>
-          </w:tcPr>
-          <w:p>
-            <w:r>
-              <w:t>88.3</w:t>
-            </w:r>
-          </w:p>
-        </w:tc>
-        <w:tc>
-          <w:tcPr>
-            <w:tcW w:type="dxa" w:w="1234"/>
-          </w:tcPr>
-          <w:p>
-            <w:r>
-              <w:t>47.0</w:t>
-            </w:r>
-          </w:p>
-        </w:tc>
-        <w:tc>
-          <w:tcPr>
-            <w:tcW w:type="dxa" w:w="1234"/>
-          </w:tcPr>
-          <w:p>
-            <w:r>
-              <w:t>74.1</w:t>
-            </w:r>
-          </w:p>
-        </w:tc>
-        <w:tc>
-          <w:tcPr>
-            <w:tcW w:type="dxa" w:w="1234"/>
-          </w:tcPr>
-          <w:p>
-            <w:r>
-              <w:t>356</w:t>
+              <w:t>631</w:t>
             </w:r>
           </w:p>
         </w:tc>
@@ -1768,7 +1448,7 @@
     </w:p>
     <w:p>
       <w:r>
-        <w:t>Section score: 80.6 / 100  (Grade: B)</w:t>
+        <w:t>Section score: 66.4 / 100  (Grade: D)</w:t>
       </w:r>
     </w:p>
     <w:p>
@@ -1911,7 +1591,7 @@
           </w:tcPr>
           <w:p>
             <w:r>
-              <w:t>71.7</w:t>
+              <w:t>50.0</w:t>
             </w:r>
           </w:p>
         </w:tc>
@@ -1921,7 +1601,7 @@
           </w:tcPr>
           <w:p>
             <w:r>
-              <w:t>10.8</w:t>
+              <w:t>7.5</w:t>
             </w:r>
           </w:p>
         </w:tc>
@@ -1943,7 +1623,7 @@
           </w:tcPr>
           <w:p>
             <w:r>
-              <w:t>100.0</w:t>
+              <w:t>81.9</w:t>
             </w:r>
           </w:p>
         </w:tc>
@@ -1953,7 +1633,7 @@
           </w:tcPr>
           <w:p>
             <w:r>
-              <w:t>20.0</w:t>
+              <w:t>16.4</w:t>
             </w:r>
           </w:p>
         </w:tc>
@@ -1975,7 +1655,39 @@
           </w:tcPr>
           <w:p>
             <w:r>
-              <w:t>100.0</w:t>
+              <w:t>0.0</w:t>
+            </w:r>
+          </w:p>
+        </w:tc>
+        <w:tc>
+          <w:tcPr>
+            <w:tcW w:type="dxa" w:w="2880"/>
+          </w:tcPr>
+          <w:p>
+            <w:r>
+              <w:t>0.0</w:t>
+            </w:r>
+          </w:p>
+        </w:tc>
+      </w:tr>
+      <w:tr>
+        <w:tc>
+          <w:tcPr>
+            <w:tcW w:type="dxa" w:w="2880"/>
+          </w:tcPr>
+          <w:p>
+            <w:r>
+              <w:t>side balance</w:t>
+            </w:r>
+          </w:p>
+        </w:tc>
+        <w:tc>
+          <w:tcPr>
+            <w:tcW w:type="dxa" w:w="2880"/>
+          </w:tcPr>
+          <w:p>
+            <w:r>
+              <w:t>50.0</w:t>
             </w:r>
           </w:p>
         </w:tc>
@@ -1997,38 +1709,6 @@
           </w:tcPr>
           <w:p>
             <w:r>
-              <w:t>side balance</w:t>
-            </w:r>
-          </w:p>
-        </w:tc>
-        <w:tc>
-          <w:tcPr>
-            <w:tcW w:type="dxa" w:w="2880"/>
-          </w:tcPr>
-          <w:p>
-            <w:r>
-              <w:t>77.2</w:t>
-            </w:r>
-          </w:p>
-        </w:tc>
-        <w:tc>
-          <w:tcPr>
-            <w:tcW w:type="dxa" w:w="2880"/>
-          </w:tcPr>
-          <w:p>
-            <w:r>
-              <w:t>7.7</w:t>
-            </w:r>
-          </w:p>
-        </w:tc>
-      </w:tr>
-      <w:tr>
-        <w:tc>
-          <w:tcPr>
-            <w:tcW w:type="dxa" w:w="2880"/>
-          </w:tcPr>
-          <w:p>
-            <w:r>
               <w:t>win rate</w:t>
             </w:r>
           </w:p>
@@ -2039,7 +1719,7 @@
           </w:tcPr>
           <w:p>
             <w:r>
-              <w:t>48.7</w:t>
+              <w:t>50.0</w:t>
             </w:r>
           </w:p>
         </w:tc>
@@ -2049,7 +1729,7 @@
           </w:tcPr>
           <w:p>
             <w:r>
-              <w:t>12.2</w:t>
+              <w:t>12.5</w:t>
             </w:r>
           </w:p>
         </w:tc>
@@ -2090,7 +1770,7 @@
           </w:tcPr>
           <w:p>
             <w:r>
-              <w:t>$656.94</w:t>
+              <w:t>$531.88</w:t>
             </w:r>
           </w:p>
         </w:tc>
@@ -2112,7 +1792,7 @@
           </w:tcPr>
           <w:p>
             <w:r>
-              <w:t>31.39%</w:t>
+              <w:t>6.38%</w:t>
             </w:r>
           </w:p>
         </w:tc>
@@ -2134,7 +1814,7 @@
           </w:tcPr>
           <w:p>
             <w:r>
-              <w:t>$58.78</w:t>
+              <w:t>$31.88</w:t>
             </w:r>
           </w:p>
         </w:tc>
@@ -2156,7 +1836,7 @@
           </w:tcPr>
           <w:p>
             <w:r>
-              <w:t>$59.73</w:t>
+              <w:t>$0.00</w:t>
             </w:r>
           </w:p>
         </w:tc>
@@ -2178,7 +1858,7 @@
           </w:tcPr>
           <w:p>
             <w:r>
-              <w:t>0.6434</w:t>
+              <w:t>—</w:t>
             </w:r>
           </w:p>
         </w:tc>
@@ -2200,7 +1880,7 @@
           </w:tcPr>
           <w:p>
             <w:r>
-              <w:t>0.5000 / 0.6697</w:t>
+              <w:t>— / —</w:t>
             </w:r>
           </w:p>
         </w:tc>
@@ -2222,7 +1902,7 @@
           </w:tcPr>
           <w:p>
             <w:r>
-              <w:t>1.2734</w:t>
+              <w:t>—</w:t>
             </w:r>
           </w:p>
         </w:tc>
@@ -2244,7 +1924,7 @@
           </w:tcPr>
           <w:p>
             <w:r>
-              <w:t>129 / 129</w:t>
+              <w:t>0 / 0</w:t>
             </w:r>
           </w:p>
         </w:tc>
@@ -2266,7 +1946,7 @@
           </w:tcPr>
           <w:p>
             <w:r>
-              <w:t>$0.46</w:t>
+              <w:t>$—</w:t>
             </w:r>
           </w:p>
         </w:tc>
@@ -2304,863 +1984,9 @@
     </w:p>
     <w:p>
       <w:r>
-        <w:t>Executed 7 · Settled 7 · Profit $59.73</w:t>
+        <w:t>Executed 0 · Settled 0 · Profit $0.0</w:t>
       </w:r>
     </w:p>
-    <w:p>
-      <w:pPr>
-        <w:pStyle w:val="Heading2"/>
-      </w:pPr>
-      <w:r>
-        <w:t>Recent positions (last 15)</w:t>
-      </w:r>
-    </w:p>
-    <w:tbl>
-      <w:tblPr>
-        <w:tblStyle w:val="TableGrid"/>
-        <w:tblW w:type="auto" w:w="0"/>
-        <w:tblLook w:firstColumn="1" w:firstRow="1" w:lastColumn="0" w:lastRow="0" w:noHBand="0" w:noVBand="1" w:val="04A0"/>
-      </w:tblPr>
-      <w:tblGrid>
-        <w:gridCol w:w="1728"/>
-        <w:gridCol w:w="1728"/>
-        <w:gridCol w:w="1728"/>
-        <w:gridCol w:w="1728"/>
-        <w:gridCol w:w="1728"/>
-      </w:tblGrid>
-      <w:tr>
-        <w:tc>
-          <w:tcPr>
-            <w:tcW w:type="dxa" w:w="1728"/>
-          </w:tcPr>
-          <w:p>
-            <w:r>
-              <w:t>Side</w:t>
-            </w:r>
-          </w:p>
-        </w:tc>
-        <w:tc>
-          <w:tcPr>
-            <w:tcW w:type="dxa" w:w="1728"/>
-          </w:tcPr>
-          <w:p>
-            <w:r>
-              <w:t>Entry</w:t>
-            </w:r>
-          </w:p>
-        </w:tc>
-        <w:tc>
-          <w:tcPr>
-            <w:tcW w:type="dxa" w:w="1728"/>
-          </w:tcPr>
-          <w:p>
-            <w:r>
-              <w:t>Outcome</w:t>
-            </w:r>
-          </w:p>
-        </w:tc>
-        <w:tc>
-          <w:tcPr>
-            <w:tcW w:type="dxa" w:w="1728"/>
-          </w:tcPr>
-          <w:p>
-            <w:r>
-              <w:t>Won</w:t>
-            </w:r>
-          </w:p>
-        </w:tc>
-        <w:tc>
-          <w:tcPr>
-            <w:tcW w:type="dxa" w:w="1728"/>
-          </w:tcPr>
-          <w:p>
-            <w:r>
-              <w:t>PnL</w:t>
-            </w:r>
-          </w:p>
-        </w:tc>
-      </w:tr>
-      <w:tr>
-        <w:tc>
-          <w:tcPr>
-            <w:tcW w:type="dxa" w:w="1728"/>
-          </w:tcPr>
-          <w:p>
-            <w:r>
-              <w:t>down</w:t>
-            </w:r>
-          </w:p>
-        </w:tc>
-        <w:tc>
-          <w:tcPr>
-            <w:tcW w:type="dxa" w:w="1728"/>
-          </w:tcPr>
-          <w:p>
-            <w:r>
-              <w:t>0.590</w:t>
-            </w:r>
-          </w:p>
-        </w:tc>
-        <w:tc>
-          <w:tcPr>
-            <w:tcW w:type="dxa" w:w="1728"/>
-          </w:tcPr>
-          <w:p>
-            <w:r>
-              <w:t>down</w:t>
-            </w:r>
-          </w:p>
-        </w:tc>
-        <w:tc>
-          <w:tcPr>
-            <w:tcW w:type="dxa" w:w="1728"/>
-          </w:tcPr>
-          <w:p>
-            <w:r>
-              <w:t>Yes</w:t>
-            </w:r>
-          </w:p>
-        </w:tc>
-        <w:tc>
-          <w:tcPr>
-            <w:tcW w:type="dxa" w:w="1728"/>
-          </w:tcPr>
-          <w:p>
-            <w:r>
-              <w:t>$3.47</w:t>
-            </w:r>
-          </w:p>
-        </w:tc>
-      </w:tr>
-      <w:tr>
-        <w:tc>
-          <w:tcPr>
-            <w:tcW w:type="dxa" w:w="1728"/>
-          </w:tcPr>
-          <w:p>
-            <w:r>
-              <w:t>down</w:t>
-            </w:r>
-          </w:p>
-        </w:tc>
-        <w:tc>
-          <w:tcPr>
-            <w:tcW w:type="dxa" w:w="1728"/>
-          </w:tcPr>
-          <w:p>
-            <w:r>
-              <w:t>0.610</w:t>
-            </w:r>
-          </w:p>
-        </w:tc>
-        <w:tc>
-          <w:tcPr>
-            <w:tcW w:type="dxa" w:w="1728"/>
-          </w:tcPr>
-          <w:p>
-            <w:r>
-              <w:t>down</w:t>
-            </w:r>
-          </w:p>
-        </w:tc>
-        <w:tc>
-          <w:tcPr>
-            <w:tcW w:type="dxa" w:w="1728"/>
-          </w:tcPr>
-          <w:p>
-            <w:r>
-              <w:t>Yes</w:t>
-            </w:r>
-          </w:p>
-        </w:tc>
-        <w:tc>
-          <w:tcPr>
-            <w:tcW w:type="dxa" w:w="1728"/>
-          </w:tcPr>
-          <w:p>
-            <w:r>
-              <w:t>$3.20</w:t>
-            </w:r>
-          </w:p>
-        </w:tc>
-      </w:tr>
-      <w:tr>
-        <w:tc>
-          <w:tcPr>
-            <w:tcW w:type="dxa" w:w="1728"/>
-          </w:tcPr>
-          <w:p>
-            <w:r>
-              <w:t>down</w:t>
-            </w:r>
-          </w:p>
-        </w:tc>
-        <w:tc>
-          <w:tcPr>
-            <w:tcW w:type="dxa" w:w="1728"/>
-          </w:tcPr>
-          <w:p>
-            <w:r>
-              <w:t>0.510</w:t>
-            </w:r>
-          </w:p>
-        </w:tc>
-        <w:tc>
-          <w:tcPr>
-            <w:tcW w:type="dxa" w:w="1728"/>
-          </w:tcPr>
-          <w:p>
-            <w:r>
-              <w:t>down</w:t>
-            </w:r>
-          </w:p>
-        </w:tc>
-        <w:tc>
-          <w:tcPr>
-            <w:tcW w:type="dxa" w:w="1728"/>
-          </w:tcPr>
-          <w:p>
-            <w:r>
-              <w:t>Yes</w:t>
-            </w:r>
-          </w:p>
-        </w:tc>
-        <w:tc>
-          <w:tcPr>
-            <w:tcW w:type="dxa" w:w="1728"/>
-          </w:tcPr>
-          <w:p>
-            <w:r>
-              <w:t>$4.80</w:t>
-            </w:r>
-          </w:p>
-        </w:tc>
-      </w:tr>
-      <w:tr>
-        <w:tc>
-          <w:tcPr>
-            <w:tcW w:type="dxa" w:w="1728"/>
-          </w:tcPr>
-          <w:p>
-            <w:r>
-              <w:t>down</w:t>
-            </w:r>
-          </w:p>
-        </w:tc>
-        <w:tc>
-          <w:tcPr>
-            <w:tcW w:type="dxa" w:w="1728"/>
-          </w:tcPr>
-          <w:p>
-            <w:r>
-              <w:t>0.550</w:t>
-            </w:r>
-          </w:p>
-        </w:tc>
-        <w:tc>
-          <w:tcPr>
-            <w:tcW w:type="dxa" w:w="1728"/>
-          </w:tcPr>
-          <w:p>
-            <w:r>
-              <w:t>down</w:t>
-            </w:r>
-          </w:p>
-        </w:tc>
-        <w:tc>
-          <w:tcPr>
-            <w:tcW w:type="dxa" w:w="1728"/>
-          </w:tcPr>
-          <w:p>
-            <w:r>
-              <w:t>Yes</w:t>
-            </w:r>
-          </w:p>
-        </w:tc>
-        <w:tc>
-          <w:tcPr>
-            <w:tcW w:type="dxa" w:w="1728"/>
-          </w:tcPr>
-          <w:p>
-            <w:r>
-              <w:t>$4.09</w:t>
-            </w:r>
-          </w:p>
-        </w:tc>
-      </w:tr>
-      <w:tr>
-        <w:tc>
-          <w:tcPr>
-            <w:tcW w:type="dxa" w:w="1728"/>
-          </w:tcPr>
-          <w:p>
-            <w:r>
-              <w:t>down</w:t>
-            </w:r>
-          </w:p>
-        </w:tc>
-        <w:tc>
-          <w:tcPr>
-            <w:tcW w:type="dxa" w:w="1728"/>
-          </w:tcPr>
-          <w:p>
-            <w:r>
-              <w:t>0.590</w:t>
-            </w:r>
-          </w:p>
-        </w:tc>
-        <w:tc>
-          <w:tcPr>
-            <w:tcW w:type="dxa" w:w="1728"/>
-          </w:tcPr>
-          <w:p>
-            <w:r>
-              <w:t>down</w:t>
-            </w:r>
-          </w:p>
-        </w:tc>
-        <w:tc>
-          <w:tcPr>
-            <w:tcW w:type="dxa" w:w="1728"/>
-          </w:tcPr>
-          <w:p>
-            <w:r>
-              <w:t>Yes</w:t>
-            </w:r>
-          </w:p>
-        </w:tc>
-        <w:tc>
-          <w:tcPr>
-            <w:tcW w:type="dxa" w:w="1728"/>
-          </w:tcPr>
-          <w:p>
-            <w:r>
-              <w:t>$3.47</w:t>
-            </w:r>
-          </w:p>
-        </w:tc>
-      </w:tr>
-      <w:tr>
-        <w:tc>
-          <w:tcPr>
-            <w:tcW w:type="dxa" w:w="1728"/>
-          </w:tcPr>
-          <w:p>
-            <w:r>
-              <w:t>down</w:t>
-            </w:r>
-          </w:p>
-        </w:tc>
-        <w:tc>
-          <w:tcPr>
-            <w:tcW w:type="dxa" w:w="1728"/>
-          </w:tcPr>
-          <w:p>
-            <w:r>
-              <w:t>0.480</w:t>
-            </w:r>
-          </w:p>
-        </w:tc>
-        <w:tc>
-          <w:tcPr>
-            <w:tcW w:type="dxa" w:w="1728"/>
-          </w:tcPr>
-          <w:p>
-            <w:r>
-              <w:t>down</w:t>
-            </w:r>
-          </w:p>
-        </w:tc>
-        <w:tc>
-          <w:tcPr>
-            <w:tcW w:type="dxa" w:w="1728"/>
-          </w:tcPr>
-          <w:p>
-            <w:r>
-              <w:t>Yes</w:t>
-            </w:r>
-          </w:p>
-        </w:tc>
-        <w:tc>
-          <w:tcPr>
-            <w:tcW w:type="dxa" w:w="1728"/>
-          </w:tcPr>
-          <w:p>
-            <w:r>
-              <w:t>$5.42</w:t>
-            </w:r>
-          </w:p>
-        </w:tc>
-      </w:tr>
-      <w:tr>
-        <w:tc>
-          <w:tcPr>
-            <w:tcW w:type="dxa" w:w="1728"/>
-          </w:tcPr>
-          <w:p>
-            <w:r>
-              <w:t>down</w:t>
-            </w:r>
-          </w:p>
-        </w:tc>
-        <w:tc>
-          <w:tcPr>
-            <w:tcW w:type="dxa" w:w="1728"/>
-          </w:tcPr>
-          <w:p>
-            <w:r>
-              <w:t>0.580</w:t>
-            </w:r>
-          </w:p>
-        </w:tc>
-        <w:tc>
-          <w:tcPr>
-            <w:tcW w:type="dxa" w:w="1728"/>
-          </w:tcPr>
-          <w:p>
-            <w:r>
-              <w:t>down</w:t>
-            </w:r>
-          </w:p>
-        </w:tc>
-        <w:tc>
-          <w:tcPr>
-            <w:tcW w:type="dxa" w:w="1728"/>
-          </w:tcPr>
-          <w:p>
-            <w:r>
-              <w:t>Yes</w:t>
-            </w:r>
-          </w:p>
-        </w:tc>
-        <w:tc>
-          <w:tcPr>
-            <w:tcW w:type="dxa" w:w="1728"/>
-          </w:tcPr>
-          <w:p>
-            <w:r>
-              <w:t>$3.62</w:t>
-            </w:r>
-          </w:p>
-        </w:tc>
-      </w:tr>
-      <w:tr>
-        <w:tc>
-          <w:tcPr>
-            <w:tcW w:type="dxa" w:w="1728"/>
-          </w:tcPr>
-          <w:p>
-            <w:r>
-              <w:t>down</w:t>
-            </w:r>
-          </w:p>
-        </w:tc>
-        <w:tc>
-          <w:tcPr>
-            <w:tcW w:type="dxa" w:w="1728"/>
-          </w:tcPr>
-          <w:p>
-            <w:r>
-              <w:t>0.570</w:t>
-            </w:r>
-          </w:p>
-        </w:tc>
-        <w:tc>
-          <w:tcPr>
-            <w:tcW w:type="dxa" w:w="1728"/>
-          </w:tcPr>
-          <w:p>
-            <w:r>
-              <w:t>down</w:t>
-            </w:r>
-          </w:p>
-        </w:tc>
-        <w:tc>
-          <w:tcPr>
-            <w:tcW w:type="dxa" w:w="1728"/>
-          </w:tcPr>
-          <w:p>
-            <w:r>
-              <w:t>Yes</w:t>
-            </w:r>
-          </w:p>
-        </w:tc>
-        <w:tc>
-          <w:tcPr>
-            <w:tcW w:type="dxa" w:w="1728"/>
-          </w:tcPr>
-          <w:p>
-            <w:r>
-              <w:t>$3.77</w:t>
-            </w:r>
-          </w:p>
-        </w:tc>
-      </w:tr>
-      <w:tr>
-        <w:tc>
-          <w:tcPr>
-            <w:tcW w:type="dxa" w:w="1728"/>
-          </w:tcPr>
-          <w:p>
-            <w:r>
-              <w:t>down</w:t>
-            </w:r>
-          </w:p>
-        </w:tc>
-        <w:tc>
-          <w:tcPr>
-            <w:tcW w:type="dxa" w:w="1728"/>
-          </w:tcPr>
-          <w:p>
-            <w:r>
-              <w:t>0.530</w:t>
-            </w:r>
-          </w:p>
-        </w:tc>
-        <w:tc>
-          <w:tcPr>
-            <w:tcW w:type="dxa" w:w="1728"/>
-          </w:tcPr>
-          <w:p>
-            <w:r>
-              <w:t>down</w:t>
-            </w:r>
-          </w:p>
-        </w:tc>
-        <w:tc>
-          <w:tcPr>
-            <w:tcW w:type="dxa" w:w="1728"/>
-          </w:tcPr>
-          <w:p>
-            <w:r>
-              <w:t>Yes</w:t>
-            </w:r>
-          </w:p>
-        </w:tc>
-        <w:tc>
-          <w:tcPr>
-            <w:tcW w:type="dxa" w:w="1728"/>
-          </w:tcPr>
-          <w:p>
-            <w:r>
-              <w:t>$4.43</w:t>
-            </w:r>
-          </w:p>
-        </w:tc>
-      </w:tr>
-      <w:tr>
-        <w:tc>
-          <w:tcPr>
-            <w:tcW w:type="dxa" w:w="1728"/>
-          </w:tcPr>
-          <w:p>
-            <w:r>
-              <w:t>down</w:t>
-            </w:r>
-          </w:p>
-        </w:tc>
-        <w:tc>
-          <w:tcPr>
-            <w:tcW w:type="dxa" w:w="1728"/>
-          </w:tcPr>
-          <w:p>
-            <w:r>
-              <w:t>0.590</w:t>
-            </w:r>
-          </w:p>
-        </w:tc>
-        <w:tc>
-          <w:tcPr>
-            <w:tcW w:type="dxa" w:w="1728"/>
-          </w:tcPr>
-          <w:p>
-            <w:r>
-              <w:t>up</w:t>
-            </w:r>
-          </w:p>
-        </w:tc>
-        <w:tc>
-          <w:tcPr>
-            <w:tcW w:type="dxa" w:w="1728"/>
-          </w:tcPr>
-          <w:p>
-            <w:r>
-              <w:t>No</w:t>
-            </w:r>
-          </w:p>
-        </w:tc>
-        <w:tc>
-          <w:tcPr>
-            <w:tcW w:type="dxa" w:w="1728"/>
-          </w:tcPr>
-          <w:p>
-            <w:r>
-              <w:t>$-5.00</w:t>
-            </w:r>
-          </w:p>
-        </w:tc>
-      </w:tr>
-      <w:tr>
-        <w:tc>
-          <w:tcPr>
-            <w:tcW w:type="dxa" w:w="1728"/>
-          </w:tcPr>
-          <w:p>
-            <w:r>
-              <w:t>down</w:t>
-            </w:r>
-          </w:p>
-        </w:tc>
-        <w:tc>
-          <w:tcPr>
-            <w:tcW w:type="dxa" w:w="1728"/>
-          </w:tcPr>
-          <w:p>
-            <w:r>
-              <w:t>0.670</w:t>
-            </w:r>
-          </w:p>
-        </w:tc>
-        <w:tc>
-          <w:tcPr>
-            <w:tcW w:type="dxa" w:w="1728"/>
-          </w:tcPr>
-          <w:p>
-            <w:r>
-              <w:t>down</w:t>
-            </w:r>
-          </w:p>
-        </w:tc>
-        <w:tc>
-          <w:tcPr>
-            <w:tcW w:type="dxa" w:w="1728"/>
-          </w:tcPr>
-          <w:p>
-            <w:r>
-              <w:t>Yes</w:t>
-            </w:r>
-          </w:p>
-        </w:tc>
-        <w:tc>
-          <w:tcPr>
-            <w:tcW w:type="dxa" w:w="1728"/>
-          </w:tcPr>
-          <w:p>
-            <w:r>
-              <w:t>$2.46</w:t>
-            </w:r>
-          </w:p>
-        </w:tc>
-      </w:tr>
-      <w:tr>
-        <w:tc>
-          <w:tcPr>
-            <w:tcW w:type="dxa" w:w="1728"/>
-          </w:tcPr>
-          <w:p>
-            <w:r>
-              <w:t>down</w:t>
-            </w:r>
-          </w:p>
-        </w:tc>
-        <w:tc>
-          <w:tcPr>
-            <w:tcW w:type="dxa" w:w="1728"/>
-          </w:tcPr>
-          <w:p>
-            <w:r>
-              <w:t>0.600</w:t>
-            </w:r>
-          </w:p>
-        </w:tc>
-        <w:tc>
-          <w:tcPr>
-            <w:tcW w:type="dxa" w:w="1728"/>
-          </w:tcPr>
-          <w:p>
-            <w:r>
-              <w:t>down</w:t>
-            </w:r>
-          </w:p>
-        </w:tc>
-        <w:tc>
-          <w:tcPr>
-            <w:tcW w:type="dxa" w:w="1728"/>
-          </w:tcPr>
-          <w:p>
-            <w:r>
-              <w:t>Yes</w:t>
-            </w:r>
-          </w:p>
-        </w:tc>
-        <w:tc>
-          <w:tcPr>
-            <w:tcW w:type="dxa" w:w="1728"/>
-          </w:tcPr>
-          <w:p>
-            <w:r>
-              <w:t>$3.33</w:t>
-            </w:r>
-          </w:p>
-        </w:tc>
-      </w:tr>
-      <w:tr>
-        <w:tc>
-          <w:tcPr>
-            <w:tcW w:type="dxa" w:w="1728"/>
-          </w:tcPr>
-          <w:p>
-            <w:r>
-              <w:t>down</w:t>
-            </w:r>
-          </w:p>
-        </w:tc>
-        <w:tc>
-          <w:tcPr>
-            <w:tcW w:type="dxa" w:w="1728"/>
-          </w:tcPr>
-          <w:p>
-            <w:r>
-              <w:t>0.500</w:t>
-            </w:r>
-          </w:p>
-        </w:tc>
-        <w:tc>
-          <w:tcPr>
-            <w:tcW w:type="dxa" w:w="1728"/>
-          </w:tcPr>
-          <w:p>
-            <w:r>
-              <w:t>down</w:t>
-            </w:r>
-          </w:p>
-        </w:tc>
-        <w:tc>
-          <w:tcPr>
-            <w:tcW w:type="dxa" w:w="1728"/>
-          </w:tcPr>
-          <w:p>
-            <w:r>
-              <w:t>Yes</w:t>
-            </w:r>
-          </w:p>
-        </w:tc>
-        <w:tc>
-          <w:tcPr>
-            <w:tcW w:type="dxa" w:w="1728"/>
-          </w:tcPr>
-          <w:p>
-            <w:r>
-              <w:t>$5.00</w:t>
-            </w:r>
-          </w:p>
-        </w:tc>
-      </w:tr>
-      <w:tr>
-        <w:tc>
-          <w:tcPr>
-            <w:tcW w:type="dxa" w:w="1728"/>
-          </w:tcPr>
-          <w:p>
-            <w:r>
-              <w:t>down</w:t>
-            </w:r>
-          </w:p>
-        </w:tc>
-        <w:tc>
-          <w:tcPr>
-            <w:tcW w:type="dxa" w:w="1728"/>
-          </w:tcPr>
-          <w:p>
-            <w:r>
-              <w:t>0.530</w:t>
-            </w:r>
-          </w:p>
-        </w:tc>
-        <w:tc>
-          <w:tcPr>
-            <w:tcW w:type="dxa" w:w="1728"/>
-          </w:tcPr>
-          <w:p>
-            <w:r>
-              <w:t>down</w:t>
-            </w:r>
-          </w:p>
-        </w:tc>
-        <w:tc>
-          <w:tcPr>
-            <w:tcW w:type="dxa" w:w="1728"/>
-          </w:tcPr>
-          <w:p>
-            <w:r>
-              <w:t>Yes</w:t>
-            </w:r>
-          </w:p>
-        </w:tc>
-        <w:tc>
-          <w:tcPr>
-            <w:tcW w:type="dxa" w:w="1728"/>
-          </w:tcPr>
-          <w:p>
-            <w:r>
-              <w:t>$4.43</w:t>
-            </w:r>
-          </w:p>
-        </w:tc>
-      </w:tr>
-      <w:tr>
-        <w:tc>
-          <w:tcPr>
-            <w:tcW w:type="dxa" w:w="1728"/>
-          </w:tcPr>
-          <w:p>
-            <w:r>
-              <w:t>down</w:t>
-            </w:r>
-          </w:p>
-        </w:tc>
-        <w:tc>
-          <w:tcPr>
-            <w:tcW w:type="dxa" w:w="1728"/>
-          </w:tcPr>
-          <w:p>
-            <w:r>
-              <w:t>0.670</w:t>
-            </w:r>
-          </w:p>
-        </w:tc>
-        <w:tc>
-          <w:tcPr>
-            <w:tcW w:type="dxa" w:w="1728"/>
-          </w:tcPr>
-          <w:p>
-            <w:r>
-              <w:t>up</w:t>
-            </w:r>
-          </w:p>
-        </w:tc>
-        <w:tc>
-          <w:tcPr>
-            <w:tcW w:type="dxa" w:w="1728"/>
-          </w:tcPr>
-          <w:p>
-            <w:r>
-              <w:t>No</w:t>
-            </w:r>
-          </w:p>
-        </w:tc>
-        <w:tc>
-          <w:tcPr>
-            <w:tcW w:type="dxa" w:w="1728"/>
-          </w:tcPr>
-          <w:p>
-            <w:r>
-              <w:t>$-5.00</w:t>
-            </w:r>
-          </w:p>
-        </w:tc>
-      </w:tr>
-    </w:tbl>
     <w:p>
       <w:r>
         <w:br w:type="page"/>
@@ -3176,7 +2002,7 @@
     </w:p>
     <w:p>
       <w:r>
-        <w:t>Section score: 88.3 / 100  (Grade: B+)</w:t>
+        <w:t>Section score: 70.9 / 100  (Grade: C)</w:t>
       </w:r>
     </w:p>
     <w:p>
@@ -3319,7 +2145,7 @@
           </w:tcPr>
           <w:p>
             <w:r>
-              <w:t>81.9</w:t>
+              <w:t>0.0</w:t>
             </w:r>
           </w:p>
         </w:tc>
@@ -3329,7 +2155,7 @@
           </w:tcPr>
           <w:p>
             <w:r>
-              <w:t>12.3</w:t>
+              <w:t>0.0</w:t>
             </w:r>
           </w:p>
         </w:tc>
@@ -3351,7 +2177,7 @@
           </w:tcPr>
           <w:p>
             <w:r>
-              <w:t>100.0</w:t>
+              <w:t>65.7</w:t>
             </w:r>
           </w:p>
         </w:tc>
@@ -3361,7 +2187,7 @@
           </w:tcPr>
           <w:p>
             <w:r>
-              <w:t>15.0</w:t>
+              <w:t>9.9</w:t>
             </w:r>
           </w:p>
         </w:tc>
@@ -3433,17 +2259,17 @@
     </w:tbl>
     <w:p>
       <w:r>
-        <w:t>Ticks: 367 · Reconciled: True · Readiness: not_ready</w:t>
+        <w:t>Ticks: 655 · Reconciled: True · Readiness: not_ready</w:t>
       </w:r>
     </w:p>
     <w:p>
       <w:r>
-        <w:t>Candidates created: 57636 · Terminals: {'accepted': 86, 'rejected': 45508, 'skipped': 11736, 'expired': 0, 'missing_data': 306}</w:t>
+        <w:t>Candidates created: 2572 · Terminals: {'accepted': 0, 'rejected': 584, 'skipped': 1966, 'expired': 0, 'missing_data': 22}</w:t>
       </w:r>
     </w:p>
     <w:p>
       <w:r>
-        <w:t>Rejected by stage: {'directional': 34922, 'execution_gate': 223, 'context_gate': 879, 'directional_allowlist': 1364, 'down_bias_gate': 538, 'mtf_gate': 276, 'grok_decider': 3540, 'execution_realistic': 3, 'verifier': 61, 'mispricing_gate': 50, 'baseline_cohort_gate': 3652}</w:t>
+        <w:t>Rejected by stage: {'directional': 537, 'execution_gate': 2, 'baseline_cohort_gate': 45}</w:t>
       </w:r>
     </w:p>
     <w:p>
@@ -4018,7 +2844,7 @@
     </w:p>
     <w:p>
       <w:r>
-        <w:t>Section score: 47.0 / 100  (Grade: F)</w:t>
+        <w:t>Section score: 49.4 / 100  (Grade: F)</w:t>
       </w:r>
     </w:p>
     <w:p>
@@ -4129,6 +2955,70 @@
           </w:tcPr>
           <w:p>
             <w:r>
+              <w:t>60.0</w:t>
+            </w:r>
+          </w:p>
+        </w:tc>
+        <w:tc>
+          <w:tcPr>
+            <w:tcW w:type="dxa" w:w="2880"/>
+          </w:tcPr>
+          <w:p>
+            <w:r>
+              <w:t>9.0</w:t>
+            </w:r>
+          </w:p>
+        </w:tc>
+      </w:tr>
+      <w:tr>
+        <w:tc>
+          <w:tcPr>
+            <w:tcW w:type="dxa" w:w="2880"/>
+          </w:tcPr>
+          <w:p>
+            <w:r>
+              <w:t>grok accuracy</w:t>
+            </w:r>
+          </w:p>
+        </w:tc>
+        <w:tc>
+          <w:tcPr>
+            <w:tcW w:type="dxa" w:w="2880"/>
+          </w:tcPr>
+          <w:p>
+            <w:r>
+              <w:t>32.5</w:t>
+            </w:r>
+          </w:p>
+        </w:tc>
+        <w:tc>
+          <w:tcPr>
+            <w:tcW w:type="dxa" w:w="2880"/>
+          </w:tcPr>
+          <w:p>
+            <w:r>
+              <w:t>4.9</w:t>
+            </w:r>
+          </w:p>
+        </w:tc>
+      </w:tr>
+      <w:tr>
+        <w:tc>
+          <w:tcPr>
+            <w:tcW w:type="dxa" w:w="2880"/>
+          </w:tcPr>
+          <w:p>
+            <w:r>
+              <w:t>tv alert flow</w:t>
+            </w:r>
+          </w:p>
+        </w:tc>
+        <w:tc>
+          <w:tcPr>
+            <w:tcW w:type="dxa" w:w="2880"/>
+          </w:tcPr>
+          <w:p>
+            <w:r>
               <w:t>100.0</w:t>
             </w:r>
           </w:p>
@@ -4151,70 +3041,6 @@
           </w:tcPr>
           <w:p>
             <w:r>
-              <w:t>grok accuracy</w:t>
-            </w:r>
-          </w:p>
-        </w:tc>
-        <w:tc>
-          <w:tcPr>
-            <w:tcW w:type="dxa" w:w="2880"/>
-          </w:tcPr>
-          <w:p>
-            <w:r>
-              <w:t>0.0</w:t>
-            </w:r>
-          </w:p>
-        </w:tc>
-        <w:tc>
-          <w:tcPr>
-            <w:tcW w:type="dxa" w:w="2880"/>
-          </w:tcPr>
-          <w:p>
-            <w:r>
-              <w:t>0.0</w:t>
-            </w:r>
-          </w:p>
-        </w:tc>
-      </w:tr>
-      <w:tr>
-        <w:tc>
-          <w:tcPr>
-            <w:tcW w:type="dxa" w:w="2880"/>
-          </w:tcPr>
-          <w:p>
-            <w:r>
-              <w:t>tv alert flow</w:t>
-            </w:r>
-          </w:p>
-        </w:tc>
-        <w:tc>
-          <w:tcPr>
-            <w:tcW w:type="dxa" w:w="2880"/>
-          </w:tcPr>
-          <w:p>
-            <w:r>
-              <w:t>100.0</w:t>
-            </w:r>
-          </w:p>
-        </w:tc>
-        <w:tc>
-          <w:tcPr>
-            <w:tcW w:type="dxa" w:w="2880"/>
-          </w:tcPr>
-          <w:p>
-            <w:r>
-              <w:t>15.0</w:t>
-            </w:r>
-          </w:p>
-        </w:tc>
-      </w:tr>
-      <w:tr>
-        <w:tc>
-          <w:tcPr>
-            <w:tcW w:type="dxa" w:w="2880"/>
-          </w:tcPr>
-          <w:p>
-            <w:r>
               <w:t>tv aligned edge</w:t>
             </w:r>
           </w:p>
@@ -4225,7 +3051,7 @@
           </w:tcPr>
           <w:p>
             <w:r>
-              <w:t>43.0</w:t>
+              <w:t>30.0</w:t>
             </w:r>
           </w:p>
         </w:tc>
@@ -4235,7 +3061,7 @@
           </w:tcPr>
           <w:p>
             <w:r>
-              <w:t>12.9</w:t>
+              <w:t>9.0</w:t>
             </w:r>
           </w:p>
         </w:tc>
@@ -4257,7 +3083,7 @@
           </w:tcPr>
           <w:p>
             <w:r>
-              <w:t>0.4</w:t>
+              <w:t>50.0</w:t>
             </w:r>
           </w:p>
         </w:tc>
@@ -4267,7 +3093,7 @@
           </w:tcPr>
           <w:p>
             <w:r>
-              <w:t>0.1</w:t>
+              <w:t>7.5</w:t>
             </w:r>
           </w:p>
         </w:tc>
@@ -4308,7 +3134,7 @@
           </w:tcPr>
           <w:p>
             <w:r>
-              <w:t>0.5652</w:t>
+              <w:t>None</w:t>
             </w:r>
           </w:p>
         </w:tc>
@@ -4330,7 +3156,7 @@
           </w:tcPr>
           <w:p>
             <w:r>
-              <w:t>0.6333</w:t>
+              <w:t>None</w:t>
             </w:r>
           </w:p>
         </w:tc>
@@ -4352,7 +3178,7 @@
           </w:tcPr>
           <w:p>
             <w:r>
-              <w:t>0.4528</w:t>
+              <w:t>None</w:t>
             </w:r>
           </w:p>
         </w:tc>
@@ -4374,7 +3200,7 @@
           </w:tcPr>
           <w:p>
             <w:r>
-              <w:t>0.4167</w:t>
+              <w:t>0.6667</w:t>
             </w:r>
           </w:p>
         </w:tc>
@@ -4396,7 +3222,7 @@
           </w:tcPr>
           <w:p>
             <w:r>
-              <w:t>0.4795</w:t>
+              <w:t>0.6000</w:t>
             </w:r>
           </w:p>
         </w:tc>
@@ -4426,7 +3252,7 @@
     </w:tbl>
     <w:p>
       <w:r>
-        <w:t>TV alerts: received 1633 · valid 1614 · rejected 2</w:t>
+        <w:t>TV alerts: received 211 · valid 208 · rejected 3</w:t>
       </w:r>
     </w:p>
     <w:sectPr>

</xml_diff>

<commit_message>
chore(reports): VPS full report 2026-06-29 03:06 UTC (0 settled, WR 50.0%, PF 999.0, grade C)
</commit_message>
<xml_diff>
--- a/vps_full_reports/latest/report.docx
+++ b/vps_full_reports/latest/report.docx
@@ -20,7 +20,7 @@
           <w:color w:val="666666"/>
           <w:sz w:val="20"/>
         </w:rPr>
-        <w:t>PAPER ONLY  ·  reconciled=True  ·  ticks=655</w:t>
+        <w:t>PAPER ONLY  ·  reconciled=True  ·  ticks=166</w:t>
       </w:r>
     </w:p>
     <w:p>
@@ -33,7 +33,7 @@
     </w:p>
     <w:p>
       <w:r>
-        <w:t>Overall score: 63.3 / 100  (Grade: D)</w:t>
+        <w:t>Overall score: 65.2 / 100  (Grade: D)</w:t>
       </w:r>
     </w:p>
     <w:tbl>
@@ -107,7 +107,7 @@
           </w:tcPr>
           <w:p>
             <w:r>
-              <w:t>66.4</w:t>
+              <w:t>70.0</w:t>
             </w:r>
           </w:p>
         </w:tc>
@@ -117,7 +117,7 @@
           </w:tcPr>
           <w:p>
             <w:r>
-              <w:t>D</w:t>
+              <w:t>C</w:t>
             </w:r>
           </w:p>
         </w:tc>
@@ -149,7 +149,7 @@
           </w:tcPr>
           <w:p>
             <w:r>
-              <w:t>70.9</w:t>
+              <w:t>71.5</w:t>
             </w:r>
           </w:p>
         </w:tc>
@@ -319,7 +319,7 @@
           </w:tcPr>
           <w:p>
             <w:r>
-              <w:t>2026-06-28 19:00:08</w:t>
+              <w:t>2026-06-28 19:04:25</w:t>
             </w:r>
           </w:p>
         </w:tc>
@@ -347,7 +347,7 @@
           </w:tcPr>
           <w:p>
             <w:r>
-              <w:t>82.0</w:t>
+              <w:t>67.1</w:t>
             </w:r>
           </w:p>
         </w:tc>
@@ -367,7 +367,7 @@
           </w:tcPr>
           <w:p>
             <w:r>
-              <w:t>56.0</w:t>
+              <w:t>52.3</w:t>
             </w:r>
           </w:p>
         </w:tc>
@@ -377,7 +377,7 @@
           </w:tcPr>
           <w:p>
             <w:r>
-              <w:t>1</w:t>
+              <w:t>18</w:t>
             </w:r>
           </w:p>
         </w:tc>
@@ -389,7 +389,7 @@
           </w:tcPr>
           <w:p>
             <w:r>
-              <w:t>2026-06-28 19:04:25</w:t>
+              <w:t>2026-06-28 19:15:10</w:t>
             </w:r>
           </w:p>
         </w:tc>
@@ -407,7 +407,7 @@
           </w:tcPr>
           <w:p>
             <w:r>
-              <w:t>52.5</w:t>
+              <w:t>55.0</w:t>
             </w:r>
           </w:p>
         </w:tc>
@@ -417,7 +417,7 @@
           </w:tcPr>
           <w:p>
             <w:r>
-              <w:t>67.1</w:t>
+              <w:t>67.2</w:t>
             </w:r>
           </w:p>
         </w:tc>
@@ -437,7 +437,7 @@
           </w:tcPr>
           <w:p>
             <w:r>
-              <w:t>52.3</w:t>
+              <w:t>53.5</w:t>
             </w:r>
           </w:p>
         </w:tc>
@@ -447,7 +447,7 @@
           </w:tcPr>
           <w:p>
             <w:r>
-              <w:t>18</w:t>
+              <w:t>61</w:t>
             </w:r>
           </w:p>
         </w:tc>
@@ -459,7 +459,7 @@
           </w:tcPr>
           <w:p>
             <w:r>
-              <w:t>2026-06-28 19:15:10</w:t>
+              <w:t>2026-06-28 19:30:10</w:t>
             </w:r>
           </w:p>
         </w:tc>
@@ -487,7 +487,7 @@
           </w:tcPr>
           <w:p>
             <w:r>
-              <w:t>67.2</w:t>
+              <w:t>67.4</w:t>
             </w:r>
           </w:p>
         </w:tc>
@@ -497,7 +497,7 @@
           </w:tcPr>
           <w:p>
             <w:r>
-              <w:t>37.0</w:t>
+              <w:t>41.9</w:t>
             </w:r>
           </w:p>
         </w:tc>
@@ -507,7 +507,7 @@
           </w:tcPr>
           <w:p>
             <w:r>
-              <w:t>53.5</w:t>
+              <w:t>54.8</w:t>
             </w:r>
           </w:p>
         </w:tc>
@@ -517,7 +517,7 @@
           </w:tcPr>
           <w:p>
             <w:r>
-              <w:t>61</w:t>
+              <w:t>121</w:t>
             </w:r>
           </w:p>
         </w:tc>
@@ -529,7 +529,7 @@
           </w:tcPr>
           <w:p>
             <w:r>
-              <w:t>2026-06-28 19:30:10</w:t>
+              <w:t>2026-06-28 20:00:10</w:t>
             </w:r>
           </w:p>
         </w:tc>
@@ -547,6 +547,36 @@
           </w:tcPr>
           <w:p>
             <w:r>
+              <w:t>55.1</w:t>
+            </w:r>
+          </w:p>
+        </w:tc>
+        <w:tc>
+          <w:tcPr>
+            <w:tcW w:type="dxa" w:w="1234"/>
+          </w:tcPr>
+          <w:p>
+            <w:r>
+              <w:t>67.7</w:t>
+            </w:r>
+          </w:p>
+        </w:tc>
+        <w:tc>
+          <w:tcPr>
+            <w:tcW w:type="dxa" w:w="1234"/>
+          </w:tcPr>
+          <w:p>
+            <w:r>
+              <w:t>41.9</w:t>
+            </w:r>
+          </w:p>
+        </w:tc>
+        <w:tc>
+          <w:tcPr>
+            <w:tcW w:type="dxa" w:w="1234"/>
+          </w:tcPr>
+          <w:p>
+            <w:r>
               <w:t>55.0</w:t>
             </w:r>
           </w:p>
@@ -557,37 +587,7 @@
           </w:tcPr>
           <w:p>
             <w:r>
-              <w:t>67.4</w:t>
-            </w:r>
-          </w:p>
-        </w:tc>
-        <w:tc>
-          <w:tcPr>
-            <w:tcW w:type="dxa" w:w="1234"/>
-          </w:tcPr>
-          <w:p>
-            <w:r>
-              <w:t>41.9</w:t>
-            </w:r>
-          </w:p>
-        </w:tc>
-        <w:tc>
-          <w:tcPr>
-            <w:tcW w:type="dxa" w:w="1234"/>
-          </w:tcPr>
-          <w:p>
-            <w:r>
-              <w:t>54.8</w:t>
-            </w:r>
-          </w:p>
-        </w:tc>
-        <w:tc>
-          <w:tcPr>
-            <w:tcW w:type="dxa" w:w="1234"/>
-          </w:tcPr>
-          <w:p>
-            <w:r>
-              <w:t>121</w:t>
+              <w:t>241</w:t>
             </w:r>
           </w:p>
         </w:tc>
@@ -599,7 +599,7 @@
           </w:tcPr>
           <w:p>
             <w:r>
-              <w:t>2026-06-28 20:00:10</w:t>
+              <w:t>2026-06-28 20:30:25</w:t>
             </w:r>
           </w:p>
         </w:tc>
@@ -617,6 +617,36 @@
           </w:tcPr>
           <w:p>
             <w:r>
+              <w:t>55.3</w:t>
+            </w:r>
+          </w:p>
+        </w:tc>
+        <w:tc>
+          <w:tcPr>
+            <w:tcW w:type="dxa" w:w="1234"/>
+          </w:tcPr>
+          <w:p>
+            <w:r>
+              <w:t>68.1</w:t>
+            </w:r>
+          </w:p>
+        </w:tc>
+        <w:tc>
+          <w:tcPr>
+            <w:tcW w:type="dxa" w:w="1234"/>
+          </w:tcPr>
+          <w:p>
+            <w:r>
+              <w:t>41.9</w:t>
+            </w:r>
+          </w:p>
+        </w:tc>
+        <w:tc>
+          <w:tcPr>
+            <w:tcW w:type="dxa" w:w="1234"/>
+          </w:tcPr>
+          <w:p>
+            <w:r>
               <w:t>55.1</w:t>
             </w:r>
           </w:p>
@@ -627,37 +657,7 @@
           </w:tcPr>
           <w:p>
             <w:r>
-              <w:t>67.7</w:t>
-            </w:r>
-          </w:p>
-        </w:tc>
-        <w:tc>
-          <w:tcPr>
-            <w:tcW w:type="dxa" w:w="1234"/>
-          </w:tcPr>
-          <w:p>
-            <w:r>
-              <w:t>41.9</w:t>
-            </w:r>
-          </w:p>
-        </w:tc>
-        <w:tc>
-          <w:tcPr>
-            <w:tcW w:type="dxa" w:w="1234"/>
-          </w:tcPr>
-          <w:p>
-            <w:r>
-              <w:t>55.0</w:t>
-            </w:r>
-          </w:p>
-        </w:tc>
-        <w:tc>
-          <w:tcPr>
-            <w:tcW w:type="dxa" w:w="1234"/>
-          </w:tcPr>
-          <w:p>
-            <w:r>
-              <w:t>241</w:t>
+              <w:t>362</w:t>
             </w:r>
           </w:p>
         </w:tc>
@@ -669,7 +669,7 @@
           </w:tcPr>
           <w:p>
             <w:r>
-              <w:t>2026-06-28 20:30:25</w:t>
+              <w:t>2026-06-28 20:45:07</w:t>
             </w:r>
           </w:p>
         </w:tc>
@@ -687,7 +687,7 @@
           </w:tcPr>
           <w:p>
             <w:r>
-              <w:t>55.3</w:t>
+              <w:t>55.7</w:t>
             </w:r>
           </w:p>
         </w:tc>
@@ -697,7 +697,7 @@
           </w:tcPr>
           <w:p>
             <w:r>
-              <w:t>68.1</w:t>
+              <w:t>68.3</w:t>
             </w:r>
           </w:p>
         </w:tc>
@@ -707,7 +707,7 @@
           </w:tcPr>
           <w:p>
             <w:r>
-              <w:t>41.9</w:t>
+              <w:t>31.2</w:t>
             </w:r>
           </w:p>
         </w:tc>
@@ -717,7 +717,7 @@
           </w:tcPr>
           <w:p>
             <w:r>
-              <w:t>55.1</w:t>
+              <w:t>52.7</w:t>
             </w:r>
           </w:p>
         </w:tc>
@@ -727,7 +727,7 @@
           </w:tcPr>
           <w:p>
             <w:r>
-              <w:t>362</w:t>
+              <w:t>45</w:t>
             </w:r>
           </w:p>
         </w:tc>
@@ -739,7 +739,7 @@
           </w:tcPr>
           <w:p>
             <w:r>
-              <w:t>2026-06-28 20:45:07</w:t>
+              <w:t>2026-06-28 21:15:07</w:t>
             </w:r>
           </w:p>
         </w:tc>
@@ -767,7 +767,7 @@
           </w:tcPr>
           <w:p>
             <w:r>
-              <w:t>68.3</w:t>
+              <w:t>68.6</w:t>
             </w:r>
           </w:p>
         </w:tc>
@@ -777,7 +777,7 @@
           </w:tcPr>
           <w:p>
             <w:r>
-              <w:t>31.2</w:t>
+              <w:t>32.1</w:t>
             </w:r>
           </w:p>
         </w:tc>
@@ -787,7 +787,7 @@
           </w:tcPr>
           <w:p>
             <w:r>
-              <w:t>52.7</w:t>
+              <w:t>53.0</w:t>
             </w:r>
           </w:p>
         </w:tc>
@@ -797,7 +797,7 @@
           </w:tcPr>
           <w:p>
             <w:r>
-              <w:t>45</w:t>
+              <w:t>165</w:t>
             </w:r>
           </w:p>
         </w:tc>
@@ -809,7 +809,7 @@
           </w:tcPr>
           <w:p>
             <w:r>
-              <w:t>2026-06-28 21:15:07</w:t>
+              <w:t>2026-06-28 21:30:04</w:t>
             </w:r>
           </w:p>
         </w:tc>
@@ -827,7 +827,7 @@
           </w:tcPr>
           <w:p>
             <w:r>
-              <w:t>55.7</w:t>
+              <w:t>55.8</w:t>
             </w:r>
           </w:p>
         </w:tc>
@@ -837,7 +837,7 @@
           </w:tcPr>
           <w:p>
             <w:r>
-              <w:t>68.6</w:t>
+              <w:t>68.8</w:t>
             </w:r>
           </w:p>
         </w:tc>
@@ -847,7 +847,7 @@
           </w:tcPr>
           <w:p>
             <w:r>
-              <w:t>32.1</w:t>
+              <w:t>36.2</w:t>
             </w:r>
           </w:p>
         </w:tc>
@@ -857,7 +857,7 @@
           </w:tcPr>
           <w:p>
             <w:r>
-              <w:t>53.0</w:t>
+              <w:t>54.1</w:t>
             </w:r>
           </w:p>
         </w:tc>
@@ -867,7 +867,7 @@
           </w:tcPr>
           <w:p>
             <w:r>
-              <w:t>165</w:t>
+              <w:t>14</w:t>
             </w:r>
           </w:p>
         </w:tc>
@@ -879,7 +879,7 @@
           </w:tcPr>
           <w:p>
             <w:r>
-              <w:t>2026-06-28 21:30:04</w:t>
+              <w:t>2026-06-28 22:00:10</w:t>
             </w:r>
           </w:p>
         </w:tc>
@@ -897,7 +897,7 @@
           </w:tcPr>
           <w:p>
             <w:r>
-              <w:t>55.8</w:t>
+              <w:t>57.1</w:t>
             </w:r>
           </w:p>
         </w:tc>
@@ -907,7 +907,7 @@
           </w:tcPr>
           <w:p>
             <w:r>
-              <w:t>68.8</w:t>
+              <w:t>69.2</w:t>
             </w:r>
           </w:p>
         </w:tc>
@@ -917,7 +917,7 @@
           </w:tcPr>
           <w:p>
             <w:r>
-              <w:t>36.2</w:t>
+              <w:t>37.1</w:t>
             </w:r>
           </w:p>
         </w:tc>
@@ -927,7 +927,7 @@
           </w:tcPr>
           <w:p>
             <w:r>
-              <w:t>54.1</w:t>
+              <w:t>55.1</w:t>
             </w:r>
           </w:p>
         </w:tc>
@@ -937,7 +937,7 @@
           </w:tcPr>
           <w:p>
             <w:r>
-              <w:t>14</w:t>
+              <w:t>91</w:t>
             </w:r>
           </w:p>
         </w:tc>
@@ -949,7 +949,7 @@
           </w:tcPr>
           <w:p>
             <w:r>
-              <w:t>2026-06-28 22:00:10</w:t>
+              <w:t>2026-06-28 22:15:10</w:t>
             </w:r>
           </w:p>
         </w:tc>
@@ -967,7 +967,7 @@
           </w:tcPr>
           <w:p>
             <w:r>
-              <w:t>57.1</w:t>
+              <w:t>58.9</w:t>
             </w:r>
           </w:p>
         </w:tc>
@@ -977,7 +977,7 @@
           </w:tcPr>
           <w:p>
             <w:r>
-              <w:t>69.2</w:t>
+              <w:t>69.3</w:t>
             </w:r>
           </w:p>
         </w:tc>
@@ -987,7 +987,7 @@
           </w:tcPr>
           <w:p>
             <w:r>
-              <w:t>37.1</w:t>
+              <w:t>37.3</w:t>
             </w:r>
           </w:p>
         </w:tc>
@@ -997,7 +997,7 @@
           </w:tcPr>
           <w:p>
             <w:r>
-              <w:t>55.1</w:t>
+              <w:t>56.1</w:t>
             </w:r>
           </w:p>
         </w:tc>
@@ -1007,7 +1007,7 @@
           </w:tcPr>
           <w:p>
             <w:r>
-              <w:t>91</w:t>
+              <w:t>151</w:t>
             </w:r>
           </w:p>
         </w:tc>
@@ -1019,7 +1019,7 @@
           </w:tcPr>
           <w:p>
             <w:r>
-              <w:t>2026-06-28 22:15:10</w:t>
+              <w:t>2026-06-28 22:16:10</w:t>
             </w:r>
           </w:p>
         </w:tc>
@@ -1047,7 +1047,7 @@
           </w:tcPr>
           <w:p>
             <w:r>
-              <w:t>69.3</w:t>
+              <w:t>69.4</w:t>
             </w:r>
           </w:p>
         </w:tc>
@@ -1057,7 +1057,7 @@
           </w:tcPr>
           <w:p>
             <w:r>
-              <w:t>37.3</w:t>
+              <w:t>49.4</w:t>
             </w:r>
           </w:p>
         </w:tc>
@@ -1067,7 +1067,7 @@
           </w:tcPr>
           <w:p>
             <w:r>
-              <w:t>56.1</w:t>
+              <w:t>59.1</w:t>
             </w:r>
           </w:p>
         </w:tc>
@@ -1077,7 +1077,7 @@
           </w:tcPr>
           <w:p>
             <w:r>
-              <w:t>151</w:t>
+              <w:t>155</w:t>
             </w:r>
           </w:p>
         </w:tc>
@@ -1089,7 +1089,7 @@
           </w:tcPr>
           <w:p>
             <w:r>
-              <w:t>2026-06-28 22:16:10</w:t>
+              <w:t>2026-06-28 22:46:25</w:t>
             </w:r>
           </w:p>
         </w:tc>
@@ -1107,7 +1107,7 @@
           </w:tcPr>
           <w:p>
             <w:r>
-              <w:t>58.9</w:t>
+              <w:t>60.3</w:t>
             </w:r>
           </w:p>
         </w:tc>
@@ -1117,7 +1117,7 @@
           </w:tcPr>
           <w:p>
             <w:r>
-              <w:t>69.4</w:t>
+              <w:t>69.7</w:t>
             </w:r>
           </w:p>
         </w:tc>
@@ -1137,7 +1137,7 @@
           </w:tcPr>
           <w:p>
             <w:r>
-              <w:t>59.1</w:t>
+              <w:t>59.9</w:t>
             </w:r>
           </w:p>
         </w:tc>
@@ -1147,7 +1147,7 @@
           </w:tcPr>
           <w:p>
             <w:r>
-              <w:t>155</w:t>
+              <w:t>276</w:t>
             </w:r>
           </w:p>
         </w:tc>
@@ -1159,7 +1159,7 @@
           </w:tcPr>
           <w:p>
             <w:r>
-              <w:t>2026-06-28 22:46:25</w:t>
+              <w:t>2026-06-28 23:15:10</w:t>
             </w:r>
           </w:p>
         </w:tc>
@@ -1177,7 +1177,7 @@
           </w:tcPr>
           <w:p>
             <w:r>
-              <w:t>60.3</w:t>
+              <w:t>63.1</w:t>
             </w:r>
           </w:p>
         </w:tc>
@@ -1187,7 +1187,7 @@
           </w:tcPr>
           <w:p>
             <w:r>
-              <w:t>69.7</w:t>
+              <w:t>70.1</w:t>
             </w:r>
           </w:p>
         </w:tc>
@@ -1207,7 +1207,7 @@
           </w:tcPr>
           <w:p>
             <w:r>
-              <w:t>59.9</w:t>
+              <w:t>61.4</w:t>
             </w:r>
           </w:p>
         </w:tc>
@@ -1217,7 +1217,7 @@
           </w:tcPr>
           <w:p>
             <w:r>
-              <w:t>276</w:t>
+              <w:t>391</w:t>
             </w:r>
           </w:p>
         </w:tc>
@@ -1229,7 +1229,7 @@
           </w:tcPr>
           <w:p>
             <w:r>
-              <w:t>2026-06-28 23:15:10</w:t>
+              <w:t>2026-06-28 23:45:11</w:t>
             </w:r>
           </w:p>
         </w:tc>
@@ -1247,7 +1247,7 @@
           </w:tcPr>
           <w:p>
             <w:r>
-              <w:t>63.1</w:t>
+              <w:t>64.3</w:t>
             </w:r>
           </w:p>
         </w:tc>
@@ -1257,7 +1257,7 @@
           </w:tcPr>
           <w:p>
             <w:r>
-              <w:t>70.1</w:t>
+              <w:t>70.4</w:t>
             </w:r>
           </w:p>
         </w:tc>
@@ -1277,7 +1277,7 @@
           </w:tcPr>
           <w:p>
             <w:r>
-              <w:t>61.4</w:t>
+              <w:t>62.1</w:t>
             </w:r>
           </w:p>
         </w:tc>
@@ -1287,7 +1287,7 @@
           </w:tcPr>
           <w:p>
             <w:r>
-              <w:t>391</w:t>
+              <w:t>511</w:t>
             </w:r>
           </w:p>
         </w:tc>
@@ -1299,7 +1299,7 @@
           </w:tcPr>
           <w:p>
             <w:r>
-              <w:t>2026-06-28 23:45:11</w:t>
+              <w:t>2026-06-29 00:15:10</w:t>
             </w:r>
           </w:p>
         </w:tc>
@@ -1317,7 +1317,7 @@
           </w:tcPr>
           <w:p>
             <w:r>
-              <w:t>64.3</w:t>
+              <w:t>66.4</w:t>
             </w:r>
           </w:p>
         </w:tc>
@@ -1327,7 +1327,7 @@
           </w:tcPr>
           <w:p>
             <w:r>
-              <w:t>70.4</w:t>
+              <w:t>70.8</w:t>
             </w:r>
           </w:p>
         </w:tc>
@@ -1347,7 +1347,7 @@
           </w:tcPr>
           <w:p>
             <w:r>
-              <w:t>62.1</w:t>
+              <w:t>63.3</w:t>
             </w:r>
           </w:p>
         </w:tc>
@@ -1357,7 +1357,7 @@
           </w:tcPr>
           <w:p>
             <w:r>
-              <w:t>511</w:t>
+              <w:t>631</w:t>
             </w:r>
           </w:p>
         </w:tc>
@@ -1369,7 +1369,7 @@
           </w:tcPr>
           <w:p>
             <w:r>
-              <w:t>2026-06-29 00:15:10</w:t>
+              <w:t>2026-06-29 00:45:21</w:t>
             </w:r>
           </w:p>
         </w:tc>
@@ -1387,7 +1387,7 @@
           </w:tcPr>
           <w:p>
             <w:r>
-              <w:t>66.4</w:t>
+              <w:t>66.8</w:t>
             </w:r>
           </w:p>
         </w:tc>
@@ -1397,7 +1397,7 @@
           </w:tcPr>
           <w:p>
             <w:r>
-              <w:t>70.8</w:t>
+              <w:t>71.1</w:t>
             </w:r>
           </w:p>
         </w:tc>
@@ -1417,7 +1417,7 @@
           </w:tcPr>
           <w:p>
             <w:r>
-              <w:t>63.3</w:t>
+              <w:t>63.5</w:t>
             </w:r>
           </w:p>
         </w:tc>
@@ -1427,7 +1427,287 @@
           </w:tcPr>
           <w:p>
             <w:r>
-              <w:t>631</w:t>
+              <w:t>95</w:t>
+            </w:r>
+          </w:p>
+        </w:tc>
+      </w:tr>
+      <w:tr>
+        <w:tc>
+          <w:tcPr>
+            <w:tcW w:type="dxa" w:w="1234"/>
+          </w:tcPr>
+          <w:p>
+            <w:r>
+              <w:t>2026-06-29 01:15:36</w:t>
+            </w:r>
+          </w:p>
+        </w:tc>
+        <w:tc>
+          <w:tcPr>
+            <w:tcW w:type="dxa" w:w="1234"/>
+          </w:tcPr>
+          <w:p>
+            <w:r/>
+          </w:p>
+        </w:tc>
+        <w:tc>
+          <w:tcPr>
+            <w:tcW w:type="dxa" w:w="1234"/>
+          </w:tcPr>
+          <w:p>
+            <w:r>
+              <w:t>68.4</w:t>
+            </w:r>
+          </w:p>
+        </w:tc>
+        <w:tc>
+          <w:tcPr>
+            <w:tcW w:type="dxa" w:w="1234"/>
+          </w:tcPr>
+          <w:p>
+            <w:r>
+              <w:t>71.5</w:t>
+            </w:r>
+          </w:p>
+        </w:tc>
+        <w:tc>
+          <w:tcPr>
+            <w:tcW w:type="dxa" w:w="1234"/>
+          </w:tcPr>
+          <w:p>
+            <w:r>
+              <w:t>49.4</w:t>
+            </w:r>
+          </w:p>
+        </w:tc>
+        <w:tc>
+          <w:tcPr>
+            <w:tcW w:type="dxa" w:w="1234"/>
+          </w:tcPr>
+          <w:p>
+            <w:r>
+              <w:t>64.4</w:t>
+            </w:r>
+          </w:p>
+        </w:tc>
+        <w:tc>
+          <w:tcPr>
+            <w:tcW w:type="dxa" w:w="1234"/>
+          </w:tcPr>
+          <w:p>
+            <w:r>
+              <w:t>216</w:t>
+            </w:r>
+          </w:p>
+        </w:tc>
+      </w:tr>
+      <w:tr>
+        <w:tc>
+          <w:tcPr>
+            <w:tcW w:type="dxa" w:w="1234"/>
+          </w:tcPr>
+          <w:p>
+            <w:r>
+              <w:t>2026-06-29 01:45:51</w:t>
+            </w:r>
+          </w:p>
+        </w:tc>
+        <w:tc>
+          <w:tcPr>
+            <w:tcW w:type="dxa" w:w="1234"/>
+          </w:tcPr>
+          <w:p>
+            <w:r/>
+          </w:p>
+        </w:tc>
+        <w:tc>
+          <w:tcPr>
+            <w:tcW w:type="dxa" w:w="1234"/>
+          </w:tcPr>
+          <w:p>
+            <w:r>
+              <w:t>68.7</w:t>
+            </w:r>
+          </w:p>
+        </w:tc>
+        <w:tc>
+          <w:tcPr>
+            <w:tcW w:type="dxa" w:w="1234"/>
+          </w:tcPr>
+          <w:p>
+            <w:r>
+              <w:t>71.5</w:t>
+            </w:r>
+          </w:p>
+        </w:tc>
+        <w:tc>
+          <w:tcPr>
+            <w:tcW w:type="dxa" w:w="1234"/>
+          </w:tcPr>
+          <w:p>
+            <w:r>
+              <w:t>49.4</w:t>
+            </w:r>
+          </w:p>
+        </w:tc>
+        <w:tc>
+          <w:tcPr>
+            <w:tcW w:type="dxa" w:w="1234"/>
+          </w:tcPr>
+          <w:p>
+            <w:r>
+              <w:t>64.6</w:t>
+            </w:r>
+          </w:p>
+        </w:tc>
+        <w:tc>
+          <w:tcPr>
+            <w:tcW w:type="dxa" w:w="1234"/>
+          </w:tcPr>
+          <w:p>
+            <w:r>
+              <w:t>337</w:t>
+            </w:r>
+          </w:p>
+        </w:tc>
+      </w:tr>
+      <w:tr>
+        <w:tc>
+          <w:tcPr>
+            <w:tcW w:type="dxa" w:w="1234"/>
+          </w:tcPr>
+          <w:p>
+            <w:r>
+              <w:t>2026-06-29 02:15:51</w:t>
+            </w:r>
+          </w:p>
+        </w:tc>
+        <w:tc>
+          <w:tcPr>
+            <w:tcW w:type="dxa" w:w="1234"/>
+          </w:tcPr>
+          <w:p>
+            <w:r/>
+          </w:p>
+        </w:tc>
+        <w:tc>
+          <w:tcPr>
+            <w:tcW w:type="dxa" w:w="1234"/>
+          </w:tcPr>
+          <w:p>
+            <w:r>
+              <w:t>68.9</w:t>
+            </w:r>
+          </w:p>
+        </w:tc>
+        <w:tc>
+          <w:tcPr>
+            <w:tcW w:type="dxa" w:w="1234"/>
+          </w:tcPr>
+          <w:p>
+            <w:r>
+              <w:t>71.5</w:t>
+            </w:r>
+          </w:p>
+        </w:tc>
+        <w:tc>
+          <w:tcPr>
+            <w:tcW w:type="dxa" w:w="1234"/>
+          </w:tcPr>
+          <w:p>
+            <w:r>
+              <w:t>49.4</w:t>
+            </w:r>
+          </w:p>
+        </w:tc>
+        <w:tc>
+          <w:tcPr>
+            <w:tcW w:type="dxa" w:w="1234"/>
+          </w:tcPr>
+          <w:p>
+            <w:r>
+              <w:t>64.7</w:t>
+            </w:r>
+          </w:p>
+        </w:tc>
+        <w:tc>
+          <w:tcPr>
+            <w:tcW w:type="dxa" w:w="1234"/>
+          </w:tcPr>
+          <w:p>
+            <w:r>
+              <w:t>457</w:t>
+            </w:r>
+          </w:p>
+        </w:tc>
+      </w:tr>
+      <w:tr>
+        <w:tc>
+          <w:tcPr>
+            <w:tcW w:type="dxa" w:w="1234"/>
+          </w:tcPr>
+          <w:p>
+            <w:r>
+              <w:t>2026-06-29 02:46:00</w:t>
+            </w:r>
+          </w:p>
+        </w:tc>
+        <w:tc>
+          <w:tcPr>
+            <w:tcW w:type="dxa" w:w="1234"/>
+          </w:tcPr>
+          <w:p>
+            <w:r/>
+          </w:p>
+        </w:tc>
+        <w:tc>
+          <w:tcPr>
+            <w:tcW w:type="dxa" w:w="1234"/>
+          </w:tcPr>
+          <w:p>
+            <w:r>
+              <w:t>69.6</w:t>
+            </w:r>
+          </w:p>
+        </w:tc>
+        <w:tc>
+          <w:tcPr>
+            <w:tcW w:type="dxa" w:w="1234"/>
+          </w:tcPr>
+          <w:p>
+            <w:r>
+              <w:t>71.5</w:t>
+            </w:r>
+          </w:p>
+        </w:tc>
+        <w:tc>
+          <w:tcPr>
+            <w:tcW w:type="dxa" w:w="1234"/>
+          </w:tcPr>
+          <w:p>
+            <w:r>
+              <w:t>49.4</w:t>
+            </w:r>
+          </w:p>
+        </w:tc>
+        <w:tc>
+          <w:tcPr>
+            <w:tcW w:type="dxa" w:w="1234"/>
+          </w:tcPr>
+          <w:p>
+            <w:r>
+              <w:t>65.0</w:t>
+            </w:r>
+          </w:p>
+        </w:tc>
+        <w:tc>
+          <w:tcPr>
+            <w:tcW w:type="dxa" w:w="1234"/>
+          </w:tcPr>
+          <w:p>
+            <w:r>
+              <w:t>83</w:t>
             </w:r>
           </w:p>
         </w:tc>
@@ -1448,7 +1728,7 @@
     </w:p>
     <w:p>
       <w:r>
-        <w:t>Section score: 66.4 / 100  (Grade: D)</w:t>
+        <w:t>Section score: 70.0 / 100  (Grade: C)</w:t>
       </w:r>
     </w:p>
     <w:p>
@@ -1623,7 +1903,7 @@
           </w:tcPr>
           <w:p>
             <w:r>
-              <w:t>81.9</w:t>
+              <w:t>100.0</w:t>
             </w:r>
           </w:p>
         </w:tc>
@@ -1633,7 +1913,7 @@
           </w:tcPr>
           <w:p>
             <w:r>
-              <w:t>16.4</w:t>
+              <w:t>20.0</w:t>
             </w:r>
           </w:p>
         </w:tc>
@@ -1770,7 +2050,7 @@
           </w:tcPr>
           <w:p>
             <w:r>
-              <w:t>$531.88</w:t>
+              <w:t>$551.88</w:t>
             </w:r>
           </w:p>
         </w:tc>
@@ -1792,7 +2072,7 @@
           </w:tcPr>
           <w:p>
             <w:r>
-              <w:t>6.38%</w:t>
+              <w:t>10.38%</w:t>
             </w:r>
           </w:p>
         </w:tc>
@@ -1814,7 +2094,7 @@
           </w:tcPr>
           <w:p>
             <w:r>
-              <w:t>$31.88</w:t>
+              <w:t>$51.88</w:t>
             </w:r>
           </w:p>
         </w:tc>
@@ -2002,7 +2282,7 @@
     </w:p>
     <w:p>
       <w:r>
-        <w:t>Section score: 70.9 / 100  (Grade: C)</w:t>
+        <w:t>Section score: 71.5 / 100  (Grade: C)</w:t>
       </w:r>
     </w:p>
     <w:p>
@@ -2177,7 +2457,7 @@
           </w:tcPr>
           <w:p>
             <w:r>
-              <w:t>65.7</w:t>
+              <w:t>70.0</w:t>
             </w:r>
           </w:p>
         </w:tc>
@@ -2187,7 +2467,7 @@
           </w:tcPr>
           <w:p>
             <w:r>
-              <w:t>9.9</w:t>
+              <w:t>10.5</w:t>
             </w:r>
           </w:p>
         </w:tc>
@@ -2259,12 +2539,12 @@
     </w:tbl>
     <w:p>
       <w:r>
-        <w:t>Ticks: 655 · Reconciled: True · Readiness: not_ready</w:t>
+        <w:t>Ticks: 166 · Reconciled: True · Readiness: not_ready</w:t>
       </w:r>
     </w:p>
     <w:p>
       <w:r>
-        <w:t>Candidates created: 2572 · Terminals: {'accepted': 0, 'rejected': 584, 'skipped': 1966, 'expired': 0, 'missing_data': 22}</w:t>
+        <w:t>Candidates created: 3898 · Terminals: {'accepted': 0, 'rejected': 584, 'skipped': 3288, 'expired': 0, 'missing_data': 26}</w:t>
       </w:r>
     </w:p>
     <w:p>
@@ -3252,7 +3532,7 @@
     </w:tbl>
     <w:p>
       <w:r>
-        <w:t>TV alerts: received 211 · valid 208 · rejected 3</w:t>
+        <w:t>TV alerts: received 426 · valid 419 · rejected 7</w:t>
       </w:r>
     </w:p>
     <w:sectPr>

</xml_diff>

<commit_message>
chore(reports): VPS full report 2026-06-29 05:16 UTC (dep-arb 41 exec, +$64, grade C, FULL_REPORT)
</commit_message>
<xml_diff>
--- a/vps_full_reports/latest/report.docx
+++ b/vps_full_reports/latest/report.docx
@@ -20,7 +20,7 @@
           <w:color w:val="666666"/>
           <w:sz w:val="20"/>
         </w:rPr>
-        <w:t>PAPER ONLY  ·  reconciled=True  ·  ticks=166</w:t>
+        <w:t>PAPER ONLY  ·  reconciled=True  ·  ticks=118</w:t>
       </w:r>
     </w:p>
     <w:p>
@@ -319,7 +319,7 @@
           </w:tcPr>
           <w:p>
             <w:r>
-              <w:t>2026-06-28 19:04:25</w:t>
+              <w:t>2026-06-28 20:30:25</w:t>
             </w:r>
           </w:p>
         </w:tc>
@@ -337,7 +337,7 @@
           </w:tcPr>
           <w:p>
             <w:r>
-              <w:t>52.5</w:t>
+              <w:t>55.3</w:t>
             </w:r>
           </w:p>
         </w:tc>
@@ -347,7 +347,7 @@
           </w:tcPr>
           <w:p>
             <w:r>
-              <w:t>67.1</w:t>
+              <w:t>68.1</w:t>
             </w:r>
           </w:p>
         </w:tc>
@@ -357,7 +357,7 @@
           </w:tcPr>
           <w:p>
             <w:r>
-              <w:t>37.0</w:t>
+              <w:t>41.9</w:t>
             </w:r>
           </w:p>
         </w:tc>
@@ -367,7 +367,7 @@
           </w:tcPr>
           <w:p>
             <w:r>
-              <w:t>52.3</w:t>
+              <w:t>55.1</w:t>
             </w:r>
           </w:p>
         </w:tc>
@@ -377,7 +377,7 @@
           </w:tcPr>
           <w:p>
             <w:r>
-              <w:t>18</w:t>
+              <w:t>362</w:t>
             </w:r>
           </w:p>
         </w:tc>
@@ -389,7 +389,7 @@
           </w:tcPr>
           <w:p>
             <w:r>
-              <w:t>2026-06-28 19:15:10</w:t>
+              <w:t>2026-06-28 20:45:07</w:t>
             </w:r>
           </w:p>
         </w:tc>
@@ -407,7 +407,7 @@
           </w:tcPr>
           <w:p>
             <w:r>
-              <w:t>55.0</w:t>
+              <w:t>55.7</w:t>
             </w:r>
           </w:p>
         </w:tc>
@@ -417,7 +417,7 @@
           </w:tcPr>
           <w:p>
             <w:r>
-              <w:t>67.2</w:t>
+              <w:t>68.3</w:t>
             </w:r>
           </w:p>
         </w:tc>
@@ -427,7 +427,7 @@
           </w:tcPr>
           <w:p>
             <w:r>
-              <w:t>37.0</w:t>
+              <w:t>31.2</w:t>
             </w:r>
           </w:p>
         </w:tc>
@@ -437,7 +437,7 @@
           </w:tcPr>
           <w:p>
             <w:r>
-              <w:t>53.5</w:t>
+              <w:t>52.7</w:t>
             </w:r>
           </w:p>
         </w:tc>
@@ -447,7 +447,7 @@
           </w:tcPr>
           <w:p>
             <w:r>
-              <w:t>61</w:t>
+              <w:t>45</w:t>
             </w:r>
           </w:p>
         </w:tc>
@@ -459,7 +459,7 @@
           </w:tcPr>
           <w:p>
             <w:r>
-              <w:t>2026-06-28 19:30:10</w:t>
+              <w:t>2026-06-28 21:15:07</w:t>
             </w:r>
           </w:p>
         </w:tc>
@@ -477,7 +477,7 @@
           </w:tcPr>
           <w:p>
             <w:r>
-              <w:t>55.0</w:t>
+              <w:t>55.7</w:t>
             </w:r>
           </w:p>
         </w:tc>
@@ -487,7 +487,7 @@
           </w:tcPr>
           <w:p>
             <w:r>
-              <w:t>67.4</w:t>
+              <w:t>68.6</w:t>
             </w:r>
           </w:p>
         </w:tc>
@@ -497,7 +497,7 @@
           </w:tcPr>
           <w:p>
             <w:r>
-              <w:t>41.9</w:t>
+              <w:t>32.1</w:t>
             </w:r>
           </w:p>
         </w:tc>
@@ -507,7 +507,7 @@
           </w:tcPr>
           <w:p>
             <w:r>
-              <w:t>54.8</w:t>
+              <w:t>53.0</w:t>
             </w:r>
           </w:p>
         </w:tc>
@@ -517,7 +517,7 @@
           </w:tcPr>
           <w:p>
             <w:r>
-              <w:t>121</w:t>
+              <w:t>165</w:t>
             </w:r>
           </w:p>
         </w:tc>
@@ -529,7 +529,7 @@
           </w:tcPr>
           <w:p>
             <w:r>
-              <w:t>2026-06-28 20:00:10</w:t>
+              <w:t>2026-06-28 21:30:04</w:t>
             </w:r>
           </w:p>
         </w:tc>
@@ -547,7 +547,7 @@
           </w:tcPr>
           <w:p>
             <w:r>
-              <w:t>55.1</w:t>
+              <w:t>55.8</w:t>
             </w:r>
           </w:p>
         </w:tc>
@@ -557,7 +557,7 @@
           </w:tcPr>
           <w:p>
             <w:r>
-              <w:t>67.7</w:t>
+              <w:t>68.8</w:t>
             </w:r>
           </w:p>
         </w:tc>
@@ -567,7 +567,7 @@
           </w:tcPr>
           <w:p>
             <w:r>
-              <w:t>41.9</w:t>
+              <w:t>36.2</w:t>
             </w:r>
           </w:p>
         </w:tc>
@@ -577,7 +577,7 @@
           </w:tcPr>
           <w:p>
             <w:r>
-              <w:t>55.0</w:t>
+              <w:t>54.1</w:t>
             </w:r>
           </w:p>
         </w:tc>
@@ -587,7 +587,7 @@
           </w:tcPr>
           <w:p>
             <w:r>
-              <w:t>241</w:t>
+              <w:t>14</w:t>
             </w:r>
           </w:p>
         </w:tc>
@@ -599,7 +599,7 @@
           </w:tcPr>
           <w:p>
             <w:r>
-              <w:t>2026-06-28 20:30:25</w:t>
+              <w:t>2026-06-28 22:00:10</w:t>
             </w:r>
           </w:p>
         </w:tc>
@@ -617,7 +617,7 @@
           </w:tcPr>
           <w:p>
             <w:r>
-              <w:t>55.3</w:t>
+              <w:t>57.1</w:t>
             </w:r>
           </w:p>
         </w:tc>
@@ -627,7 +627,7 @@
           </w:tcPr>
           <w:p>
             <w:r>
-              <w:t>68.1</w:t>
+              <w:t>69.2</w:t>
             </w:r>
           </w:p>
         </w:tc>
@@ -637,7 +637,7 @@
           </w:tcPr>
           <w:p>
             <w:r>
-              <w:t>41.9</w:t>
+              <w:t>37.1</w:t>
             </w:r>
           </w:p>
         </w:tc>
@@ -657,7 +657,7 @@
           </w:tcPr>
           <w:p>
             <w:r>
-              <w:t>362</w:t>
+              <w:t>91</w:t>
             </w:r>
           </w:p>
         </w:tc>
@@ -669,7 +669,7 @@
           </w:tcPr>
           <w:p>
             <w:r>
-              <w:t>2026-06-28 20:45:07</w:t>
+              <w:t>2026-06-28 22:15:10</w:t>
             </w:r>
           </w:p>
         </w:tc>
@@ -687,7 +687,7 @@
           </w:tcPr>
           <w:p>
             <w:r>
-              <w:t>55.7</w:t>
+              <w:t>58.9</w:t>
             </w:r>
           </w:p>
         </w:tc>
@@ -697,7 +697,7 @@
           </w:tcPr>
           <w:p>
             <w:r>
-              <w:t>68.3</w:t>
+              <w:t>69.3</w:t>
             </w:r>
           </w:p>
         </w:tc>
@@ -707,7 +707,7 @@
           </w:tcPr>
           <w:p>
             <w:r>
-              <w:t>31.2</w:t>
+              <w:t>37.3</w:t>
             </w:r>
           </w:p>
         </w:tc>
@@ -717,7 +717,7 @@
           </w:tcPr>
           <w:p>
             <w:r>
-              <w:t>52.7</w:t>
+              <w:t>56.1</w:t>
             </w:r>
           </w:p>
         </w:tc>
@@ -727,7 +727,7 @@
           </w:tcPr>
           <w:p>
             <w:r>
-              <w:t>45</w:t>
+              <w:t>151</w:t>
             </w:r>
           </w:p>
         </w:tc>
@@ -739,7 +739,7 @@
           </w:tcPr>
           <w:p>
             <w:r>
-              <w:t>2026-06-28 21:15:07</w:t>
+              <w:t>2026-06-28 22:16:10</w:t>
             </w:r>
           </w:p>
         </w:tc>
@@ -757,7 +757,7 @@
           </w:tcPr>
           <w:p>
             <w:r>
-              <w:t>55.7</w:t>
+              <w:t>58.9</w:t>
             </w:r>
           </w:p>
         </w:tc>
@@ -767,7 +767,7 @@
           </w:tcPr>
           <w:p>
             <w:r>
-              <w:t>68.6</w:t>
+              <w:t>69.4</w:t>
             </w:r>
           </w:p>
         </w:tc>
@@ -777,7 +777,7 @@
           </w:tcPr>
           <w:p>
             <w:r>
-              <w:t>32.1</w:t>
+              <w:t>49.4</w:t>
             </w:r>
           </w:p>
         </w:tc>
@@ -787,7 +787,7 @@
           </w:tcPr>
           <w:p>
             <w:r>
-              <w:t>53.0</w:t>
+              <w:t>59.1</w:t>
             </w:r>
           </w:p>
         </w:tc>
@@ -797,7 +797,7 @@
           </w:tcPr>
           <w:p>
             <w:r>
-              <w:t>165</w:t>
+              <w:t>155</w:t>
             </w:r>
           </w:p>
         </w:tc>
@@ -809,7 +809,7 @@
           </w:tcPr>
           <w:p>
             <w:r>
-              <w:t>2026-06-28 21:30:04</w:t>
+              <w:t>2026-06-28 22:46:25</w:t>
             </w:r>
           </w:p>
         </w:tc>
@@ -827,7 +827,7 @@
           </w:tcPr>
           <w:p>
             <w:r>
-              <w:t>55.8</w:t>
+              <w:t>60.3</w:t>
             </w:r>
           </w:p>
         </w:tc>
@@ -837,7 +837,7 @@
           </w:tcPr>
           <w:p>
             <w:r>
-              <w:t>68.8</w:t>
+              <w:t>69.7</w:t>
             </w:r>
           </w:p>
         </w:tc>
@@ -847,7 +847,7 @@
           </w:tcPr>
           <w:p>
             <w:r>
-              <w:t>36.2</w:t>
+              <w:t>49.4</w:t>
             </w:r>
           </w:p>
         </w:tc>
@@ -857,7 +857,7 @@
           </w:tcPr>
           <w:p>
             <w:r>
-              <w:t>54.1</w:t>
+              <w:t>59.9</w:t>
             </w:r>
           </w:p>
         </w:tc>
@@ -867,7 +867,7 @@
           </w:tcPr>
           <w:p>
             <w:r>
-              <w:t>14</w:t>
+              <w:t>276</w:t>
             </w:r>
           </w:p>
         </w:tc>
@@ -879,7 +879,7 @@
           </w:tcPr>
           <w:p>
             <w:r>
-              <w:t>2026-06-28 22:00:10</w:t>
+              <w:t>2026-06-28 23:15:10</w:t>
             </w:r>
           </w:p>
         </w:tc>
@@ -897,7 +897,7 @@
           </w:tcPr>
           <w:p>
             <w:r>
-              <w:t>57.1</w:t>
+              <w:t>63.1</w:t>
             </w:r>
           </w:p>
         </w:tc>
@@ -907,7 +907,7 @@
           </w:tcPr>
           <w:p>
             <w:r>
-              <w:t>69.2</w:t>
+              <w:t>70.1</w:t>
             </w:r>
           </w:p>
         </w:tc>
@@ -917,7 +917,7 @@
           </w:tcPr>
           <w:p>
             <w:r>
-              <w:t>37.1</w:t>
+              <w:t>49.4</w:t>
             </w:r>
           </w:p>
         </w:tc>
@@ -927,7 +927,7 @@
           </w:tcPr>
           <w:p>
             <w:r>
-              <w:t>55.1</w:t>
+              <w:t>61.4</w:t>
             </w:r>
           </w:p>
         </w:tc>
@@ -937,7 +937,7 @@
           </w:tcPr>
           <w:p>
             <w:r>
-              <w:t>91</w:t>
+              <w:t>391</w:t>
             </w:r>
           </w:p>
         </w:tc>
@@ -949,7 +949,7 @@
           </w:tcPr>
           <w:p>
             <w:r>
-              <w:t>2026-06-28 22:15:10</w:t>
+              <w:t>2026-06-28 23:45:11</w:t>
             </w:r>
           </w:p>
         </w:tc>
@@ -967,7 +967,7 @@
           </w:tcPr>
           <w:p>
             <w:r>
-              <w:t>58.9</w:t>
+              <w:t>64.3</w:t>
             </w:r>
           </w:p>
         </w:tc>
@@ -977,7 +977,7 @@
           </w:tcPr>
           <w:p>
             <w:r>
-              <w:t>69.3</w:t>
+              <w:t>70.4</w:t>
             </w:r>
           </w:p>
         </w:tc>
@@ -987,7 +987,7 @@
           </w:tcPr>
           <w:p>
             <w:r>
-              <w:t>37.3</w:t>
+              <w:t>49.4</w:t>
             </w:r>
           </w:p>
         </w:tc>
@@ -997,7 +997,7 @@
           </w:tcPr>
           <w:p>
             <w:r>
-              <w:t>56.1</w:t>
+              <w:t>62.1</w:t>
             </w:r>
           </w:p>
         </w:tc>
@@ -1007,7 +1007,7 @@
           </w:tcPr>
           <w:p>
             <w:r>
-              <w:t>151</w:t>
+              <w:t>511</w:t>
             </w:r>
           </w:p>
         </w:tc>
@@ -1019,7 +1019,7 @@
           </w:tcPr>
           <w:p>
             <w:r>
-              <w:t>2026-06-28 22:16:10</w:t>
+              <w:t>2026-06-29 00:15:10</w:t>
             </w:r>
           </w:p>
         </w:tc>
@@ -1037,7 +1037,7 @@
           </w:tcPr>
           <w:p>
             <w:r>
-              <w:t>58.9</w:t>
+              <w:t>66.4</w:t>
             </w:r>
           </w:p>
         </w:tc>
@@ -1047,7 +1047,7 @@
           </w:tcPr>
           <w:p>
             <w:r>
-              <w:t>69.4</w:t>
+              <w:t>70.8</w:t>
             </w:r>
           </w:p>
         </w:tc>
@@ -1067,7 +1067,7 @@
           </w:tcPr>
           <w:p>
             <w:r>
-              <w:t>59.1</w:t>
+              <w:t>63.3</w:t>
             </w:r>
           </w:p>
         </w:tc>
@@ -1077,7 +1077,7 @@
           </w:tcPr>
           <w:p>
             <w:r>
-              <w:t>155</w:t>
+              <w:t>631</w:t>
             </w:r>
           </w:p>
         </w:tc>
@@ -1089,7 +1089,7 @@
           </w:tcPr>
           <w:p>
             <w:r>
-              <w:t>2026-06-28 22:46:25</w:t>
+              <w:t>2026-06-29 00:45:21</w:t>
             </w:r>
           </w:p>
         </w:tc>
@@ -1107,7 +1107,7 @@
           </w:tcPr>
           <w:p>
             <w:r>
-              <w:t>60.3</w:t>
+              <w:t>66.8</w:t>
             </w:r>
           </w:p>
         </w:tc>
@@ -1117,7 +1117,7 @@
           </w:tcPr>
           <w:p>
             <w:r>
-              <w:t>69.7</w:t>
+              <w:t>71.1</w:t>
             </w:r>
           </w:p>
         </w:tc>
@@ -1137,7 +1137,7 @@
           </w:tcPr>
           <w:p>
             <w:r>
-              <w:t>59.9</w:t>
+              <w:t>63.5</w:t>
             </w:r>
           </w:p>
         </w:tc>
@@ -1147,7 +1147,7 @@
           </w:tcPr>
           <w:p>
             <w:r>
-              <w:t>276</w:t>
+              <w:t>95</w:t>
             </w:r>
           </w:p>
         </w:tc>
@@ -1159,7 +1159,7 @@
           </w:tcPr>
           <w:p>
             <w:r>
-              <w:t>2026-06-28 23:15:10</w:t>
+              <w:t>2026-06-29 01:15:36</w:t>
             </w:r>
           </w:p>
         </w:tc>
@@ -1177,7 +1177,7 @@
           </w:tcPr>
           <w:p>
             <w:r>
-              <w:t>63.1</w:t>
+              <w:t>68.4</w:t>
             </w:r>
           </w:p>
         </w:tc>
@@ -1187,7 +1187,7 @@
           </w:tcPr>
           <w:p>
             <w:r>
-              <w:t>70.1</w:t>
+              <w:t>71.5</w:t>
             </w:r>
           </w:p>
         </w:tc>
@@ -1207,7 +1207,7 @@
           </w:tcPr>
           <w:p>
             <w:r>
-              <w:t>61.4</w:t>
+              <w:t>64.4</w:t>
             </w:r>
           </w:p>
         </w:tc>
@@ -1217,7 +1217,7 @@
           </w:tcPr>
           <w:p>
             <w:r>
-              <w:t>391</w:t>
+              <w:t>216</w:t>
             </w:r>
           </w:p>
         </w:tc>
@@ -1229,7 +1229,7 @@
           </w:tcPr>
           <w:p>
             <w:r>
-              <w:t>2026-06-28 23:45:11</w:t>
+              <w:t>2026-06-29 01:45:51</w:t>
             </w:r>
           </w:p>
         </w:tc>
@@ -1247,7 +1247,7 @@
           </w:tcPr>
           <w:p>
             <w:r>
-              <w:t>64.3</w:t>
+              <w:t>68.7</w:t>
             </w:r>
           </w:p>
         </w:tc>
@@ -1257,7 +1257,7 @@
           </w:tcPr>
           <w:p>
             <w:r>
-              <w:t>70.4</w:t>
+              <w:t>71.5</w:t>
             </w:r>
           </w:p>
         </w:tc>
@@ -1277,7 +1277,7 @@
           </w:tcPr>
           <w:p>
             <w:r>
-              <w:t>62.1</w:t>
+              <w:t>64.6</w:t>
             </w:r>
           </w:p>
         </w:tc>
@@ -1287,7 +1287,7 @@
           </w:tcPr>
           <w:p>
             <w:r>
-              <w:t>511</w:t>
+              <w:t>337</w:t>
             </w:r>
           </w:p>
         </w:tc>
@@ -1299,7 +1299,7 @@
           </w:tcPr>
           <w:p>
             <w:r>
-              <w:t>2026-06-29 00:15:10</w:t>
+              <w:t>2026-06-29 02:15:51</w:t>
             </w:r>
           </w:p>
         </w:tc>
@@ -1317,7 +1317,7 @@
           </w:tcPr>
           <w:p>
             <w:r>
-              <w:t>66.4</w:t>
+              <w:t>68.9</w:t>
             </w:r>
           </w:p>
         </w:tc>
@@ -1327,7 +1327,7 @@
           </w:tcPr>
           <w:p>
             <w:r>
-              <w:t>70.8</w:t>
+              <w:t>71.5</w:t>
             </w:r>
           </w:p>
         </w:tc>
@@ -1347,7 +1347,7 @@
           </w:tcPr>
           <w:p>
             <w:r>
-              <w:t>63.3</w:t>
+              <w:t>64.7</w:t>
             </w:r>
           </w:p>
         </w:tc>
@@ -1357,7 +1357,7 @@
           </w:tcPr>
           <w:p>
             <w:r>
-              <w:t>631</w:t>
+              <w:t>457</w:t>
             </w:r>
           </w:p>
         </w:tc>
@@ -1369,7 +1369,7 @@
           </w:tcPr>
           <w:p>
             <w:r>
-              <w:t>2026-06-29 00:45:21</w:t>
+              <w:t>2026-06-29 02:46:00</w:t>
             </w:r>
           </w:p>
         </w:tc>
@@ -1387,7 +1387,7 @@
           </w:tcPr>
           <w:p>
             <w:r>
-              <w:t>66.8</w:t>
+              <w:t>69.6</w:t>
             </w:r>
           </w:p>
         </w:tc>
@@ -1397,7 +1397,7 @@
           </w:tcPr>
           <w:p>
             <w:r>
-              <w:t>71.1</w:t>
+              <w:t>71.5</w:t>
             </w:r>
           </w:p>
         </w:tc>
@@ -1417,7 +1417,7 @@
           </w:tcPr>
           <w:p>
             <w:r>
-              <w:t>63.5</w:t>
+              <w:t>65.0</w:t>
             </w:r>
           </w:p>
         </w:tc>
@@ -1427,7 +1427,7 @@
           </w:tcPr>
           <w:p>
             <w:r>
-              <w:t>95</w:t>
+              <w:t>83</w:t>
             </w:r>
           </w:p>
         </w:tc>
@@ -1439,7 +1439,7 @@
           </w:tcPr>
           <w:p>
             <w:r>
-              <w:t>2026-06-29 01:15:36</w:t>
+              <w:t>2026-06-29 03:16:04</w:t>
             </w:r>
           </w:p>
         </w:tc>
@@ -1457,7 +1457,7 @@
           </w:tcPr>
           <w:p>
             <w:r>
-              <w:t>68.4</w:t>
+              <w:t>70.0</w:t>
             </w:r>
           </w:p>
         </w:tc>
@@ -1487,7 +1487,7 @@
           </w:tcPr>
           <w:p>
             <w:r>
-              <w:t>64.4</w:t>
+              <w:t>65.2</w:t>
             </w:r>
           </w:p>
         </w:tc>
@@ -1497,7 +1497,7 @@
           </w:tcPr>
           <w:p>
             <w:r>
-              <w:t>216</w:t>
+              <w:t>36</w:t>
             </w:r>
           </w:p>
         </w:tc>
@@ -1509,7 +1509,7 @@
           </w:tcPr>
           <w:p>
             <w:r>
-              <w:t>2026-06-29 01:45:51</w:t>
+              <w:t>2026-06-29 03:46:19</w:t>
             </w:r>
           </w:p>
         </w:tc>
@@ -1527,7 +1527,7 @@
           </w:tcPr>
           <w:p>
             <w:r>
-              <w:t>68.7</w:t>
+              <w:t>70.0</w:t>
             </w:r>
           </w:p>
         </w:tc>
@@ -1557,7 +1557,7 @@
           </w:tcPr>
           <w:p>
             <w:r>
-              <w:t>64.6</w:t>
+              <w:t>65.2</w:t>
             </w:r>
           </w:p>
         </w:tc>
@@ -1567,7 +1567,7 @@
           </w:tcPr>
           <w:p>
             <w:r>
-              <w:t>337</w:t>
+              <w:t>157</w:t>
             </w:r>
           </w:p>
         </w:tc>
@@ -1579,7 +1579,7 @@
           </w:tcPr>
           <w:p>
             <w:r>
-              <w:t>2026-06-29 02:15:51</w:t>
+              <w:t>2026-06-29 04:16:34</w:t>
             </w:r>
           </w:p>
         </w:tc>
@@ -1597,7 +1597,7 @@
           </w:tcPr>
           <w:p>
             <w:r>
-              <w:t>68.9</w:t>
+              <w:t>70.0</w:t>
             </w:r>
           </w:p>
         </w:tc>
@@ -1627,7 +1627,7 @@
           </w:tcPr>
           <w:p>
             <w:r>
-              <w:t>64.7</w:t>
+              <w:t>65.2</w:t>
             </w:r>
           </w:p>
         </w:tc>
@@ -1637,7 +1637,7 @@
           </w:tcPr>
           <w:p>
             <w:r>
-              <w:t>457</w:t>
+              <w:t>278</w:t>
             </w:r>
           </w:p>
         </w:tc>
@@ -1649,7 +1649,7 @@
           </w:tcPr>
           <w:p>
             <w:r>
-              <w:t>2026-06-29 02:46:00</w:t>
+              <w:t>2026-06-29 04:46:49</w:t>
             </w:r>
           </w:p>
         </w:tc>
@@ -1667,7 +1667,7 @@
           </w:tcPr>
           <w:p>
             <w:r>
-              <w:t>69.6</w:t>
+              <w:t>70.0</w:t>
             </w:r>
           </w:p>
         </w:tc>
@@ -1697,7 +1697,7 @@
           </w:tcPr>
           <w:p>
             <w:r>
-              <w:t>65.0</w:t>
+              <w:t>65.2</w:t>
             </w:r>
           </w:p>
         </w:tc>
@@ -1707,7 +1707,7 @@
           </w:tcPr>
           <w:p>
             <w:r>
-              <w:t>83</w:t>
+              <w:t>399</w:t>
             </w:r>
           </w:p>
         </w:tc>
@@ -2050,7 +2050,7 @@
           </w:tcPr>
           <w:p>
             <w:r>
-              <w:t>$551.88</w:t>
+              <w:t>$565.54</w:t>
             </w:r>
           </w:p>
         </w:tc>
@@ -2072,7 +2072,7 @@
           </w:tcPr>
           <w:p>
             <w:r>
-              <w:t>10.38%</w:t>
+              <w:t>13.11%</w:t>
             </w:r>
           </w:p>
         </w:tc>
@@ -2094,7 +2094,7 @@
           </w:tcPr>
           <w:p>
             <w:r>
-              <w:t>$51.88</w:t>
+              <w:t>$65.54</w:t>
             </w:r>
           </w:p>
         </w:tc>
@@ -2539,12 +2539,12 @@
     </w:tbl>
     <w:p>
       <w:r>
-        <w:t>Ticks: 166 · Reconciled: True · Readiness: not_ready</w:t>
+        <w:t>Ticks: 118 · Reconciled: True · Readiness: not_ready</w:t>
       </w:r>
     </w:p>
     <w:p>
       <w:r>
-        <w:t>Candidates created: 3898 · Terminals: {'accepted': 0, 'rejected': 584, 'skipped': 3288, 'expired': 0, 'missing_data': 26}</w:t>
+        <w:t>Candidates created: 4940 · Terminals: {'accepted': 0, 'rejected': 584, 'skipped': 4326, 'expired': 0, 'missing_data': 30}</w:t>
       </w:r>
     </w:p>
     <w:p>
@@ -3532,7 +3532,7 @@
     </w:tbl>
     <w:p>
       <w:r>
-        <w:t>TV alerts: received 426 · valid 419 · rejected 7</w:t>
+        <w:t>TV alerts: received 708 · valid 560 · rejected 148</w:t>
       </w:r>
     </w:p>
     <w:sectPr>

</xml_diff>

<commit_message>
chore(reports): VPS full report 2026-06-29 11:34 UTC (0 settled, WR 50.0%, PF 0.968, grade C)
</commit_message>
<xml_diff>
--- a/vps_full_reports/latest/report.docx
+++ b/vps_full_reports/latest/report.docx
@@ -20,7 +20,7 @@
           <w:color w:val="666666"/>
           <w:sz w:val="20"/>
         </w:rPr>
-        <w:t>PAPER ONLY  ·  reconciled=True  ·  ticks=118</w:t>
+        <w:t>PAPER ONLY  ·  reconciled=True  ·  ticks=1215</w:t>
       </w:r>
     </w:p>
     <w:p>
@@ -319,7 +319,7 @@
           </w:tcPr>
           <w:p>
             <w:r>
-              <w:t>2026-06-28 20:30:25</w:t>
+              <w:t>2026-06-29 04:16:34</w:t>
             </w:r>
           </w:p>
         </w:tc>
@@ -337,7 +337,7 @@
           </w:tcPr>
           <w:p>
             <w:r>
-              <w:t>55.3</w:t>
+              <w:t>70.0</w:t>
             </w:r>
           </w:p>
         </w:tc>
@@ -347,7 +347,7 @@
           </w:tcPr>
           <w:p>
             <w:r>
-              <w:t>68.1</w:t>
+              <w:t>71.5</w:t>
             </w:r>
           </w:p>
         </w:tc>
@@ -357,7 +357,7 @@
           </w:tcPr>
           <w:p>
             <w:r>
-              <w:t>41.9</w:t>
+              <w:t>49.4</w:t>
             </w:r>
           </w:p>
         </w:tc>
@@ -367,7 +367,7 @@
           </w:tcPr>
           <w:p>
             <w:r>
-              <w:t>55.1</w:t>
+              <w:t>65.2</w:t>
             </w:r>
           </w:p>
         </w:tc>
@@ -377,7 +377,7 @@
           </w:tcPr>
           <w:p>
             <w:r>
-              <w:t>362</w:t>
+              <w:t>278</w:t>
             </w:r>
           </w:p>
         </w:tc>
@@ -389,7 +389,7 @@
           </w:tcPr>
           <w:p>
             <w:r>
-              <w:t>2026-06-28 20:45:07</w:t>
+              <w:t>2026-06-29 04:46:49</w:t>
             </w:r>
           </w:p>
         </w:tc>
@@ -407,7 +407,7 @@
           </w:tcPr>
           <w:p>
             <w:r>
-              <w:t>55.7</w:t>
+              <w:t>70.0</w:t>
             </w:r>
           </w:p>
         </w:tc>
@@ -417,7 +417,7 @@
           </w:tcPr>
           <w:p>
             <w:r>
-              <w:t>68.3</w:t>
+              <w:t>71.5</w:t>
             </w:r>
           </w:p>
         </w:tc>
@@ -427,7 +427,7 @@
           </w:tcPr>
           <w:p>
             <w:r>
-              <w:t>31.2</w:t>
+              <w:t>49.4</w:t>
             </w:r>
           </w:p>
         </w:tc>
@@ -437,7 +437,7 @@
           </w:tcPr>
           <w:p>
             <w:r>
-              <w:t>52.7</w:t>
+              <w:t>65.2</w:t>
             </w:r>
           </w:p>
         </w:tc>
@@ -447,7 +447,7 @@
           </w:tcPr>
           <w:p>
             <w:r>
-              <w:t>45</w:t>
+              <w:t>399</w:t>
             </w:r>
           </w:p>
         </w:tc>
@@ -459,7 +459,7 @@
           </w:tcPr>
           <w:p>
             <w:r>
-              <w:t>2026-06-28 21:15:07</w:t>
+              <w:t>2026-06-29 05:16:56</w:t>
             </w:r>
           </w:p>
         </w:tc>
@@ -477,7 +477,7 @@
           </w:tcPr>
           <w:p>
             <w:r>
-              <w:t>55.7</w:t>
+              <w:t>70.0</w:t>
             </w:r>
           </w:p>
         </w:tc>
@@ -487,7 +487,7 @@
           </w:tcPr>
           <w:p>
             <w:r>
-              <w:t>68.6</w:t>
+              <w:t>71.5</w:t>
             </w:r>
           </w:p>
         </w:tc>
@@ -497,7 +497,7 @@
           </w:tcPr>
           <w:p>
             <w:r>
-              <w:t>32.1</w:t>
+              <w:t>49.4</w:t>
             </w:r>
           </w:p>
         </w:tc>
@@ -507,7 +507,7 @@
           </w:tcPr>
           <w:p>
             <w:r>
-              <w:t>53.0</w:t>
+              <w:t>65.2</w:t>
             </w:r>
           </w:p>
         </w:tc>
@@ -517,7 +517,7 @@
           </w:tcPr>
           <w:p>
             <w:r>
-              <w:t>165</w:t>
+              <w:t>119</w:t>
             </w:r>
           </w:p>
         </w:tc>
@@ -529,7 +529,7 @@
           </w:tcPr>
           <w:p>
             <w:r>
-              <w:t>2026-06-28 21:30:04</w:t>
+              <w:t>2026-06-29 05:46:56</w:t>
             </w:r>
           </w:p>
         </w:tc>
@@ -547,7 +547,7 @@
           </w:tcPr>
           <w:p>
             <w:r>
-              <w:t>55.8</w:t>
+              <w:t>70.0</w:t>
             </w:r>
           </w:p>
         </w:tc>
@@ -557,7 +557,7 @@
           </w:tcPr>
           <w:p>
             <w:r>
-              <w:t>68.8</w:t>
+              <w:t>71.5</w:t>
             </w:r>
           </w:p>
         </w:tc>
@@ -567,7 +567,7 @@
           </w:tcPr>
           <w:p>
             <w:r>
-              <w:t>36.2</w:t>
+              <w:t>49.4</w:t>
             </w:r>
           </w:p>
         </w:tc>
@@ -577,7 +577,7 @@
           </w:tcPr>
           <w:p>
             <w:r>
-              <w:t>54.1</w:t>
+              <w:t>65.2</w:t>
             </w:r>
           </w:p>
         </w:tc>
@@ -587,7 +587,7 @@
           </w:tcPr>
           <w:p>
             <w:r>
-              <w:t>14</w:t>
+              <w:t>239</w:t>
             </w:r>
           </w:p>
         </w:tc>
@@ -599,7 +599,7 @@
           </w:tcPr>
           <w:p>
             <w:r>
-              <w:t>2026-06-28 22:00:10</w:t>
+              <w:t>2026-06-29 06:16:56</w:t>
             </w:r>
           </w:p>
         </w:tc>
@@ -617,7 +617,7 @@
           </w:tcPr>
           <w:p>
             <w:r>
-              <w:t>57.1</w:t>
+              <w:t>70.0</w:t>
             </w:r>
           </w:p>
         </w:tc>
@@ -627,7 +627,7 @@
           </w:tcPr>
           <w:p>
             <w:r>
-              <w:t>69.2</w:t>
+              <w:t>71.5</w:t>
             </w:r>
           </w:p>
         </w:tc>
@@ -637,7 +637,7 @@
           </w:tcPr>
           <w:p>
             <w:r>
-              <w:t>37.1</w:t>
+              <w:t>49.4</w:t>
             </w:r>
           </w:p>
         </w:tc>
@@ -647,7 +647,7 @@
           </w:tcPr>
           <w:p>
             <w:r>
-              <w:t>55.1</w:t>
+              <w:t>65.2</w:t>
             </w:r>
           </w:p>
         </w:tc>
@@ -657,7 +657,7 @@
           </w:tcPr>
           <w:p>
             <w:r>
-              <w:t>91</w:t>
+              <w:t>359</w:t>
             </w:r>
           </w:p>
         </w:tc>
@@ -669,7 +669,7 @@
           </w:tcPr>
           <w:p>
             <w:r>
-              <w:t>2026-06-28 22:15:10</w:t>
+              <w:t>2026-06-29 06:47:10</w:t>
             </w:r>
           </w:p>
         </w:tc>
@@ -687,7 +687,7 @@
           </w:tcPr>
           <w:p>
             <w:r>
-              <w:t>58.9</w:t>
+              <w:t>70.0</w:t>
             </w:r>
           </w:p>
         </w:tc>
@@ -697,7 +697,7 @@
           </w:tcPr>
           <w:p>
             <w:r>
-              <w:t>69.3</w:t>
+              <w:t>71.5</w:t>
             </w:r>
           </w:p>
         </w:tc>
@@ -707,7 +707,7 @@
           </w:tcPr>
           <w:p>
             <w:r>
-              <w:t>37.3</w:t>
+              <w:t>49.4</w:t>
             </w:r>
           </w:p>
         </w:tc>
@@ -717,7 +717,7 @@
           </w:tcPr>
           <w:p>
             <w:r>
-              <w:t>56.1</w:t>
+              <w:t>65.2</w:t>
             </w:r>
           </w:p>
         </w:tc>
@@ -727,7 +727,7 @@
           </w:tcPr>
           <w:p>
             <w:r>
-              <w:t>151</w:t>
+              <w:t>66</w:t>
             </w:r>
           </w:p>
         </w:tc>
@@ -739,7 +739,7 @@
           </w:tcPr>
           <w:p>
             <w:r>
-              <w:t>2026-06-28 22:16:10</w:t>
+              <w:t>2026-06-29 06:49:55</w:t>
             </w:r>
           </w:p>
         </w:tc>
@@ -757,7 +757,7 @@
           </w:tcPr>
           <w:p>
             <w:r>
-              <w:t>58.9</w:t>
+              <w:t>62.4</w:t>
             </w:r>
           </w:p>
         </w:tc>
@@ -767,7 +767,7 @@
           </w:tcPr>
           <w:p>
             <w:r>
-              <w:t>69.4</w:t>
+              <w:t>71.5</w:t>
             </w:r>
           </w:p>
         </w:tc>
@@ -787,7 +787,7 @@
           </w:tcPr>
           <w:p>
             <w:r>
-              <w:t>59.1</w:t>
+              <w:t>61.4</w:t>
             </w:r>
           </w:p>
         </w:tc>
@@ -797,7 +797,7 @@
           </w:tcPr>
           <w:p>
             <w:r>
-              <w:t>155</w:t>
+              <w:t>77</w:t>
             </w:r>
           </w:p>
         </w:tc>
@@ -809,7 +809,7 @@
           </w:tcPr>
           <w:p>
             <w:r>
-              <w:t>2026-06-28 22:46:25</w:t>
+              <w:t>2026-06-29 07:05:40</w:t>
             </w:r>
           </w:p>
         </w:tc>
@@ -827,7 +827,7 @@
           </w:tcPr>
           <w:p>
             <w:r>
-              <w:t>60.3</w:t>
+              <w:t>70.0</w:t>
             </w:r>
           </w:p>
         </w:tc>
@@ -837,7 +837,7 @@
           </w:tcPr>
           <w:p>
             <w:r>
-              <w:t>69.7</w:t>
+              <w:t>71.5</w:t>
             </w:r>
           </w:p>
         </w:tc>
@@ -857,7 +857,7 @@
           </w:tcPr>
           <w:p>
             <w:r>
-              <w:t>59.9</w:t>
+              <w:t>65.2</w:t>
             </w:r>
           </w:p>
         </w:tc>
@@ -867,7 +867,7 @@
           </w:tcPr>
           <w:p>
             <w:r>
-              <w:t>276</w:t>
+              <w:t>140</w:t>
             </w:r>
           </w:p>
         </w:tc>
@@ -879,7 +879,7 @@
           </w:tcPr>
           <w:p>
             <w:r>
-              <w:t>2026-06-28 23:15:10</w:t>
+              <w:t>2026-06-29 07:35:40</w:t>
             </w:r>
           </w:p>
         </w:tc>
@@ -897,7 +897,7 @@
           </w:tcPr>
           <w:p>
             <w:r>
-              <w:t>63.1</w:t>
+              <w:t>70.0</w:t>
             </w:r>
           </w:p>
         </w:tc>
@@ -907,7 +907,7 @@
           </w:tcPr>
           <w:p>
             <w:r>
-              <w:t>70.1</w:t>
+              <w:t>71.5</w:t>
             </w:r>
           </w:p>
         </w:tc>
@@ -927,7 +927,7 @@
           </w:tcPr>
           <w:p>
             <w:r>
-              <w:t>61.4</w:t>
+              <w:t>65.2</w:t>
             </w:r>
           </w:p>
         </w:tc>
@@ -937,7 +937,7 @@
           </w:tcPr>
           <w:p>
             <w:r>
-              <w:t>391</w:t>
+              <w:t>260</w:t>
             </w:r>
           </w:p>
         </w:tc>
@@ -949,7 +949,7 @@
           </w:tcPr>
           <w:p>
             <w:r>
-              <w:t>2026-06-28 23:45:11</w:t>
+              <w:t>2026-06-29 08:05:40</w:t>
             </w:r>
           </w:p>
         </w:tc>
@@ -967,7 +967,7 @@
           </w:tcPr>
           <w:p>
             <w:r>
-              <w:t>64.3</w:t>
+              <w:t>70.0</w:t>
             </w:r>
           </w:p>
         </w:tc>
@@ -977,7 +977,7 @@
           </w:tcPr>
           <w:p>
             <w:r>
-              <w:t>70.4</w:t>
+              <w:t>71.5</w:t>
             </w:r>
           </w:p>
         </w:tc>
@@ -997,7 +997,7 @@
           </w:tcPr>
           <w:p>
             <w:r>
-              <w:t>62.1</w:t>
+              <w:t>65.2</w:t>
             </w:r>
           </w:p>
         </w:tc>
@@ -1007,7 +1007,7 @@
           </w:tcPr>
           <w:p>
             <w:r>
-              <w:t>511</w:t>
+              <w:t>380</w:t>
             </w:r>
           </w:p>
         </w:tc>
@@ -1019,7 +1019,7 @@
           </w:tcPr>
           <w:p>
             <w:r>
-              <w:t>2026-06-29 00:15:10</w:t>
+              <w:t>2026-06-29 08:35:55</w:t>
             </w:r>
           </w:p>
         </w:tc>
@@ -1037,7 +1037,7 @@
           </w:tcPr>
           <w:p>
             <w:r>
-              <w:t>66.4</w:t>
+              <w:t>68.2</w:t>
             </w:r>
           </w:p>
         </w:tc>
@@ -1047,7 +1047,7 @@
           </w:tcPr>
           <w:p>
             <w:r>
-              <w:t>70.8</w:t>
+              <w:t>71.5</w:t>
             </w:r>
           </w:p>
         </w:tc>
@@ -1067,7 +1067,7 @@
           </w:tcPr>
           <w:p>
             <w:r>
-              <w:t>63.3</w:t>
+              <w:t>64.3</w:t>
             </w:r>
           </w:p>
         </w:tc>
@@ -1077,7 +1077,7 @@
           </w:tcPr>
           <w:p>
             <w:r>
-              <w:t>631</w:t>
+              <w:t>501</w:t>
             </w:r>
           </w:p>
         </w:tc>
@@ -1089,7 +1089,7 @@
           </w:tcPr>
           <w:p>
             <w:r>
-              <w:t>2026-06-29 00:45:21</w:t>
+              <w:t>2026-06-29 09:06:55</w:t>
             </w:r>
           </w:p>
         </w:tc>
@@ -1107,7 +1107,7 @@
           </w:tcPr>
           <w:p>
             <w:r>
-              <w:t>66.8</w:t>
+              <w:t>67.1</w:t>
             </w:r>
           </w:p>
         </w:tc>
@@ -1117,7 +1117,7 @@
           </w:tcPr>
           <w:p>
             <w:r>
-              <w:t>71.1</w:t>
+              <w:t>71.5</w:t>
             </w:r>
           </w:p>
         </w:tc>
@@ -1137,7 +1137,7 @@
           </w:tcPr>
           <w:p>
             <w:r>
-              <w:t>63.5</w:t>
+              <w:t>63.8</w:t>
             </w:r>
           </w:p>
         </w:tc>
@@ -1147,7 +1147,7 @@
           </w:tcPr>
           <w:p>
             <w:r>
-              <w:t>95</w:t>
+              <w:t>625</w:t>
             </w:r>
           </w:p>
         </w:tc>
@@ -1159,7 +1159,7 @@
           </w:tcPr>
           <w:p>
             <w:r>
-              <w:t>2026-06-29 01:15:36</w:t>
+              <w:t>2026-06-29 09:19:40</w:t>
             </w:r>
           </w:p>
         </w:tc>
@@ -1177,7 +1177,7 @@
           </w:tcPr>
           <w:p>
             <w:r>
-              <w:t>68.4</w:t>
+              <w:t>70.0</w:t>
             </w:r>
           </w:p>
         </w:tc>
@@ -1207,7 +1207,7 @@
           </w:tcPr>
           <w:p>
             <w:r>
-              <w:t>64.4</w:t>
+              <w:t>65.2</w:t>
             </w:r>
           </w:p>
         </w:tc>
@@ -1217,7 +1217,7 @@
           </w:tcPr>
           <w:p>
             <w:r>
-              <w:t>216</w:t>
+              <w:t>676</w:t>
             </w:r>
           </w:p>
         </w:tc>
@@ -1229,7 +1229,7 @@
           </w:tcPr>
           <w:p>
             <w:r>
-              <w:t>2026-06-29 01:45:51</w:t>
+              <w:t>2026-06-29 09:36:25</w:t>
             </w:r>
           </w:p>
         </w:tc>
@@ -1247,7 +1247,7 @@
           </w:tcPr>
           <w:p>
             <w:r>
-              <w:t>68.7</w:t>
+              <w:t>65.7</w:t>
             </w:r>
           </w:p>
         </w:tc>
@@ -1277,7 +1277,7 @@
           </w:tcPr>
           <w:p>
             <w:r>
-              <w:t>64.6</w:t>
+              <w:t>63.1</w:t>
             </w:r>
           </w:p>
         </w:tc>
@@ -1287,7 +1287,7 @@
           </w:tcPr>
           <w:p>
             <w:r>
-              <w:t>337</w:t>
+              <w:t>743</w:t>
             </w:r>
           </w:p>
         </w:tc>
@@ -1299,7 +1299,7 @@
           </w:tcPr>
           <w:p>
             <w:r>
-              <w:t>2026-06-29 02:15:51</w:t>
+              <w:t>2026-06-29 09:51:25</w:t>
             </w:r>
           </w:p>
         </w:tc>
@@ -1317,7 +1317,7 @@
           </w:tcPr>
           <w:p>
             <w:r>
-              <w:t>68.9</w:t>
+              <w:t>70.0</w:t>
             </w:r>
           </w:p>
         </w:tc>
@@ -1347,7 +1347,7 @@
           </w:tcPr>
           <w:p>
             <w:r>
-              <w:t>64.7</w:t>
+              <w:t>65.2</w:t>
             </w:r>
           </w:p>
         </w:tc>
@@ -1357,7 +1357,7 @@
           </w:tcPr>
           <w:p>
             <w:r>
-              <w:t>457</w:t>
+              <w:t>803</w:t>
             </w:r>
           </w:p>
         </w:tc>
@@ -1369,7 +1369,7 @@
           </w:tcPr>
           <w:p>
             <w:r>
-              <w:t>2026-06-29 02:46:00</w:t>
+              <w:t>2026-06-29 10:21:40</w:t>
             </w:r>
           </w:p>
         </w:tc>
@@ -1387,7 +1387,7 @@
           </w:tcPr>
           <w:p>
             <w:r>
-              <w:t>69.6</w:t>
+              <w:t>70.0</w:t>
             </w:r>
           </w:p>
         </w:tc>
@@ -1417,7 +1417,7 @@
           </w:tcPr>
           <w:p>
             <w:r>
-              <w:t>65.0</w:t>
+              <w:t>65.2</w:t>
             </w:r>
           </w:p>
         </w:tc>
@@ -1427,7 +1427,7 @@
           </w:tcPr>
           <w:p>
             <w:r>
-              <w:t>83</w:t>
+              <w:t>924</w:t>
             </w:r>
           </w:p>
         </w:tc>
@@ -1439,7 +1439,7 @@
           </w:tcPr>
           <w:p>
             <w:r>
-              <w:t>2026-06-29 03:16:04</w:t>
+              <w:t>2026-06-29 10:51:41</w:t>
             </w:r>
           </w:p>
         </w:tc>
@@ -1457,7 +1457,7 @@
           </w:tcPr>
           <w:p>
             <w:r>
-              <w:t>70.0</w:t>
+              <w:t>68.8</w:t>
             </w:r>
           </w:p>
         </w:tc>
@@ -1487,7 +1487,7 @@
           </w:tcPr>
           <w:p>
             <w:r>
-              <w:t>65.2</w:t>
+              <w:t>64.6</w:t>
             </w:r>
           </w:p>
         </w:tc>
@@ -1497,7 +1497,7 @@
           </w:tcPr>
           <w:p>
             <w:r>
-              <w:t>36</w:t>
+              <w:t>1044</w:t>
             </w:r>
           </w:p>
         </w:tc>
@@ -1509,7 +1509,7 @@
           </w:tcPr>
           <w:p>
             <w:r>
-              <w:t>2026-06-29 03:46:19</w:t>
+              <w:t>2026-06-29 11:01:55</w:t>
             </w:r>
           </w:p>
         </w:tc>
@@ -1527,7 +1527,7 @@
           </w:tcPr>
           <w:p>
             <w:r>
-              <w:t>70.0</w:t>
+              <w:t>49.5</w:t>
             </w:r>
           </w:p>
         </w:tc>
@@ -1537,7 +1537,7 @@
           </w:tcPr>
           <w:p>
             <w:r>
-              <w:t>71.5</w:t>
+              <w:t>56.5</w:t>
             </w:r>
           </w:p>
         </w:tc>
@@ -1557,7 +1557,7 @@
           </w:tcPr>
           <w:p>
             <w:r>
-              <w:t>65.2</w:t>
+              <w:t>51.2</w:t>
             </w:r>
           </w:p>
         </w:tc>
@@ -1567,7 +1567,7 @@
           </w:tcPr>
           <w:p>
             <w:r>
-              <w:t>157</w:t>
+              <w:t>1085</w:t>
             </w:r>
           </w:p>
         </w:tc>
@@ -1579,7 +1579,7 @@
           </w:tcPr>
           <w:p>
             <w:r>
-              <w:t>2026-06-29 04:16:34</w:t>
+              <w:t>2026-06-29 11:17:55</w:t>
             </w:r>
           </w:p>
         </w:tc>
@@ -1597,7 +1597,7 @@
           </w:tcPr>
           <w:p>
             <w:r>
-              <w:t>70.0</w:t>
+              <w:t>35.0</w:t>
             </w:r>
           </w:p>
         </w:tc>
@@ -1607,7 +1607,7 @@
           </w:tcPr>
           <w:p>
             <w:r>
-              <w:t>71.5</w:t>
+              <w:t>56.5</w:t>
             </w:r>
           </w:p>
         </w:tc>
@@ -1627,7 +1627,7 @@
           </w:tcPr>
           <w:p>
             <w:r>
-              <w:t>65.2</w:t>
+              <w:t>44.0</w:t>
             </w:r>
           </w:p>
         </w:tc>
@@ -1637,7 +1637,7 @@
           </w:tcPr>
           <w:p>
             <w:r>
-              <w:t>278</w:t>
+              <w:t>1149</w:t>
             </w:r>
           </w:p>
         </w:tc>
@@ -1649,7 +1649,7 @@
           </w:tcPr>
           <w:p>
             <w:r>
-              <w:t>2026-06-29 04:46:49</w:t>
+              <w:t>2026-06-29 11:32:55</w:t>
             </w:r>
           </w:p>
         </w:tc>
@@ -1707,7 +1707,7 @@
           </w:tcPr>
           <w:p>
             <w:r>
-              <w:t>399</w:t>
+              <w:t>1209</w:t>
             </w:r>
           </w:p>
         </w:tc>
@@ -2050,7 +2050,7 @@
           </w:tcPr>
           <w:p>
             <w:r>
-              <w:t>$565.54</w:t>
+              <w:t>$552.18</w:t>
             </w:r>
           </w:p>
         </w:tc>
@@ -2072,7 +2072,7 @@
           </w:tcPr>
           <w:p>
             <w:r>
-              <w:t>13.11%</w:t>
+              <w:t>10.44%</w:t>
             </w:r>
           </w:p>
         </w:tc>
@@ -2094,7 +2094,7 @@
           </w:tcPr>
           <w:p>
             <w:r>
-              <w:t>$65.54</w:t>
+              <w:t>$52.18</w:t>
             </w:r>
           </w:p>
         </w:tc>
@@ -2539,12 +2539,12 @@
     </w:tbl>
     <w:p>
       <w:r>
-        <w:t>Ticks: 118 · Reconciled: True · Readiness: not_ready</w:t>
+        <w:t>Ticks: 1215 · Reconciled: True · Readiness: not_ready</w:t>
       </w:r>
     </w:p>
     <w:p>
       <w:r>
-        <w:t>Candidates created: 4940 · Terminals: {'accepted': 0, 'rejected': 584, 'skipped': 4326, 'expired': 0, 'missing_data': 30}</w:t>
+        <w:t>Candidates created: 7842 · Terminals: {'accepted': 0, 'rejected': 584, 'skipped': 7224, 'expired': 0, 'missing_data': 34}</w:t>
       </w:r>
     </w:p>
     <w:p>
@@ -3532,7 +3532,7 @@
     </w:tbl>
     <w:p>
       <w:r>
-        <w:t>TV alerts: received 708 · valid 560 · rejected 148</w:t>
+        <w:t>TV alerts: received 1188 · valid 969 · rejected 219</w:t>
       </w:r>
     </w:p>
     <w:sectPr>

</xml_diff>

<commit_message>
chore(reports): VPS full report 2026-06-29 11:43 UTC (0 settled, WR 50.0%, PF 0.968, grade C)
</commit_message>
<xml_diff>
--- a/vps_full_reports/latest/report.docx
+++ b/vps_full_reports/latest/report.docx
@@ -20,7 +20,7 @@
           <w:color w:val="666666"/>
           <w:sz w:val="20"/>
         </w:rPr>
-        <w:t>PAPER ONLY  ·  reconciled=True  ·  ticks=1215</w:t>
+        <w:t>PAPER ONLY  ·  reconciled=True  ·  ticks=5</w:t>
       </w:r>
     </w:p>
     <w:p>
@@ -2259,7 +2259,1575 @@
         <w:pStyle w:val="Heading2"/>
       </w:pPr>
       <w:r>
-        <w:t>Arbitrage</w:t>
+        <w:t>Dependency arbitrage (P-UP)</w:t>
+      </w:r>
+    </w:p>
+    <w:p>
+      <w:r>
+        <w:t>Realized $52.176 · Executed 67 · Settled 65 · Wins 54 · Losses 11 · Kelly active False</w:t>
+      </w:r>
+    </w:p>
+    <w:p>
+      <w:pPr>
+        <w:pStyle w:val="Heading3"/>
+      </w:pPr>
+      <w:r>
+        <w:t>Calibration buckets</w:t>
+      </w:r>
+    </w:p>
+    <w:tbl>
+      <w:tblPr>
+        <w:tblStyle w:val="TableGrid"/>
+        <w:tblW w:type="auto" w:w="0"/>
+        <w:tblLook w:firstColumn="1" w:firstRow="1" w:lastColumn="0" w:lastRow="0" w:noHBand="0" w:noVBand="1" w:val="04A0"/>
+      </w:tblPr>
+      <w:tblGrid>
+        <w:gridCol w:w="1728"/>
+        <w:gridCol w:w="1728"/>
+        <w:gridCol w:w="1728"/>
+        <w:gridCol w:w="1728"/>
+        <w:gridCol w:w="1728"/>
+      </w:tblGrid>
+      <w:tr>
+        <w:tc>
+          <w:tcPr>
+            <w:tcW w:type="dxa" w:w="1728"/>
+          </w:tcPr>
+          <w:p>
+            <w:r>
+              <w:t>Bucket</w:t>
+            </w:r>
+          </w:p>
+        </w:tc>
+        <w:tc>
+          <w:tcPr>
+            <w:tcW w:type="dxa" w:w="1728"/>
+          </w:tcPr>
+          <w:p>
+            <w:r>
+              <w:t>n</w:t>
+            </w:r>
+          </w:p>
+        </w:tc>
+        <w:tc>
+          <w:tcPr>
+            <w:tcW w:type="dxa" w:w="1728"/>
+          </w:tcPr>
+          <w:p>
+            <w:r>
+              <w:t>Win rate</w:t>
+            </w:r>
+          </w:p>
+        </w:tc>
+        <w:tc>
+          <w:tcPr>
+            <w:tcW w:type="dxa" w:w="1728"/>
+          </w:tcPr>
+          <w:p>
+            <w:r>
+              <w:t>PF</w:t>
+            </w:r>
+          </w:p>
+        </w:tc>
+        <w:tc>
+          <w:tcPr>
+            <w:tcW w:type="dxa" w:w="1728"/>
+          </w:tcPr>
+          <w:p>
+            <w:r>
+              <w:t>Avg PnL</w:t>
+            </w:r>
+          </w:p>
+        </w:tc>
+      </w:tr>
+      <w:tr>
+        <w:tc>
+          <w:tcPr>
+            <w:tcW w:type="dxa" w:w="1728"/>
+          </w:tcPr>
+          <w:p>
+            <w:r>
+              <w:t>0.20-0.35</w:t>
+            </w:r>
+          </w:p>
+        </w:tc>
+        <w:tc>
+          <w:tcPr>
+            <w:tcW w:type="dxa" w:w="1728"/>
+          </w:tcPr>
+          <w:p>
+            <w:r>
+              <w:t>3</w:t>
+            </w:r>
+          </w:p>
+        </w:tc>
+        <w:tc>
+          <w:tcPr>
+            <w:tcW w:type="dxa" w:w="1728"/>
+          </w:tcPr>
+          <w:p>
+            <w:r>
+              <w:t>0.6667</w:t>
+            </w:r>
+          </w:p>
+        </w:tc>
+        <w:tc>
+          <w:tcPr>
+            <w:tcW w:type="dxa" w:w="1728"/>
+          </w:tcPr>
+          <w:p>
+            <w:r>
+              <w:t>4.8660</w:t>
+            </w:r>
+          </w:p>
+        </w:tc>
+        <w:tc>
+          <w:tcPr>
+            <w:tcW w:type="dxa" w:w="1728"/>
+          </w:tcPr>
+          <w:p>
+            <w:r>
+              <w:t>$64.43</w:t>
+            </w:r>
+          </w:p>
+        </w:tc>
+      </w:tr>
+      <w:tr>
+        <w:tc>
+          <w:tcPr>
+            <w:tcW w:type="dxa" w:w="1728"/>
+          </w:tcPr>
+          <w:p>
+            <w:r>
+              <w:t>0.35-0.50</w:t>
+            </w:r>
+          </w:p>
+        </w:tc>
+        <w:tc>
+          <w:tcPr>
+            <w:tcW w:type="dxa" w:w="1728"/>
+          </w:tcPr>
+          <w:p>
+            <w:r>
+              <w:t>2</w:t>
+            </w:r>
+          </w:p>
+        </w:tc>
+        <w:tc>
+          <w:tcPr>
+            <w:tcW w:type="dxa" w:w="1728"/>
+          </w:tcPr>
+          <w:p>
+            <w:r>
+              <w:t>0.0000</w:t>
+            </w:r>
+          </w:p>
+        </w:tc>
+        <w:tc>
+          <w:tcPr>
+            <w:tcW w:type="dxa" w:w="1728"/>
+          </w:tcPr>
+          <w:p>
+            <w:r>
+              <w:t>0.0000</w:t>
+            </w:r>
+          </w:p>
+        </w:tc>
+        <w:tc>
+          <w:tcPr>
+            <w:tcW w:type="dxa" w:w="1728"/>
+          </w:tcPr>
+          <w:p>
+            <w:r>
+              <w:t>$-50.00</w:t>
+            </w:r>
+          </w:p>
+        </w:tc>
+      </w:tr>
+      <w:tr>
+        <w:tc>
+          <w:tcPr>
+            <w:tcW w:type="dxa" w:w="1728"/>
+          </w:tcPr>
+          <w:p>
+            <w:r>
+              <w:t>&gt;0.50</w:t>
+            </w:r>
+          </w:p>
+        </w:tc>
+        <w:tc>
+          <w:tcPr>
+            <w:tcW w:type="dxa" w:w="1728"/>
+          </w:tcPr>
+          <w:p>
+            <w:r>
+              <w:t>15</w:t>
+            </w:r>
+          </w:p>
+        </w:tc>
+        <w:tc>
+          <w:tcPr>
+            <w:tcW w:type="dxa" w:w="1728"/>
+          </w:tcPr>
+          <w:p>
+            <w:r>
+              <w:t>0.4667</w:t>
+            </w:r>
+          </w:p>
+        </w:tc>
+        <w:tc>
+          <w:tcPr>
+            <w:tcW w:type="dxa" w:w="1728"/>
+          </w:tcPr>
+          <w:p>
+            <w:r>
+              <w:t>0.7227</w:t>
+            </w:r>
+          </w:p>
+        </w:tc>
+        <w:tc>
+          <w:tcPr>
+            <w:tcW w:type="dxa" w:w="1728"/>
+          </w:tcPr>
+          <w:p>
+            <w:r>
+              <w:t>$-7.39</w:t>
+            </w:r>
+          </w:p>
+        </w:tc>
+      </w:tr>
+    </w:tbl>
+    <w:p>
+      <w:pPr>
+        <w:pStyle w:val="Heading3"/>
+      </w:pPr>
+      <w:r>
+        <w:t>Last 20 dep-arb trades</w:t>
+      </w:r>
+    </w:p>
+    <w:tbl>
+      <w:tblPr>
+        <w:tblStyle w:val="TableGrid"/>
+        <w:tblW w:type="auto" w:w="0"/>
+        <w:tblLook w:firstColumn="1" w:firstRow="1" w:lastColumn="0" w:lastRow="0" w:noHBand="0" w:noVBand="1" w:val="04A0"/>
+      </w:tblPr>
+      <w:tblGrid>
+        <w:gridCol w:w="1440"/>
+        <w:gridCol w:w="1440"/>
+        <w:gridCol w:w="1440"/>
+        <w:gridCol w:w="1440"/>
+        <w:gridCol w:w="1440"/>
+        <w:gridCol w:w="1440"/>
+      </w:tblGrid>
+      <w:tr>
+        <w:tc>
+          <w:tcPr>
+            <w:tcW w:type="dxa" w:w="1440"/>
+          </w:tcPr>
+          <w:p>
+            <w:r>
+              <w:t>Parent</w:t>
+            </w:r>
+          </w:p>
+        </w:tc>
+        <w:tc>
+          <w:tcPr>
+            <w:tcW w:type="dxa" w:w="1440"/>
+          </w:tcPr>
+          <w:p>
+            <w:r>
+              <w:t>Status</w:t>
+            </w:r>
+          </w:p>
+        </w:tc>
+        <w:tc>
+          <w:tcPr>
+            <w:tcW w:type="dxa" w:w="1440"/>
+          </w:tcPr>
+          <w:p>
+            <w:r>
+              <w:t>Won</w:t>
+            </w:r>
+          </w:p>
+        </w:tc>
+        <w:tc>
+          <w:tcPr>
+            <w:tcW w:type="dxa" w:w="1440"/>
+          </w:tcPr>
+          <w:p>
+            <w:r>
+              <w:t>Entry</w:t>
+            </w:r>
+          </w:p>
+        </w:tc>
+        <w:tc>
+          <w:tcPr>
+            <w:tcW w:type="dxa" w:w="1440"/>
+          </w:tcPr>
+          <w:p>
+            <w:r>
+              <w:t>PnL</w:t>
+            </w:r>
+          </w:p>
+        </w:tc>
+        <w:tc>
+          <w:tcPr>
+            <w:tcW w:type="dxa" w:w="1440"/>
+          </w:tcPr>
+          <w:p>
+            <w:r>
+              <w:t>Settled</w:t>
+            </w:r>
+          </w:p>
+        </w:tc>
+      </w:tr>
+      <w:tr>
+        <w:tc>
+          <w:tcPr>
+            <w:tcW w:type="dxa" w:w="1440"/>
+          </w:tcPr>
+          <w:p>
+            <w:r>
+              <w:t>parent 644116</w:t>
+            </w:r>
+          </w:p>
+        </w:tc>
+        <w:tc>
+          <w:tcPr>
+            <w:tcW w:type="dxa" w:w="1440"/>
+          </w:tcPr>
+          <w:p>
+            <w:r>
+              <w:t>open</w:t>
+            </w:r>
+          </w:p>
+        </w:tc>
+        <w:tc>
+          <w:tcPr>
+            <w:tcW w:type="dxa" w:w="1440"/>
+          </w:tcPr>
+          <w:p>
+            <w:r>
+              <w:t>—</w:t>
+            </w:r>
+          </w:p>
+        </w:tc>
+        <w:tc>
+          <w:tcPr>
+            <w:tcW w:type="dxa" w:w="1440"/>
+          </w:tcPr>
+          <w:p>
+            <w:r>
+              <w:t>0.560</w:t>
+            </w:r>
+          </w:p>
+        </w:tc>
+        <w:tc>
+          <w:tcPr>
+            <w:tcW w:type="dxa" w:w="1440"/>
+          </w:tcPr>
+          <w:p>
+            <w:r>
+              <w:t>$—</w:t>
+            </w:r>
+          </w:p>
+        </w:tc>
+        <w:tc>
+          <w:tcPr>
+            <w:tcW w:type="dxa" w:w="1440"/>
+          </w:tcPr>
+          <w:p>
+            <w:r>
+              <w:t>heuristic</w:t>
+            </w:r>
+          </w:p>
+        </w:tc>
+      </w:tr>
+      <w:tr>
+        <w:tc>
+          <w:tcPr>
+            <w:tcW w:type="dxa" w:w="1440"/>
+          </w:tcPr>
+          <w:p>
+            <w:r>
+              <w:t>parent 644085</w:t>
+            </w:r>
+          </w:p>
+        </w:tc>
+        <w:tc>
+          <w:tcPr>
+            <w:tcW w:type="dxa" w:w="1440"/>
+          </w:tcPr>
+          <w:p>
+            <w:r>
+              <w:t>settled</w:t>
+            </w:r>
+          </w:p>
+        </w:tc>
+        <w:tc>
+          <w:tcPr>
+            <w:tcW w:type="dxa" w:w="1440"/>
+          </w:tcPr>
+          <w:p>
+            <w:r>
+              <w:t>Yes</w:t>
+            </w:r>
+          </w:p>
+        </w:tc>
+        <w:tc>
+          <w:tcPr>
+            <w:tcW w:type="dxa" w:w="1440"/>
+          </w:tcPr>
+          <w:p>
+            <w:r>
+              <w:t>0.316</w:t>
+            </w:r>
+          </w:p>
+        </w:tc>
+        <w:tc>
+          <w:tcPr>
+            <w:tcW w:type="dxa" w:w="1440"/>
+          </w:tcPr>
+          <w:p>
+            <w:r>
+              <w:t>$108.12</w:t>
+            </w:r>
+          </w:p>
+        </w:tc>
+        <w:tc>
+          <w:tcPr>
+            <w:tcW w:type="dxa" w:w="1440"/>
+          </w:tcPr>
+          <w:p>
+            <w:r>
+              <w:t>outcome</w:t>
+            </w:r>
+          </w:p>
+        </w:tc>
+      </w:tr>
+      <w:tr>
+        <w:tc>
+          <w:tcPr>
+            <w:tcW w:type="dxa" w:w="1440"/>
+          </w:tcPr>
+          <w:p>
+            <w:r>
+              <w:t>parent 644066</w:t>
+            </w:r>
+          </w:p>
+        </w:tc>
+        <w:tc>
+          <w:tcPr>
+            <w:tcW w:type="dxa" w:w="1440"/>
+          </w:tcPr>
+          <w:p>
+            <w:r>
+              <w:t>settled</w:t>
+            </w:r>
+          </w:p>
+        </w:tc>
+        <w:tc>
+          <w:tcPr>
+            <w:tcW w:type="dxa" w:w="1440"/>
+          </w:tcPr>
+          <w:p>
+            <w:r>
+              <w:t>No</w:t>
+            </w:r>
+          </w:p>
+        </w:tc>
+        <w:tc>
+          <w:tcPr>
+            <w:tcW w:type="dxa" w:w="1440"/>
+          </w:tcPr>
+          <w:p>
+            <w:r>
+              <w:t>0.510</w:t>
+            </w:r>
+          </w:p>
+        </w:tc>
+        <w:tc>
+          <w:tcPr>
+            <w:tcW w:type="dxa" w:w="1440"/>
+          </w:tcPr>
+          <w:p>
+            <w:r>
+              <w:t>$-50.00</w:t>
+            </w:r>
+          </w:p>
+        </w:tc>
+        <w:tc>
+          <w:tcPr>
+            <w:tcW w:type="dxa" w:w="1440"/>
+          </w:tcPr>
+          <w:p>
+            <w:r>
+              <w:t>outcome</w:t>
+            </w:r>
+          </w:p>
+        </w:tc>
+      </w:tr>
+      <w:tr>
+        <w:tc>
+          <w:tcPr>
+            <w:tcW w:type="dxa" w:w="1440"/>
+          </w:tcPr>
+          <w:p>
+            <w:r>
+              <w:t>parent 644020</w:t>
+            </w:r>
+          </w:p>
+        </w:tc>
+        <w:tc>
+          <w:tcPr>
+            <w:tcW w:type="dxa" w:w="1440"/>
+          </w:tcPr>
+          <w:p>
+            <w:r>
+              <w:t>settled</w:t>
+            </w:r>
+          </w:p>
+        </w:tc>
+        <w:tc>
+          <w:tcPr>
+            <w:tcW w:type="dxa" w:w="1440"/>
+          </w:tcPr>
+          <w:p>
+            <w:r>
+              <w:t>No</w:t>
+            </w:r>
+          </w:p>
+        </w:tc>
+        <w:tc>
+          <w:tcPr>
+            <w:tcW w:type="dxa" w:w="1440"/>
+          </w:tcPr>
+          <w:p>
+            <w:r>
+              <w:t>0.520</w:t>
+            </w:r>
+          </w:p>
+        </w:tc>
+        <w:tc>
+          <w:tcPr>
+            <w:tcW w:type="dxa" w:w="1440"/>
+          </w:tcPr>
+          <w:p>
+            <w:r>
+              <w:t>$-50.00</w:t>
+            </w:r>
+          </w:p>
+        </w:tc>
+        <w:tc>
+          <w:tcPr>
+            <w:tcW w:type="dxa" w:w="1440"/>
+          </w:tcPr>
+          <w:p>
+            <w:r>
+              <w:t>outcome</w:t>
+            </w:r>
+          </w:p>
+        </w:tc>
+      </w:tr>
+      <w:tr>
+        <w:tc>
+          <w:tcPr>
+            <w:tcW w:type="dxa" w:w="1440"/>
+          </w:tcPr>
+          <w:p>
+            <w:r>
+              <w:t>parent 643996</w:t>
+            </w:r>
+          </w:p>
+        </w:tc>
+        <w:tc>
+          <w:tcPr>
+            <w:tcW w:type="dxa" w:w="1440"/>
+          </w:tcPr>
+          <w:p>
+            <w:r>
+              <w:t>settled</w:t>
+            </w:r>
+          </w:p>
+        </w:tc>
+        <w:tc>
+          <w:tcPr>
+            <w:tcW w:type="dxa" w:w="1440"/>
+          </w:tcPr>
+          <w:p>
+            <w:r>
+              <w:t>No</w:t>
+            </w:r>
+          </w:p>
+        </w:tc>
+        <w:tc>
+          <w:tcPr>
+            <w:tcW w:type="dxa" w:w="1440"/>
+          </w:tcPr>
+          <w:p>
+            <w:r>
+              <w:t>0.262</w:t>
+            </w:r>
+          </w:p>
+        </w:tc>
+        <w:tc>
+          <w:tcPr>
+            <w:tcW w:type="dxa" w:w="1440"/>
+          </w:tcPr>
+          <w:p>
+            <w:r>
+              <w:t>$-50.00</w:t>
+            </w:r>
+          </w:p>
+        </w:tc>
+        <w:tc>
+          <w:tcPr>
+            <w:tcW w:type="dxa" w:w="1440"/>
+          </w:tcPr>
+          <w:p>
+            <w:r>
+              <w:t>outcome</w:t>
+            </w:r>
+          </w:p>
+        </w:tc>
+      </w:tr>
+      <w:tr>
+        <w:tc>
+          <w:tcPr>
+            <w:tcW w:type="dxa" w:w="1440"/>
+          </w:tcPr>
+          <w:p>
+            <w:r>
+              <w:t>parent 643963</w:t>
+            </w:r>
+          </w:p>
+        </w:tc>
+        <w:tc>
+          <w:tcPr>
+            <w:tcW w:type="dxa" w:w="1440"/>
+          </w:tcPr>
+          <w:p>
+            <w:r>
+              <w:t>settled</w:t>
+            </w:r>
+          </w:p>
+        </w:tc>
+        <w:tc>
+          <w:tcPr>
+            <w:tcW w:type="dxa" w:w="1440"/>
+          </w:tcPr>
+          <w:p>
+            <w:r>
+              <w:t>No</w:t>
+            </w:r>
+          </w:p>
+        </w:tc>
+        <w:tc>
+          <w:tcPr>
+            <w:tcW w:type="dxa" w:w="1440"/>
+          </w:tcPr>
+          <w:p>
+            <w:r>
+              <w:t>0.470</w:t>
+            </w:r>
+          </w:p>
+        </w:tc>
+        <w:tc>
+          <w:tcPr>
+            <w:tcW w:type="dxa" w:w="1440"/>
+          </w:tcPr>
+          <w:p>
+            <w:r>
+              <w:t>$-50.00</w:t>
+            </w:r>
+          </w:p>
+        </w:tc>
+        <w:tc>
+          <w:tcPr>
+            <w:tcW w:type="dxa" w:w="1440"/>
+          </w:tcPr>
+          <w:p>
+            <w:r>
+              <w:t>outcome</w:t>
+            </w:r>
+          </w:p>
+        </w:tc>
+      </w:tr>
+      <w:tr>
+        <w:tc>
+          <w:tcPr>
+            <w:tcW w:type="dxa" w:w="1440"/>
+          </w:tcPr>
+          <w:p>
+            <w:r>
+              <w:t>parent 643933</w:t>
+            </w:r>
+          </w:p>
+        </w:tc>
+        <w:tc>
+          <w:tcPr>
+            <w:tcW w:type="dxa" w:w="1440"/>
+          </w:tcPr>
+          <w:p>
+            <w:r>
+              <w:t>settled</w:t>
+            </w:r>
+          </w:p>
+        </w:tc>
+        <w:tc>
+          <w:tcPr>
+            <w:tcW w:type="dxa" w:w="1440"/>
+          </w:tcPr>
+          <w:p>
+            <w:r>
+              <w:t>Yes</w:t>
+            </w:r>
+          </w:p>
+        </w:tc>
+        <w:tc>
+          <w:tcPr>
+            <w:tcW w:type="dxa" w:w="1440"/>
+          </w:tcPr>
+          <w:p>
+            <w:r>
+              <w:t>0.588</w:t>
+            </w:r>
+          </w:p>
+        </w:tc>
+        <w:tc>
+          <w:tcPr>
+            <w:tcW w:type="dxa" w:w="1440"/>
+          </w:tcPr>
+          <w:p>
+            <w:r>
+              <w:t>$35.01</w:t>
+            </w:r>
+          </w:p>
+        </w:tc>
+        <w:tc>
+          <w:tcPr>
+            <w:tcW w:type="dxa" w:w="1440"/>
+          </w:tcPr>
+          <w:p>
+            <w:r>
+              <w:t>outcome</w:t>
+            </w:r>
+          </w:p>
+        </w:tc>
+      </w:tr>
+      <w:tr>
+        <w:tc>
+          <w:tcPr>
+            <w:tcW w:type="dxa" w:w="1440"/>
+          </w:tcPr>
+          <w:p>
+            <w:r>
+              <w:t>parent 643844</w:t>
+            </w:r>
+          </w:p>
+        </w:tc>
+        <w:tc>
+          <w:tcPr>
+            <w:tcW w:type="dxa" w:w="1440"/>
+          </w:tcPr>
+          <w:p>
+            <w:r>
+              <w:t>settled</w:t>
+            </w:r>
+          </w:p>
+        </w:tc>
+        <w:tc>
+          <w:tcPr>
+            <w:tcW w:type="dxa" w:w="1440"/>
+          </w:tcPr>
+          <w:p>
+            <w:r>
+              <w:t>Yes</w:t>
+            </w:r>
+          </w:p>
+        </w:tc>
+        <w:tc>
+          <w:tcPr>
+            <w:tcW w:type="dxa" w:w="1440"/>
+          </w:tcPr>
+          <w:p>
+            <w:r>
+              <w:t>0.513</w:t>
+            </w:r>
+          </w:p>
+        </w:tc>
+        <w:tc>
+          <w:tcPr>
+            <w:tcW w:type="dxa" w:w="1440"/>
+          </w:tcPr>
+          <w:p>
+            <w:r>
+              <w:t>$47.46</w:t>
+            </w:r>
+          </w:p>
+        </w:tc>
+        <w:tc>
+          <w:tcPr>
+            <w:tcW w:type="dxa" w:w="1440"/>
+          </w:tcPr>
+          <w:p>
+            <w:r>
+              <w:t>outcome</w:t>
+            </w:r>
+          </w:p>
+        </w:tc>
+      </w:tr>
+      <w:tr>
+        <w:tc>
+          <w:tcPr>
+            <w:tcW w:type="dxa" w:w="1440"/>
+          </w:tcPr>
+          <w:p>
+            <w:r>
+              <w:t>parent 643813</w:t>
+            </w:r>
+          </w:p>
+        </w:tc>
+        <w:tc>
+          <w:tcPr>
+            <w:tcW w:type="dxa" w:w="1440"/>
+          </w:tcPr>
+          <w:p>
+            <w:r>
+              <w:t>settled</w:t>
+            </w:r>
+          </w:p>
+        </w:tc>
+        <w:tc>
+          <w:tcPr>
+            <w:tcW w:type="dxa" w:w="1440"/>
+          </w:tcPr>
+          <w:p>
+            <w:r>
+              <w:t>Yes</w:t>
+            </w:r>
+          </w:p>
+        </w:tc>
+        <w:tc>
+          <w:tcPr>
+            <w:tcW w:type="dxa" w:w="1440"/>
+          </w:tcPr>
+          <w:p>
+            <w:r>
+              <w:t>0.600</w:t>
+            </w:r>
+          </w:p>
+        </w:tc>
+        <w:tc>
+          <w:tcPr>
+            <w:tcW w:type="dxa" w:w="1440"/>
+          </w:tcPr>
+          <w:p>
+            <w:r>
+              <w:t>$33.33</w:t>
+            </w:r>
+          </w:p>
+        </w:tc>
+        <w:tc>
+          <w:tcPr>
+            <w:tcW w:type="dxa" w:w="1440"/>
+          </w:tcPr>
+          <w:p>
+            <w:r>
+              <w:t>outcome</w:t>
+            </w:r>
+          </w:p>
+        </w:tc>
+      </w:tr>
+      <w:tr>
+        <w:tc>
+          <w:tcPr>
+            <w:tcW w:type="dxa" w:w="1440"/>
+          </w:tcPr>
+          <w:p>
+            <w:r>
+              <w:t>parent 643786</w:t>
+            </w:r>
+          </w:p>
+        </w:tc>
+        <w:tc>
+          <w:tcPr>
+            <w:tcW w:type="dxa" w:w="1440"/>
+          </w:tcPr>
+          <w:p>
+            <w:r>
+              <w:t>settled</w:t>
+            </w:r>
+          </w:p>
+        </w:tc>
+        <w:tc>
+          <w:tcPr>
+            <w:tcW w:type="dxa" w:w="1440"/>
+          </w:tcPr>
+          <w:p>
+            <w:r>
+              <w:t>No</w:t>
+            </w:r>
+          </w:p>
+        </w:tc>
+        <w:tc>
+          <w:tcPr>
+            <w:tcW w:type="dxa" w:w="1440"/>
+          </w:tcPr>
+          <w:p>
+            <w:r>
+              <w:t>0.550</w:t>
+            </w:r>
+          </w:p>
+        </w:tc>
+        <w:tc>
+          <w:tcPr>
+            <w:tcW w:type="dxa" w:w="1440"/>
+          </w:tcPr>
+          <w:p>
+            <w:r>
+              <w:t>$-50.00</w:t>
+            </w:r>
+          </w:p>
+        </w:tc>
+        <w:tc>
+          <w:tcPr>
+            <w:tcW w:type="dxa" w:w="1440"/>
+          </w:tcPr>
+          <w:p>
+            <w:r>
+              <w:t>outcome</w:t>
+            </w:r>
+          </w:p>
+        </w:tc>
+      </w:tr>
+      <w:tr>
+        <w:tc>
+          <w:tcPr>
+            <w:tcW w:type="dxa" w:w="1440"/>
+          </w:tcPr>
+          <w:p>
+            <w:r>
+              <w:t>parent 643761</w:t>
+            </w:r>
+          </w:p>
+        </w:tc>
+        <w:tc>
+          <w:tcPr>
+            <w:tcW w:type="dxa" w:w="1440"/>
+          </w:tcPr>
+          <w:p>
+            <w:r>
+              <w:t>settled</w:t>
+            </w:r>
+          </w:p>
+        </w:tc>
+        <w:tc>
+          <w:tcPr>
+            <w:tcW w:type="dxa" w:w="1440"/>
+          </w:tcPr>
+          <w:p>
+            <w:r>
+              <w:t>Yes</w:t>
+            </w:r>
+          </w:p>
+        </w:tc>
+        <w:tc>
+          <w:tcPr>
+            <w:tcW w:type="dxa" w:w="1440"/>
+          </w:tcPr>
+          <w:p>
+            <w:r>
+              <w:t>0.539</w:t>
+            </w:r>
+          </w:p>
+        </w:tc>
+        <w:tc>
+          <w:tcPr>
+            <w:tcW w:type="dxa" w:w="1440"/>
+          </w:tcPr>
+          <w:p>
+            <w:r>
+              <w:t>$42.83</w:t>
+            </w:r>
+          </w:p>
+        </w:tc>
+        <w:tc>
+          <w:tcPr>
+            <w:tcW w:type="dxa" w:w="1440"/>
+          </w:tcPr>
+          <w:p>
+            <w:r>
+              <w:t>outcome</w:t>
+            </w:r>
+          </w:p>
+        </w:tc>
+      </w:tr>
+      <w:tr>
+        <w:tc>
+          <w:tcPr>
+            <w:tcW w:type="dxa" w:w="1440"/>
+          </w:tcPr>
+          <w:p>
+            <w:r>
+              <w:t>parent 643724</w:t>
+            </w:r>
+          </w:p>
+        </w:tc>
+        <w:tc>
+          <w:tcPr>
+            <w:tcW w:type="dxa" w:w="1440"/>
+          </w:tcPr>
+          <w:p>
+            <w:r>
+              <w:t>settled</w:t>
+            </w:r>
+          </w:p>
+        </w:tc>
+        <w:tc>
+          <w:tcPr>
+            <w:tcW w:type="dxa" w:w="1440"/>
+          </w:tcPr>
+          <w:p>
+            <w:r>
+              <w:t>No</w:t>
+            </w:r>
+          </w:p>
+        </w:tc>
+        <w:tc>
+          <w:tcPr>
+            <w:tcW w:type="dxa" w:w="1440"/>
+          </w:tcPr>
+          <w:p>
+            <w:r>
+              <w:t>0.596</w:t>
+            </w:r>
+          </w:p>
+        </w:tc>
+        <w:tc>
+          <w:tcPr>
+            <w:tcW w:type="dxa" w:w="1440"/>
+          </w:tcPr>
+          <w:p>
+            <w:r>
+              <w:t>$-50.00</w:t>
+            </w:r>
+          </w:p>
+        </w:tc>
+        <w:tc>
+          <w:tcPr>
+            <w:tcW w:type="dxa" w:w="1440"/>
+          </w:tcPr>
+          <w:p>
+            <w:r>
+              <w:t>outcome</w:t>
+            </w:r>
+          </w:p>
+        </w:tc>
+      </w:tr>
+      <w:tr>
+        <w:tc>
+          <w:tcPr>
+            <w:tcW w:type="dxa" w:w="1440"/>
+          </w:tcPr>
+          <w:p>
+            <w:r>
+              <w:t>parent 643683</w:t>
+            </w:r>
+          </w:p>
+        </w:tc>
+        <w:tc>
+          <w:tcPr>
+            <w:tcW w:type="dxa" w:w="1440"/>
+          </w:tcPr>
+          <w:p>
+            <w:r>
+              <w:t>settled</w:t>
+            </w:r>
+          </w:p>
+        </w:tc>
+        <w:tc>
+          <w:tcPr>
+            <w:tcW w:type="dxa" w:w="1440"/>
+          </w:tcPr>
+          <w:p>
+            <w:r>
+              <w:t>Yes</w:t>
+            </w:r>
+          </w:p>
+        </w:tc>
+        <w:tc>
+          <w:tcPr>
+            <w:tcW w:type="dxa" w:w="1440"/>
+          </w:tcPr>
+          <w:p>
+            <w:r>
+              <w:t>0.530</w:t>
+            </w:r>
+          </w:p>
+        </w:tc>
+        <w:tc>
+          <w:tcPr>
+            <w:tcW w:type="dxa" w:w="1440"/>
+          </w:tcPr>
+          <w:p>
+            <w:r>
+              <w:t>$44.34</w:t>
+            </w:r>
+          </w:p>
+        </w:tc>
+        <w:tc>
+          <w:tcPr>
+            <w:tcW w:type="dxa" w:w="1440"/>
+          </w:tcPr>
+          <w:p>
+            <w:r>
+              <w:t>outcome</w:t>
+            </w:r>
+          </w:p>
+        </w:tc>
+      </w:tr>
+      <w:tr>
+        <w:tc>
+          <w:tcPr>
+            <w:tcW w:type="dxa" w:w="1440"/>
+          </w:tcPr>
+          <w:p>
+            <w:r>
+              <w:t>parent 643656</w:t>
+            </w:r>
+          </w:p>
+        </w:tc>
+        <w:tc>
+          <w:tcPr>
+            <w:tcW w:type="dxa" w:w="1440"/>
+          </w:tcPr>
+          <w:p>
+            <w:r>
+              <w:t>settled</w:t>
+            </w:r>
+          </w:p>
+        </w:tc>
+        <w:tc>
+          <w:tcPr>
+            <w:tcW w:type="dxa" w:w="1440"/>
+          </w:tcPr>
+          <w:p>
+            <w:r>
+              <w:t>No</w:t>
+            </w:r>
+          </w:p>
+        </w:tc>
+        <w:tc>
+          <w:tcPr>
+            <w:tcW w:type="dxa" w:w="1440"/>
+          </w:tcPr>
+          <w:p>
+            <w:r>
+              <w:t>0.540</w:t>
+            </w:r>
+          </w:p>
+        </w:tc>
+        <w:tc>
+          <w:tcPr>
+            <w:tcW w:type="dxa" w:w="1440"/>
+          </w:tcPr>
+          <w:p>
+            <w:r>
+              <w:t>$-50.00</w:t>
+            </w:r>
+          </w:p>
+        </w:tc>
+        <w:tc>
+          <w:tcPr>
+            <w:tcW w:type="dxa" w:w="1440"/>
+          </w:tcPr>
+          <w:p>
+            <w:r>
+              <w:t>outcome</w:t>
+            </w:r>
+          </w:p>
+        </w:tc>
+      </w:tr>
+      <w:tr>
+        <w:tc>
+          <w:tcPr>
+            <w:tcW w:type="dxa" w:w="1440"/>
+          </w:tcPr>
+          <w:p>
+            <w:r>
+              <w:t>parent 643630</w:t>
+            </w:r>
+          </w:p>
+        </w:tc>
+        <w:tc>
+          <w:tcPr>
+            <w:tcW w:type="dxa" w:w="1440"/>
+          </w:tcPr>
+          <w:p>
+            <w:r>
+              <w:t>settled</w:t>
+            </w:r>
+          </w:p>
+        </w:tc>
+        <w:tc>
+          <w:tcPr>
+            <w:tcW w:type="dxa" w:w="1440"/>
+          </w:tcPr>
+          <w:p>
+            <w:r>
+              <w:t>No</w:t>
+            </w:r>
+          </w:p>
+        </w:tc>
+        <w:tc>
+          <w:tcPr>
+            <w:tcW w:type="dxa" w:w="1440"/>
+          </w:tcPr>
+          <w:p>
+            <w:r>
+              <w:t>0.760</w:t>
+            </w:r>
+          </w:p>
+        </w:tc>
+        <w:tc>
+          <w:tcPr>
+            <w:tcW w:type="dxa" w:w="1440"/>
+          </w:tcPr>
+          <w:p>
+            <w:r>
+              <w:t>$-50.00</w:t>
+            </w:r>
+          </w:p>
+        </w:tc>
+        <w:tc>
+          <w:tcPr>
+            <w:tcW w:type="dxa" w:w="1440"/>
+          </w:tcPr>
+          <w:p>
+            <w:r>
+              <w:t>outcome</w:t>
+            </w:r>
+          </w:p>
+        </w:tc>
+      </w:tr>
+      <w:tr>
+        <w:tc>
+          <w:tcPr>
+            <w:tcW w:type="dxa" w:w="1440"/>
+          </w:tcPr>
+          <w:p>
+            <w:r>
+              <w:t>parent 643598</w:t>
+            </w:r>
+          </w:p>
+        </w:tc>
+        <w:tc>
+          <w:tcPr>
+            <w:tcW w:type="dxa" w:w="1440"/>
+          </w:tcPr>
+          <w:p>
+            <w:r>
+              <w:t>settled</w:t>
+            </w:r>
+          </w:p>
+        </w:tc>
+        <w:tc>
+          <w:tcPr>
+            <w:tcW w:type="dxa" w:w="1440"/>
+          </w:tcPr>
+          <w:p>
+            <w:r>
+              <w:t>No</w:t>
+            </w:r>
+          </w:p>
+        </w:tc>
+        <w:tc>
+          <w:tcPr>
+            <w:tcW w:type="dxa" w:w="1440"/>
+          </w:tcPr>
+          <w:p>
+            <w:r>
+              <w:t>0.550</w:t>
+            </w:r>
+          </w:p>
+        </w:tc>
+        <w:tc>
+          <w:tcPr>
+            <w:tcW w:type="dxa" w:w="1440"/>
+          </w:tcPr>
+          <w:p>
+            <w:r>
+              <w:t>$-50.00</w:t>
+            </w:r>
+          </w:p>
+        </w:tc>
+        <w:tc>
+          <w:tcPr>
+            <w:tcW w:type="dxa" w:w="1440"/>
+          </w:tcPr>
+          <w:p>
+            <w:r>
+              <w:t>outcome</w:t>
+            </w:r>
+          </w:p>
+        </w:tc>
+      </w:tr>
+      <w:tr>
+        <w:tc>
+          <w:tcPr>
+            <w:tcW w:type="dxa" w:w="1440"/>
+          </w:tcPr>
+          <w:p>
+            <w:r>
+              <w:t>parent 643562</w:t>
+            </w:r>
+          </w:p>
+        </w:tc>
+        <w:tc>
+          <w:tcPr>
+            <w:tcW w:type="dxa" w:w="1440"/>
+          </w:tcPr>
+          <w:p>
+            <w:r>
+              <w:t>settled</w:t>
+            </w:r>
+          </w:p>
+        </w:tc>
+        <w:tc>
+          <w:tcPr>
+            <w:tcW w:type="dxa" w:w="1440"/>
+          </w:tcPr>
+          <w:p>
+            <w:r>
+              <w:t>No</w:t>
+            </w:r>
+          </w:p>
+        </w:tc>
+        <w:tc>
+          <w:tcPr>
+            <w:tcW w:type="dxa" w:w="1440"/>
+          </w:tcPr>
+          <w:p>
+            <w:r>
+              <w:t>0.499</w:t>
+            </w:r>
+          </w:p>
+        </w:tc>
+        <w:tc>
+          <w:tcPr>
+            <w:tcW w:type="dxa" w:w="1440"/>
+          </w:tcPr>
+          <w:p>
+            <w:r>
+              <w:t>$-50.00</w:t>
+            </w:r>
+          </w:p>
+        </w:tc>
+        <w:tc>
+          <w:tcPr>
+            <w:tcW w:type="dxa" w:w="1440"/>
+          </w:tcPr>
+          <w:p>
+            <w:r>
+              <w:t>outcome</w:t>
+            </w:r>
+          </w:p>
+        </w:tc>
+      </w:tr>
+      <w:tr>
+        <w:tc>
+          <w:tcPr>
+            <w:tcW w:type="dxa" w:w="1440"/>
+          </w:tcPr>
+          <w:p>
+            <w:r>
+              <w:t>parent 643527</w:t>
+            </w:r>
+          </w:p>
+        </w:tc>
+        <w:tc>
+          <w:tcPr>
+            <w:tcW w:type="dxa" w:w="1440"/>
+          </w:tcPr>
+          <w:p>
+            <w:r>
+              <w:t>settled</w:t>
+            </w:r>
+          </w:p>
+        </w:tc>
+        <w:tc>
+          <w:tcPr>
+            <w:tcW w:type="dxa" w:w="1440"/>
+          </w:tcPr>
+          <w:p>
+            <w:r>
+              <w:t>Yes</w:t>
+            </w:r>
+          </w:p>
+        </w:tc>
+        <w:tc>
+          <w:tcPr>
+            <w:tcW w:type="dxa" w:w="1440"/>
+          </w:tcPr>
+          <w:p>
+            <w:r>
+              <w:t>0.568</w:t>
+            </w:r>
+          </w:p>
+        </w:tc>
+        <w:tc>
+          <w:tcPr>
+            <w:tcW w:type="dxa" w:w="1440"/>
+          </w:tcPr>
+          <w:p>
+            <w:r>
+              <w:t>$38.07</w:t>
+            </w:r>
+          </w:p>
+        </w:tc>
+        <w:tc>
+          <w:tcPr>
+            <w:tcW w:type="dxa" w:w="1440"/>
+          </w:tcPr>
+          <w:p>
+            <w:r>
+              <w:t>outcome</w:t>
+            </w:r>
+          </w:p>
+        </w:tc>
+      </w:tr>
+      <w:tr>
+        <w:tc>
+          <w:tcPr>
+            <w:tcW w:type="dxa" w:w="1440"/>
+          </w:tcPr>
+          <w:p>
+            <w:r>
+              <w:t>parent 643501</w:t>
+            </w:r>
+          </w:p>
+        </w:tc>
+        <w:tc>
+          <w:tcPr>
+            <w:tcW w:type="dxa" w:w="1440"/>
+          </w:tcPr>
+          <w:p>
+            <w:r>
+              <w:t>settled</w:t>
+            </w:r>
+          </w:p>
+        </w:tc>
+        <w:tc>
+          <w:tcPr>
+            <w:tcW w:type="dxa" w:w="1440"/>
+          </w:tcPr>
+          <w:p>
+            <w:r>
+              <w:t>Yes</w:t>
+            </w:r>
+          </w:p>
+        </w:tc>
+        <w:tc>
+          <w:tcPr>
+            <w:tcW w:type="dxa" w:w="1440"/>
+          </w:tcPr>
+          <w:p>
+            <w:r>
+              <w:t>0.270</w:t>
+            </w:r>
+          </w:p>
+        </w:tc>
+        <w:tc>
+          <w:tcPr>
+            <w:tcW w:type="dxa" w:w="1440"/>
+          </w:tcPr>
+          <w:p>
+            <w:r>
+              <w:t>$135.19</w:t>
+            </w:r>
+          </w:p>
+        </w:tc>
+        <w:tc>
+          <w:tcPr>
+            <w:tcW w:type="dxa" w:w="1440"/>
+          </w:tcPr>
+          <w:p>
+            <w:r>
+              <w:t>outcome</w:t>
+            </w:r>
+          </w:p>
+        </w:tc>
+      </w:tr>
+      <w:tr>
+        <w:tc>
+          <w:tcPr>
+            <w:tcW w:type="dxa" w:w="1440"/>
+          </w:tcPr>
+          <w:p>
+            <w:r>
+              <w:t>parent 643455</w:t>
+            </w:r>
+          </w:p>
+        </w:tc>
+        <w:tc>
+          <w:tcPr>
+            <w:tcW w:type="dxa" w:w="1440"/>
+          </w:tcPr>
+          <w:p>
+            <w:r>
+              <w:t>settled</w:t>
+            </w:r>
+          </w:p>
+        </w:tc>
+        <w:tc>
+          <w:tcPr>
+            <w:tcW w:type="dxa" w:w="1440"/>
+          </w:tcPr>
+          <w:p>
+            <w:r>
+              <w:t>Yes</w:t>
+            </w:r>
+          </w:p>
+        </w:tc>
+        <w:tc>
+          <w:tcPr>
+            <w:tcW w:type="dxa" w:w="1440"/>
+          </w:tcPr>
+          <w:p>
+            <w:r>
+              <w:t>0.510</w:t>
+            </w:r>
+          </w:p>
+        </w:tc>
+        <w:tc>
+          <w:tcPr>
+            <w:tcW w:type="dxa" w:w="1440"/>
+          </w:tcPr>
+          <w:p>
+            <w:r>
+              <w:t>$48.04</w:t>
+            </w:r>
+          </w:p>
+        </w:tc>
+        <w:tc>
+          <w:tcPr>
+            <w:tcW w:type="dxa" w:w="1440"/>
+          </w:tcPr>
+          <w:p>
+            <w:r>
+              <w:t>outcome</w:t>
+            </w:r>
+          </w:p>
+        </w:tc>
+      </w:tr>
+    </w:tbl>
+    <w:p>
+      <w:pPr>
+        <w:pStyle w:val="Heading2"/>
+      </w:pPr>
+      <w:r>
+        <w:t>Dutch-book arbitrage</w:t>
       </w:r>
     </w:p>
     <w:p>
@@ -2539,12 +4107,12 @@
     </w:tbl>
     <w:p>
       <w:r>
-        <w:t>Ticks: 1215 · Reconciled: True · Readiness: not_ready</w:t>
+        <w:t>Ticks: 5 · Reconciled: True · Readiness: not_ready</w:t>
       </w:r>
     </w:p>
     <w:p>
       <w:r>
-        <w:t>Candidates created: 7842 · Terminals: {'accepted': 0, 'rejected': 584, 'skipped': 7224, 'expired': 0, 'missing_data': 34}</w:t>
+        <w:t>Candidates created: 7916 · Terminals: {'accepted': 0, 'rejected': 584, 'skipped': 7296, 'expired': 0, 'missing_data': 36}</w:t>
       </w:r>
     </w:p>
     <w:p>
@@ -3532,7 +5100,7 @@
     </w:tbl>
     <w:p>
       <w:r>
-        <w:t>TV alerts: received 1188 · valid 969 · rejected 219</w:t>
+        <w:t>TV alerts: received 1197 · valid 978 · rejected 219</w:t>
       </w:r>
     </w:p>
     <w:sectPr>

</xml_diff>

<commit_message>
chore(reports): VPS full report 2026-06-29 20:25 UTC (2 settled, WR 0.0%, PF 0.0, grade D)
</commit_message>
<xml_diff>
--- a/vps_full_reports/latest/report.docx
+++ b/vps_full_reports/latest/report.docx
@@ -20,7 +20,7 @@
           <w:color w:val="666666"/>
           <w:sz w:val="20"/>
         </w:rPr>
-        <w:t>PAPER ONLY  ·  reconciled=True  ·  ticks=5</w:t>
+        <w:t>PAPER ONLY  ·  reconciled=True  ·  ticks=7</w:t>
       </w:r>
     </w:p>
     <w:p>
@@ -33,7 +33,7 @@
     </w:p>
     <w:p>
       <w:r>
-        <w:t>Overall score: 65.2 / 100  (Grade: D)</w:t>
+        <w:t>Overall score: 50.1 / 100  (Grade: F)</w:t>
       </w:r>
     </w:p>
     <w:tbl>
@@ -107,7 +107,7 @@
           </w:tcPr>
           <w:p>
             <w:r>
-              <w:t>70.0</w:t>
+              <w:t>39.8</w:t>
             </w:r>
           </w:p>
         </w:tc>
@@ -117,7 +117,7 @@
           </w:tcPr>
           <w:p>
             <w:r>
-              <w:t>C</w:t>
+              <w:t>F</w:t>
             </w:r>
           </w:p>
         </w:tc>
@@ -149,7 +149,7 @@
           </w:tcPr>
           <w:p>
             <w:r>
-              <w:t>71.5</w:t>
+              <w:t>75.4</w:t>
             </w:r>
           </w:p>
         </w:tc>
@@ -159,7 +159,7 @@
           </w:tcPr>
           <w:p>
             <w:r>
-              <w:t>C</w:t>
+              <w:t>C+</w:t>
             </w:r>
           </w:p>
         </w:tc>
@@ -191,7 +191,7 @@
           </w:tcPr>
           <w:p>
             <w:r>
-              <w:t>49.4</w:t>
+              <w:t>45.6</w:t>
             </w:r>
           </w:p>
         </w:tc>
@@ -319,7 +319,7 @@
           </w:tcPr>
           <w:p>
             <w:r>
-              <w:t>2026-06-29 04:16:34</w:t>
+              <w:t>2026-06-29 12:33:24</w:t>
             </w:r>
           </w:p>
         </w:tc>
@@ -337,7 +337,7 @@
           </w:tcPr>
           <w:p>
             <w:r>
-              <w:t>70.0</w:t>
+              <w:t>58.0</w:t>
             </w:r>
           </w:p>
         </w:tc>
@@ -367,7 +367,7 @@
           </w:tcPr>
           <w:p>
             <w:r>
-              <w:t>65.2</w:t>
+              <w:t>59.2</w:t>
             </w:r>
           </w:p>
         </w:tc>
@@ -377,7 +377,7 @@
           </w:tcPr>
           <w:p>
             <w:r>
-              <w:t>278</w:t>
+              <w:t>197</w:t>
             </w:r>
           </w:p>
         </w:tc>
@@ -389,7 +389,7 @@
           </w:tcPr>
           <w:p>
             <w:r>
-              <w:t>2026-06-29 04:46:49</w:t>
+              <w:t>2026-06-29 12:45:09</w:t>
             </w:r>
           </w:p>
         </w:tc>
@@ -407,7 +407,7 @@
           </w:tcPr>
           <w:p>
             <w:r>
-              <w:t>70.0</w:t>
+              <w:t>48.0</w:t>
             </w:r>
           </w:p>
         </w:tc>
@@ -417,7 +417,7 @@
           </w:tcPr>
           <w:p>
             <w:r>
-              <w:t>71.5</w:t>
+              <w:t>56.5</w:t>
             </w:r>
           </w:p>
         </w:tc>
@@ -437,7 +437,7 @@
           </w:tcPr>
           <w:p>
             <w:r>
-              <w:t>65.2</w:t>
+              <w:t>50.5</w:t>
             </w:r>
           </w:p>
         </w:tc>
@@ -447,7 +447,7 @@
           </w:tcPr>
           <w:p>
             <w:r>
-              <w:t>399</w:t>
+              <w:t>244</w:t>
             </w:r>
           </w:p>
         </w:tc>
@@ -459,7 +459,7 @@
           </w:tcPr>
           <w:p>
             <w:r>
-              <w:t>2026-06-29 05:16:56</w:t>
+              <w:t>2026-06-29 13:05:24</w:t>
             </w:r>
           </w:p>
         </w:tc>
@@ -477,7 +477,7 @@
           </w:tcPr>
           <w:p>
             <w:r>
-              <w:t>70.0</w:t>
+              <w:t>42.5</w:t>
             </w:r>
           </w:p>
         </w:tc>
@@ -487,7 +487,7 @@
           </w:tcPr>
           <w:p>
             <w:r>
-              <w:t>71.5</w:t>
+              <w:t>56.5</w:t>
             </w:r>
           </w:p>
         </w:tc>
@@ -507,7 +507,7 @@
           </w:tcPr>
           <w:p>
             <w:r>
-              <w:t>65.2</w:t>
+              <w:t>47.7</w:t>
             </w:r>
           </w:p>
         </w:tc>
@@ -517,7 +517,7 @@
           </w:tcPr>
           <w:p>
             <w:r>
-              <w:t>119</w:t>
+              <w:t>325</w:t>
             </w:r>
           </w:p>
         </w:tc>
@@ -529,7 +529,7 @@
           </w:tcPr>
           <w:p>
             <w:r>
-              <w:t>2026-06-29 05:46:56</w:t>
+              <w:t>2026-06-29 13:18:24</w:t>
             </w:r>
           </w:p>
         </w:tc>
@@ -547,7 +547,7 @@
           </w:tcPr>
           <w:p>
             <w:r>
-              <w:t>70.0</w:t>
+              <w:t>45.5</w:t>
             </w:r>
           </w:p>
         </w:tc>
@@ -557,7 +557,7 @@
           </w:tcPr>
           <w:p>
             <w:r>
-              <w:t>71.5</w:t>
+              <w:t>56.5</w:t>
             </w:r>
           </w:p>
         </w:tc>
@@ -577,7 +577,7 @@
           </w:tcPr>
           <w:p>
             <w:r>
-              <w:t>65.2</w:t>
+              <w:t>49.2</w:t>
             </w:r>
           </w:p>
         </w:tc>
@@ -587,7 +587,7 @@
           </w:tcPr>
           <w:p>
             <w:r>
-              <w:t>239</w:t>
+              <w:t>377</w:t>
             </w:r>
           </w:p>
         </w:tc>
@@ -599,7 +599,7 @@
           </w:tcPr>
           <w:p>
             <w:r>
-              <w:t>2026-06-29 06:16:56</w:t>
+              <w:t>2026-06-29 13:31:38</w:t>
             </w:r>
           </w:p>
         </w:tc>
@@ -617,7 +617,7 @@
           </w:tcPr>
           <w:p>
             <w:r>
-              <w:t>70.0</w:t>
+              <w:t>42.5</w:t>
             </w:r>
           </w:p>
         </w:tc>
@@ -627,7 +627,7 @@
           </w:tcPr>
           <w:p>
             <w:r>
-              <w:t>71.5</w:t>
+              <w:t>56.5</w:t>
             </w:r>
           </w:p>
         </w:tc>
@@ -647,7 +647,7 @@
           </w:tcPr>
           <w:p>
             <w:r>
-              <w:t>65.2</w:t>
+              <w:t>47.7</w:t>
             </w:r>
           </w:p>
         </w:tc>
@@ -657,7 +657,7 @@
           </w:tcPr>
           <w:p>
             <w:r>
-              <w:t>359</w:t>
+              <w:t>430</w:t>
             </w:r>
           </w:p>
         </w:tc>
@@ -669,7 +669,7 @@
           </w:tcPr>
           <w:p>
             <w:r>
-              <w:t>2026-06-29 06:47:10</w:t>
+              <w:t>2026-06-29 14:01:39</w:t>
             </w:r>
           </w:p>
         </w:tc>
@@ -687,7 +687,7 @@
           </w:tcPr>
           <w:p>
             <w:r>
-              <w:t>70.0</w:t>
+              <w:t>42.5</w:t>
             </w:r>
           </w:p>
         </w:tc>
@@ -697,7 +697,7 @@
           </w:tcPr>
           <w:p>
             <w:r>
-              <w:t>71.5</w:t>
+              <w:t>56.5</w:t>
             </w:r>
           </w:p>
         </w:tc>
@@ -717,7 +717,7 @@
           </w:tcPr>
           <w:p>
             <w:r>
-              <w:t>65.2</w:t>
+              <w:t>47.7</w:t>
             </w:r>
           </w:p>
         </w:tc>
@@ -727,7 +727,7 @@
           </w:tcPr>
           <w:p>
             <w:r>
-              <w:t>66</w:t>
+              <w:t>550</w:t>
             </w:r>
           </w:p>
         </w:tc>
@@ -739,7 +739,7 @@
           </w:tcPr>
           <w:p>
             <w:r>
-              <w:t>2026-06-29 06:49:55</w:t>
+              <w:t>2026-06-29 14:31:39</w:t>
             </w:r>
           </w:p>
         </w:tc>
@@ -757,7 +757,7 @@
           </w:tcPr>
           <w:p>
             <w:r>
-              <w:t>62.4</w:t>
+              <w:t>42.5</w:t>
             </w:r>
           </w:p>
         </w:tc>
@@ -767,7 +767,7 @@
           </w:tcPr>
           <w:p>
             <w:r>
-              <w:t>71.5</w:t>
+              <w:t>56.5</w:t>
             </w:r>
           </w:p>
         </w:tc>
@@ -787,7 +787,7 @@
           </w:tcPr>
           <w:p>
             <w:r>
-              <w:t>61.4</w:t>
+              <w:t>47.7</w:t>
             </w:r>
           </w:p>
         </w:tc>
@@ -797,7 +797,7 @@
           </w:tcPr>
           <w:p>
             <w:r>
-              <w:t>77</w:t>
+              <w:t>670</w:t>
             </w:r>
           </w:p>
         </w:tc>
@@ -809,7 +809,7 @@
           </w:tcPr>
           <w:p>
             <w:r>
-              <w:t>2026-06-29 07:05:40</w:t>
+              <w:t>2026-06-29 15:01:46</w:t>
             </w:r>
           </w:p>
         </w:tc>
@@ -827,7 +827,7 @@
           </w:tcPr>
           <w:p>
             <w:r>
-              <w:t>70.0</w:t>
+              <w:t>42.5</w:t>
             </w:r>
           </w:p>
         </w:tc>
@@ -837,7 +837,7 @@
           </w:tcPr>
           <w:p>
             <w:r>
-              <w:t>71.5</w:t>
+              <w:t>56.5</w:t>
             </w:r>
           </w:p>
         </w:tc>
@@ -857,7 +857,7 @@
           </w:tcPr>
           <w:p>
             <w:r>
-              <w:t>65.2</w:t>
+              <w:t>47.7</w:t>
             </w:r>
           </w:p>
         </w:tc>
@@ -867,7 +867,7 @@
           </w:tcPr>
           <w:p>
             <w:r>
-              <w:t>140</w:t>
+              <w:t>73</w:t>
             </w:r>
           </w:p>
         </w:tc>
@@ -879,7 +879,7 @@
           </w:tcPr>
           <w:p>
             <w:r>
-              <w:t>2026-06-29 07:35:40</w:t>
+              <w:t>2026-06-29 15:31:46</w:t>
             </w:r>
           </w:p>
         </w:tc>
@@ -897,7 +897,7 @@
           </w:tcPr>
           <w:p>
             <w:r>
-              <w:t>70.0</w:t>
+              <w:t>42.5</w:t>
             </w:r>
           </w:p>
         </w:tc>
@@ -907,7 +907,7 @@
           </w:tcPr>
           <w:p>
             <w:r>
-              <w:t>71.5</w:t>
+              <w:t>56.5</w:t>
             </w:r>
           </w:p>
         </w:tc>
@@ -927,7 +927,7 @@
           </w:tcPr>
           <w:p>
             <w:r>
-              <w:t>65.2</w:t>
+              <w:t>47.7</w:t>
             </w:r>
           </w:p>
         </w:tc>
@@ -937,7 +937,7 @@
           </w:tcPr>
           <w:p>
             <w:r>
-              <w:t>260</w:t>
+              <w:t>193</w:t>
             </w:r>
           </w:p>
         </w:tc>
@@ -949,7 +949,7 @@
           </w:tcPr>
           <w:p>
             <w:r>
-              <w:t>2026-06-29 08:05:40</w:t>
+              <w:t>2026-06-29 16:01:46</w:t>
             </w:r>
           </w:p>
         </w:tc>
@@ -967,7 +967,7 @@
           </w:tcPr>
           <w:p>
             <w:r>
-              <w:t>70.0</w:t>
+              <w:t>42.5</w:t>
             </w:r>
           </w:p>
         </w:tc>
@@ -977,7 +977,7 @@
           </w:tcPr>
           <w:p>
             <w:r>
-              <w:t>71.5</w:t>
+              <w:t>56.5</w:t>
             </w:r>
           </w:p>
         </w:tc>
@@ -997,7 +997,7 @@
           </w:tcPr>
           <w:p>
             <w:r>
-              <w:t>65.2</w:t>
+              <w:t>47.7</w:t>
             </w:r>
           </w:p>
         </w:tc>
@@ -1007,7 +1007,7 @@
           </w:tcPr>
           <w:p>
             <w:r>
-              <w:t>380</w:t>
+              <w:t>313</w:t>
             </w:r>
           </w:p>
         </w:tc>
@@ -1019,7 +1019,7 @@
           </w:tcPr>
           <w:p>
             <w:r>
-              <w:t>2026-06-29 08:35:55</w:t>
+              <w:t>2026-06-29 16:31:47</w:t>
             </w:r>
           </w:p>
         </w:tc>
@@ -1037,7 +1037,7 @@
           </w:tcPr>
           <w:p>
             <w:r>
-              <w:t>68.2</w:t>
+              <w:t>42.5</w:t>
             </w:r>
           </w:p>
         </w:tc>
@@ -1047,7 +1047,7 @@
           </w:tcPr>
           <w:p>
             <w:r>
-              <w:t>71.5</w:t>
+              <w:t>56.5</w:t>
             </w:r>
           </w:p>
         </w:tc>
@@ -1067,7 +1067,7 @@
           </w:tcPr>
           <w:p>
             <w:r>
-              <w:t>64.3</w:t>
+              <w:t>47.7</w:t>
             </w:r>
           </w:p>
         </w:tc>
@@ -1077,7 +1077,7 @@
           </w:tcPr>
           <w:p>
             <w:r>
-              <w:t>501</w:t>
+              <w:t>110</w:t>
             </w:r>
           </w:p>
         </w:tc>
@@ -1089,7 +1089,7 @@
           </w:tcPr>
           <w:p>
             <w:r>
-              <w:t>2026-06-29 09:06:55</w:t>
+              <w:t>2026-06-29 17:01:59</w:t>
             </w:r>
           </w:p>
         </w:tc>
@@ -1107,7 +1107,7 @@
           </w:tcPr>
           <w:p>
             <w:r>
-              <w:t>67.1</w:t>
+              <w:t>42.5</w:t>
             </w:r>
           </w:p>
         </w:tc>
@@ -1117,7 +1117,7 @@
           </w:tcPr>
           <w:p>
             <w:r>
-              <w:t>71.5</w:t>
+              <w:t>56.5</w:t>
             </w:r>
           </w:p>
         </w:tc>
@@ -1137,7 +1137,7 @@
           </w:tcPr>
           <w:p>
             <w:r>
-              <w:t>63.8</w:t>
+              <w:t>47.7</w:t>
             </w:r>
           </w:p>
         </w:tc>
@@ -1147,7 +1147,7 @@
           </w:tcPr>
           <w:p>
             <w:r>
-              <w:t>625</w:t>
+              <w:t>102</w:t>
             </w:r>
           </w:p>
         </w:tc>
@@ -1159,7 +1159,7 @@
           </w:tcPr>
           <w:p>
             <w:r>
-              <w:t>2026-06-29 09:19:40</w:t>
+              <w:t>2026-06-29 17:32:56</w:t>
             </w:r>
           </w:p>
         </w:tc>
@@ -1177,7 +1177,7 @@
           </w:tcPr>
           <w:p>
             <w:r>
-              <w:t>70.0</w:t>
+              <w:t>42.5</w:t>
             </w:r>
           </w:p>
         </w:tc>
@@ -1187,7 +1187,7 @@
           </w:tcPr>
           <w:p>
             <w:r>
-              <w:t>71.5</w:t>
+              <w:t>56.5</w:t>
             </w:r>
           </w:p>
         </w:tc>
@@ -1207,7 +1207,7 @@
           </w:tcPr>
           <w:p>
             <w:r>
-              <w:t>65.2</w:t>
+              <w:t>47.7</w:t>
             </w:r>
           </w:p>
         </w:tc>
@@ -1217,7 +1217,7 @@
           </w:tcPr>
           <w:p>
             <w:r>
-              <w:t>676</w:t>
+              <w:t>1</w:t>
             </w:r>
           </w:p>
         </w:tc>
@@ -1229,7 +1229,7 @@
           </w:tcPr>
           <w:p>
             <w:r>
-              <w:t>2026-06-29 09:36:25</w:t>
+              <w:t>2026-06-29 18:02:58</w:t>
             </w:r>
           </w:p>
         </w:tc>
@@ -1247,7 +1247,7 @@
           </w:tcPr>
           <w:p>
             <w:r>
-              <w:t>65.7</w:t>
+              <w:t>42.5</w:t>
             </w:r>
           </w:p>
         </w:tc>
@@ -1257,7 +1257,7 @@
           </w:tcPr>
           <w:p>
             <w:r>
-              <w:t>71.5</w:t>
+              <w:t>57.5</w:t>
             </w:r>
           </w:p>
         </w:tc>
@@ -1277,7 +1277,7 @@
           </w:tcPr>
           <w:p>
             <w:r>
-              <w:t>63.1</w:t>
+              <w:t>48.0</w:t>
             </w:r>
           </w:p>
         </w:tc>
@@ -1287,7 +1287,7 @@
           </w:tcPr>
           <w:p>
             <w:r>
-              <w:t>743</w:t>
+              <w:t>121</w:t>
             </w:r>
           </w:p>
         </w:tc>
@@ -1299,7 +1299,7 @@
           </w:tcPr>
           <w:p>
             <w:r>
-              <w:t>2026-06-29 09:51:25</w:t>
+              <w:t>2026-06-29 18:33:13</w:t>
             </w:r>
           </w:p>
         </w:tc>
@@ -1317,7 +1317,7 @@
           </w:tcPr>
           <w:p>
             <w:r>
-              <w:t>70.0</w:t>
+              <w:t>42.5</w:t>
             </w:r>
           </w:p>
         </w:tc>
@@ -1327,7 +1327,7 @@
           </w:tcPr>
           <w:p>
             <w:r>
-              <w:t>71.5</w:t>
+              <w:t>58.7</w:t>
             </w:r>
           </w:p>
         </w:tc>
@@ -1337,7 +1337,7 @@
           </w:tcPr>
           <w:p>
             <w:r>
-              <w:t>49.4</w:t>
+              <w:t>45.6</w:t>
             </w:r>
           </w:p>
         </w:tc>
@@ -1347,7 +1347,7 @@
           </w:tcPr>
           <w:p>
             <w:r>
-              <w:t>65.2</w:t>
+              <w:t>47.3</w:t>
             </w:r>
           </w:p>
         </w:tc>
@@ -1357,7 +1357,7 @@
           </w:tcPr>
           <w:p>
             <w:r>
-              <w:t>803</w:t>
+              <w:t>242</w:t>
             </w:r>
           </w:p>
         </w:tc>
@@ -1369,7 +1369,7 @@
           </w:tcPr>
           <w:p>
             <w:r>
-              <w:t>2026-06-29 10:21:40</w:t>
+              <w:t>2026-06-29 18:48:13</w:t>
             </w:r>
           </w:p>
         </w:tc>
@@ -1378,7 +1378,9 @@
             <w:tcW w:type="dxa" w:w="1234"/>
           </w:tcPr>
           <w:p>
-            <w:r/>
+            <w:r>
+              <w:t>1</w:t>
+            </w:r>
           </w:p>
         </w:tc>
         <w:tc>
@@ -1387,7 +1389,7 @@
           </w:tcPr>
           <w:p>
             <w:r>
-              <w:t>70.0</w:t>
+              <w:t>21.2</w:t>
             </w:r>
           </w:p>
         </w:tc>
@@ -1397,7 +1399,7 @@
           </w:tcPr>
           <w:p>
             <w:r>
-              <w:t>71.5</w:t>
+              <w:t>59.1</w:t>
             </w:r>
           </w:p>
         </w:tc>
@@ -1407,7 +1409,7 @@
           </w:tcPr>
           <w:p>
             <w:r>
-              <w:t>49.4</w:t>
+              <w:t>45.6</w:t>
             </w:r>
           </w:p>
         </w:tc>
@@ -1417,7 +1419,7 @@
           </w:tcPr>
           <w:p>
             <w:r>
-              <w:t>65.2</w:t>
+              <w:t>36.8</w:t>
             </w:r>
           </w:p>
         </w:tc>
@@ -1427,7 +1429,7 @@
           </w:tcPr>
           <w:p>
             <w:r>
-              <w:t>924</w:t>
+              <w:t>302</w:t>
             </w:r>
           </w:p>
         </w:tc>
@@ -1439,7 +1441,7 @@
           </w:tcPr>
           <w:p>
             <w:r>
-              <w:t>2026-06-29 10:51:41</w:t>
+              <w:t>2026-06-29 19:06:58</w:t>
             </w:r>
           </w:p>
         </w:tc>
@@ -1448,7 +1450,9 @@
             <w:tcW w:type="dxa" w:w="1234"/>
           </w:tcPr>
           <w:p>
-            <w:r/>
+            <w:r>
+              <w:t>2</w:t>
+            </w:r>
           </w:p>
         </w:tc>
         <w:tc>
@@ -1457,7 +1461,7 @@
           </w:tcPr>
           <w:p>
             <w:r>
-              <w:t>68.8</w:t>
+              <w:t>20.7</w:t>
             </w:r>
           </w:p>
         </w:tc>
@@ -1467,7 +1471,7 @@
           </w:tcPr>
           <w:p>
             <w:r>
-              <w:t>71.5</w:t>
+              <w:t>59.9</w:t>
             </w:r>
           </w:p>
         </w:tc>
@@ -1477,7 +1481,7 @@
           </w:tcPr>
           <w:p>
             <w:r>
-              <w:t>49.4</w:t>
+              <w:t>45.6</w:t>
             </w:r>
           </w:p>
         </w:tc>
@@ -1487,7 +1491,7 @@
           </w:tcPr>
           <w:p>
             <w:r>
-              <w:t>64.6</w:t>
+              <w:t>36.7</w:t>
             </w:r>
           </w:p>
         </w:tc>
@@ -1497,7 +1501,7 @@
           </w:tcPr>
           <w:p>
             <w:r>
-              <w:t>1044</w:t>
+              <w:t>377</w:t>
             </w:r>
           </w:p>
         </w:tc>
@@ -1509,7 +1513,7 @@
           </w:tcPr>
           <w:p>
             <w:r>
-              <w:t>2026-06-29 11:01:55</w:t>
+              <w:t>2026-06-29 19:37:13</w:t>
             </w:r>
           </w:p>
         </w:tc>
@@ -1518,7 +1522,9 @@
             <w:tcW w:type="dxa" w:w="1234"/>
           </w:tcPr>
           <w:p>
-            <w:r/>
+            <w:r>
+              <w:t>2</w:t>
+            </w:r>
           </w:p>
         </w:tc>
         <w:tc>
@@ -1527,7 +1533,7 @@
           </w:tcPr>
           <w:p>
             <w:r>
-              <w:t>49.5</w:t>
+              <w:t>19.8</w:t>
             </w:r>
           </w:p>
         </w:tc>
@@ -1537,7 +1543,7 @@
           </w:tcPr>
           <w:p>
             <w:r>
-              <w:t>56.5</w:t>
+              <w:t>59.9</w:t>
             </w:r>
           </w:p>
         </w:tc>
@@ -1547,7 +1553,7 @@
           </w:tcPr>
           <w:p>
             <w:r>
-              <w:t>49.4</w:t>
+              <w:t>45.6</w:t>
             </w:r>
           </w:p>
         </w:tc>
@@ -1557,7 +1563,7 @@
           </w:tcPr>
           <w:p>
             <w:r>
-              <w:t>51.2</w:t>
+              <w:t>36.3</w:t>
             </w:r>
           </w:p>
         </w:tc>
@@ -1567,7 +1573,7 @@
           </w:tcPr>
           <w:p>
             <w:r>
-              <w:t>1085</w:t>
+              <w:t>498</w:t>
             </w:r>
           </w:p>
         </w:tc>
@@ -1579,7 +1585,7 @@
           </w:tcPr>
           <w:p>
             <w:r>
-              <w:t>2026-06-29 11:17:55</w:t>
+              <w:t>2026-06-29 19:48:58</w:t>
             </w:r>
           </w:p>
         </w:tc>
@@ -1588,7 +1594,9 @@
             <w:tcW w:type="dxa" w:w="1234"/>
           </w:tcPr>
           <w:p>
-            <w:r/>
+            <w:r>
+              <w:t>2</w:t>
+            </w:r>
           </w:p>
         </w:tc>
         <w:tc>
@@ -1597,7 +1605,7 @@
           </w:tcPr>
           <w:p>
             <w:r>
-              <w:t>35.0</w:t>
+              <w:t>39.8</w:t>
             </w:r>
           </w:p>
         </w:tc>
@@ -1607,7 +1615,7 @@
           </w:tcPr>
           <w:p>
             <w:r>
-              <w:t>56.5</w:t>
+              <w:t>76.0</w:t>
             </w:r>
           </w:p>
         </w:tc>
@@ -1617,7 +1625,7 @@
           </w:tcPr>
           <w:p>
             <w:r>
-              <w:t>49.4</w:t>
+              <w:t>45.6</w:t>
             </w:r>
           </w:p>
         </w:tc>
@@ -1627,7 +1635,7 @@
           </w:tcPr>
           <w:p>
             <w:r>
-              <w:t>44.0</w:t>
+              <w:t>50.3</w:t>
             </w:r>
           </w:p>
         </w:tc>
@@ -1637,7 +1645,7 @@
           </w:tcPr>
           <w:p>
             <w:r>
-              <w:t>1149</w:t>
+              <w:t>545</w:t>
             </w:r>
           </w:p>
         </w:tc>
@@ -1649,7 +1657,7 @@
           </w:tcPr>
           <w:p>
             <w:r>
-              <w:t>2026-06-29 11:32:55</w:t>
+              <w:t>2026-06-29 20:19:13</w:t>
             </w:r>
           </w:p>
         </w:tc>
@@ -1658,7 +1666,9 @@
             <w:tcW w:type="dxa" w:w="1234"/>
           </w:tcPr>
           <w:p>
-            <w:r/>
+            <w:r>
+              <w:t>2</w:t>
+            </w:r>
           </w:p>
         </w:tc>
         <w:tc>
@@ -1667,7 +1677,7 @@
           </w:tcPr>
           <w:p>
             <w:r>
-              <w:t>70.0</w:t>
+              <w:t>39.8</w:t>
             </w:r>
           </w:p>
         </w:tc>
@@ -1677,7 +1687,7 @@
           </w:tcPr>
           <w:p>
             <w:r>
-              <w:t>71.5</w:t>
+              <w:t>75.7</w:t>
             </w:r>
           </w:p>
         </w:tc>
@@ -1687,7 +1697,7 @@
           </w:tcPr>
           <w:p>
             <w:r>
-              <w:t>49.4</w:t>
+              <w:t>45.6</w:t>
             </w:r>
           </w:p>
         </w:tc>
@@ -1697,7 +1707,7 @@
           </w:tcPr>
           <w:p>
             <w:r>
-              <w:t>65.2</w:t>
+              <w:t>50.2</w:t>
             </w:r>
           </w:p>
         </w:tc>
@@ -1707,7 +1717,7 @@
           </w:tcPr>
           <w:p>
             <w:r>
-              <w:t>1209</w:t>
+              <w:t>666</w:t>
             </w:r>
           </w:p>
         </w:tc>
@@ -1728,7 +1738,7 @@
     </w:p>
     <w:p>
       <w:r>
-        <w:t>Section score: 70.0 / 100  (Grade: C)</w:t>
+        <w:t>Section score: 39.8 / 100  (Grade: F)</w:t>
       </w:r>
     </w:p>
     <w:p>
@@ -1839,7 +1849,7 @@
           </w:tcPr>
           <w:p>
             <w:r>
-              <w:t>100.0</w:t>
+              <w:t>30.0</w:t>
             </w:r>
           </w:p>
         </w:tc>
@@ -1849,7 +1859,7 @@
           </w:tcPr>
           <w:p>
             <w:r>
-              <w:t>15.0</w:t>
+              <w:t>4.5</w:t>
             </w:r>
           </w:p>
         </w:tc>
@@ -1871,7 +1881,7 @@
           </w:tcPr>
           <w:p>
             <w:r>
-              <w:t>50.0</w:t>
+              <w:t>0.0</w:t>
             </w:r>
           </w:p>
         </w:tc>
@@ -1881,7 +1891,7 @@
           </w:tcPr>
           <w:p>
             <w:r>
-              <w:t>7.5</w:t>
+              <w:t>0.0</w:t>
             </w:r>
           </w:p>
         </w:tc>
@@ -1935,7 +1945,7 @@
           </w:tcPr>
           <w:p>
             <w:r>
-              <w:t>0.0</w:t>
+              <w:t>6.7</w:t>
             </w:r>
           </w:p>
         </w:tc>
@@ -1945,7 +1955,7 @@
           </w:tcPr>
           <w:p>
             <w:r>
-              <w:t>0.0</w:t>
+              <w:t>0.3</w:t>
             </w:r>
           </w:p>
         </w:tc>
@@ -1999,7 +2009,7 @@
           </w:tcPr>
           <w:p>
             <w:r>
-              <w:t>50.0</w:t>
+              <w:t>0.0</w:t>
             </w:r>
           </w:p>
         </w:tc>
@@ -2009,7 +2019,7 @@
           </w:tcPr>
           <w:p>
             <w:r>
-              <w:t>12.5</w:t>
+              <w:t>0.0</w:t>
             </w:r>
           </w:p>
         </w:tc>
@@ -2050,7 +2060,7 @@
           </w:tcPr>
           <w:p>
             <w:r>
-              <w:t>$552.18</w:t>
+              <w:t>$807.56</w:t>
             </w:r>
           </w:p>
         </w:tc>
@@ -2072,7 +2082,7 @@
           </w:tcPr>
           <w:p>
             <w:r>
-              <w:t>10.44%</w:t>
+              <w:t>61.51%</w:t>
             </w:r>
           </w:p>
         </w:tc>
@@ -2094,7 +2104,7 @@
           </w:tcPr>
           <w:p>
             <w:r>
-              <w:t>$52.18</w:t>
+              <w:t>$-10.00</w:t>
             </w:r>
           </w:p>
         </w:tc>
@@ -2138,7 +2148,7 @@
           </w:tcPr>
           <w:p>
             <w:r>
-              <w:t>—</w:t>
+              <w:t>0.0000</w:t>
             </w:r>
           </w:p>
         </w:tc>
@@ -2160,7 +2170,7 @@
           </w:tcPr>
           <w:p>
             <w:r>
-              <w:t>— / —</w:t>
+              <w:t>— / 0.0000</w:t>
             </w:r>
           </w:p>
         </w:tc>
@@ -2182,7 +2192,7 @@
           </w:tcPr>
           <w:p>
             <w:r>
-              <w:t>—</w:t>
+              <w:t>0.0000</w:t>
             </w:r>
           </w:p>
         </w:tc>
@@ -2204,7 +2214,7 @@
           </w:tcPr>
           <w:p>
             <w:r>
-              <w:t>0 / 0</w:t>
+              <w:t>2 / 2</w:t>
             </w:r>
           </w:p>
         </w:tc>
@@ -2226,7 +2236,7 @@
           </w:tcPr>
           <w:p>
             <w:r>
-              <w:t>$—</w:t>
+              <w:t>$-5.00</w:t>
             </w:r>
           </w:p>
         </w:tc>
@@ -2264,7 +2274,7 @@
     </w:p>
     <w:p>
       <w:r>
-        <w:t>Realized $52.176 · Executed 67 · Settled 65 · Wins 54 · Losses 11 · Kelly active False</w:t>
+        <w:t>Realized $317.5631 · Executed 102 · Settled 100 · Wins 73 · Losses 27 · Kelly active False</w:t>
       </w:r>
     </w:p>
     <w:p>
@@ -2347,7 +2357,7 @@
           </w:tcPr>
           <w:p>
             <w:r>
-              <w:t>0.20-0.35</w:t>
+              <w:t>0-0.10</w:t>
             </w:r>
           </w:p>
         </w:tc>
@@ -2357,7 +2367,7 @@
           </w:tcPr>
           <w:p>
             <w:r>
-              <w:t>3</w:t>
+              <w:t>1</w:t>
             </w:r>
           </w:p>
         </w:tc>
@@ -2367,7 +2377,7 @@
           </w:tcPr>
           <w:p>
             <w:r>
-              <w:t>0.6667</w:t>
+              <w:t>0.0000</w:t>
             </w:r>
           </w:p>
         </w:tc>
@@ -2377,7 +2387,7 @@
           </w:tcPr>
           <w:p>
             <w:r>
-              <w:t>4.8660</w:t>
+              <w:t>0.0000</w:t>
             </w:r>
           </w:p>
         </w:tc>
@@ -2387,7 +2397,7 @@
           </w:tcPr>
           <w:p>
             <w:r>
-              <w:t>$64.43</w:t>
+              <w:t>$-50.00</w:t>
             </w:r>
           </w:p>
         </w:tc>
@@ -2399,7 +2409,7 @@
           </w:tcPr>
           <w:p>
             <w:r>
-              <w:t>0.35-0.50</w:t>
+              <w:t>0.10-0.20</w:t>
             </w:r>
           </w:p>
         </w:tc>
@@ -2409,7 +2419,7 @@
           </w:tcPr>
           <w:p>
             <w:r>
-              <w:t>2</w:t>
+              <w:t>3</w:t>
             </w:r>
           </w:p>
         </w:tc>
@@ -2419,7 +2429,7 @@
           </w:tcPr>
           <w:p>
             <w:r>
-              <w:t>0.0000</w:t>
+              <w:t>0.3333</w:t>
             </w:r>
           </w:p>
         </w:tc>
@@ -2429,7 +2439,7 @@
           </w:tcPr>
           <w:p>
             <w:r>
-              <w:t>0.0000</w:t>
+              <w:t>3.7390</w:t>
             </w:r>
           </w:p>
         </w:tc>
@@ -2439,7 +2449,7 @@
           </w:tcPr>
           <w:p>
             <w:r>
-              <w:t>$-50.00</w:t>
+              <w:t>$91.30</w:t>
             </w:r>
           </w:p>
         </w:tc>
@@ -2451,6 +2461,110 @@
           </w:tcPr>
           <w:p>
             <w:r>
+              <w:t>0.20-0.35</w:t>
+            </w:r>
+          </w:p>
+        </w:tc>
+        <w:tc>
+          <w:tcPr>
+            <w:tcW w:type="dxa" w:w="1728"/>
+          </w:tcPr>
+          <w:p>
+            <w:r>
+              <w:t>6</w:t>
+            </w:r>
+          </w:p>
+        </w:tc>
+        <w:tc>
+          <w:tcPr>
+            <w:tcW w:type="dxa" w:w="1728"/>
+          </w:tcPr>
+          <w:p>
+            <w:r>
+              <w:t>0.3333</w:t>
+            </w:r>
+          </w:p>
+        </w:tc>
+        <w:tc>
+          <w:tcPr>
+            <w:tcW w:type="dxa" w:w="1728"/>
+          </w:tcPr>
+          <w:p>
+            <w:r>
+              <w:t>1.2165</w:t>
+            </w:r>
+          </w:p>
+        </w:tc>
+        <w:tc>
+          <w:tcPr>
+            <w:tcW w:type="dxa" w:w="1728"/>
+          </w:tcPr>
+          <w:p>
+            <w:r>
+              <w:t>$7.22</w:t>
+            </w:r>
+          </w:p>
+        </w:tc>
+      </w:tr>
+      <w:tr>
+        <w:tc>
+          <w:tcPr>
+            <w:tcW w:type="dxa" w:w="1728"/>
+          </w:tcPr>
+          <w:p>
+            <w:r>
+              <w:t>0.35-0.50</w:t>
+            </w:r>
+          </w:p>
+        </w:tc>
+        <w:tc>
+          <w:tcPr>
+            <w:tcW w:type="dxa" w:w="1728"/>
+          </w:tcPr>
+          <w:p>
+            <w:r>
+              <w:t>5</w:t>
+            </w:r>
+          </w:p>
+        </w:tc>
+        <w:tc>
+          <w:tcPr>
+            <w:tcW w:type="dxa" w:w="1728"/>
+          </w:tcPr>
+          <w:p>
+            <w:r>
+              <w:t>0.2000</w:t>
+            </w:r>
+          </w:p>
+        </w:tc>
+        <w:tc>
+          <w:tcPr>
+            <w:tcW w:type="dxa" w:w="1728"/>
+          </w:tcPr>
+          <w:p>
+            <w:r>
+              <w:t>0.2602</w:t>
+            </w:r>
+          </w:p>
+        </w:tc>
+        <w:tc>
+          <w:tcPr>
+            <w:tcW w:type="dxa" w:w="1728"/>
+          </w:tcPr>
+          <w:p>
+            <w:r>
+              <w:t>$-29.59</w:t>
+            </w:r>
+          </w:p>
+        </w:tc>
+      </w:tr>
+      <w:tr>
+        <w:tc>
+          <w:tcPr>
+            <w:tcW w:type="dxa" w:w="1728"/>
+          </w:tcPr>
+          <w:p>
+            <w:r>
               <w:t>&gt;0.50</w:t>
             </w:r>
           </w:p>
@@ -2461,7 +2575,7 @@
           </w:tcPr>
           <w:p>
             <w:r>
-              <w:t>15</w:t>
+              <w:t>40</w:t>
             </w:r>
           </w:p>
         </w:tc>
@@ -2471,7 +2585,7 @@
           </w:tcPr>
           <w:p>
             <w:r>
-              <w:t>0.4667</w:t>
+              <w:t>0.6000</w:t>
             </w:r>
           </w:p>
         </w:tc>
@@ -2481,7 +2595,7 @@
           </w:tcPr>
           <w:p>
             <w:r>
-              <w:t>0.7227</w:t>
+              <w:t>1.1607</w:t>
             </w:r>
           </w:p>
         </w:tc>
@@ -2491,7 +2605,7 @@
           </w:tcPr>
           <w:p>
             <w:r>
-              <w:t>$-7.39</w:t>
+              <w:t>$3.21</w:t>
             </w:r>
           </w:p>
         </w:tc>
@@ -2588,7 +2702,7 @@
           </w:tcPr>
           <w:p>
             <w:r>
-              <w:t>parent 644116</w:t>
+              <w:t>parent 645401</w:t>
             </w:r>
           </w:p>
         </w:tc>
@@ -2618,7 +2732,7 @@
           </w:tcPr>
           <w:p>
             <w:r>
-              <w:t>0.560</w:t>
+              <w:t>0.240</w:t>
             </w:r>
           </w:p>
         </w:tc>
@@ -2650,7 +2764,7 @@
           </w:tcPr>
           <w:p>
             <w:r>
-              <w:t>parent 644085</w:t>
+              <w:t>parent 645381</w:t>
             </w:r>
           </w:p>
         </w:tc>
@@ -2680,7 +2794,7 @@
           </w:tcPr>
           <w:p>
             <w:r>
-              <w:t>0.316</w:t>
+              <w:t>0.580</w:t>
             </w:r>
           </w:p>
         </w:tc>
@@ -2690,7 +2804,7 @@
           </w:tcPr>
           <w:p>
             <w:r>
-              <w:t>$108.12</w:t>
+              <w:t>$36.21</w:t>
             </w:r>
           </w:p>
         </w:tc>
@@ -2712,7 +2826,7 @@
           </w:tcPr>
           <w:p>
             <w:r>
-              <w:t>parent 644066</w:t>
+              <w:t>parent 645340</w:t>
             </w:r>
           </w:p>
         </w:tc>
@@ -2742,7 +2856,7 @@
           </w:tcPr>
           <w:p>
             <w:r>
-              <w:t>0.510</w:t>
+              <w:t>0.538</w:t>
             </w:r>
           </w:p>
         </w:tc>
@@ -2774,7 +2888,7 @@
           </w:tcPr>
           <w:p>
             <w:r>
-              <w:t>parent 644020</w:t>
+              <w:t>parent 645281</w:t>
             </w:r>
           </w:p>
         </w:tc>
@@ -2794,7 +2908,7 @@
           </w:tcPr>
           <w:p>
             <w:r>
-              <w:t>No</w:t>
+              <w:t>Yes</w:t>
             </w:r>
           </w:p>
         </w:tc>
@@ -2804,7 +2918,7 @@
           </w:tcPr>
           <w:p>
             <w:r>
-              <w:t>0.520</w:t>
+              <w:t>0.118</w:t>
             </w:r>
           </w:p>
         </w:tc>
@@ -2814,7 +2928,7 @@
           </w:tcPr>
           <w:p>
             <w:r>
-              <w:t>$-50.00</w:t>
+              <w:t>$373.90</w:t>
             </w:r>
           </w:p>
         </w:tc>
@@ -2836,7 +2950,7 @@
           </w:tcPr>
           <w:p>
             <w:r>
-              <w:t>parent 643996</w:t>
+              <w:t>parent 645252</w:t>
             </w:r>
           </w:p>
         </w:tc>
@@ -2856,7 +2970,7 @@
           </w:tcPr>
           <w:p>
             <w:r>
-              <w:t>No</w:t>
+              <w:t>Yes</w:t>
             </w:r>
           </w:p>
         </w:tc>
@@ -2866,7 +2980,7 @@
           </w:tcPr>
           <w:p>
             <w:r>
-              <w:t>0.262</w:t>
+              <w:t>0.537</w:t>
             </w:r>
           </w:p>
         </w:tc>
@@ -2876,7 +2990,7 @@
           </w:tcPr>
           <w:p>
             <w:r>
-              <w:t>$-50.00</w:t>
+              <w:t>$43.06</w:t>
             </w:r>
           </w:p>
         </w:tc>
@@ -2898,7 +3012,7 @@
           </w:tcPr>
           <w:p>
             <w:r>
-              <w:t>parent 643963</w:t>
+              <w:t>parent 645212</w:t>
             </w:r>
           </w:p>
         </w:tc>
@@ -2928,7 +3042,7 @@
           </w:tcPr>
           <w:p>
             <w:r>
-              <w:t>0.470</w:t>
+              <w:t>0.080</w:t>
             </w:r>
           </w:p>
         </w:tc>
@@ -2960,7 +3074,7 @@
           </w:tcPr>
           <w:p>
             <w:r>
-              <w:t>parent 643933</w:t>
+              <w:t>parent 645157</w:t>
             </w:r>
           </w:p>
         </w:tc>
@@ -2990,7 +3104,7 @@
           </w:tcPr>
           <w:p>
             <w:r>
-              <w:t>0.588</w:t>
+              <w:t>0.540</w:t>
             </w:r>
           </w:p>
         </w:tc>
@@ -3000,7 +3114,7 @@
           </w:tcPr>
           <w:p>
             <w:r>
-              <w:t>$35.01</w:t>
+              <w:t>$42.59</w:t>
             </w:r>
           </w:p>
         </w:tc>
@@ -3022,7 +3136,7 @@
           </w:tcPr>
           <w:p>
             <w:r>
-              <w:t>parent 643844</w:t>
+              <w:t>parent 645117</w:t>
             </w:r>
           </w:p>
         </w:tc>
@@ -3052,7 +3166,7 @@
           </w:tcPr>
           <w:p>
             <w:r>
-              <w:t>0.513</w:t>
+              <w:t>0.527</w:t>
             </w:r>
           </w:p>
         </w:tc>
@@ -3062,7 +3176,7 @@
           </w:tcPr>
           <w:p>
             <w:r>
-              <w:t>$47.46</w:t>
+              <w:t>$44.80</w:t>
             </w:r>
           </w:p>
         </w:tc>
@@ -3084,7 +3198,7 @@
           </w:tcPr>
           <w:p>
             <w:r>
-              <w:t>parent 643813</w:t>
+              <w:t>parent 645086</w:t>
             </w:r>
           </w:p>
         </w:tc>
@@ -3104,7 +3218,7 @@
           </w:tcPr>
           <w:p>
             <w:r>
-              <w:t>Yes</w:t>
+              <w:t>No</w:t>
             </w:r>
           </w:p>
         </w:tc>
@@ -3114,7 +3228,7 @@
           </w:tcPr>
           <w:p>
             <w:r>
-              <w:t>0.600</w:t>
+              <w:t>0.240</w:t>
             </w:r>
           </w:p>
         </w:tc>
@@ -3124,7 +3238,7 @@
           </w:tcPr>
           <w:p>
             <w:r>
-              <w:t>$33.33</w:t>
+              <w:t>$-50.00</w:t>
             </w:r>
           </w:p>
         </w:tc>
@@ -3146,7 +3260,7 @@
           </w:tcPr>
           <w:p>
             <w:r>
-              <w:t>parent 643786</w:t>
+              <w:t>parent 645067</w:t>
             </w:r>
           </w:p>
         </w:tc>
@@ -3166,7 +3280,7 @@
           </w:tcPr>
           <w:p>
             <w:r>
-              <w:t>No</w:t>
+              <w:t>Yes</w:t>
             </w:r>
           </w:p>
         </w:tc>
@@ -3176,7 +3290,7 @@
           </w:tcPr>
           <w:p>
             <w:r>
-              <w:t>0.550</w:t>
+              <w:t>0.589</w:t>
             </w:r>
           </w:p>
         </w:tc>
@@ -3186,7 +3300,7 @@
           </w:tcPr>
           <w:p>
             <w:r>
-              <w:t>$-50.00</w:t>
+              <w:t>$34.83</w:t>
             </w:r>
           </w:p>
         </w:tc>
@@ -3208,7 +3322,7 @@
           </w:tcPr>
           <w:p>
             <w:r>
-              <w:t>parent 643761</w:t>
+              <w:t>parent 645020</w:t>
             </w:r>
           </w:p>
         </w:tc>
@@ -3228,7 +3342,7 @@
           </w:tcPr>
           <w:p>
             <w:r>
-              <w:t>Yes</w:t>
+              <w:t>No</w:t>
             </w:r>
           </w:p>
         </w:tc>
@@ -3238,7 +3352,7 @@
           </w:tcPr>
           <w:p>
             <w:r>
-              <w:t>0.539</w:t>
+              <w:t>0.300</w:t>
             </w:r>
           </w:p>
         </w:tc>
@@ -3248,7 +3362,7 @@
           </w:tcPr>
           <w:p>
             <w:r>
-              <w:t>$42.83</w:t>
+              <w:t>$-50.00</w:t>
             </w:r>
           </w:p>
         </w:tc>
@@ -3270,7 +3384,7 @@
           </w:tcPr>
           <w:p>
             <w:r>
-              <w:t>parent 643724</w:t>
+              <w:t>parent 644996</w:t>
             </w:r>
           </w:p>
         </w:tc>
@@ -3290,7 +3404,7 @@
           </w:tcPr>
           <w:p>
             <w:r>
-              <w:t>No</w:t>
+              <w:t>Yes</w:t>
             </w:r>
           </w:p>
         </w:tc>
@@ -3300,7 +3414,7 @@
           </w:tcPr>
           <w:p>
             <w:r>
-              <w:t>0.596</w:t>
+              <w:t>0.490</w:t>
             </w:r>
           </w:p>
         </w:tc>
@@ -3310,7 +3424,7 @@
           </w:tcPr>
           <w:p>
             <w:r>
-              <w:t>$-50.00</w:t>
+              <w:t>$52.04</w:t>
             </w:r>
           </w:p>
         </w:tc>
@@ -3332,7 +3446,7 @@
           </w:tcPr>
           <w:p>
             <w:r>
-              <w:t>parent 643683</w:t>
+              <w:t>parent 644966</w:t>
             </w:r>
           </w:p>
         </w:tc>
@@ -3362,7 +3476,7 @@
           </w:tcPr>
           <w:p>
             <w:r>
-              <w:t>0.530</w:t>
+              <w:t>0.537</w:t>
             </w:r>
           </w:p>
         </w:tc>
@@ -3372,7 +3486,7 @@
           </w:tcPr>
           <w:p>
             <w:r>
-              <w:t>$44.34</w:t>
+              <w:t>$43.16</w:t>
             </w:r>
           </w:p>
         </w:tc>
@@ -3394,7 +3508,7 @@
           </w:tcPr>
           <w:p>
             <w:r>
-              <w:t>parent 643656</w:t>
+              <w:t>parent 644931</w:t>
             </w:r>
           </w:p>
         </w:tc>
@@ -3414,7 +3528,7 @@
           </w:tcPr>
           <w:p>
             <w:r>
-              <w:t>No</w:t>
+              <w:t>Yes</w:t>
             </w:r>
           </w:p>
         </w:tc>
@@ -3424,7 +3538,7 @@
           </w:tcPr>
           <w:p>
             <w:r>
-              <w:t>0.540</w:t>
+              <w:t>0.588</w:t>
             </w:r>
           </w:p>
         </w:tc>
@@ -3434,7 +3548,7 @@
           </w:tcPr>
           <w:p>
             <w:r>
-              <w:t>$-50.00</w:t>
+              <w:t>$35.08</w:t>
             </w:r>
           </w:p>
         </w:tc>
@@ -3456,7 +3570,7 @@
           </w:tcPr>
           <w:p>
             <w:r>
-              <w:t>parent 643630</w:t>
+              <w:t>parent 644897</w:t>
             </w:r>
           </w:p>
         </w:tc>
@@ -3476,7 +3590,7 @@
           </w:tcPr>
           <w:p>
             <w:r>
-              <w:t>No</w:t>
+              <w:t>Yes</w:t>
             </w:r>
           </w:p>
         </w:tc>
@@ -3486,7 +3600,7 @@
           </w:tcPr>
           <w:p>
             <w:r>
-              <w:t>0.760</w:t>
+              <w:t>0.546</w:t>
             </w:r>
           </w:p>
         </w:tc>
@@ -3496,7 +3610,7 @@
           </w:tcPr>
           <w:p>
             <w:r>
-              <w:t>$-50.00</w:t>
+              <w:t>$41.54</w:t>
             </w:r>
           </w:p>
         </w:tc>
@@ -3518,7 +3632,7 @@
           </w:tcPr>
           <w:p>
             <w:r>
-              <w:t>parent 643598</w:t>
+              <w:t>parent 644852</w:t>
             </w:r>
           </w:p>
         </w:tc>
@@ -3538,7 +3652,7 @@
           </w:tcPr>
           <w:p>
             <w:r>
-              <w:t>No</w:t>
+              <w:t>Yes</w:t>
             </w:r>
           </w:p>
         </w:tc>
@@ -3548,7 +3662,7 @@
           </w:tcPr>
           <w:p>
             <w:r>
-              <w:t>0.550</w:t>
+              <w:t>0.540</w:t>
             </w:r>
           </w:p>
         </w:tc>
@@ -3558,7 +3672,7 @@
           </w:tcPr>
           <w:p>
             <w:r>
-              <w:t>$-50.00</w:t>
+              <w:t>$42.59</w:t>
             </w:r>
           </w:p>
         </w:tc>
@@ -3580,7 +3694,7 @@
           </w:tcPr>
           <w:p>
             <w:r>
-              <w:t>parent 643562</w:t>
+              <w:t>parent 644830</w:t>
             </w:r>
           </w:p>
         </w:tc>
@@ -3610,7 +3724,7 @@
           </w:tcPr>
           <w:p>
             <w:r>
-              <w:t>0.499</w:t>
+              <w:t>0.542</w:t>
             </w:r>
           </w:p>
         </w:tc>
@@ -3642,7 +3756,7 @@
           </w:tcPr>
           <w:p>
             <w:r>
-              <w:t>parent 643527</w:t>
+              <w:t>parent 644788</w:t>
             </w:r>
           </w:p>
         </w:tc>
@@ -3662,7 +3776,7 @@
           </w:tcPr>
           <w:p>
             <w:r>
-              <w:t>Yes</w:t>
+              <w:t>No</w:t>
             </w:r>
           </w:p>
         </w:tc>
@@ -3672,7 +3786,7 @@
           </w:tcPr>
           <w:p>
             <w:r>
-              <w:t>0.568</w:t>
+              <w:t>0.469</w:t>
             </w:r>
           </w:p>
         </w:tc>
@@ -3682,7 +3796,7 @@
           </w:tcPr>
           <w:p>
             <w:r>
-              <w:t>$38.07</w:t>
+              <w:t>$-50.00</w:t>
             </w:r>
           </w:p>
         </w:tc>
@@ -3704,7 +3818,7 @@
           </w:tcPr>
           <w:p>
             <w:r>
-              <w:t>parent 643501</w:t>
+              <w:t>parent 644688</w:t>
             </w:r>
           </w:p>
         </w:tc>
@@ -3724,7 +3838,7 @@
           </w:tcPr>
           <w:p>
             <w:r>
-              <w:t>Yes</w:t>
+              <w:t>No</w:t>
             </w:r>
           </w:p>
         </w:tc>
@@ -3734,7 +3848,7 @@
           </w:tcPr>
           <w:p>
             <w:r>
-              <w:t>0.270</w:t>
+              <w:t>0.472</w:t>
             </w:r>
           </w:p>
         </w:tc>
@@ -3744,7 +3858,7 @@
           </w:tcPr>
           <w:p>
             <w:r>
-              <w:t>$135.19</w:t>
+              <w:t>$-50.00</w:t>
             </w:r>
           </w:p>
         </w:tc>
@@ -3766,7 +3880,7 @@
           </w:tcPr>
           <w:p>
             <w:r>
-              <w:t>parent 643455</w:t>
+              <w:t>parent 644667</w:t>
             </w:r>
           </w:p>
         </w:tc>
@@ -3796,7 +3910,7 @@
           </w:tcPr>
           <w:p>
             <w:r>
-              <w:t>0.510</w:t>
+              <w:t>0.600</w:t>
             </w:r>
           </w:p>
         </w:tc>
@@ -3806,7 +3920,7 @@
           </w:tcPr>
           <w:p>
             <w:r>
-              <w:t>$48.04</w:t>
+              <w:t>$33.33</w:t>
             </w:r>
           </w:p>
         </w:tc>
@@ -3836,6 +3950,184 @@
       </w:r>
     </w:p>
     <w:p>
+      <w:pPr>
+        <w:pStyle w:val="Heading2"/>
+      </w:pPr>
+      <w:r>
+        <w:t>Recent positions (last 15)</w:t>
+      </w:r>
+    </w:p>
+    <w:tbl>
+      <w:tblPr>
+        <w:tblStyle w:val="TableGrid"/>
+        <w:tblW w:type="auto" w:w="0"/>
+        <w:tblLook w:firstColumn="1" w:firstRow="1" w:lastColumn="0" w:lastRow="0" w:noHBand="0" w:noVBand="1" w:val="04A0"/>
+      </w:tblPr>
+      <w:tblGrid>
+        <w:gridCol w:w="1728"/>
+        <w:gridCol w:w="1728"/>
+        <w:gridCol w:w="1728"/>
+        <w:gridCol w:w="1728"/>
+        <w:gridCol w:w="1728"/>
+      </w:tblGrid>
+      <w:tr>
+        <w:tc>
+          <w:tcPr>
+            <w:tcW w:type="dxa" w:w="1728"/>
+          </w:tcPr>
+          <w:p>
+            <w:r>
+              <w:t>Side</w:t>
+            </w:r>
+          </w:p>
+        </w:tc>
+        <w:tc>
+          <w:tcPr>
+            <w:tcW w:type="dxa" w:w="1728"/>
+          </w:tcPr>
+          <w:p>
+            <w:r>
+              <w:t>Entry</w:t>
+            </w:r>
+          </w:p>
+        </w:tc>
+        <w:tc>
+          <w:tcPr>
+            <w:tcW w:type="dxa" w:w="1728"/>
+          </w:tcPr>
+          <w:p>
+            <w:r>
+              <w:t>Outcome</w:t>
+            </w:r>
+          </w:p>
+        </w:tc>
+        <w:tc>
+          <w:tcPr>
+            <w:tcW w:type="dxa" w:w="1728"/>
+          </w:tcPr>
+          <w:p>
+            <w:r>
+              <w:t>Won</w:t>
+            </w:r>
+          </w:p>
+        </w:tc>
+        <w:tc>
+          <w:tcPr>
+            <w:tcW w:type="dxa" w:w="1728"/>
+          </w:tcPr>
+          <w:p>
+            <w:r>
+              <w:t>PnL</w:t>
+            </w:r>
+          </w:p>
+        </w:tc>
+      </w:tr>
+      <w:tr>
+        <w:tc>
+          <w:tcPr>
+            <w:tcW w:type="dxa" w:w="1728"/>
+          </w:tcPr>
+          <w:p>
+            <w:r>
+              <w:t>down</w:t>
+            </w:r>
+          </w:p>
+        </w:tc>
+        <w:tc>
+          <w:tcPr>
+            <w:tcW w:type="dxa" w:w="1728"/>
+          </w:tcPr>
+          <w:p>
+            <w:r>
+              <w:t>0.530</w:t>
+            </w:r>
+          </w:p>
+        </w:tc>
+        <w:tc>
+          <w:tcPr>
+            <w:tcW w:type="dxa" w:w="1728"/>
+          </w:tcPr>
+          <w:p>
+            <w:r>
+              <w:t>up</w:t>
+            </w:r>
+          </w:p>
+        </w:tc>
+        <w:tc>
+          <w:tcPr>
+            <w:tcW w:type="dxa" w:w="1728"/>
+          </w:tcPr>
+          <w:p>
+            <w:r>
+              <w:t>No</w:t>
+            </w:r>
+          </w:p>
+        </w:tc>
+        <w:tc>
+          <w:tcPr>
+            <w:tcW w:type="dxa" w:w="1728"/>
+          </w:tcPr>
+          <w:p>
+            <w:r>
+              <w:t>$-5.00</w:t>
+            </w:r>
+          </w:p>
+        </w:tc>
+      </w:tr>
+      <w:tr>
+        <w:tc>
+          <w:tcPr>
+            <w:tcW w:type="dxa" w:w="1728"/>
+          </w:tcPr>
+          <w:p>
+            <w:r>
+              <w:t>down</w:t>
+            </w:r>
+          </w:p>
+        </w:tc>
+        <w:tc>
+          <w:tcPr>
+            <w:tcW w:type="dxa" w:w="1728"/>
+          </w:tcPr>
+          <w:p>
+            <w:r>
+              <w:t>0.500</w:t>
+            </w:r>
+          </w:p>
+        </w:tc>
+        <w:tc>
+          <w:tcPr>
+            <w:tcW w:type="dxa" w:w="1728"/>
+          </w:tcPr>
+          <w:p>
+            <w:r>
+              <w:t>up</w:t>
+            </w:r>
+          </w:p>
+        </w:tc>
+        <w:tc>
+          <w:tcPr>
+            <w:tcW w:type="dxa" w:w="1728"/>
+          </w:tcPr>
+          <w:p>
+            <w:r>
+              <w:t>No</w:t>
+            </w:r>
+          </w:p>
+        </w:tc>
+        <w:tc>
+          <w:tcPr>
+            <w:tcW w:type="dxa" w:w="1728"/>
+          </w:tcPr>
+          <w:p>
+            <w:r>
+              <w:t>$-5.00</w:t>
+            </w:r>
+          </w:p>
+        </w:tc>
+      </w:tr>
+    </w:tbl>
+    <w:p>
       <w:r>
         <w:br w:type="page"/>
       </w:r>
@@ -3850,7 +4142,7 @@
     </w:p>
     <w:p>
       <w:r>
-        <w:t>Section score: 71.5 / 100  (Grade: C)</w:t>
+        <w:t>Section score: 75.4 / 100  (Grade: C+)</w:t>
       </w:r>
     </w:p>
     <w:p>
@@ -3993,7 +4285,7 @@
           </w:tcPr>
           <w:p>
             <w:r>
-              <w:t>0.0</w:t>
+              <w:t>25.9</w:t>
             </w:r>
           </w:p>
         </w:tc>
@@ -4003,7 +4295,7 @@
           </w:tcPr>
           <w:p>
             <w:r>
-              <w:t>0.0</w:t>
+              <w:t>3.9</w:t>
             </w:r>
           </w:p>
         </w:tc>
@@ -4107,17 +4399,17 @@
     </w:tbl>
     <w:p>
       <w:r>
-        <w:t>Ticks: 5 · Reconciled: True · Readiness: not_ready</w:t>
+        <w:t>Ticks: 7 · Reconciled: True · Readiness: not_ready</w:t>
       </w:r>
     </w:p>
     <w:p>
       <w:r>
-        <w:t>Candidates created: 7916 · Terminals: {'accepted': 0, 'rejected': 584, 'skipped': 7296, 'expired': 0, 'missing_data': 36}</w:t>
+        <w:t>Candidates created: 11811 · Terminals: {'accepted': 0, 'rejected': 1147, 'skipped': 10612, 'expired': 0, 'missing_data': 52}</w:t>
       </w:r>
     </w:p>
     <w:p>
       <w:r>
-        <w:t>Rejected by stage: {'directional': 537, 'execution_gate': 2, 'baseline_cohort_gate': 45}</w:t>
+        <w:t>Rejected by stage: {'directional': 1039, 'execution_gate': 12, 'baseline_cohort_gate': 96}</w:t>
       </w:r>
     </w:p>
     <w:p>
@@ -4692,7 +4984,7 @@
     </w:p>
     <w:p>
       <w:r>
-        <w:t>Section score: 49.4 / 100  (Grade: F)</w:t>
+        <w:t>Section score: 45.6 / 100  (Grade: F)</w:t>
       </w:r>
     </w:p>
     <w:p>
@@ -4835,7 +5127,7 @@
           </w:tcPr>
           <w:p>
             <w:r>
-              <w:t>32.5</w:t>
+              <w:t>7.5</w:t>
             </w:r>
           </w:p>
         </w:tc>
@@ -4845,7 +5137,7 @@
           </w:tcPr>
           <w:p>
             <w:r>
-              <w:t>4.9</w:t>
+              <w:t>1.1</w:t>
             </w:r>
           </w:p>
         </w:tc>
@@ -5048,7 +5340,7 @@
           </w:tcPr>
           <w:p>
             <w:r>
-              <w:t>0.6667</w:t>
+              <w:t>0.5000</w:t>
             </w:r>
           </w:p>
         </w:tc>
@@ -5070,7 +5362,7 @@
           </w:tcPr>
           <w:p>
             <w:r>
-              <w:t>0.6000</w:t>
+              <w:t>0.5238</w:t>
             </w:r>
           </w:p>
         </w:tc>
@@ -5100,7 +5392,7 @@
     </w:tbl>
     <w:p>
       <w:r>
-        <w:t>TV alerts: received 1197 · valid 978 · rejected 219</w:t>
+        <w:t>TV alerts: received 1754 · valid 1535 · rejected 219</w:t>
       </w:r>
     </w:p>
     <w:sectPr>

</xml_diff>

<commit_message>
chore(reports): VPS full report 2026-06-29 20:26 UTC (2 settled, WR 0.0%, PF 0.0, grade D)
</commit_message>
<xml_diff>
--- a/vps_full_reports/latest/report.docx
+++ b/vps_full_reports/latest/report.docx
@@ -20,7 +20,7 @@
           <w:color w:val="666666"/>
           <w:sz w:val="20"/>
         </w:rPr>
-        <w:t>PAPER ONLY  ·  reconciled=True  ·  ticks=7</w:t>
+        <w:t>PAPER ONLY  ·  reconciled=True  ·  ticks=11</w:t>
       </w:r>
     </w:p>
     <w:p>
@@ -4399,17 +4399,17 @@
     </w:tbl>
     <w:p>
       <w:r>
-        <w:t>Ticks: 7 · Reconciled: True · Readiness: not_ready</w:t>
+        <w:t>Ticks: 11 · Reconciled: True · Readiness: not_ready</w:t>
       </w:r>
     </w:p>
     <w:p>
       <w:r>
-        <w:t>Candidates created: 11811 · Terminals: {'accepted': 0, 'rejected': 1147, 'skipped': 10612, 'expired': 0, 'missing_data': 52}</w:t>
+        <w:t>Candidates created: 11819 · Terminals: {'accepted': 0, 'rejected': 1151, 'skipped': 10616, 'expired': 0, 'missing_data': 52}</w:t>
       </w:r>
     </w:p>
     <w:p>
       <w:r>
-        <w:t>Rejected by stage: {'directional': 1039, 'execution_gate': 12, 'baseline_cohort_gate': 96}</w:t>
+        <w:t>Rejected by stage: {'directional': 1043, 'execution_gate': 12, 'baseline_cohort_gate': 96}</w:t>
       </w:r>
     </w:p>
     <w:p>
@@ -5392,7 +5392,7 @@
     </w:tbl>
     <w:p>
       <w:r>
-        <w:t>TV alerts: received 1754 · valid 1535 · rejected 219</w:t>
+        <w:t>TV alerts: received 1755 · valid 1536 · rejected 219</w:t>
       </w:r>
     </w:p>
     <w:sectPr>

</xml_diff>

<commit_message>
chore(reports): VPS full report 2026-06-29 21:16 UTC (2 settled, WR 0.0%, PF 0.0, grade F)
</commit_message>
<xml_diff>
--- a/vps_full_reports/latest/report.docx
+++ b/vps_full_reports/latest/report.docx
@@ -20,7 +20,7 @@
           <w:color w:val="666666"/>
           <w:sz w:val="20"/>
         </w:rPr>
-        <w:t>PAPER ONLY  ·  reconciled=True  ·  ticks=11</w:t>
+        <w:t>PAPER ONLY  ·  reconciled=True  ·  ticks=212</w:t>
       </w:r>
     </w:p>
     <w:p>
@@ -33,7 +33,7 @@
     </w:p>
     <w:p>
       <w:r>
-        <w:t>Overall score: 50.1 / 100  (Grade: F)</w:t>
+        <w:t>Overall score: 50.2 / 100  (Grade: F)</w:t>
       </w:r>
     </w:p>
     <w:tbl>
@@ -149,7 +149,7 @@
           </w:tcPr>
           <w:p>
             <w:r>
-              <w:t>75.4</w:t>
+              <w:t>75.8</w:t>
             </w:r>
           </w:p>
         </w:tc>
@@ -319,7 +319,7 @@
           </w:tcPr>
           <w:p>
             <w:r>
-              <w:t>2026-06-29 12:33:24</w:t>
+              <w:t>2026-06-29 12:45:09</w:t>
             </w:r>
           </w:p>
         </w:tc>
@@ -337,7 +337,7 @@
           </w:tcPr>
           <w:p>
             <w:r>
-              <w:t>58.0</w:t>
+              <w:t>48.0</w:t>
             </w:r>
           </w:p>
         </w:tc>
@@ -347,7 +347,7 @@
           </w:tcPr>
           <w:p>
             <w:r>
-              <w:t>71.5</w:t>
+              <w:t>56.5</w:t>
             </w:r>
           </w:p>
         </w:tc>
@@ -367,7 +367,7 @@
           </w:tcPr>
           <w:p>
             <w:r>
-              <w:t>59.2</w:t>
+              <w:t>50.5</w:t>
             </w:r>
           </w:p>
         </w:tc>
@@ -377,7 +377,7 @@
           </w:tcPr>
           <w:p>
             <w:r>
-              <w:t>197</w:t>
+              <w:t>244</w:t>
             </w:r>
           </w:p>
         </w:tc>
@@ -389,7 +389,7 @@
           </w:tcPr>
           <w:p>
             <w:r>
-              <w:t>2026-06-29 12:45:09</w:t>
+              <w:t>2026-06-29 13:05:24</w:t>
             </w:r>
           </w:p>
         </w:tc>
@@ -407,7 +407,7 @@
           </w:tcPr>
           <w:p>
             <w:r>
-              <w:t>48.0</w:t>
+              <w:t>42.5</w:t>
             </w:r>
           </w:p>
         </w:tc>
@@ -437,7 +437,7 @@
           </w:tcPr>
           <w:p>
             <w:r>
-              <w:t>50.5</w:t>
+              <w:t>47.7</w:t>
             </w:r>
           </w:p>
         </w:tc>
@@ -447,7 +447,7 @@
           </w:tcPr>
           <w:p>
             <w:r>
-              <w:t>244</w:t>
+              <w:t>325</w:t>
             </w:r>
           </w:p>
         </w:tc>
@@ -459,7 +459,7 @@
           </w:tcPr>
           <w:p>
             <w:r>
-              <w:t>2026-06-29 13:05:24</w:t>
+              <w:t>2026-06-29 13:18:24</w:t>
             </w:r>
           </w:p>
         </w:tc>
@@ -477,7 +477,7 @@
           </w:tcPr>
           <w:p>
             <w:r>
-              <w:t>42.5</w:t>
+              <w:t>45.5</w:t>
             </w:r>
           </w:p>
         </w:tc>
@@ -507,7 +507,7 @@
           </w:tcPr>
           <w:p>
             <w:r>
-              <w:t>47.7</w:t>
+              <w:t>49.2</w:t>
             </w:r>
           </w:p>
         </w:tc>
@@ -517,7 +517,7 @@
           </w:tcPr>
           <w:p>
             <w:r>
-              <w:t>325</w:t>
+              <w:t>377</w:t>
             </w:r>
           </w:p>
         </w:tc>
@@ -529,7 +529,7 @@
           </w:tcPr>
           <w:p>
             <w:r>
-              <w:t>2026-06-29 13:18:24</w:t>
+              <w:t>2026-06-29 13:31:38</w:t>
             </w:r>
           </w:p>
         </w:tc>
@@ -547,7 +547,7 @@
           </w:tcPr>
           <w:p>
             <w:r>
-              <w:t>45.5</w:t>
+              <w:t>42.5</w:t>
             </w:r>
           </w:p>
         </w:tc>
@@ -577,7 +577,7 @@
           </w:tcPr>
           <w:p>
             <w:r>
-              <w:t>49.2</w:t>
+              <w:t>47.7</w:t>
             </w:r>
           </w:p>
         </w:tc>
@@ -587,7 +587,7 @@
           </w:tcPr>
           <w:p>
             <w:r>
-              <w:t>377</w:t>
+              <w:t>430</w:t>
             </w:r>
           </w:p>
         </w:tc>
@@ -599,7 +599,7 @@
           </w:tcPr>
           <w:p>
             <w:r>
-              <w:t>2026-06-29 13:31:38</w:t>
+              <w:t>2026-06-29 14:01:39</w:t>
             </w:r>
           </w:p>
         </w:tc>
@@ -657,7 +657,7 @@
           </w:tcPr>
           <w:p>
             <w:r>
-              <w:t>430</w:t>
+              <w:t>550</w:t>
             </w:r>
           </w:p>
         </w:tc>
@@ -669,7 +669,7 @@
           </w:tcPr>
           <w:p>
             <w:r>
-              <w:t>2026-06-29 14:01:39</w:t>
+              <w:t>2026-06-29 14:31:39</w:t>
             </w:r>
           </w:p>
         </w:tc>
@@ -727,7 +727,7 @@
           </w:tcPr>
           <w:p>
             <w:r>
-              <w:t>550</w:t>
+              <w:t>670</w:t>
             </w:r>
           </w:p>
         </w:tc>
@@ -739,7 +739,7 @@
           </w:tcPr>
           <w:p>
             <w:r>
-              <w:t>2026-06-29 14:31:39</w:t>
+              <w:t>2026-06-29 15:01:46</w:t>
             </w:r>
           </w:p>
         </w:tc>
@@ -797,7 +797,7 @@
           </w:tcPr>
           <w:p>
             <w:r>
-              <w:t>670</w:t>
+              <w:t>73</w:t>
             </w:r>
           </w:p>
         </w:tc>
@@ -809,7 +809,7 @@
           </w:tcPr>
           <w:p>
             <w:r>
-              <w:t>2026-06-29 15:01:46</w:t>
+              <w:t>2026-06-29 15:31:46</w:t>
             </w:r>
           </w:p>
         </w:tc>
@@ -867,7 +867,7 @@
           </w:tcPr>
           <w:p>
             <w:r>
-              <w:t>73</w:t>
+              <w:t>193</w:t>
             </w:r>
           </w:p>
         </w:tc>
@@ -879,7 +879,7 @@
           </w:tcPr>
           <w:p>
             <w:r>
-              <w:t>2026-06-29 15:31:46</w:t>
+              <w:t>2026-06-29 16:01:46</w:t>
             </w:r>
           </w:p>
         </w:tc>
@@ -937,7 +937,7 @@
           </w:tcPr>
           <w:p>
             <w:r>
-              <w:t>193</w:t>
+              <w:t>313</w:t>
             </w:r>
           </w:p>
         </w:tc>
@@ -949,7 +949,7 @@
           </w:tcPr>
           <w:p>
             <w:r>
-              <w:t>2026-06-29 16:01:46</w:t>
+              <w:t>2026-06-29 16:31:47</w:t>
             </w:r>
           </w:p>
         </w:tc>
@@ -1007,7 +1007,7 @@
           </w:tcPr>
           <w:p>
             <w:r>
-              <w:t>313</w:t>
+              <w:t>110</w:t>
             </w:r>
           </w:p>
         </w:tc>
@@ -1019,7 +1019,7 @@
           </w:tcPr>
           <w:p>
             <w:r>
-              <w:t>2026-06-29 16:31:47</w:t>
+              <w:t>2026-06-29 17:01:59</w:t>
             </w:r>
           </w:p>
         </w:tc>
@@ -1077,7 +1077,7 @@
           </w:tcPr>
           <w:p>
             <w:r>
-              <w:t>110</w:t>
+              <w:t>102</w:t>
             </w:r>
           </w:p>
         </w:tc>
@@ -1089,7 +1089,7 @@
           </w:tcPr>
           <w:p>
             <w:r>
-              <w:t>2026-06-29 17:01:59</w:t>
+              <w:t>2026-06-29 17:32:56</w:t>
             </w:r>
           </w:p>
         </w:tc>
@@ -1147,7 +1147,7 @@
           </w:tcPr>
           <w:p>
             <w:r>
-              <w:t>102</w:t>
+              <w:t>1</w:t>
             </w:r>
           </w:p>
         </w:tc>
@@ -1159,7 +1159,7 @@
           </w:tcPr>
           <w:p>
             <w:r>
-              <w:t>2026-06-29 17:32:56</w:t>
+              <w:t>2026-06-29 18:02:58</w:t>
             </w:r>
           </w:p>
         </w:tc>
@@ -1187,7 +1187,7 @@
           </w:tcPr>
           <w:p>
             <w:r>
-              <w:t>56.5</w:t>
+              <w:t>57.5</w:t>
             </w:r>
           </w:p>
         </w:tc>
@@ -1207,7 +1207,7 @@
           </w:tcPr>
           <w:p>
             <w:r>
-              <w:t>47.7</w:t>
+              <w:t>48.0</w:t>
             </w:r>
           </w:p>
         </w:tc>
@@ -1217,7 +1217,7 @@
           </w:tcPr>
           <w:p>
             <w:r>
-              <w:t>1</w:t>
+              <w:t>121</w:t>
             </w:r>
           </w:p>
         </w:tc>
@@ -1229,7 +1229,7 @@
           </w:tcPr>
           <w:p>
             <w:r>
-              <w:t>2026-06-29 18:02:58</w:t>
+              <w:t>2026-06-29 18:33:13</w:t>
             </w:r>
           </w:p>
         </w:tc>
@@ -1257,7 +1257,7 @@
           </w:tcPr>
           <w:p>
             <w:r>
-              <w:t>57.5</w:t>
+              <w:t>58.7</w:t>
             </w:r>
           </w:p>
         </w:tc>
@@ -1267,7 +1267,7 @@
           </w:tcPr>
           <w:p>
             <w:r>
-              <w:t>49.4</w:t>
+              <w:t>45.6</w:t>
             </w:r>
           </w:p>
         </w:tc>
@@ -1277,7 +1277,7 @@
           </w:tcPr>
           <w:p>
             <w:r>
-              <w:t>48.0</w:t>
+              <w:t>47.3</w:t>
             </w:r>
           </w:p>
         </w:tc>
@@ -1287,7 +1287,7 @@
           </w:tcPr>
           <w:p>
             <w:r>
-              <w:t>121</w:t>
+              <w:t>242</w:t>
             </w:r>
           </w:p>
         </w:tc>
@@ -1299,7 +1299,7 @@
           </w:tcPr>
           <w:p>
             <w:r>
-              <w:t>2026-06-29 18:33:13</w:t>
+              <w:t>2026-06-29 18:48:13</w:t>
             </w:r>
           </w:p>
         </w:tc>
@@ -1308,7 +1308,9 @@
             <w:tcW w:type="dxa" w:w="1234"/>
           </w:tcPr>
           <w:p>
-            <w:r/>
+            <w:r>
+              <w:t>1</w:t>
+            </w:r>
           </w:p>
         </w:tc>
         <w:tc>
@@ -1317,7 +1319,7 @@
           </w:tcPr>
           <w:p>
             <w:r>
-              <w:t>42.5</w:t>
+              <w:t>21.2</w:t>
             </w:r>
           </w:p>
         </w:tc>
@@ -1327,7 +1329,7 @@
           </w:tcPr>
           <w:p>
             <w:r>
-              <w:t>58.7</w:t>
+              <w:t>59.1</w:t>
             </w:r>
           </w:p>
         </w:tc>
@@ -1347,7 +1349,7 @@
           </w:tcPr>
           <w:p>
             <w:r>
-              <w:t>47.3</w:t>
+              <w:t>36.8</w:t>
             </w:r>
           </w:p>
         </w:tc>
@@ -1357,7 +1359,7 @@
           </w:tcPr>
           <w:p>
             <w:r>
-              <w:t>242</w:t>
+              <w:t>302</w:t>
             </w:r>
           </w:p>
         </w:tc>
@@ -1369,7 +1371,7 @@
           </w:tcPr>
           <w:p>
             <w:r>
-              <w:t>2026-06-29 18:48:13</w:t>
+              <w:t>2026-06-29 19:06:58</w:t>
             </w:r>
           </w:p>
         </w:tc>
@@ -1379,7 +1381,7 @@
           </w:tcPr>
           <w:p>
             <w:r>
-              <w:t>1</w:t>
+              <w:t>2</w:t>
             </w:r>
           </w:p>
         </w:tc>
@@ -1389,7 +1391,7 @@
           </w:tcPr>
           <w:p>
             <w:r>
-              <w:t>21.2</w:t>
+              <w:t>20.7</w:t>
             </w:r>
           </w:p>
         </w:tc>
@@ -1399,7 +1401,7 @@
           </w:tcPr>
           <w:p>
             <w:r>
-              <w:t>59.1</w:t>
+              <w:t>59.9</w:t>
             </w:r>
           </w:p>
         </w:tc>
@@ -1419,7 +1421,7 @@
           </w:tcPr>
           <w:p>
             <w:r>
-              <w:t>36.8</w:t>
+              <w:t>36.7</w:t>
             </w:r>
           </w:p>
         </w:tc>
@@ -1429,7 +1431,7 @@
           </w:tcPr>
           <w:p>
             <w:r>
-              <w:t>302</w:t>
+              <w:t>377</w:t>
             </w:r>
           </w:p>
         </w:tc>
@@ -1441,7 +1443,7 @@
           </w:tcPr>
           <w:p>
             <w:r>
-              <w:t>2026-06-29 19:06:58</w:t>
+              <w:t>2026-06-29 19:37:13</w:t>
             </w:r>
           </w:p>
         </w:tc>
@@ -1461,7 +1463,7 @@
           </w:tcPr>
           <w:p>
             <w:r>
-              <w:t>20.7</w:t>
+              <w:t>19.8</w:t>
             </w:r>
           </w:p>
         </w:tc>
@@ -1491,7 +1493,7 @@
           </w:tcPr>
           <w:p>
             <w:r>
-              <w:t>36.7</w:t>
+              <w:t>36.3</w:t>
             </w:r>
           </w:p>
         </w:tc>
@@ -1501,7 +1503,7 @@
           </w:tcPr>
           <w:p>
             <w:r>
-              <w:t>377</w:t>
+              <w:t>498</w:t>
             </w:r>
           </w:p>
         </w:tc>
@@ -1513,7 +1515,7 @@
           </w:tcPr>
           <w:p>
             <w:r>
-              <w:t>2026-06-29 19:37:13</w:t>
+              <w:t>2026-06-29 19:48:58</w:t>
             </w:r>
           </w:p>
         </w:tc>
@@ -1533,7 +1535,7 @@
           </w:tcPr>
           <w:p>
             <w:r>
-              <w:t>19.8</w:t>
+              <w:t>39.8</w:t>
             </w:r>
           </w:p>
         </w:tc>
@@ -1543,7 +1545,7 @@
           </w:tcPr>
           <w:p>
             <w:r>
-              <w:t>59.9</w:t>
+              <w:t>76.0</w:t>
             </w:r>
           </w:p>
         </w:tc>
@@ -1563,7 +1565,7 @@
           </w:tcPr>
           <w:p>
             <w:r>
-              <w:t>36.3</w:t>
+              <w:t>50.3</w:t>
             </w:r>
           </w:p>
         </w:tc>
@@ -1573,7 +1575,7 @@
           </w:tcPr>
           <w:p>
             <w:r>
-              <w:t>498</w:t>
+              <w:t>545</w:t>
             </w:r>
           </w:p>
         </w:tc>
@@ -1585,7 +1587,7 @@
           </w:tcPr>
           <w:p>
             <w:r>
-              <w:t>2026-06-29 19:48:58</w:t>
+              <w:t>2026-06-29 20:19:13</w:t>
             </w:r>
           </w:p>
         </w:tc>
@@ -1615,7 +1617,7 @@
           </w:tcPr>
           <w:p>
             <w:r>
-              <w:t>76.0</w:t>
+              <w:t>75.7</w:t>
             </w:r>
           </w:p>
         </w:tc>
@@ -1635,7 +1637,7 @@
           </w:tcPr>
           <w:p>
             <w:r>
-              <w:t>50.3</w:t>
+              <w:t>50.2</w:t>
             </w:r>
           </w:p>
         </w:tc>
@@ -1645,7 +1647,7 @@
           </w:tcPr>
           <w:p>
             <w:r>
-              <w:t>545</w:t>
+              <w:t>666</w:t>
             </w:r>
           </w:p>
         </w:tc>
@@ -1657,7 +1659,7 @@
           </w:tcPr>
           <w:p>
             <w:r>
-              <w:t>2026-06-29 20:19:13</w:t>
+              <w:t>2026-06-29 20:49:15</w:t>
             </w:r>
           </w:p>
         </w:tc>
@@ -1687,7 +1689,7 @@
           </w:tcPr>
           <w:p>
             <w:r>
-              <w:t>75.7</w:t>
+              <w:t>76.0</w:t>
             </w:r>
           </w:p>
         </w:tc>
@@ -1707,7 +1709,7 @@
           </w:tcPr>
           <w:p>
             <w:r>
-              <w:t>50.2</w:t>
+              <w:t>50.3</w:t>
             </w:r>
           </w:p>
         </w:tc>
@@ -1717,7 +1719,7 @@
           </w:tcPr>
           <w:p>
             <w:r>
-              <w:t>666</w:t>
+              <w:t>103</w:t>
             </w:r>
           </w:p>
         </w:tc>
@@ -2060,7 +2062,7 @@
           </w:tcPr>
           <w:p>
             <w:r>
-              <w:t>$807.56</w:t>
+              <w:t>$787.75</w:t>
             </w:r>
           </w:p>
         </w:tc>
@@ -2082,7 +2084,7 @@
           </w:tcPr>
           <w:p>
             <w:r>
-              <w:t>61.51%</w:t>
+              <w:t>57.55%</w:t>
             </w:r>
           </w:p>
         </w:tc>
@@ -2274,7 +2276,7 @@
     </w:p>
     <w:p>
       <w:r>
-        <w:t>Realized $317.5631 · Executed 102 · Settled 100 · Wins 73 · Losses 27 · Kelly active False</w:t>
+        <w:t>Realized $297.7537 · Executed 105 · Settled 104 · Wins 75 · Losses 29 · Kelly active False</w:t>
       </w:r>
     </w:p>
     <w:p>
@@ -2471,7 +2473,7 @@
           </w:tcPr>
           <w:p>
             <w:r>
-              <w:t>6</w:t>
+              <w:t>8</w:t>
             </w:r>
           </w:p>
         </w:tc>
@@ -2481,7 +2483,7 @@
           </w:tcPr>
           <w:p>
             <w:r>
-              <w:t>0.3333</w:t>
+              <w:t>0.2500</w:t>
             </w:r>
           </w:p>
         </w:tc>
@@ -2491,7 +2493,7 @@
           </w:tcPr>
           <w:p>
             <w:r>
-              <w:t>1.2165</w:t>
+              <w:t>0.8110</w:t>
             </w:r>
           </w:p>
         </w:tc>
@@ -2501,7 +2503,7 @@
           </w:tcPr>
           <w:p>
             <w:r>
-              <w:t>$7.22</w:t>
+              <w:t>$-7.09</w:t>
             </w:r>
           </w:p>
         </w:tc>
@@ -2575,7 +2577,7 @@
           </w:tcPr>
           <w:p>
             <w:r>
-              <w:t>40</w:t>
+              <w:t>42</w:t>
             </w:r>
           </w:p>
         </w:tc>
@@ -2585,7 +2587,7 @@
           </w:tcPr>
           <w:p>
             <w:r>
-              <w:t>0.6000</w:t>
+              <w:t>0.6190</w:t>
             </w:r>
           </w:p>
         </w:tc>
@@ -2595,7 +2597,7 @@
           </w:tcPr>
           <w:p>
             <w:r>
-              <w:t>1.1607</w:t>
+              <w:t>1.2609</w:t>
             </w:r>
           </w:p>
         </w:tc>
@@ -2605,7 +2607,7 @@
           </w:tcPr>
           <w:p>
             <w:r>
-              <w:t>$3.21</w:t>
+              <w:t>$4.97</w:t>
             </w:r>
           </w:p>
         </w:tc>
@@ -2702,7 +2704,7 @@
           </w:tcPr>
           <w:p>
             <w:r>
-              <w:t>parent 645401</w:t>
+              <w:t>parent 645526</w:t>
             </w:r>
           </w:p>
         </w:tc>
@@ -2712,7 +2714,7 @@
           </w:tcPr>
           <w:p>
             <w:r>
-              <w:t>open</w:t>
+              <w:t>settled</w:t>
             </w:r>
           </w:p>
         </w:tc>
@@ -2722,7 +2724,7 @@
           </w:tcPr>
           <w:p>
             <w:r>
-              <w:t>—</w:t>
+              <w:t>Yes</w:t>
             </w:r>
           </w:p>
         </w:tc>
@@ -2732,7 +2734,7 @@
           </w:tcPr>
           <w:p>
             <w:r>
-              <w:t>0.240</w:t>
+              <w:t>0.530</w:t>
             </w:r>
           </w:p>
         </w:tc>
@@ -2742,7 +2744,7 @@
           </w:tcPr>
           <w:p>
             <w:r>
-              <w:t>$—</w:t>
+              <w:t>$44.34</w:t>
             </w:r>
           </w:p>
         </w:tc>
@@ -2752,7 +2754,7 @@
           </w:tcPr>
           <w:p>
             <w:r>
-              <w:t>heuristic</w:t>
+              <w:t>outcome</w:t>
             </w:r>
           </w:p>
         </w:tc>
@@ -2764,7 +2766,7 @@
           </w:tcPr>
           <w:p>
             <w:r>
-              <w:t>parent 645381</w:t>
+              <w:t>parent 645484</w:t>
             </w:r>
           </w:p>
         </w:tc>
@@ -2784,7 +2786,7 @@
           </w:tcPr>
           <w:p>
             <w:r>
-              <w:t>Yes</w:t>
+              <w:t>No</w:t>
             </w:r>
           </w:p>
         </w:tc>
@@ -2794,7 +2796,7 @@
           </w:tcPr>
           <w:p>
             <w:r>
-              <w:t>0.580</w:t>
+              <w:t>0.315</w:t>
             </w:r>
           </w:p>
         </w:tc>
@@ -2804,7 +2806,7 @@
           </w:tcPr>
           <w:p>
             <w:r>
-              <w:t>$36.21</w:t>
+              <w:t>$-50.00</w:t>
             </w:r>
           </w:p>
         </w:tc>
@@ -2826,7 +2828,7 @@
           </w:tcPr>
           <w:p>
             <w:r>
-              <w:t>parent 645340</w:t>
+              <w:t>parent 645429</w:t>
             </w:r>
           </w:p>
         </w:tc>
@@ -2846,7 +2848,7 @@
           </w:tcPr>
           <w:p>
             <w:r>
-              <w:t>No</w:t>
+              <w:t>Yes</w:t>
             </w:r>
           </w:p>
         </w:tc>
@@ -2856,7 +2858,7 @@
           </w:tcPr>
           <w:p>
             <w:r>
-              <w:t>0.538</w:t>
+              <w:t>0.582</w:t>
             </w:r>
           </w:p>
         </w:tc>
@@ -2866,7 +2868,7 @@
           </w:tcPr>
           <w:p>
             <w:r>
-              <w:t>$-50.00</w:t>
+              <w:t>$35.85</w:t>
             </w:r>
           </w:p>
         </w:tc>
@@ -2888,7 +2890,7 @@
           </w:tcPr>
           <w:p>
             <w:r>
-              <w:t>parent 645281</w:t>
+              <w:t>parent 645401</w:t>
             </w:r>
           </w:p>
         </w:tc>
@@ -2908,7 +2910,7 @@
           </w:tcPr>
           <w:p>
             <w:r>
-              <w:t>Yes</w:t>
+              <w:t>No</w:t>
             </w:r>
           </w:p>
         </w:tc>
@@ -2918,7 +2920,7 @@
           </w:tcPr>
           <w:p>
             <w:r>
-              <w:t>0.118</w:t>
+              <w:t>0.240</w:t>
             </w:r>
           </w:p>
         </w:tc>
@@ -2928,7 +2930,7 @@
           </w:tcPr>
           <w:p>
             <w:r>
-              <w:t>$373.90</w:t>
+              <w:t>$-50.00</w:t>
             </w:r>
           </w:p>
         </w:tc>
@@ -2950,7 +2952,7 @@
           </w:tcPr>
           <w:p>
             <w:r>
-              <w:t>parent 645252</w:t>
+              <w:t>parent 645381</w:t>
             </w:r>
           </w:p>
         </w:tc>
@@ -2980,7 +2982,7 @@
           </w:tcPr>
           <w:p>
             <w:r>
-              <w:t>0.537</w:t>
+              <w:t>0.580</w:t>
             </w:r>
           </w:p>
         </w:tc>
@@ -2990,7 +2992,7 @@
           </w:tcPr>
           <w:p>
             <w:r>
-              <w:t>$43.06</w:t>
+              <w:t>$36.21</w:t>
             </w:r>
           </w:p>
         </w:tc>
@@ -3012,7 +3014,7 @@
           </w:tcPr>
           <w:p>
             <w:r>
-              <w:t>parent 645212</w:t>
+              <w:t>parent 645340</w:t>
             </w:r>
           </w:p>
         </w:tc>
@@ -3042,7 +3044,7 @@
           </w:tcPr>
           <w:p>
             <w:r>
-              <w:t>0.080</w:t>
+              <w:t>0.538</w:t>
             </w:r>
           </w:p>
         </w:tc>
@@ -3074,7 +3076,7 @@
           </w:tcPr>
           <w:p>
             <w:r>
-              <w:t>parent 645157</w:t>
+              <w:t>parent 645281</w:t>
             </w:r>
           </w:p>
         </w:tc>
@@ -3104,7 +3106,7 @@
           </w:tcPr>
           <w:p>
             <w:r>
-              <w:t>0.540</w:t>
+              <w:t>0.118</w:t>
             </w:r>
           </w:p>
         </w:tc>
@@ -3114,7 +3116,7 @@
           </w:tcPr>
           <w:p>
             <w:r>
-              <w:t>$42.59</w:t>
+              <w:t>$373.90</w:t>
             </w:r>
           </w:p>
         </w:tc>
@@ -3136,7 +3138,7 @@
           </w:tcPr>
           <w:p>
             <w:r>
-              <w:t>parent 645117</w:t>
+              <w:t>parent 645252</w:t>
             </w:r>
           </w:p>
         </w:tc>
@@ -3166,7 +3168,7 @@
           </w:tcPr>
           <w:p>
             <w:r>
-              <w:t>0.527</w:t>
+              <w:t>0.537</w:t>
             </w:r>
           </w:p>
         </w:tc>
@@ -3176,7 +3178,7 @@
           </w:tcPr>
           <w:p>
             <w:r>
-              <w:t>$44.80</w:t>
+              <w:t>$43.06</w:t>
             </w:r>
           </w:p>
         </w:tc>
@@ -3198,7 +3200,7 @@
           </w:tcPr>
           <w:p>
             <w:r>
-              <w:t>parent 645086</w:t>
+              <w:t>parent 645212</w:t>
             </w:r>
           </w:p>
         </w:tc>
@@ -3228,7 +3230,7 @@
           </w:tcPr>
           <w:p>
             <w:r>
-              <w:t>0.240</w:t>
+              <w:t>0.080</w:t>
             </w:r>
           </w:p>
         </w:tc>
@@ -3260,7 +3262,7 @@
           </w:tcPr>
           <w:p>
             <w:r>
-              <w:t>parent 645067</w:t>
+              <w:t>parent 645157</w:t>
             </w:r>
           </w:p>
         </w:tc>
@@ -3290,7 +3292,7 @@
           </w:tcPr>
           <w:p>
             <w:r>
-              <w:t>0.589</w:t>
+              <w:t>0.540</w:t>
             </w:r>
           </w:p>
         </w:tc>
@@ -3300,7 +3302,7 @@
           </w:tcPr>
           <w:p>
             <w:r>
-              <w:t>$34.83</w:t>
+              <w:t>$42.59</w:t>
             </w:r>
           </w:p>
         </w:tc>
@@ -3322,7 +3324,7 @@
           </w:tcPr>
           <w:p>
             <w:r>
-              <w:t>parent 645020</w:t>
+              <w:t>parent 645117</w:t>
             </w:r>
           </w:p>
         </w:tc>
@@ -3342,7 +3344,7 @@
           </w:tcPr>
           <w:p>
             <w:r>
-              <w:t>No</w:t>
+              <w:t>Yes</w:t>
             </w:r>
           </w:p>
         </w:tc>
@@ -3352,7 +3354,7 @@
           </w:tcPr>
           <w:p>
             <w:r>
-              <w:t>0.300</w:t>
+              <w:t>0.527</w:t>
             </w:r>
           </w:p>
         </w:tc>
@@ -3362,7 +3364,7 @@
           </w:tcPr>
           <w:p>
             <w:r>
-              <w:t>$-50.00</w:t>
+              <w:t>$44.80</w:t>
             </w:r>
           </w:p>
         </w:tc>
@@ -3384,7 +3386,7 @@
           </w:tcPr>
           <w:p>
             <w:r>
-              <w:t>parent 644996</w:t>
+              <w:t>parent 645086</w:t>
             </w:r>
           </w:p>
         </w:tc>
@@ -3404,7 +3406,7 @@
           </w:tcPr>
           <w:p>
             <w:r>
-              <w:t>Yes</w:t>
+              <w:t>No</w:t>
             </w:r>
           </w:p>
         </w:tc>
@@ -3414,7 +3416,7 @@
           </w:tcPr>
           <w:p>
             <w:r>
-              <w:t>0.490</w:t>
+              <w:t>0.240</w:t>
             </w:r>
           </w:p>
         </w:tc>
@@ -3424,7 +3426,7 @@
           </w:tcPr>
           <w:p>
             <w:r>
-              <w:t>$52.04</w:t>
+              <w:t>$-50.00</w:t>
             </w:r>
           </w:p>
         </w:tc>
@@ -3446,7 +3448,7 @@
           </w:tcPr>
           <w:p>
             <w:r>
-              <w:t>parent 644966</w:t>
+              <w:t>parent 645067</w:t>
             </w:r>
           </w:p>
         </w:tc>
@@ -3476,7 +3478,7 @@
           </w:tcPr>
           <w:p>
             <w:r>
-              <w:t>0.537</w:t>
+              <w:t>0.589</w:t>
             </w:r>
           </w:p>
         </w:tc>
@@ -3486,7 +3488,7 @@
           </w:tcPr>
           <w:p>
             <w:r>
-              <w:t>$43.16</w:t>
+              <w:t>$34.83</w:t>
             </w:r>
           </w:p>
         </w:tc>
@@ -3508,7 +3510,7 @@
           </w:tcPr>
           <w:p>
             <w:r>
-              <w:t>parent 644931</w:t>
+              <w:t>parent 645020</w:t>
             </w:r>
           </w:p>
         </w:tc>
@@ -3528,7 +3530,7 @@
           </w:tcPr>
           <w:p>
             <w:r>
-              <w:t>Yes</w:t>
+              <w:t>No</w:t>
             </w:r>
           </w:p>
         </w:tc>
@@ -3538,7 +3540,7 @@
           </w:tcPr>
           <w:p>
             <w:r>
-              <w:t>0.588</w:t>
+              <w:t>0.300</w:t>
             </w:r>
           </w:p>
         </w:tc>
@@ -3548,7 +3550,7 @@
           </w:tcPr>
           <w:p>
             <w:r>
-              <w:t>$35.08</w:t>
+              <w:t>$-50.00</w:t>
             </w:r>
           </w:p>
         </w:tc>
@@ -3570,7 +3572,7 @@
           </w:tcPr>
           <w:p>
             <w:r>
-              <w:t>parent 644897</w:t>
+              <w:t>parent 644996</w:t>
             </w:r>
           </w:p>
         </w:tc>
@@ -3600,7 +3602,7 @@
           </w:tcPr>
           <w:p>
             <w:r>
-              <w:t>0.546</w:t>
+              <w:t>0.490</w:t>
             </w:r>
           </w:p>
         </w:tc>
@@ -3610,7 +3612,7 @@
           </w:tcPr>
           <w:p>
             <w:r>
-              <w:t>$41.54</w:t>
+              <w:t>$52.04</w:t>
             </w:r>
           </w:p>
         </w:tc>
@@ -3632,7 +3634,7 @@
           </w:tcPr>
           <w:p>
             <w:r>
-              <w:t>parent 644852</w:t>
+              <w:t>parent 644966</w:t>
             </w:r>
           </w:p>
         </w:tc>
@@ -3662,7 +3664,7 @@
           </w:tcPr>
           <w:p>
             <w:r>
-              <w:t>0.540</w:t>
+              <w:t>0.537</w:t>
             </w:r>
           </w:p>
         </w:tc>
@@ -3672,7 +3674,7 @@
           </w:tcPr>
           <w:p>
             <w:r>
-              <w:t>$42.59</w:t>
+              <w:t>$43.16</w:t>
             </w:r>
           </w:p>
         </w:tc>
@@ -3694,7 +3696,7 @@
           </w:tcPr>
           <w:p>
             <w:r>
-              <w:t>parent 644830</w:t>
+              <w:t>parent 644931</w:t>
             </w:r>
           </w:p>
         </w:tc>
@@ -3714,7 +3716,7 @@
           </w:tcPr>
           <w:p>
             <w:r>
-              <w:t>No</w:t>
+              <w:t>Yes</w:t>
             </w:r>
           </w:p>
         </w:tc>
@@ -3724,7 +3726,7 @@
           </w:tcPr>
           <w:p>
             <w:r>
-              <w:t>0.542</w:t>
+              <w:t>0.588</w:t>
             </w:r>
           </w:p>
         </w:tc>
@@ -3734,7 +3736,7 @@
           </w:tcPr>
           <w:p>
             <w:r>
-              <w:t>$-50.00</w:t>
+              <w:t>$35.08</w:t>
             </w:r>
           </w:p>
         </w:tc>
@@ -3756,7 +3758,7 @@
           </w:tcPr>
           <w:p>
             <w:r>
-              <w:t>parent 644788</w:t>
+              <w:t>parent 644897</w:t>
             </w:r>
           </w:p>
         </w:tc>
@@ -3776,7 +3778,7 @@
           </w:tcPr>
           <w:p>
             <w:r>
-              <w:t>No</w:t>
+              <w:t>Yes</w:t>
             </w:r>
           </w:p>
         </w:tc>
@@ -3786,7 +3788,7 @@
           </w:tcPr>
           <w:p>
             <w:r>
-              <w:t>0.469</w:t>
+              <w:t>0.546</w:t>
             </w:r>
           </w:p>
         </w:tc>
@@ -3796,7 +3798,7 @@
           </w:tcPr>
           <w:p>
             <w:r>
-              <w:t>$-50.00</w:t>
+              <w:t>$41.54</w:t>
             </w:r>
           </w:p>
         </w:tc>
@@ -3818,7 +3820,7 @@
           </w:tcPr>
           <w:p>
             <w:r>
-              <w:t>parent 644688</w:t>
+              <w:t>parent 644852</w:t>
             </w:r>
           </w:p>
         </w:tc>
@@ -3838,7 +3840,7 @@
           </w:tcPr>
           <w:p>
             <w:r>
-              <w:t>No</w:t>
+              <w:t>Yes</w:t>
             </w:r>
           </w:p>
         </w:tc>
@@ -3848,7 +3850,7 @@
           </w:tcPr>
           <w:p>
             <w:r>
-              <w:t>0.472</w:t>
+              <w:t>0.540</w:t>
             </w:r>
           </w:p>
         </w:tc>
@@ -3858,7 +3860,7 @@
           </w:tcPr>
           <w:p>
             <w:r>
-              <w:t>$-50.00</w:t>
+              <w:t>$42.59</w:t>
             </w:r>
           </w:p>
         </w:tc>
@@ -3880,7 +3882,7 @@
           </w:tcPr>
           <w:p>
             <w:r>
-              <w:t>parent 644667</w:t>
+              <w:t>parent 644830</w:t>
             </w:r>
           </w:p>
         </w:tc>
@@ -3900,7 +3902,7 @@
           </w:tcPr>
           <w:p>
             <w:r>
-              <w:t>Yes</w:t>
+              <w:t>No</w:t>
             </w:r>
           </w:p>
         </w:tc>
@@ -3910,7 +3912,7 @@
           </w:tcPr>
           <w:p>
             <w:r>
-              <w:t>0.600</w:t>
+              <w:t>0.542</w:t>
             </w:r>
           </w:p>
         </w:tc>
@@ -3920,7 +3922,7 @@
           </w:tcPr>
           <w:p>
             <w:r>
-              <w:t>$33.33</w:t>
+              <w:t>$-50.00</w:t>
             </w:r>
           </w:p>
         </w:tc>
@@ -4142,7 +4144,7 @@
     </w:p>
     <w:p>
       <w:r>
-        <w:t>Section score: 75.4 / 100  (Grade: C+)</w:t>
+        <w:t>Section score: 75.8 / 100  (Grade: C+)</w:t>
       </w:r>
     </w:p>
     <w:p>
@@ -4285,7 +4287,7 @@
           </w:tcPr>
           <w:p>
             <w:r>
-              <w:t>25.9</w:t>
+              <w:t>28.8</w:t>
             </w:r>
           </w:p>
         </w:tc>
@@ -4295,7 +4297,7 @@
           </w:tcPr>
           <w:p>
             <w:r>
-              <w:t>3.9</w:t>
+              <w:t>4.3</w:t>
             </w:r>
           </w:p>
         </w:tc>
@@ -4399,17 +4401,17 @@
     </w:tbl>
     <w:p>
       <w:r>
-        <w:t>Ticks: 11 · Reconciled: True · Readiness: not_ready</w:t>
+        <w:t>Ticks: 212 · Reconciled: True · Readiness: not_ready</w:t>
       </w:r>
     </w:p>
     <w:p>
       <w:r>
-        <w:t>Candidates created: 11819 · Terminals: {'accepted': 0, 'rejected': 1151, 'skipped': 10616, 'expired': 0, 'missing_data': 52}</w:t>
+        <w:t>Candidates created: 12221 · Terminals: {'accepted': 0, 'rejected': 1352, 'skipped': 10817, 'expired': 0, 'missing_data': 52}</w:t>
       </w:r>
     </w:p>
     <w:p>
       <w:r>
-        <w:t>Rejected by stage: {'directional': 1043, 'execution_gate': 12, 'baseline_cohort_gate': 96}</w:t>
+        <w:t>Rejected by stage: {'directional': 1175, 'execution_gate': 23, 'baseline_cohort_gate': 154}</w:t>
       </w:r>
     </w:p>
     <w:p>
@@ -5362,7 +5364,7 @@
           </w:tcPr>
           <w:p>
             <w:r>
-              <w:t>0.5238</w:t>
+              <w:t>0.4800</w:t>
             </w:r>
           </w:p>
         </w:tc>
@@ -5392,7 +5394,7 @@
     </w:tbl>
     <w:p>
       <w:r>
-        <w:t>TV alerts: received 1755 · valid 1536 · rejected 219</w:t>
+        <w:t>TV alerts: received 1810 · valid 1591 · rejected 219</w:t>
       </w:r>
     </w:p>
     <w:sectPr>

</xml_diff>

<commit_message>
chore(reports): VPS full report 2026-06-29 23:38 UTC (5 settled, WR 60.0%, PF 1.3732, grade D)
</commit_message>
<xml_diff>
--- a/vps_full_reports/latest/report.docx
+++ b/vps_full_reports/latest/report.docx
@@ -20,7 +20,7 @@
           <w:color w:val="666666"/>
           <w:sz w:val="20"/>
         </w:rPr>
-        <w:t>PAPER ONLY  ·  reconciled=True  ·  ticks=212</w:t>
+        <w:t>PAPER ONLY  ·  reconciled=True  ·  ticks=778</w:t>
       </w:r>
     </w:p>
     <w:p>
@@ -33,7 +33,7 @@
     </w:p>
     <w:p>
       <w:r>
-        <w:t>Overall score: 50.2 / 100  (Grade: F)</w:t>
+        <w:t>Overall score: 61.3 / 100  (Grade: D)</w:t>
       </w:r>
     </w:p>
     <w:tbl>
@@ -107,7 +107,7 @@
           </w:tcPr>
           <w:p>
             <w:r>
-              <w:t>39.8</w:t>
+              <w:t>62.6</w:t>
             </w:r>
           </w:p>
         </w:tc>
@@ -117,7 +117,7 @@
           </w:tcPr>
           <w:p>
             <w:r>
-              <w:t>F</w:t>
+              <w:t>D</w:t>
             </w:r>
           </w:p>
         </w:tc>
@@ -149,7 +149,7 @@
           </w:tcPr>
           <w:p>
             <w:r>
-              <w:t>75.8</w:t>
+              <w:t>75.6</w:t>
             </w:r>
           </w:p>
         </w:tc>
@@ -191,7 +191,7 @@
           </w:tcPr>
           <w:p>
             <w:r>
-              <w:t>45.6</w:t>
+              <w:t>44.5</w:t>
             </w:r>
           </w:p>
         </w:tc>
@@ -319,7 +319,7 @@
           </w:tcPr>
           <w:p>
             <w:r>
-              <w:t>2026-06-29 12:45:09</w:t>
+              <w:t>2026-06-29 15:31:46</w:t>
             </w:r>
           </w:p>
         </w:tc>
@@ -337,7 +337,7 @@
           </w:tcPr>
           <w:p>
             <w:r>
-              <w:t>48.0</w:t>
+              <w:t>42.5</w:t>
             </w:r>
           </w:p>
         </w:tc>
@@ -367,7 +367,7 @@
           </w:tcPr>
           <w:p>
             <w:r>
-              <w:t>50.5</w:t>
+              <w:t>47.7</w:t>
             </w:r>
           </w:p>
         </w:tc>
@@ -377,7 +377,7 @@
           </w:tcPr>
           <w:p>
             <w:r>
-              <w:t>244</w:t>
+              <w:t>193</w:t>
             </w:r>
           </w:p>
         </w:tc>
@@ -389,7 +389,7 @@
           </w:tcPr>
           <w:p>
             <w:r>
-              <w:t>2026-06-29 13:05:24</w:t>
+              <w:t>2026-06-29 16:01:46</w:t>
             </w:r>
           </w:p>
         </w:tc>
@@ -447,7 +447,7 @@
           </w:tcPr>
           <w:p>
             <w:r>
-              <w:t>325</w:t>
+              <w:t>313</w:t>
             </w:r>
           </w:p>
         </w:tc>
@@ -459,7 +459,7 @@
           </w:tcPr>
           <w:p>
             <w:r>
-              <w:t>2026-06-29 13:18:24</w:t>
+              <w:t>2026-06-29 16:31:47</w:t>
             </w:r>
           </w:p>
         </w:tc>
@@ -477,7 +477,7 @@
           </w:tcPr>
           <w:p>
             <w:r>
-              <w:t>45.5</w:t>
+              <w:t>42.5</w:t>
             </w:r>
           </w:p>
         </w:tc>
@@ -507,7 +507,7 @@
           </w:tcPr>
           <w:p>
             <w:r>
-              <w:t>49.2</w:t>
+              <w:t>47.7</w:t>
             </w:r>
           </w:p>
         </w:tc>
@@ -517,7 +517,7 @@
           </w:tcPr>
           <w:p>
             <w:r>
-              <w:t>377</w:t>
+              <w:t>110</w:t>
             </w:r>
           </w:p>
         </w:tc>
@@ -529,7 +529,7 @@
           </w:tcPr>
           <w:p>
             <w:r>
-              <w:t>2026-06-29 13:31:38</w:t>
+              <w:t>2026-06-29 17:01:59</w:t>
             </w:r>
           </w:p>
         </w:tc>
@@ -587,7 +587,7 @@
           </w:tcPr>
           <w:p>
             <w:r>
-              <w:t>430</w:t>
+              <w:t>102</w:t>
             </w:r>
           </w:p>
         </w:tc>
@@ -599,7 +599,7 @@
           </w:tcPr>
           <w:p>
             <w:r>
-              <w:t>2026-06-29 14:01:39</w:t>
+              <w:t>2026-06-29 17:32:56</w:t>
             </w:r>
           </w:p>
         </w:tc>
@@ -657,7 +657,7 @@
           </w:tcPr>
           <w:p>
             <w:r>
-              <w:t>550</w:t>
+              <w:t>1</w:t>
             </w:r>
           </w:p>
         </w:tc>
@@ -669,7 +669,7 @@
           </w:tcPr>
           <w:p>
             <w:r>
-              <w:t>2026-06-29 14:31:39</w:t>
+              <w:t>2026-06-29 18:02:58</w:t>
             </w:r>
           </w:p>
         </w:tc>
@@ -697,7 +697,7 @@
           </w:tcPr>
           <w:p>
             <w:r>
-              <w:t>56.5</w:t>
+              <w:t>57.5</w:t>
             </w:r>
           </w:p>
         </w:tc>
@@ -717,7 +717,7 @@
           </w:tcPr>
           <w:p>
             <w:r>
-              <w:t>47.7</w:t>
+              <w:t>48.0</w:t>
             </w:r>
           </w:p>
         </w:tc>
@@ -727,7 +727,7 @@
           </w:tcPr>
           <w:p>
             <w:r>
-              <w:t>670</w:t>
+              <w:t>121</w:t>
             </w:r>
           </w:p>
         </w:tc>
@@ -739,7 +739,7 @@
           </w:tcPr>
           <w:p>
             <w:r>
-              <w:t>2026-06-29 15:01:46</w:t>
+              <w:t>2026-06-29 18:33:13</w:t>
             </w:r>
           </w:p>
         </w:tc>
@@ -767,7 +767,7 @@
           </w:tcPr>
           <w:p>
             <w:r>
-              <w:t>56.5</w:t>
+              <w:t>58.7</w:t>
             </w:r>
           </w:p>
         </w:tc>
@@ -777,7 +777,7 @@
           </w:tcPr>
           <w:p>
             <w:r>
-              <w:t>49.4</w:t>
+              <w:t>45.6</w:t>
             </w:r>
           </w:p>
         </w:tc>
@@ -787,7 +787,7 @@
           </w:tcPr>
           <w:p>
             <w:r>
-              <w:t>47.7</w:t>
+              <w:t>47.3</w:t>
             </w:r>
           </w:p>
         </w:tc>
@@ -797,7 +797,7 @@
           </w:tcPr>
           <w:p>
             <w:r>
-              <w:t>73</w:t>
+              <w:t>242</w:t>
             </w:r>
           </w:p>
         </w:tc>
@@ -809,7 +809,7 @@
           </w:tcPr>
           <w:p>
             <w:r>
-              <w:t>2026-06-29 15:31:46</w:t>
+              <w:t>2026-06-29 18:48:13</w:t>
             </w:r>
           </w:p>
         </w:tc>
@@ -818,7 +818,9 @@
             <w:tcW w:type="dxa" w:w="1234"/>
           </w:tcPr>
           <w:p>
-            <w:r/>
+            <w:r>
+              <w:t>1</w:t>
+            </w:r>
           </w:p>
         </w:tc>
         <w:tc>
@@ -827,7 +829,7 @@
           </w:tcPr>
           <w:p>
             <w:r>
-              <w:t>42.5</w:t>
+              <w:t>21.2</w:t>
             </w:r>
           </w:p>
         </w:tc>
@@ -837,7 +839,7 @@
           </w:tcPr>
           <w:p>
             <w:r>
-              <w:t>56.5</w:t>
+              <w:t>59.1</w:t>
             </w:r>
           </w:p>
         </w:tc>
@@ -847,7 +849,7 @@
           </w:tcPr>
           <w:p>
             <w:r>
-              <w:t>49.4</w:t>
+              <w:t>45.6</w:t>
             </w:r>
           </w:p>
         </w:tc>
@@ -857,7 +859,7 @@
           </w:tcPr>
           <w:p>
             <w:r>
-              <w:t>47.7</w:t>
+              <w:t>36.8</w:t>
             </w:r>
           </w:p>
         </w:tc>
@@ -867,7 +869,7 @@
           </w:tcPr>
           <w:p>
             <w:r>
-              <w:t>193</w:t>
+              <w:t>302</w:t>
             </w:r>
           </w:p>
         </w:tc>
@@ -879,7 +881,7 @@
           </w:tcPr>
           <w:p>
             <w:r>
-              <w:t>2026-06-29 16:01:46</w:t>
+              <w:t>2026-06-29 19:06:58</w:t>
             </w:r>
           </w:p>
         </w:tc>
@@ -888,7 +890,9 @@
             <w:tcW w:type="dxa" w:w="1234"/>
           </w:tcPr>
           <w:p>
-            <w:r/>
+            <w:r>
+              <w:t>2</w:t>
+            </w:r>
           </w:p>
         </w:tc>
         <w:tc>
@@ -897,7 +901,7 @@
           </w:tcPr>
           <w:p>
             <w:r>
-              <w:t>42.5</w:t>
+              <w:t>20.7</w:t>
             </w:r>
           </w:p>
         </w:tc>
@@ -907,7 +911,7 @@
           </w:tcPr>
           <w:p>
             <w:r>
-              <w:t>56.5</w:t>
+              <w:t>59.9</w:t>
             </w:r>
           </w:p>
         </w:tc>
@@ -917,7 +921,7 @@
           </w:tcPr>
           <w:p>
             <w:r>
-              <w:t>49.4</w:t>
+              <w:t>45.6</w:t>
             </w:r>
           </w:p>
         </w:tc>
@@ -927,7 +931,7 @@
           </w:tcPr>
           <w:p>
             <w:r>
-              <w:t>47.7</w:t>
+              <w:t>36.7</w:t>
             </w:r>
           </w:p>
         </w:tc>
@@ -937,7 +941,7 @@
           </w:tcPr>
           <w:p>
             <w:r>
-              <w:t>313</w:t>
+              <w:t>377</w:t>
             </w:r>
           </w:p>
         </w:tc>
@@ -949,7 +953,7 @@
           </w:tcPr>
           <w:p>
             <w:r>
-              <w:t>2026-06-29 16:31:47</w:t>
+              <w:t>2026-06-29 19:37:13</w:t>
             </w:r>
           </w:p>
         </w:tc>
@@ -958,7 +962,9 @@
             <w:tcW w:type="dxa" w:w="1234"/>
           </w:tcPr>
           <w:p>
-            <w:r/>
+            <w:r>
+              <w:t>2</w:t>
+            </w:r>
           </w:p>
         </w:tc>
         <w:tc>
@@ -967,7 +973,7 @@
           </w:tcPr>
           <w:p>
             <w:r>
-              <w:t>42.5</w:t>
+              <w:t>19.8</w:t>
             </w:r>
           </w:p>
         </w:tc>
@@ -977,7 +983,7 @@
           </w:tcPr>
           <w:p>
             <w:r>
-              <w:t>56.5</w:t>
+              <w:t>59.9</w:t>
             </w:r>
           </w:p>
         </w:tc>
@@ -987,7 +993,7 @@
           </w:tcPr>
           <w:p>
             <w:r>
-              <w:t>49.4</w:t>
+              <w:t>45.6</w:t>
             </w:r>
           </w:p>
         </w:tc>
@@ -997,7 +1003,7 @@
           </w:tcPr>
           <w:p>
             <w:r>
-              <w:t>47.7</w:t>
+              <w:t>36.3</w:t>
             </w:r>
           </w:p>
         </w:tc>
@@ -1007,7 +1013,7 @@
           </w:tcPr>
           <w:p>
             <w:r>
-              <w:t>110</w:t>
+              <w:t>498</w:t>
             </w:r>
           </w:p>
         </w:tc>
@@ -1019,7 +1025,7 @@
           </w:tcPr>
           <w:p>
             <w:r>
-              <w:t>2026-06-29 17:01:59</w:t>
+              <w:t>2026-06-29 19:48:58</w:t>
             </w:r>
           </w:p>
         </w:tc>
@@ -1028,7 +1034,9 @@
             <w:tcW w:type="dxa" w:w="1234"/>
           </w:tcPr>
           <w:p>
-            <w:r/>
+            <w:r>
+              <w:t>2</w:t>
+            </w:r>
           </w:p>
         </w:tc>
         <w:tc>
@@ -1037,7 +1045,7 @@
           </w:tcPr>
           <w:p>
             <w:r>
-              <w:t>42.5</w:t>
+              <w:t>39.8</w:t>
             </w:r>
           </w:p>
         </w:tc>
@@ -1047,7 +1055,7 @@
           </w:tcPr>
           <w:p>
             <w:r>
-              <w:t>56.5</w:t>
+              <w:t>76.0</w:t>
             </w:r>
           </w:p>
         </w:tc>
@@ -1057,7 +1065,7 @@
           </w:tcPr>
           <w:p>
             <w:r>
-              <w:t>49.4</w:t>
+              <w:t>45.6</w:t>
             </w:r>
           </w:p>
         </w:tc>
@@ -1067,7 +1075,7 @@
           </w:tcPr>
           <w:p>
             <w:r>
-              <w:t>47.7</w:t>
+              <w:t>50.3</w:t>
             </w:r>
           </w:p>
         </w:tc>
@@ -1077,7 +1085,7 @@
           </w:tcPr>
           <w:p>
             <w:r>
-              <w:t>102</w:t>
+              <w:t>545</w:t>
             </w:r>
           </w:p>
         </w:tc>
@@ -1089,7 +1097,7 @@
           </w:tcPr>
           <w:p>
             <w:r>
-              <w:t>2026-06-29 17:32:56</w:t>
+              <w:t>2026-06-29 20:19:13</w:t>
             </w:r>
           </w:p>
         </w:tc>
@@ -1098,7 +1106,9 @@
             <w:tcW w:type="dxa" w:w="1234"/>
           </w:tcPr>
           <w:p>
-            <w:r/>
+            <w:r>
+              <w:t>2</w:t>
+            </w:r>
           </w:p>
         </w:tc>
         <w:tc>
@@ -1107,7 +1117,7 @@
           </w:tcPr>
           <w:p>
             <w:r>
-              <w:t>42.5</w:t>
+              <w:t>39.8</w:t>
             </w:r>
           </w:p>
         </w:tc>
@@ -1117,7 +1127,7 @@
           </w:tcPr>
           <w:p>
             <w:r>
-              <w:t>56.5</w:t>
+              <w:t>75.7</w:t>
             </w:r>
           </w:p>
         </w:tc>
@@ -1127,7 +1137,7 @@
           </w:tcPr>
           <w:p>
             <w:r>
-              <w:t>49.4</w:t>
+              <w:t>45.6</w:t>
             </w:r>
           </w:p>
         </w:tc>
@@ -1137,7 +1147,7 @@
           </w:tcPr>
           <w:p>
             <w:r>
-              <w:t>47.7</w:t>
+              <w:t>50.2</w:t>
             </w:r>
           </w:p>
         </w:tc>
@@ -1147,7 +1157,7 @@
           </w:tcPr>
           <w:p>
             <w:r>
-              <w:t>1</w:t>
+              <w:t>666</w:t>
             </w:r>
           </w:p>
         </w:tc>
@@ -1159,7 +1169,7 @@
           </w:tcPr>
           <w:p>
             <w:r>
-              <w:t>2026-06-29 18:02:58</w:t>
+              <w:t>2026-06-29 20:49:15</w:t>
             </w:r>
           </w:p>
         </w:tc>
@@ -1168,7 +1178,9 @@
             <w:tcW w:type="dxa" w:w="1234"/>
           </w:tcPr>
           <w:p>
-            <w:r/>
+            <w:r>
+              <w:t>2</w:t>
+            </w:r>
           </w:p>
         </w:tc>
         <w:tc>
@@ -1177,7 +1189,7 @@
           </w:tcPr>
           <w:p>
             <w:r>
-              <w:t>42.5</w:t>
+              <w:t>39.8</w:t>
             </w:r>
           </w:p>
         </w:tc>
@@ -1187,7 +1199,7 @@
           </w:tcPr>
           <w:p>
             <w:r>
-              <w:t>57.5</w:t>
+              <w:t>76.0</w:t>
             </w:r>
           </w:p>
         </w:tc>
@@ -1197,7 +1209,7 @@
           </w:tcPr>
           <w:p>
             <w:r>
-              <w:t>49.4</w:t>
+              <w:t>45.6</w:t>
             </w:r>
           </w:p>
         </w:tc>
@@ -1207,7 +1219,7 @@
           </w:tcPr>
           <w:p>
             <w:r>
-              <w:t>48.0</w:t>
+              <w:t>50.3</w:t>
             </w:r>
           </w:p>
         </w:tc>
@@ -1217,7 +1229,7 @@
           </w:tcPr>
           <w:p>
             <w:r>
-              <w:t>121</w:t>
+              <w:t>103</w:t>
             </w:r>
           </w:p>
         </w:tc>
@@ -1229,7 +1241,7 @@
           </w:tcPr>
           <w:p>
             <w:r>
-              <w:t>2026-06-29 18:33:13</w:t>
+              <w:t>2026-06-29 21:19:30</w:t>
             </w:r>
           </w:p>
         </w:tc>
@@ -1238,7 +1250,9 @@
             <w:tcW w:type="dxa" w:w="1234"/>
           </w:tcPr>
           <w:p>
-            <w:r/>
+            <w:r>
+              <w:t>2</w:t>
+            </w:r>
           </w:p>
         </w:tc>
         <w:tc>
@@ -1247,7 +1261,7 @@
           </w:tcPr>
           <w:p>
             <w:r>
-              <w:t>42.5</w:t>
+              <w:t>39.8</w:t>
             </w:r>
           </w:p>
         </w:tc>
@@ -1257,7 +1271,7 @@
           </w:tcPr>
           <w:p>
             <w:r>
-              <w:t>58.7</w:t>
+              <w:t>75.7</w:t>
             </w:r>
           </w:p>
         </w:tc>
@@ -1277,7 +1291,7 @@
           </w:tcPr>
           <w:p>
             <w:r>
-              <w:t>47.3</w:t>
+              <w:t>50.2</w:t>
             </w:r>
           </w:p>
         </w:tc>
@@ -1287,7 +1301,7 @@
           </w:tcPr>
           <w:p>
             <w:r>
-              <w:t>242</w:t>
+              <w:t>224</w:t>
             </w:r>
           </w:p>
         </w:tc>
@@ -1299,7 +1313,7 @@
           </w:tcPr>
           <w:p>
             <w:r>
-              <w:t>2026-06-29 18:48:13</w:t>
+              <w:t>2026-06-29 21:49:45</w:t>
             </w:r>
           </w:p>
         </w:tc>
@@ -1309,7 +1323,7 @@
           </w:tcPr>
           <w:p>
             <w:r>
-              <w:t>1</w:t>
+              <w:t>2</w:t>
             </w:r>
           </w:p>
         </w:tc>
@@ -1319,7 +1333,7 @@
           </w:tcPr>
           <w:p>
             <w:r>
-              <w:t>21.2</w:t>
+              <w:t>39.8</w:t>
             </w:r>
           </w:p>
         </w:tc>
@@ -1329,7 +1343,7 @@
           </w:tcPr>
           <w:p>
             <w:r>
-              <w:t>59.1</w:t>
+              <w:t>75.6</w:t>
             </w:r>
           </w:p>
         </w:tc>
@@ -1349,7 +1363,7 @@
           </w:tcPr>
           <w:p>
             <w:r>
-              <w:t>36.8</w:t>
+              <w:t>50.2</w:t>
             </w:r>
           </w:p>
         </w:tc>
@@ -1359,7 +1373,7 @@
           </w:tcPr>
           <w:p>
             <w:r>
-              <w:t>302</w:t>
+              <w:t>345</w:t>
             </w:r>
           </w:p>
         </w:tc>
@@ -1371,7 +1385,7 @@
           </w:tcPr>
           <w:p>
             <w:r>
-              <w:t>2026-06-29 19:06:58</w:t>
+              <w:t>2026-06-29 22:19:58</w:t>
             </w:r>
           </w:p>
         </w:tc>
@@ -1391,7 +1405,7 @@
           </w:tcPr>
           <w:p>
             <w:r>
-              <w:t>20.7</w:t>
+              <w:t>39.8</w:t>
             </w:r>
           </w:p>
         </w:tc>
@@ -1401,7 +1415,7 @@
           </w:tcPr>
           <w:p>
             <w:r>
-              <w:t>59.9</w:t>
+              <w:t>75.9</w:t>
             </w:r>
           </w:p>
         </w:tc>
@@ -1411,7 +1425,7 @@
           </w:tcPr>
           <w:p>
             <w:r>
-              <w:t>45.6</w:t>
+              <w:t>44.5</w:t>
             </w:r>
           </w:p>
         </w:tc>
@@ -1421,7 +1435,7 @@
           </w:tcPr>
           <w:p>
             <w:r>
-              <w:t>36.7</w:t>
+              <w:t>50.0</w:t>
             </w:r>
           </w:p>
         </w:tc>
@@ -1431,7 +1445,7 @@
           </w:tcPr>
           <w:p>
             <w:r>
-              <w:t>377</w:t>
+              <w:t>466</w:t>
             </w:r>
           </w:p>
         </w:tc>
@@ -1443,7 +1457,7 @@
           </w:tcPr>
           <w:p>
             <w:r>
-              <w:t>2026-06-29 19:37:13</w:t>
+              <w:t>2026-06-29 22:33:15</w:t>
             </w:r>
           </w:p>
         </w:tc>
@@ -1453,7 +1467,7 @@
           </w:tcPr>
           <w:p>
             <w:r>
-              <w:t>2</w:t>
+              <w:t>3</w:t>
             </w:r>
           </w:p>
         </w:tc>
@@ -1463,7 +1477,7 @@
           </w:tcPr>
           <w:p>
             <w:r>
-              <w:t>19.8</w:t>
+              <w:t>41.4</w:t>
             </w:r>
           </w:p>
         </w:tc>
@@ -1473,7 +1487,7 @@
           </w:tcPr>
           <w:p>
             <w:r>
-              <w:t>59.9</w:t>
+              <w:t>76.1</w:t>
             </w:r>
           </w:p>
         </w:tc>
@@ -1483,7 +1497,7 @@
           </w:tcPr>
           <w:p>
             <w:r>
-              <w:t>45.6</w:t>
+              <w:t>44.5</w:t>
             </w:r>
           </w:p>
         </w:tc>
@@ -1493,7 +1507,7 @@
           </w:tcPr>
           <w:p>
             <w:r>
-              <w:t>36.3</w:t>
+              <w:t>50.8</w:t>
             </w:r>
           </w:p>
         </w:tc>
@@ -1503,7 +1517,7 @@
           </w:tcPr>
           <w:p>
             <w:r>
-              <w:t>498</w:t>
+              <w:t>519</w:t>
             </w:r>
           </w:p>
         </w:tc>
@@ -1515,7 +1529,7 @@
           </w:tcPr>
           <w:p>
             <w:r>
-              <w:t>2026-06-29 19:48:58</w:t>
+              <w:t>2026-06-29 23:04:45</w:t>
             </w:r>
           </w:p>
         </w:tc>
@@ -1525,7 +1539,7 @@
           </w:tcPr>
           <w:p>
             <w:r>
-              <w:t>2</w:t>
+              <w:t>4</w:t>
             </w:r>
           </w:p>
         </w:tc>
@@ -1535,7 +1549,7 @@
           </w:tcPr>
           <w:p>
             <w:r>
-              <w:t>39.8</w:t>
+              <w:t>53.4</w:t>
             </w:r>
           </w:p>
         </w:tc>
@@ -1545,7 +1559,7 @@
           </w:tcPr>
           <w:p>
             <w:r>
-              <w:t>76.0</w:t>
+              <w:t>75.9</w:t>
             </w:r>
           </w:p>
         </w:tc>
@@ -1555,7 +1569,7 @@
           </w:tcPr>
           <w:p>
             <w:r>
-              <w:t>45.6</w:t>
+              <w:t>44.5</w:t>
             </w:r>
           </w:p>
         </w:tc>
@@ -1565,7 +1579,7 @@
           </w:tcPr>
           <w:p>
             <w:r>
-              <w:t>50.3</w:t>
+              <w:t>56.8</w:t>
             </w:r>
           </w:p>
         </w:tc>
@@ -1575,7 +1589,7 @@
           </w:tcPr>
           <w:p>
             <w:r>
-              <w:t>545</w:t>
+              <w:t>645</w:t>
             </w:r>
           </w:p>
         </w:tc>
@@ -1587,7 +1601,7 @@
           </w:tcPr>
           <w:p>
             <w:r>
-              <w:t>2026-06-29 20:19:13</w:t>
+              <w:t>2026-06-29 23:21:15</w:t>
             </w:r>
           </w:p>
         </w:tc>
@@ -1597,7 +1611,7 @@
           </w:tcPr>
           <w:p>
             <w:r>
-              <w:t>2</w:t>
+              <w:t>5</w:t>
             </w:r>
           </w:p>
         </w:tc>
@@ -1607,7 +1621,7 @@
           </w:tcPr>
           <w:p>
             <w:r>
-              <w:t>39.8</w:t>
+              <w:t>67.1</w:t>
             </w:r>
           </w:p>
         </w:tc>
@@ -1617,7 +1631,7 @@
           </w:tcPr>
           <w:p>
             <w:r>
-              <w:t>75.7</w:t>
+              <w:t>75.6</w:t>
             </w:r>
           </w:p>
         </w:tc>
@@ -1627,7 +1641,7 @@
           </w:tcPr>
           <w:p>
             <w:r>
-              <w:t>45.6</w:t>
+              <w:t>44.5</w:t>
             </w:r>
           </w:p>
         </w:tc>
@@ -1637,7 +1651,7 @@
           </w:tcPr>
           <w:p>
             <w:r>
-              <w:t>50.2</w:t>
+              <w:t>63.6</w:t>
             </w:r>
           </w:p>
         </w:tc>
@@ -1647,7 +1661,7 @@
           </w:tcPr>
           <w:p>
             <w:r>
-              <w:t>666</w:t>
+              <w:t>711</w:t>
             </w:r>
           </w:p>
         </w:tc>
@@ -1659,7 +1673,7 @@
           </w:tcPr>
           <w:p>
             <w:r>
-              <w:t>2026-06-29 20:49:15</w:t>
+              <w:t>2026-06-29 23:32:15</w:t>
             </w:r>
           </w:p>
         </w:tc>
@@ -1669,7 +1683,7 @@
           </w:tcPr>
           <w:p>
             <w:r>
-              <w:t>2</w:t>
+              <w:t>5</w:t>
             </w:r>
           </w:p>
         </w:tc>
@@ -1679,7 +1693,7 @@
           </w:tcPr>
           <w:p>
             <w:r>
-              <w:t>39.8</w:t>
+              <w:t>62.6</w:t>
             </w:r>
           </w:p>
         </w:tc>
@@ -1689,7 +1703,7 @@
           </w:tcPr>
           <w:p>
             <w:r>
-              <w:t>76.0</w:t>
+              <w:t>75.8</w:t>
             </w:r>
           </w:p>
         </w:tc>
@@ -1699,7 +1713,7 @@
           </w:tcPr>
           <w:p>
             <w:r>
-              <w:t>45.6</w:t>
+              <w:t>44.5</w:t>
             </w:r>
           </w:p>
         </w:tc>
@@ -1709,7 +1723,7 @@
           </w:tcPr>
           <w:p>
             <w:r>
-              <w:t>50.3</w:t>
+              <w:t>61.4</w:t>
             </w:r>
           </w:p>
         </w:tc>
@@ -1719,7 +1733,7 @@
           </w:tcPr>
           <w:p>
             <w:r>
-              <w:t>103</w:t>
+              <w:t>755</w:t>
             </w:r>
           </w:p>
         </w:tc>
@@ -1740,7 +1754,7 @@
     </w:p>
     <w:p>
       <w:r>
-        <w:t>Section score: 39.8 / 100  (Grade: F)</w:t>
+        <w:t>Section score: 62.6 / 100  (Grade: D)</w:t>
       </w:r>
     </w:p>
     <w:p>
@@ -1851,7 +1865,7 @@
           </w:tcPr>
           <w:p>
             <w:r>
-              <w:t>30.0</w:t>
+              <w:t>57.5</w:t>
             </w:r>
           </w:p>
         </w:tc>
@@ -1861,7 +1875,7 @@
           </w:tcPr>
           <w:p>
             <w:r>
-              <w:t>4.5</w:t>
+              <w:t>8.6</w:t>
             </w:r>
           </w:p>
         </w:tc>
@@ -1883,7 +1897,7 @@
           </w:tcPr>
           <w:p>
             <w:r>
-              <w:t>0.0</w:t>
+              <w:t>84.2</w:t>
             </w:r>
           </w:p>
         </w:tc>
@@ -1893,7 +1907,7 @@
           </w:tcPr>
           <w:p>
             <w:r>
-              <w:t>0.0</w:t>
+              <w:t>12.6</w:t>
             </w:r>
           </w:p>
         </w:tc>
@@ -1915,7 +1929,7 @@
           </w:tcPr>
           <w:p>
             <w:r>
-              <w:t>100.0</w:t>
+              <w:t>77.5</w:t>
             </w:r>
           </w:p>
         </w:tc>
@@ -1925,7 +1939,7 @@
           </w:tcPr>
           <w:p>
             <w:r>
-              <w:t>20.0</w:t>
+              <w:t>15.5</w:t>
             </w:r>
           </w:p>
         </w:tc>
@@ -1947,7 +1961,7 @@
           </w:tcPr>
           <w:p>
             <w:r>
-              <w:t>6.7</w:t>
+              <w:t>16.6</w:t>
             </w:r>
           </w:p>
         </w:tc>
@@ -1957,7 +1971,7 @@
           </w:tcPr>
           <w:p>
             <w:r>
-              <w:t>0.3</w:t>
+              <w:t>0.8</w:t>
             </w:r>
           </w:p>
         </w:tc>
@@ -2011,7 +2025,7 @@
           </w:tcPr>
           <w:p>
             <w:r>
-              <w:t>0.0</w:t>
+              <w:t>40.0</w:t>
             </w:r>
           </w:p>
         </w:tc>
@@ -2021,7 +2035,7 @@
           </w:tcPr>
           <w:p>
             <w:r>
-              <w:t>0.0</w:t>
+              <w:t>10.0</w:t>
             </w:r>
           </w:p>
         </w:tc>
@@ -2062,7 +2076,7 @@
           </w:tcPr>
           <w:p>
             <w:r>
-              <w:t>$787.75</w:t>
+              <w:t>$527.47</w:t>
             </w:r>
           </w:p>
         </w:tc>
@@ -2084,7 +2098,7 @@
           </w:tcPr>
           <w:p>
             <w:r>
-              <w:t>57.55%</w:t>
+              <w:t>5.49%</w:t>
             </w:r>
           </w:p>
         </w:tc>
@@ -2106,7 +2120,7 @@
           </w:tcPr>
           <w:p>
             <w:r>
-              <w:t>$-10.00</w:t>
+              <w:t>$3.73</w:t>
             </w:r>
           </w:p>
         </w:tc>
@@ -2128,7 +2142,7 @@
           </w:tcPr>
           <w:p>
             <w:r>
-              <w:t>$0.00</w:t>
+              <w:t>$4.23</w:t>
             </w:r>
           </w:p>
         </w:tc>
@@ -2150,7 +2164,7 @@
           </w:tcPr>
           <w:p>
             <w:r>
-              <w:t>0.0000</w:t>
+              <w:t>0.6000</w:t>
             </w:r>
           </w:p>
         </w:tc>
@@ -2172,7 +2186,7 @@
           </w:tcPr>
           <w:p>
             <w:r>
-              <w:t>— / 0.0000</w:t>
+              <w:t>— / 0.6000</w:t>
             </w:r>
           </w:p>
         </w:tc>
@@ -2194,7 +2208,7 @@
           </w:tcPr>
           <w:p>
             <w:r>
-              <w:t>0.0000</w:t>
+              <w:t>1.3732</w:t>
             </w:r>
           </w:p>
         </w:tc>
@@ -2216,7 +2230,7 @@
           </w:tcPr>
           <w:p>
             <w:r>
-              <w:t>2 / 2</w:t>
+              <w:t>5 / 5</w:t>
             </w:r>
           </w:p>
         </w:tc>
@@ -2238,7 +2252,7 @@
           </w:tcPr>
           <w:p>
             <w:r>
-              <w:t>$-5.00</w:t>
+              <w:t>$0.75</w:t>
             </w:r>
           </w:p>
         </w:tc>
@@ -2276,7 +2290,7 @@
     </w:p>
     <w:p>
       <w:r>
-        <w:t>Realized $297.7537 · Executed 105 · Settled 104 · Wins 75 · Losses 29 · Kelly active False</w:t>
+        <w:t>Realized $19.5133 · Executed 115 · Settled 113 · Wins 77 · Losses 36 · Kelly active False</w:t>
       </w:r>
     </w:p>
     <w:p>
@@ -2421,7 +2435,7 @@
           </w:tcPr>
           <w:p>
             <w:r>
-              <w:t>3</w:t>
+              <w:t>4</w:t>
             </w:r>
           </w:p>
         </w:tc>
@@ -2431,7 +2445,7 @@
           </w:tcPr>
           <w:p>
             <w:r>
-              <w:t>0.3333</w:t>
+              <w:t>0.2500</w:t>
             </w:r>
           </w:p>
         </w:tc>
@@ -2441,7 +2455,7 @@
           </w:tcPr>
           <w:p>
             <w:r>
-              <w:t>3.7390</w:t>
+              <w:t>2.4927</w:t>
             </w:r>
           </w:p>
         </w:tc>
@@ -2451,7 +2465,7 @@
           </w:tcPr>
           <w:p>
             <w:r>
-              <w:t>$91.30</w:t>
+              <w:t>$55.98</w:t>
             </w:r>
           </w:p>
         </w:tc>
@@ -2577,7 +2591,7 @@
           </w:tcPr>
           <w:p>
             <w:r>
-              <w:t>42</w:t>
+              <w:t>50</w:t>
             </w:r>
           </w:p>
         </w:tc>
@@ -2587,7 +2601,7 @@
           </w:tcPr>
           <w:p>
             <w:r>
-              <w:t>0.6190</w:t>
+              <w:t>0.5600</w:t>
             </w:r>
           </w:p>
         </w:tc>
@@ -2597,7 +2611,7 @@
           </w:tcPr>
           <w:p>
             <w:r>
-              <w:t>1.2609</w:t>
+              <w:t>0.9823</w:t>
             </w:r>
           </w:p>
         </w:tc>
@@ -2607,7 +2621,7 @@
           </w:tcPr>
           <w:p>
             <w:r>
-              <w:t>$4.97</w:t>
+              <w:t>$-0.39</w:t>
             </w:r>
           </w:p>
         </w:tc>
@@ -2704,7 +2718,7 @@
           </w:tcPr>
           <w:p>
             <w:r>
-              <w:t>parent 645526</w:t>
+              <w:t>parent 645841</w:t>
             </w:r>
           </w:p>
         </w:tc>
@@ -2714,7 +2728,7 @@
           </w:tcPr>
           <w:p>
             <w:r>
-              <w:t>settled</w:t>
+              <w:t>open</w:t>
             </w:r>
           </w:p>
         </w:tc>
@@ -2724,7 +2738,7 @@
           </w:tcPr>
           <w:p>
             <w:r>
-              <w:t>Yes</w:t>
+              <w:t>—</w:t>
             </w:r>
           </w:p>
         </w:tc>
@@ -2734,7 +2748,7 @@
           </w:tcPr>
           <w:p>
             <w:r>
-              <w:t>0.530</w:t>
+              <w:t>0.670</w:t>
             </w:r>
           </w:p>
         </w:tc>
@@ -2744,7 +2758,7 @@
           </w:tcPr>
           <w:p>
             <w:r>
-              <w:t>$44.34</w:t>
+              <w:t>$—</w:t>
             </w:r>
           </w:p>
         </w:tc>
@@ -2754,7 +2768,7 @@
           </w:tcPr>
           <w:p>
             <w:r>
-              <w:t>outcome</w:t>
+              <w:t>heuristic</w:t>
             </w:r>
           </w:p>
         </w:tc>
@@ -2766,7 +2780,7 @@
           </w:tcPr>
           <w:p>
             <w:r>
-              <w:t>parent 645484</w:t>
+              <w:t>parent 645808</w:t>
             </w:r>
           </w:p>
         </w:tc>
@@ -2796,7 +2810,7 @@
           </w:tcPr>
           <w:p>
             <w:r>
-              <w:t>0.315</w:t>
+              <w:t>0.594</w:t>
             </w:r>
           </w:p>
         </w:tc>
@@ -2828,7 +2842,7 @@
           </w:tcPr>
           <w:p>
             <w:r>
-              <w:t>parent 645429</w:t>
+              <w:t>parent 645778</w:t>
             </w:r>
           </w:p>
         </w:tc>
@@ -2848,7 +2862,7 @@
           </w:tcPr>
           <w:p>
             <w:r>
-              <w:t>Yes</w:t>
+              <w:t>No</w:t>
             </w:r>
           </w:p>
         </w:tc>
@@ -2858,7 +2872,7 @@
           </w:tcPr>
           <w:p>
             <w:r>
-              <w:t>0.582</w:t>
+              <w:t>0.610</w:t>
             </w:r>
           </w:p>
         </w:tc>
@@ -2868,7 +2882,7 @@
           </w:tcPr>
           <w:p>
             <w:r>
-              <w:t>$35.85</w:t>
+              <w:t>$-50.00</w:t>
             </w:r>
           </w:p>
         </w:tc>
@@ -2890,7 +2904,7 @@
           </w:tcPr>
           <w:p>
             <w:r>
-              <w:t>parent 645401</w:t>
+              <w:t>parent 645747</w:t>
             </w:r>
           </w:p>
         </w:tc>
@@ -2920,7 +2934,7 @@
           </w:tcPr>
           <w:p>
             <w:r>
-              <w:t>0.240</w:t>
+              <w:t>0.583</w:t>
             </w:r>
           </w:p>
         </w:tc>
@@ -2952,7 +2966,7 @@
           </w:tcPr>
           <w:p>
             <w:r>
-              <w:t>parent 645381</w:t>
+              <w:t>parent 645717</w:t>
             </w:r>
           </w:p>
         </w:tc>
@@ -2972,7 +2986,7 @@
           </w:tcPr>
           <w:p>
             <w:r>
-              <w:t>Yes</w:t>
+              <w:t>No</w:t>
             </w:r>
           </w:p>
         </w:tc>
@@ -2982,7 +2996,7 @@
           </w:tcPr>
           <w:p>
             <w:r>
-              <w:t>0.580</w:t>
+              <w:t>0.597</w:t>
             </w:r>
           </w:p>
         </w:tc>
@@ -2992,7 +3006,7 @@
           </w:tcPr>
           <w:p>
             <w:r>
-              <w:t>$36.21</w:t>
+              <w:t>$-50.00</w:t>
             </w:r>
           </w:p>
         </w:tc>
@@ -3014,7 +3028,7 @@
           </w:tcPr>
           <w:p>
             <w:r>
-              <w:t>parent 645340</w:t>
+              <w:t>parent 645693</w:t>
             </w:r>
           </w:p>
         </w:tc>
@@ -3044,7 +3058,7 @@
           </w:tcPr>
           <w:p>
             <w:r>
-              <w:t>0.538</w:t>
+              <w:t>0.577</w:t>
             </w:r>
           </w:p>
         </w:tc>
@@ -3076,7 +3090,7 @@
           </w:tcPr>
           <w:p>
             <w:r>
-              <w:t>parent 645281</w:t>
+              <w:t>parent 645658</w:t>
             </w:r>
           </w:p>
         </w:tc>
@@ -3096,7 +3110,7 @@
           </w:tcPr>
           <w:p>
             <w:r>
-              <w:t>Yes</w:t>
+              <w:t>No</w:t>
             </w:r>
           </w:p>
         </w:tc>
@@ -3106,7 +3120,7 @@
           </w:tcPr>
           <w:p>
             <w:r>
-              <w:t>0.118</w:t>
+              <w:t>0.510</w:t>
             </w:r>
           </w:p>
         </w:tc>
@@ -3116,7 +3130,7 @@
           </w:tcPr>
           <w:p>
             <w:r>
-              <w:t>$373.90</w:t>
+              <w:t>$-50.00</w:t>
             </w:r>
           </w:p>
         </w:tc>
@@ -3138,7 +3152,7 @@
           </w:tcPr>
           <w:p>
             <w:r>
-              <w:t>parent 645252</w:t>
+              <w:t>parent 645617</w:t>
             </w:r>
           </w:p>
         </w:tc>
@@ -3168,7 +3182,7 @@
           </w:tcPr>
           <w:p>
             <w:r>
-              <w:t>0.537</w:t>
+              <w:t>0.550</w:t>
             </w:r>
           </w:p>
         </w:tc>
@@ -3178,7 +3192,7 @@
           </w:tcPr>
           <w:p>
             <w:r>
-              <w:t>$43.06</w:t>
+              <w:t>$40.91</w:t>
             </w:r>
           </w:p>
         </w:tc>
@@ -3200,7 +3214,7 @@
           </w:tcPr>
           <w:p>
             <w:r>
-              <w:t>parent 645212</w:t>
+              <w:t>parent 645583</w:t>
             </w:r>
           </w:p>
         </w:tc>
@@ -3220,7 +3234,7 @@
           </w:tcPr>
           <w:p>
             <w:r>
-              <w:t>No</w:t>
+              <w:t>Yes</w:t>
             </w:r>
           </w:p>
         </w:tc>
@@ -3230,7 +3244,7 @@
           </w:tcPr>
           <w:p>
             <w:r>
-              <w:t>0.080</w:t>
+              <w:t>0.618</w:t>
             </w:r>
           </w:p>
         </w:tc>
@@ -3240,7 +3254,7 @@
           </w:tcPr>
           <w:p>
             <w:r>
-              <w:t>$-50.00</w:t>
+              <w:t>$30.85</w:t>
             </w:r>
           </w:p>
         </w:tc>
@@ -3262,7 +3276,7 @@
           </w:tcPr>
           <w:p>
             <w:r>
-              <w:t>parent 645157</w:t>
+              <w:t>parent 645559</w:t>
             </w:r>
           </w:p>
         </w:tc>
@@ -3282,7 +3296,7 @@
           </w:tcPr>
           <w:p>
             <w:r>
-              <w:t>Yes</w:t>
+              <w:t>No</w:t>
             </w:r>
           </w:p>
         </w:tc>
@@ -3292,7 +3306,7 @@
           </w:tcPr>
           <w:p>
             <w:r>
-              <w:t>0.540</w:t>
+              <w:t>0.110</w:t>
             </w:r>
           </w:p>
         </w:tc>
@@ -3302,7 +3316,7 @@
           </w:tcPr>
           <w:p>
             <w:r>
-              <w:t>$42.59</w:t>
+              <w:t>$-50.00</w:t>
             </w:r>
           </w:p>
         </w:tc>
@@ -3324,7 +3338,7 @@
           </w:tcPr>
           <w:p>
             <w:r>
-              <w:t>parent 645117</w:t>
+              <w:t>parent 645526</w:t>
             </w:r>
           </w:p>
         </w:tc>
@@ -3354,7 +3368,7 @@
           </w:tcPr>
           <w:p>
             <w:r>
-              <w:t>0.527</w:t>
+              <w:t>0.530</w:t>
             </w:r>
           </w:p>
         </w:tc>
@@ -3364,7 +3378,7 @@
           </w:tcPr>
           <w:p>
             <w:r>
-              <w:t>$44.80</w:t>
+              <w:t>$44.34</w:t>
             </w:r>
           </w:p>
         </w:tc>
@@ -3386,7 +3400,7 @@
           </w:tcPr>
           <w:p>
             <w:r>
-              <w:t>parent 645086</w:t>
+              <w:t>parent 645484</w:t>
             </w:r>
           </w:p>
         </w:tc>
@@ -3416,7 +3430,7 @@
           </w:tcPr>
           <w:p>
             <w:r>
-              <w:t>0.240</w:t>
+              <w:t>0.315</w:t>
             </w:r>
           </w:p>
         </w:tc>
@@ -3448,7 +3462,7 @@
           </w:tcPr>
           <w:p>
             <w:r>
-              <w:t>parent 645067</w:t>
+              <w:t>parent 645429</w:t>
             </w:r>
           </w:p>
         </w:tc>
@@ -3478,7 +3492,7 @@
           </w:tcPr>
           <w:p>
             <w:r>
-              <w:t>0.589</w:t>
+              <w:t>0.582</w:t>
             </w:r>
           </w:p>
         </w:tc>
@@ -3488,7 +3502,7 @@
           </w:tcPr>
           <w:p>
             <w:r>
-              <w:t>$34.83</w:t>
+              <w:t>$35.85</w:t>
             </w:r>
           </w:p>
         </w:tc>
@@ -3510,7 +3524,7 @@
           </w:tcPr>
           <w:p>
             <w:r>
-              <w:t>parent 645020</w:t>
+              <w:t>parent 645401</w:t>
             </w:r>
           </w:p>
         </w:tc>
@@ -3540,7 +3554,7 @@
           </w:tcPr>
           <w:p>
             <w:r>
-              <w:t>0.300</w:t>
+              <w:t>0.240</w:t>
             </w:r>
           </w:p>
         </w:tc>
@@ -3572,7 +3586,7 @@
           </w:tcPr>
           <w:p>
             <w:r>
-              <w:t>parent 644996</w:t>
+              <w:t>parent 645381</w:t>
             </w:r>
           </w:p>
         </w:tc>
@@ -3602,7 +3616,7 @@
           </w:tcPr>
           <w:p>
             <w:r>
-              <w:t>0.490</w:t>
+              <w:t>0.580</w:t>
             </w:r>
           </w:p>
         </w:tc>
@@ -3612,7 +3626,7 @@
           </w:tcPr>
           <w:p>
             <w:r>
-              <w:t>$52.04</w:t>
+              <w:t>$36.21</w:t>
             </w:r>
           </w:p>
         </w:tc>
@@ -3634,7 +3648,7 @@
           </w:tcPr>
           <w:p>
             <w:r>
-              <w:t>parent 644966</w:t>
+              <w:t>parent 645340</w:t>
             </w:r>
           </w:p>
         </w:tc>
@@ -3654,7 +3668,7 @@
           </w:tcPr>
           <w:p>
             <w:r>
-              <w:t>Yes</w:t>
+              <w:t>No</w:t>
             </w:r>
           </w:p>
         </w:tc>
@@ -3664,7 +3678,7 @@
           </w:tcPr>
           <w:p>
             <w:r>
-              <w:t>0.537</w:t>
+              <w:t>0.538</w:t>
             </w:r>
           </w:p>
         </w:tc>
@@ -3674,7 +3688,7 @@
           </w:tcPr>
           <w:p>
             <w:r>
-              <w:t>$43.16</w:t>
+              <w:t>$-50.00</w:t>
             </w:r>
           </w:p>
         </w:tc>
@@ -3696,7 +3710,7 @@
           </w:tcPr>
           <w:p>
             <w:r>
-              <w:t>parent 644931</w:t>
+              <w:t>parent 645281</w:t>
             </w:r>
           </w:p>
         </w:tc>
@@ -3726,7 +3740,7 @@
           </w:tcPr>
           <w:p>
             <w:r>
-              <w:t>0.588</w:t>
+              <w:t>0.118</w:t>
             </w:r>
           </w:p>
         </w:tc>
@@ -3736,7 +3750,7 @@
           </w:tcPr>
           <w:p>
             <w:r>
-              <w:t>$35.08</w:t>
+              <w:t>$373.90</w:t>
             </w:r>
           </w:p>
         </w:tc>
@@ -3758,7 +3772,7 @@
           </w:tcPr>
           <w:p>
             <w:r>
-              <w:t>parent 644897</w:t>
+              <w:t>parent 645252</w:t>
             </w:r>
           </w:p>
         </w:tc>
@@ -3788,7 +3802,7 @@
           </w:tcPr>
           <w:p>
             <w:r>
-              <w:t>0.546</w:t>
+              <w:t>0.537</w:t>
             </w:r>
           </w:p>
         </w:tc>
@@ -3798,7 +3812,7 @@
           </w:tcPr>
           <w:p>
             <w:r>
-              <w:t>$41.54</w:t>
+              <w:t>$43.06</w:t>
             </w:r>
           </w:p>
         </w:tc>
@@ -3820,7 +3834,7 @@
           </w:tcPr>
           <w:p>
             <w:r>
-              <w:t>parent 644852</w:t>
+              <w:t>parent 645212</w:t>
             </w:r>
           </w:p>
         </w:tc>
@@ -3840,7 +3854,7 @@
           </w:tcPr>
           <w:p>
             <w:r>
-              <w:t>Yes</w:t>
+              <w:t>No</w:t>
             </w:r>
           </w:p>
         </w:tc>
@@ -3850,7 +3864,7 @@
           </w:tcPr>
           <w:p>
             <w:r>
-              <w:t>0.540</w:t>
+              <w:t>0.080</w:t>
             </w:r>
           </w:p>
         </w:tc>
@@ -3860,7 +3874,7 @@
           </w:tcPr>
           <w:p>
             <w:r>
-              <w:t>$42.59</w:t>
+              <w:t>$-50.00</w:t>
             </w:r>
           </w:p>
         </w:tc>
@@ -3882,7 +3896,7 @@
           </w:tcPr>
           <w:p>
             <w:r>
-              <w:t>parent 644830</w:t>
+              <w:t>parent 645157</w:t>
             </w:r>
           </w:p>
         </w:tc>
@@ -3902,7 +3916,7 @@
           </w:tcPr>
           <w:p>
             <w:r>
-              <w:t>No</w:t>
+              <w:t>Yes</w:t>
             </w:r>
           </w:p>
         </w:tc>
@@ -3912,7 +3926,7 @@
           </w:tcPr>
           <w:p>
             <w:r>
-              <w:t>0.542</w:t>
+              <w:t>0.540</w:t>
             </w:r>
           </w:p>
         </w:tc>
@@ -3922,7 +3936,7 @@
           </w:tcPr>
           <w:p>
             <w:r>
-              <w:t>$-50.00</w:t>
+              <w:t>$42.59</w:t>
             </w:r>
           </w:p>
         </w:tc>
@@ -3948,7 +3962,7 @@
     </w:p>
     <w:p>
       <w:r>
-        <w:t>Executed 0 · Settled 0 · Profit $0.0</w:t>
+        <w:t>Executed 1 · Settled 1 · Profit $4.2254</w:t>
       </w:r>
     </w:p>
     <w:p>
@@ -4041,6 +4055,162 @@
           </w:tcPr>
           <w:p>
             <w:r>
+              <w:t>0.560</w:t>
+            </w:r>
+          </w:p>
+        </w:tc>
+        <w:tc>
+          <w:tcPr>
+            <w:tcW w:type="dxa" w:w="1728"/>
+          </w:tcPr>
+          <w:p>
+            <w:r>
+              <w:t>down</w:t>
+            </w:r>
+          </w:p>
+        </w:tc>
+        <w:tc>
+          <w:tcPr>
+            <w:tcW w:type="dxa" w:w="1728"/>
+          </w:tcPr>
+          <w:p>
+            <w:r>
+              <w:t>Yes</w:t>
+            </w:r>
+          </w:p>
+        </w:tc>
+        <w:tc>
+          <w:tcPr>
+            <w:tcW w:type="dxa" w:w="1728"/>
+          </w:tcPr>
+          <w:p>
+            <w:r>
+              <w:t>$3.93</w:t>
+            </w:r>
+          </w:p>
+        </w:tc>
+      </w:tr>
+      <w:tr>
+        <w:tc>
+          <w:tcPr>
+            <w:tcW w:type="dxa" w:w="1728"/>
+          </w:tcPr>
+          <w:p>
+            <w:r>
+              <w:t>down</w:t>
+            </w:r>
+          </w:p>
+        </w:tc>
+        <w:tc>
+          <w:tcPr>
+            <w:tcW w:type="dxa" w:w="1728"/>
+          </w:tcPr>
+          <w:p>
+            <w:r>
+              <w:t>0.500</w:t>
+            </w:r>
+          </w:p>
+        </w:tc>
+        <w:tc>
+          <w:tcPr>
+            <w:tcW w:type="dxa" w:w="1728"/>
+          </w:tcPr>
+          <w:p>
+            <w:r>
+              <w:t>down</w:t>
+            </w:r>
+          </w:p>
+        </w:tc>
+        <w:tc>
+          <w:tcPr>
+            <w:tcW w:type="dxa" w:w="1728"/>
+          </w:tcPr>
+          <w:p>
+            <w:r>
+              <w:t>Yes</w:t>
+            </w:r>
+          </w:p>
+        </w:tc>
+        <w:tc>
+          <w:tcPr>
+            <w:tcW w:type="dxa" w:w="1728"/>
+          </w:tcPr>
+          <w:p>
+            <w:r>
+              <w:t>$5.00</w:t>
+            </w:r>
+          </w:p>
+        </w:tc>
+      </w:tr>
+      <w:tr>
+        <w:tc>
+          <w:tcPr>
+            <w:tcW w:type="dxa" w:w="1728"/>
+          </w:tcPr>
+          <w:p>
+            <w:r>
+              <w:t>down</w:t>
+            </w:r>
+          </w:p>
+        </w:tc>
+        <w:tc>
+          <w:tcPr>
+            <w:tcW w:type="dxa" w:w="1728"/>
+          </w:tcPr>
+          <w:p>
+            <w:r>
+              <w:t>0.510</w:t>
+            </w:r>
+          </w:p>
+        </w:tc>
+        <w:tc>
+          <w:tcPr>
+            <w:tcW w:type="dxa" w:w="1728"/>
+          </w:tcPr>
+          <w:p>
+            <w:r>
+              <w:t>down</w:t>
+            </w:r>
+          </w:p>
+        </w:tc>
+        <w:tc>
+          <w:tcPr>
+            <w:tcW w:type="dxa" w:w="1728"/>
+          </w:tcPr>
+          <w:p>
+            <w:r>
+              <w:t>Yes</w:t>
+            </w:r>
+          </w:p>
+        </w:tc>
+        <w:tc>
+          <w:tcPr>
+            <w:tcW w:type="dxa" w:w="1728"/>
+          </w:tcPr>
+          <w:p>
+            <w:r>
+              <w:t>$4.80</w:t>
+            </w:r>
+          </w:p>
+        </w:tc>
+      </w:tr>
+      <w:tr>
+        <w:tc>
+          <w:tcPr>
+            <w:tcW w:type="dxa" w:w="1728"/>
+          </w:tcPr>
+          <w:p>
+            <w:r>
+              <w:t>down</w:t>
+            </w:r>
+          </w:p>
+        </w:tc>
+        <w:tc>
+          <w:tcPr>
+            <w:tcW w:type="dxa" w:w="1728"/>
+          </w:tcPr>
+          <w:p>
+            <w:r>
               <w:t>0.530</w:t>
             </w:r>
           </w:p>
@@ -4144,7 +4314,7 @@
     </w:p>
     <w:p>
       <w:r>
-        <w:t>Section score: 75.8 / 100  (Grade: C+)</w:t>
+        <w:t>Section score: 75.6 / 100  (Grade: C+)</w:t>
       </w:r>
     </w:p>
     <w:p>
@@ -4287,7 +4457,7 @@
           </w:tcPr>
           <w:p>
             <w:r>
-              <w:t>28.8</w:t>
+              <w:t>27.4</w:t>
             </w:r>
           </w:p>
         </w:tc>
@@ -4297,7 +4467,7 @@
           </w:tcPr>
           <w:p>
             <w:r>
-              <w:t>4.3</w:t>
+              <w:t>4.1</w:t>
             </w:r>
           </w:p>
         </w:tc>
@@ -4401,17 +4571,17 @@
     </w:tbl>
     <w:p>
       <w:r>
-        <w:t>Ticks: 212 · Reconciled: True · Readiness: not_ready</w:t>
+        <w:t>Ticks: 778 · Reconciled: True · Readiness: not_ready</w:t>
       </w:r>
     </w:p>
     <w:p>
       <w:r>
-        <w:t>Candidates created: 12221 · Terminals: {'accepted': 0, 'rejected': 1352, 'skipped': 10817, 'expired': 0, 'missing_data': 52}</w:t>
+        <w:t>Candidates created: 13176 · Terminals: {'accepted': 0, 'rejected': 1772, 'skipped': 11352, 'expired': 0, 'missing_data': 52}</w:t>
       </w:r>
     </w:p>
     <w:p>
       <w:r>
-        <w:t>Rejected by stage: {'directional': 1175, 'execution_gate': 23, 'baseline_cohort_gate': 154}</w:t>
+        <w:t>Rejected by stage: {'directional': 1566, 'execution_gate': 23, 'baseline_cohort_gate': 183}</w:t>
       </w:r>
     </w:p>
     <w:p>
@@ -4986,7 +5156,7 @@
     </w:p>
     <w:p>
       <w:r>
-        <w:t>Section score: 45.6 / 100  (Grade: F)</w:t>
+        <w:t>Section score: 44.5 / 100  (Grade: F)</w:t>
       </w:r>
     </w:p>
     <w:p>
@@ -5129,7 +5299,7 @@
           </w:tcPr>
           <w:p>
             <w:r>
-              <w:t>7.5</w:t>
+              <w:t>0.0</w:t>
             </w:r>
           </w:p>
         </w:tc>
@@ -5139,7 +5309,7 @@
           </w:tcPr>
           <w:p>
             <w:r>
-              <w:t>1.1</w:t>
+              <w:t>0.0</w:t>
             </w:r>
           </w:p>
         </w:tc>
@@ -5342,7 +5512,7 @@
           </w:tcPr>
           <w:p>
             <w:r>
-              <w:t>0.5000</w:t>
+              <w:t>0.4000</w:t>
             </w:r>
           </w:p>
         </w:tc>
@@ -5364,7 +5534,7 @@
           </w:tcPr>
           <w:p>
             <w:r>
-              <w:t>0.4800</w:t>
+              <w:t>0.4706</w:t>
             </w:r>
           </w:p>
         </w:tc>
@@ -5394,7 +5564,7 @@
     </w:tbl>
     <w:p>
       <w:r>
-        <w:t>TV alerts: received 1810 · valid 1591 · rejected 219</w:t>
+        <w:t>TV alerts: received 1962 · valid 1743 · rejected 219</w:t>
       </w:r>
     </w:p>
     <w:sectPr>

</xml_diff>

<commit_message>
chore(reports): VPS full report 2026-06-30 00:33 UTC (6 settled, WR 50.0%, PF 0.9155, grade F)
</commit_message>
<xml_diff>
--- a/vps_full_reports/latest/report.docx
+++ b/vps_full_reports/latest/report.docx
@@ -20,7 +20,7 @@
           <w:color w:val="666666"/>
           <w:sz w:val="20"/>
         </w:rPr>
-        <w:t>PAPER ONLY  ·  reconciled=True  ·  ticks=778</w:t>
+        <w:t>PAPER ONLY  ·  reconciled=True  ·  ticks=37</w:t>
       </w:r>
     </w:p>
     <w:p>
@@ -33,7 +33,7 @@
     </w:p>
     <w:p>
       <w:r>
-        <w:t>Overall score: 61.3 / 100  (Grade: D)</w:t>
+        <w:t>Overall score: 41.7 / 100  (Grade: F)</w:t>
       </w:r>
     </w:p>
     <w:tbl>
@@ -107,7 +107,7 @@
           </w:tcPr>
           <w:p>
             <w:r>
-              <w:t>62.6</w:t>
+              <w:t>38.8</w:t>
             </w:r>
           </w:p>
         </w:tc>
@@ -117,7 +117,7 @@
           </w:tcPr>
           <w:p>
             <w:r>
-              <w:t>D</w:t>
+              <w:t>F</w:t>
             </w:r>
           </w:p>
         </w:tc>
@@ -149,7 +149,7 @@
           </w:tcPr>
           <w:p>
             <w:r>
-              <w:t>75.6</w:t>
+              <w:t>61.1</w:t>
             </w:r>
           </w:p>
         </w:tc>
@@ -159,7 +159,7 @@
           </w:tcPr>
           <w:p>
             <w:r>
-              <w:t>C+</w:t>
+              <w:t>D</w:t>
             </w:r>
           </w:p>
         </w:tc>
@@ -191,7 +191,7 @@
           </w:tcPr>
           <w:p>
             <w:r>
-              <w:t>44.5</w:t>
+              <w:t>28.0</w:t>
             </w:r>
           </w:p>
         </w:tc>
@@ -319,7 +319,7 @@
           </w:tcPr>
           <w:p>
             <w:r>
-              <w:t>2026-06-29 15:31:46</w:t>
+              <w:t>2026-06-29 17:32:56</w:t>
             </w:r>
           </w:p>
         </w:tc>
@@ -377,7 +377,7 @@
           </w:tcPr>
           <w:p>
             <w:r>
-              <w:t>193</w:t>
+              <w:t>1</w:t>
             </w:r>
           </w:p>
         </w:tc>
@@ -389,7 +389,7 @@
           </w:tcPr>
           <w:p>
             <w:r>
-              <w:t>2026-06-29 16:01:46</w:t>
+              <w:t>2026-06-29 18:02:58</w:t>
             </w:r>
           </w:p>
         </w:tc>
@@ -417,7 +417,7 @@
           </w:tcPr>
           <w:p>
             <w:r>
-              <w:t>56.5</w:t>
+              <w:t>57.5</w:t>
             </w:r>
           </w:p>
         </w:tc>
@@ -437,7 +437,7 @@
           </w:tcPr>
           <w:p>
             <w:r>
-              <w:t>47.7</w:t>
+              <w:t>48.0</w:t>
             </w:r>
           </w:p>
         </w:tc>
@@ -447,7 +447,7 @@
           </w:tcPr>
           <w:p>
             <w:r>
-              <w:t>313</w:t>
+              <w:t>121</w:t>
             </w:r>
           </w:p>
         </w:tc>
@@ -459,7 +459,7 @@
           </w:tcPr>
           <w:p>
             <w:r>
-              <w:t>2026-06-29 16:31:47</w:t>
+              <w:t>2026-06-29 18:33:13</w:t>
             </w:r>
           </w:p>
         </w:tc>
@@ -487,7 +487,7 @@
           </w:tcPr>
           <w:p>
             <w:r>
-              <w:t>56.5</w:t>
+              <w:t>58.7</w:t>
             </w:r>
           </w:p>
         </w:tc>
@@ -497,7 +497,7 @@
           </w:tcPr>
           <w:p>
             <w:r>
-              <w:t>49.4</w:t>
+              <w:t>45.6</w:t>
             </w:r>
           </w:p>
         </w:tc>
@@ -507,7 +507,7 @@
           </w:tcPr>
           <w:p>
             <w:r>
-              <w:t>47.7</w:t>
+              <w:t>47.3</w:t>
             </w:r>
           </w:p>
         </w:tc>
@@ -517,7 +517,7 @@
           </w:tcPr>
           <w:p>
             <w:r>
-              <w:t>110</w:t>
+              <w:t>242</w:t>
             </w:r>
           </w:p>
         </w:tc>
@@ -529,7 +529,7 @@
           </w:tcPr>
           <w:p>
             <w:r>
-              <w:t>2026-06-29 17:01:59</w:t>
+              <w:t>2026-06-29 18:48:13</w:t>
             </w:r>
           </w:p>
         </w:tc>
@@ -538,7 +538,9 @@
             <w:tcW w:type="dxa" w:w="1234"/>
           </w:tcPr>
           <w:p>
-            <w:r/>
+            <w:r>
+              <w:t>1</w:t>
+            </w:r>
           </w:p>
         </w:tc>
         <w:tc>
@@ -547,7 +549,7 @@
           </w:tcPr>
           <w:p>
             <w:r>
-              <w:t>42.5</w:t>
+              <w:t>21.2</w:t>
             </w:r>
           </w:p>
         </w:tc>
@@ -557,7 +559,7 @@
           </w:tcPr>
           <w:p>
             <w:r>
-              <w:t>56.5</w:t>
+              <w:t>59.1</w:t>
             </w:r>
           </w:p>
         </w:tc>
@@ -567,7 +569,7 @@
           </w:tcPr>
           <w:p>
             <w:r>
-              <w:t>49.4</w:t>
+              <w:t>45.6</w:t>
             </w:r>
           </w:p>
         </w:tc>
@@ -577,7 +579,7 @@
           </w:tcPr>
           <w:p>
             <w:r>
-              <w:t>47.7</w:t>
+              <w:t>36.8</w:t>
             </w:r>
           </w:p>
         </w:tc>
@@ -587,7 +589,7 @@
           </w:tcPr>
           <w:p>
             <w:r>
-              <w:t>102</w:t>
+              <w:t>302</w:t>
             </w:r>
           </w:p>
         </w:tc>
@@ -599,7 +601,7 @@
           </w:tcPr>
           <w:p>
             <w:r>
-              <w:t>2026-06-29 17:32:56</w:t>
+              <w:t>2026-06-29 19:06:58</w:t>
             </w:r>
           </w:p>
         </w:tc>
@@ -608,7 +610,9 @@
             <w:tcW w:type="dxa" w:w="1234"/>
           </w:tcPr>
           <w:p>
-            <w:r/>
+            <w:r>
+              <w:t>2</w:t>
+            </w:r>
           </w:p>
         </w:tc>
         <w:tc>
@@ -617,7 +621,7 @@
           </w:tcPr>
           <w:p>
             <w:r>
-              <w:t>42.5</w:t>
+              <w:t>20.7</w:t>
             </w:r>
           </w:p>
         </w:tc>
@@ -627,7 +631,7 @@
           </w:tcPr>
           <w:p>
             <w:r>
-              <w:t>56.5</w:t>
+              <w:t>59.9</w:t>
             </w:r>
           </w:p>
         </w:tc>
@@ -637,7 +641,7 @@
           </w:tcPr>
           <w:p>
             <w:r>
-              <w:t>49.4</w:t>
+              <w:t>45.6</w:t>
             </w:r>
           </w:p>
         </w:tc>
@@ -647,7 +651,7 @@
           </w:tcPr>
           <w:p>
             <w:r>
-              <w:t>47.7</w:t>
+              <w:t>36.7</w:t>
             </w:r>
           </w:p>
         </w:tc>
@@ -657,7 +661,7 @@
           </w:tcPr>
           <w:p>
             <w:r>
-              <w:t>1</w:t>
+              <w:t>377</w:t>
             </w:r>
           </w:p>
         </w:tc>
@@ -669,7 +673,7 @@
           </w:tcPr>
           <w:p>
             <w:r>
-              <w:t>2026-06-29 18:02:58</w:t>
+              <w:t>2026-06-29 19:37:13</w:t>
             </w:r>
           </w:p>
         </w:tc>
@@ -678,7 +682,9 @@
             <w:tcW w:type="dxa" w:w="1234"/>
           </w:tcPr>
           <w:p>
-            <w:r/>
+            <w:r>
+              <w:t>2</w:t>
+            </w:r>
           </w:p>
         </w:tc>
         <w:tc>
@@ -687,7 +693,7 @@
           </w:tcPr>
           <w:p>
             <w:r>
-              <w:t>42.5</w:t>
+              <w:t>19.8</w:t>
             </w:r>
           </w:p>
         </w:tc>
@@ -697,7 +703,7 @@
           </w:tcPr>
           <w:p>
             <w:r>
-              <w:t>57.5</w:t>
+              <w:t>59.9</w:t>
             </w:r>
           </w:p>
         </w:tc>
@@ -707,7 +713,7 @@
           </w:tcPr>
           <w:p>
             <w:r>
-              <w:t>49.4</w:t>
+              <w:t>45.6</w:t>
             </w:r>
           </w:p>
         </w:tc>
@@ -717,7 +723,7 @@
           </w:tcPr>
           <w:p>
             <w:r>
-              <w:t>48.0</w:t>
+              <w:t>36.3</w:t>
             </w:r>
           </w:p>
         </w:tc>
@@ -727,7 +733,7 @@
           </w:tcPr>
           <w:p>
             <w:r>
-              <w:t>121</w:t>
+              <w:t>498</w:t>
             </w:r>
           </w:p>
         </w:tc>
@@ -739,7 +745,7 @@
           </w:tcPr>
           <w:p>
             <w:r>
-              <w:t>2026-06-29 18:33:13</w:t>
+              <w:t>2026-06-29 19:48:58</w:t>
             </w:r>
           </w:p>
         </w:tc>
@@ -748,7 +754,9 @@
             <w:tcW w:type="dxa" w:w="1234"/>
           </w:tcPr>
           <w:p>
-            <w:r/>
+            <w:r>
+              <w:t>2</w:t>
+            </w:r>
           </w:p>
         </w:tc>
         <w:tc>
@@ -757,7 +765,7 @@
           </w:tcPr>
           <w:p>
             <w:r>
-              <w:t>42.5</w:t>
+              <w:t>39.8</w:t>
             </w:r>
           </w:p>
         </w:tc>
@@ -767,7 +775,7 @@
           </w:tcPr>
           <w:p>
             <w:r>
-              <w:t>58.7</w:t>
+              <w:t>76.0</w:t>
             </w:r>
           </w:p>
         </w:tc>
@@ -787,7 +795,7 @@
           </w:tcPr>
           <w:p>
             <w:r>
-              <w:t>47.3</w:t>
+              <w:t>50.3</w:t>
             </w:r>
           </w:p>
         </w:tc>
@@ -797,7 +805,7 @@
           </w:tcPr>
           <w:p>
             <w:r>
-              <w:t>242</w:t>
+              <w:t>545</w:t>
             </w:r>
           </w:p>
         </w:tc>
@@ -809,7 +817,7 @@
           </w:tcPr>
           <w:p>
             <w:r>
-              <w:t>2026-06-29 18:48:13</w:t>
+              <w:t>2026-06-29 20:19:13</w:t>
             </w:r>
           </w:p>
         </w:tc>
@@ -819,7 +827,7 @@
           </w:tcPr>
           <w:p>
             <w:r>
-              <w:t>1</w:t>
+              <w:t>2</w:t>
             </w:r>
           </w:p>
         </w:tc>
@@ -829,7 +837,7 @@
           </w:tcPr>
           <w:p>
             <w:r>
-              <w:t>21.2</w:t>
+              <w:t>39.8</w:t>
             </w:r>
           </w:p>
         </w:tc>
@@ -839,7 +847,7 @@
           </w:tcPr>
           <w:p>
             <w:r>
-              <w:t>59.1</w:t>
+              <w:t>75.7</w:t>
             </w:r>
           </w:p>
         </w:tc>
@@ -859,7 +867,7 @@
           </w:tcPr>
           <w:p>
             <w:r>
-              <w:t>36.8</w:t>
+              <w:t>50.2</w:t>
             </w:r>
           </w:p>
         </w:tc>
@@ -869,7 +877,7 @@
           </w:tcPr>
           <w:p>
             <w:r>
-              <w:t>302</w:t>
+              <w:t>666</w:t>
             </w:r>
           </w:p>
         </w:tc>
@@ -881,7 +889,7 @@
           </w:tcPr>
           <w:p>
             <w:r>
-              <w:t>2026-06-29 19:06:58</w:t>
+              <w:t>2026-06-29 20:49:15</w:t>
             </w:r>
           </w:p>
         </w:tc>
@@ -901,7 +909,7 @@
           </w:tcPr>
           <w:p>
             <w:r>
-              <w:t>20.7</w:t>
+              <w:t>39.8</w:t>
             </w:r>
           </w:p>
         </w:tc>
@@ -911,7 +919,7 @@
           </w:tcPr>
           <w:p>
             <w:r>
-              <w:t>59.9</w:t>
+              <w:t>76.0</w:t>
             </w:r>
           </w:p>
         </w:tc>
@@ -931,7 +939,7 @@
           </w:tcPr>
           <w:p>
             <w:r>
-              <w:t>36.7</w:t>
+              <w:t>50.3</w:t>
             </w:r>
           </w:p>
         </w:tc>
@@ -941,7 +949,7 @@
           </w:tcPr>
           <w:p>
             <w:r>
-              <w:t>377</w:t>
+              <w:t>103</w:t>
             </w:r>
           </w:p>
         </w:tc>
@@ -953,7 +961,7 @@
           </w:tcPr>
           <w:p>
             <w:r>
-              <w:t>2026-06-29 19:37:13</w:t>
+              <w:t>2026-06-29 21:19:30</w:t>
             </w:r>
           </w:p>
         </w:tc>
@@ -973,7 +981,7 @@
           </w:tcPr>
           <w:p>
             <w:r>
-              <w:t>19.8</w:t>
+              <w:t>39.8</w:t>
             </w:r>
           </w:p>
         </w:tc>
@@ -983,7 +991,7 @@
           </w:tcPr>
           <w:p>
             <w:r>
-              <w:t>59.9</w:t>
+              <w:t>75.7</w:t>
             </w:r>
           </w:p>
         </w:tc>
@@ -1003,7 +1011,7 @@
           </w:tcPr>
           <w:p>
             <w:r>
-              <w:t>36.3</w:t>
+              <w:t>50.2</w:t>
             </w:r>
           </w:p>
         </w:tc>
@@ -1013,7 +1021,7 @@
           </w:tcPr>
           <w:p>
             <w:r>
-              <w:t>498</w:t>
+              <w:t>224</w:t>
             </w:r>
           </w:p>
         </w:tc>
@@ -1025,7 +1033,7 @@
           </w:tcPr>
           <w:p>
             <w:r>
-              <w:t>2026-06-29 19:48:58</w:t>
+              <w:t>2026-06-29 21:49:45</w:t>
             </w:r>
           </w:p>
         </w:tc>
@@ -1055,7 +1063,7 @@
           </w:tcPr>
           <w:p>
             <w:r>
-              <w:t>76.0</w:t>
+              <w:t>75.6</w:t>
             </w:r>
           </w:p>
         </w:tc>
@@ -1075,7 +1083,7 @@
           </w:tcPr>
           <w:p>
             <w:r>
-              <w:t>50.3</w:t>
+              <w:t>50.2</w:t>
             </w:r>
           </w:p>
         </w:tc>
@@ -1085,7 +1093,7 @@
           </w:tcPr>
           <w:p>
             <w:r>
-              <w:t>545</w:t>
+              <w:t>345</w:t>
             </w:r>
           </w:p>
         </w:tc>
@@ -1097,7 +1105,7 @@
           </w:tcPr>
           <w:p>
             <w:r>
-              <w:t>2026-06-29 20:19:13</w:t>
+              <w:t>2026-06-29 22:19:58</w:t>
             </w:r>
           </w:p>
         </w:tc>
@@ -1127,7 +1135,7 @@
           </w:tcPr>
           <w:p>
             <w:r>
-              <w:t>75.7</w:t>
+              <w:t>75.9</w:t>
             </w:r>
           </w:p>
         </w:tc>
@@ -1137,7 +1145,7 @@
           </w:tcPr>
           <w:p>
             <w:r>
-              <w:t>45.6</w:t>
+              <w:t>44.5</w:t>
             </w:r>
           </w:p>
         </w:tc>
@@ -1147,7 +1155,7 @@
           </w:tcPr>
           <w:p>
             <w:r>
-              <w:t>50.2</w:t>
+              <w:t>50.0</w:t>
             </w:r>
           </w:p>
         </w:tc>
@@ -1157,7 +1165,7 @@
           </w:tcPr>
           <w:p>
             <w:r>
-              <w:t>666</w:t>
+              <w:t>466</w:t>
             </w:r>
           </w:p>
         </w:tc>
@@ -1169,7 +1177,7 @@
           </w:tcPr>
           <w:p>
             <w:r>
-              <w:t>2026-06-29 20:49:15</w:t>
+              <w:t>2026-06-29 22:33:15</w:t>
             </w:r>
           </w:p>
         </w:tc>
@@ -1179,7 +1187,7 @@
           </w:tcPr>
           <w:p>
             <w:r>
-              <w:t>2</w:t>
+              <w:t>3</w:t>
             </w:r>
           </w:p>
         </w:tc>
@@ -1189,7 +1197,7 @@
           </w:tcPr>
           <w:p>
             <w:r>
-              <w:t>39.8</w:t>
+              <w:t>41.4</w:t>
             </w:r>
           </w:p>
         </w:tc>
@@ -1199,7 +1207,7 @@
           </w:tcPr>
           <w:p>
             <w:r>
-              <w:t>76.0</w:t>
+              <w:t>76.1</w:t>
             </w:r>
           </w:p>
         </w:tc>
@@ -1209,7 +1217,7 @@
           </w:tcPr>
           <w:p>
             <w:r>
-              <w:t>45.6</w:t>
+              <w:t>44.5</w:t>
             </w:r>
           </w:p>
         </w:tc>
@@ -1219,7 +1227,7 @@
           </w:tcPr>
           <w:p>
             <w:r>
-              <w:t>50.3</w:t>
+              <w:t>50.8</w:t>
             </w:r>
           </w:p>
         </w:tc>
@@ -1229,7 +1237,7 @@
           </w:tcPr>
           <w:p>
             <w:r>
-              <w:t>103</w:t>
+              <w:t>519</w:t>
             </w:r>
           </w:p>
         </w:tc>
@@ -1241,7 +1249,7 @@
           </w:tcPr>
           <w:p>
             <w:r>
-              <w:t>2026-06-29 21:19:30</w:t>
+              <w:t>2026-06-29 23:04:45</w:t>
             </w:r>
           </w:p>
         </w:tc>
@@ -1251,7 +1259,7 @@
           </w:tcPr>
           <w:p>
             <w:r>
-              <w:t>2</w:t>
+              <w:t>4</w:t>
             </w:r>
           </w:p>
         </w:tc>
@@ -1261,7 +1269,7 @@
           </w:tcPr>
           <w:p>
             <w:r>
-              <w:t>39.8</w:t>
+              <w:t>53.4</w:t>
             </w:r>
           </w:p>
         </w:tc>
@@ -1271,7 +1279,7 @@
           </w:tcPr>
           <w:p>
             <w:r>
-              <w:t>75.7</w:t>
+              <w:t>75.9</w:t>
             </w:r>
           </w:p>
         </w:tc>
@@ -1281,7 +1289,7 @@
           </w:tcPr>
           <w:p>
             <w:r>
-              <w:t>45.6</w:t>
+              <w:t>44.5</w:t>
             </w:r>
           </w:p>
         </w:tc>
@@ -1291,7 +1299,7 @@
           </w:tcPr>
           <w:p>
             <w:r>
-              <w:t>50.2</w:t>
+              <w:t>56.8</w:t>
             </w:r>
           </w:p>
         </w:tc>
@@ -1301,7 +1309,7 @@
           </w:tcPr>
           <w:p>
             <w:r>
-              <w:t>224</w:t>
+              <w:t>645</w:t>
             </w:r>
           </w:p>
         </w:tc>
@@ -1313,7 +1321,7 @@
           </w:tcPr>
           <w:p>
             <w:r>
-              <w:t>2026-06-29 21:49:45</w:t>
+              <w:t>2026-06-29 23:21:15</w:t>
             </w:r>
           </w:p>
         </w:tc>
@@ -1323,7 +1331,7 @@
           </w:tcPr>
           <w:p>
             <w:r>
-              <w:t>2</w:t>
+              <w:t>5</w:t>
             </w:r>
           </w:p>
         </w:tc>
@@ -1333,7 +1341,7 @@
           </w:tcPr>
           <w:p>
             <w:r>
-              <w:t>39.8</w:t>
+              <w:t>67.1</w:t>
             </w:r>
           </w:p>
         </w:tc>
@@ -1353,7 +1361,7 @@
           </w:tcPr>
           <w:p>
             <w:r>
-              <w:t>45.6</w:t>
+              <w:t>44.5</w:t>
             </w:r>
           </w:p>
         </w:tc>
@@ -1363,7 +1371,7 @@
           </w:tcPr>
           <w:p>
             <w:r>
-              <w:t>50.2</w:t>
+              <w:t>63.6</w:t>
             </w:r>
           </w:p>
         </w:tc>
@@ -1373,7 +1381,7 @@
           </w:tcPr>
           <w:p>
             <w:r>
-              <w:t>345</w:t>
+              <w:t>711</w:t>
             </w:r>
           </w:p>
         </w:tc>
@@ -1385,7 +1393,7 @@
           </w:tcPr>
           <w:p>
             <w:r>
-              <w:t>2026-06-29 22:19:58</w:t>
+              <w:t>2026-06-29 23:32:15</w:t>
             </w:r>
           </w:p>
         </w:tc>
@@ -1395,7 +1403,7 @@
           </w:tcPr>
           <w:p>
             <w:r>
-              <w:t>2</w:t>
+              <w:t>5</w:t>
             </w:r>
           </w:p>
         </w:tc>
@@ -1405,7 +1413,7 @@
           </w:tcPr>
           <w:p>
             <w:r>
-              <w:t>39.8</w:t>
+              <w:t>62.6</w:t>
             </w:r>
           </w:p>
         </w:tc>
@@ -1415,7 +1423,7 @@
           </w:tcPr>
           <w:p>
             <w:r>
-              <w:t>75.9</w:t>
+              <w:t>75.8</w:t>
             </w:r>
           </w:p>
         </w:tc>
@@ -1435,7 +1443,7 @@
           </w:tcPr>
           <w:p>
             <w:r>
-              <w:t>50.0</w:t>
+              <w:t>61.4</w:t>
             </w:r>
           </w:p>
         </w:tc>
@@ -1445,7 +1453,7 @@
           </w:tcPr>
           <w:p>
             <w:r>
-              <w:t>466</w:t>
+              <w:t>755</w:t>
             </w:r>
           </w:p>
         </w:tc>
@@ -1457,7 +1465,7 @@
           </w:tcPr>
           <w:p>
             <w:r>
-              <w:t>2026-06-29 22:33:15</w:t>
+              <w:t>2026-06-29 23:48:04</w:t>
             </w:r>
           </w:p>
         </w:tc>
@@ -1467,7 +1475,7 @@
           </w:tcPr>
           <w:p>
             <w:r>
-              <w:t>3</w:t>
+              <w:t>5</w:t>
             </w:r>
           </w:p>
         </w:tc>
@@ -1477,7 +1485,7 @@
           </w:tcPr>
           <w:p>
             <w:r>
-              <w:t>41.4</w:t>
+              <w:t>67.1</w:t>
             </w:r>
           </w:p>
         </w:tc>
@@ -1487,7 +1495,7 @@
           </w:tcPr>
           <w:p>
             <w:r>
-              <w:t>76.1</w:t>
+              <w:t>76.0</w:t>
             </w:r>
           </w:p>
         </w:tc>
@@ -1507,7 +1515,7 @@
           </w:tcPr>
           <w:p>
             <w:r>
-              <w:t>50.8</w:t>
+              <w:t>63.7</w:t>
             </w:r>
           </w:p>
         </w:tc>
@@ -1517,7 +1525,7 @@
           </w:tcPr>
           <w:p>
             <w:r>
-              <w:t>519</w:t>
+              <w:t>1</w:t>
             </w:r>
           </w:p>
         </w:tc>
@@ -1529,7 +1537,7 @@
           </w:tcPr>
           <w:p>
             <w:r>
-              <w:t>2026-06-29 23:04:45</w:t>
+              <w:t>2026-06-30 00:02:03</w:t>
             </w:r>
           </w:p>
         </w:tc>
@@ -1539,7 +1547,7 @@
           </w:tcPr>
           <w:p>
             <w:r>
-              <w:t>4</w:t>
+              <w:t>6</w:t>
             </w:r>
           </w:p>
         </w:tc>
@@ -1549,7 +1557,7 @@
           </w:tcPr>
           <w:p>
             <w:r>
-              <w:t>53.4</w:t>
+              <w:t>52.2</w:t>
             </w:r>
           </w:p>
         </w:tc>
@@ -1559,7 +1567,7 @@
           </w:tcPr>
           <w:p>
             <w:r>
-              <w:t>75.9</w:t>
+              <w:t>76.2</w:t>
             </w:r>
           </w:p>
         </w:tc>
@@ -1569,7 +1577,7 @@
           </w:tcPr>
           <w:p>
             <w:r>
-              <w:t>44.5</w:t>
+              <w:t>28.0</w:t>
             </w:r>
           </w:p>
         </w:tc>
@@ -1579,7 +1587,7 @@
           </w:tcPr>
           <w:p>
             <w:r>
-              <w:t>56.8</w:t>
+              <w:t>52.2</w:t>
             </w:r>
           </w:p>
         </w:tc>
@@ -1589,7 +1597,7 @@
           </w:tcPr>
           <w:p>
             <w:r>
-              <w:t>645</w:t>
+              <w:t>55</w:t>
             </w:r>
           </w:p>
         </w:tc>
@@ -1601,7 +1609,7 @@
           </w:tcPr>
           <w:p>
             <w:r>
-              <w:t>2026-06-29 23:21:15</w:t>
+              <w:t>2026-06-30 00:19:33</w:t>
             </w:r>
           </w:p>
         </w:tc>
@@ -1611,7 +1619,7 @@
           </w:tcPr>
           <w:p>
             <w:r>
-              <w:t>5</w:t>
+              <w:t>6</w:t>
             </w:r>
           </w:p>
         </w:tc>
@@ -1621,7 +1629,7 @@
           </w:tcPr>
           <w:p>
             <w:r>
-              <w:t>67.1</w:t>
+              <w:t>48.8</w:t>
             </w:r>
           </w:p>
         </w:tc>
@@ -1631,7 +1639,7 @@
           </w:tcPr>
           <w:p>
             <w:r>
-              <w:t>75.6</w:t>
+              <w:t>76.3</w:t>
             </w:r>
           </w:p>
         </w:tc>
@@ -1641,7 +1649,7 @@
           </w:tcPr>
           <w:p>
             <w:r>
-              <w:t>44.5</w:t>
+              <w:t>28.0</w:t>
             </w:r>
           </w:p>
         </w:tc>
@@ -1651,7 +1659,7 @@
           </w:tcPr>
           <w:p>
             <w:r>
-              <w:t>63.6</w:t>
+              <w:t>50.5</w:t>
             </w:r>
           </w:p>
         </w:tc>
@@ -1661,7 +1669,7 @@
           </w:tcPr>
           <w:p>
             <w:r>
-              <w:t>711</w:t>
+              <w:t>125</w:t>
             </w:r>
           </w:p>
         </w:tc>
@@ -1673,7 +1681,7 @@
           </w:tcPr>
           <w:p>
             <w:r>
-              <w:t>2026-06-29 23:32:15</w:t>
+              <w:t>2026-06-30 00:30:16</w:t>
             </w:r>
           </w:p>
         </w:tc>
@@ -1683,7 +1691,7 @@
           </w:tcPr>
           <w:p>
             <w:r>
-              <w:t>5</w:t>
+              <w:t>6</w:t>
             </w:r>
           </w:p>
         </w:tc>
@@ -1693,7 +1701,7 @@
           </w:tcPr>
           <w:p>
             <w:r>
-              <w:t>62.6</w:t>
+              <w:t>38.8</w:t>
             </w:r>
           </w:p>
         </w:tc>
@@ -1703,7 +1711,7 @@
           </w:tcPr>
           <w:p>
             <w:r>
-              <w:t>75.8</w:t>
+              <w:t>61.0</w:t>
             </w:r>
           </w:p>
         </w:tc>
@@ -1713,7 +1721,7 @@
           </w:tcPr>
           <w:p>
             <w:r>
-              <w:t>44.5</w:t>
+              <w:t>28.0</w:t>
             </w:r>
           </w:p>
         </w:tc>
@@ -1723,7 +1731,7 @@
           </w:tcPr>
           <w:p>
             <w:r>
-              <w:t>61.4</w:t>
+              <w:t>41.6</w:t>
             </w:r>
           </w:p>
         </w:tc>
@@ -1733,7 +1741,7 @@
           </w:tcPr>
           <w:p>
             <w:r>
-              <w:t>755</w:t>
+              <w:t>26</w:t>
             </w:r>
           </w:p>
         </w:tc>
@@ -1754,7 +1762,7 @@
     </w:p>
     <w:p>
       <w:r>
-        <w:t>Section score: 62.6 / 100  (Grade: D)</w:t>
+        <w:t>Section score: 38.8 / 100  (Grade: F)</w:t>
       </w:r>
     </w:p>
     <w:p>
@@ -1865,7 +1873,7 @@
           </w:tcPr>
           <w:p>
             <w:r>
-              <w:t>57.5</w:t>
+              <w:t>47.5</w:t>
             </w:r>
           </w:p>
         </w:tc>
@@ -1875,7 +1883,7 @@
           </w:tcPr>
           <w:p>
             <w:r>
-              <w:t>8.6</w:t>
+              <w:t>7.1</w:t>
             </w:r>
           </w:p>
         </w:tc>
@@ -1897,7 +1905,7 @@
           </w:tcPr>
           <w:p>
             <w:r>
-              <w:t>84.2</w:t>
+              <w:t>26.9</w:t>
             </w:r>
           </w:p>
         </w:tc>
@@ -1907,7 +1915,7 @@
           </w:tcPr>
           <w:p>
             <w:r>
-              <w:t>12.6</w:t>
+              <w:t>4.0</w:t>
             </w:r>
           </w:p>
         </w:tc>
@@ -1929,7 +1937,7 @@
           </w:tcPr>
           <w:p>
             <w:r>
-              <w:t>77.5</w:t>
+              <w:t>33.3</w:t>
             </w:r>
           </w:p>
         </w:tc>
@@ -1939,7 +1947,7 @@
           </w:tcPr>
           <w:p>
             <w:r>
-              <w:t>15.5</w:t>
+              <w:t>6.7</w:t>
             </w:r>
           </w:p>
         </w:tc>
@@ -1961,7 +1969,7 @@
           </w:tcPr>
           <w:p>
             <w:r>
-              <w:t>16.6</w:t>
+              <w:t>20.0</w:t>
             </w:r>
           </w:p>
         </w:tc>
@@ -1971,7 +1979,7 @@
           </w:tcPr>
           <w:p>
             <w:r>
-              <w:t>0.8</w:t>
+              <w:t>1.0</w:t>
             </w:r>
           </w:p>
         </w:tc>
@@ -2025,7 +2033,7 @@
           </w:tcPr>
           <w:p>
             <w:r>
-              <w:t>40.0</w:t>
+              <w:t>20.0</w:t>
             </w:r>
           </w:p>
         </w:tc>
@@ -2035,7 +2043,7 @@
           </w:tcPr>
           <w:p>
             <w:r>
-              <w:t>10.0</w:t>
+              <w:t>5.0</w:t>
             </w:r>
           </w:p>
         </w:tc>
@@ -2076,7 +2084,7 @@
           </w:tcPr>
           <w:p>
             <w:r>
-              <w:t>$527.47</w:t>
+              <w:t>$483.30</w:t>
             </w:r>
           </w:p>
         </w:tc>
@@ -2098,7 +2106,7 @@
           </w:tcPr>
           <w:p>
             <w:r>
-              <w:t>5.49%</w:t>
+              <w:t>-3.34%</w:t>
             </w:r>
           </w:p>
         </w:tc>
@@ -2120,7 +2128,7 @@
           </w:tcPr>
           <w:p>
             <w:r>
-              <w:t>$3.73</w:t>
+              <w:t>$-1.27</w:t>
             </w:r>
           </w:p>
         </w:tc>
@@ -2164,7 +2172,7 @@
           </w:tcPr>
           <w:p>
             <w:r>
-              <w:t>0.6000</w:t>
+              <w:t>0.5000</w:t>
             </w:r>
           </w:p>
         </w:tc>
@@ -2186,7 +2194,7 @@
           </w:tcPr>
           <w:p>
             <w:r>
-              <w:t>— / 0.6000</w:t>
+              <w:t>— / 0.5000</w:t>
             </w:r>
           </w:p>
         </w:tc>
@@ -2208,7 +2216,7 @@
           </w:tcPr>
           <w:p>
             <w:r>
-              <w:t>1.3732</w:t>
+              <w:t>0.9155</w:t>
             </w:r>
           </w:p>
         </w:tc>
@@ -2230,7 +2238,7 @@
           </w:tcPr>
           <w:p>
             <w:r>
-              <w:t>5 / 5</w:t>
+              <w:t>6 / 6</w:t>
             </w:r>
           </w:p>
         </w:tc>
@@ -2252,7 +2260,7 @@
           </w:tcPr>
           <w:p>
             <w:r>
-              <w:t>$0.75</w:t>
+              <w:t>$-0.21</w:t>
             </w:r>
           </w:p>
         </w:tc>
@@ -2290,7 +2298,7 @@
     </w:p>
     <w:p>
       <w:r>
-        <w:t>Realized $19.5133 · Executed 115 · Settled 113 · Wins 77 · Losses 36 · Kelly active False</w:t>
+        <w:t>Realized $-19.6529 · Executed 118 · Settled 117 · Wins 79 · Losses 38 · Kelly active False</w:t>
       </w:r>
     </w:p>
     <w:p>
@@ -2435,7 +2443,7 @@
           </w:tcPr>
           <w:p>
             <w:r>
-              <w:t>4</w:t>
+              <w:t>5</w:t>
             </w:r>
           </w:p>
         </w:tc>
@@ -2445,7 +2453,7 @@
           </w:tcPr>
           <w:p>
             <w:r>
-              <w:t>0.2500</w:t>
+              <w:t>0.2000</w:t>
             </w:r>
           </w:p>
         </w:tc>
@@ -2455,7 +2463,7 @@
           </w:tcPr>
           <w:p>
             <w:r>
-              <w:t>2.4927</w:t>
+              <w:t>1.8695</w:t>
             </w:r>
           </w:p>
         </w:tc>
@@ -2465,7 +2473,7 @@
           </w:tcPr>
           <w:p>
             <w:r>
-              <w:t>$55.98</w:t>
+              <w:t>$34.78</w:t>
             </w:r>
           </w:p>
         </w:tc>
@@ -2591,7 +2599,7 @@
           </w:tcPr>
           <w:p>
             <w:r>
-              <w:t>50</w:t>
+              <w:t>53</w:t>
             </w:r>
           </w:p>
         </w:tc>
@@ -2601,7 +2609,7 @@
           </w:tcPr>
           <w:p>
             <w:r>
-              <w:t>0.5600</w:t>
+              <w:t>0.5660</w:t>
             </w:r>
           </w:p>
         </w:tc>
@@ -2611,7 +2619,7 @@
           </w:tcPr>
           <w:p>
             <w:r>
-              <w:t>0.9823</w:t>
+              <w:t>0.9924</w:t>
             </w:r>
           </w:p>
         </w:tc>
@@ -2621,7 +2629,7 @@
           </w:tcPr>
           <w:p>
             <w:r>
-              <w:t>$-0.39</w:t>
+              <w:t>$-0.16</w:t>
             </w:r>
           </w:p>
         </w:tc>
@@ -2718,7 +2726,7 @@
           </w:tcPr>
           <w:p>
             <w:r>
-              <w:t>parent 645841</w:t>
+              <w:t>parent 645938</w:t>
             </w:r>
           </w:p>
         </w:tc>
@@ -2728,7 +2736,7 @@
           </w:tcPr>
           <w:p>
             <w:r>
-              <w:t>open</w:t>
+              <w:t>settled</w:t>
             </w:r>
           </w:p>
         </w:tc>
@@ -2738,7 +2746,7 @@
           </w:tcPr>
           <w:p>
             <w:r>
-              <w:t>—</w:t>
+              <w:t>No</w:t>
             </w:r>
           </w:p>
         </w:tc>
@@ -2748,7 +2756,7 @@
           </w:tcPr>
           <w:p>
             <w:r>
-              <w:t>0.670</w:t>
+              <w:t>0.640</w:t>
             </w:r>
           </w:p>
         </w:tc>
@@ -2758,7 +2766,7 @@
           </w:tcPr>
           <w:p>
             <w:r>
-              <w:t>$—</w:t>
+              <w:t>$-50.00</w:t>
             </w:r>
           </w:p>
         </w:tc>
@@ -2768,7 +2776,7 @@
           </w:tcPr>
           <w:p>
             <w:r>
-              <w:t>heuristic</w:t>
+              <w:t>outcome</w:t>
             </w:r>
           </w:p>
         </w:tc>
@@ -2780,7 +2788,7 @@
           </w:tcPr>
           <w:p>
             <w:r>
-              <w:t>parent 645808</w:t>
+              <w:t>parent 645916</w:t>
             </w:r>
           </w:p>
         </w:tc>
@@ -2810,7 +2818,7 @@
           </w:tcPr>
           <w:p>
             <w:r>
-              <w:t>0.594</w:t>
+              <w:t>0.133</w:t>
             </w:r>
           </w:p>
         </w:tc>
@@ -2842,7 +2850,7 @@
           </w:tcPr>
           <w:p>
             <w:r>
-              <w:t>parent 645778</w:t>
+              <w:t>parent 645871</w:t>
             </w:r>
           </w:p>
         </w:tc>
@@ -2862,7 +2870,7 @@
           </w:tcPr>
           <w:p>
             <w:r>
-              <w:t>No</w:t>
+              <w:t>Yes</w:t>
             </w:r>
           </w:p>
         </w:tc>
@@ -2872,7 +2880,7 @@
           </w:tcPr>
           <w:p>
             <w:r>
-              <w:t>0.610</w:t>
+              <w:t>0.580</w:t>
             </w:r>
           </w:p>
         </w:tc>
@@ -2882,7 +2890,7 @@
           </w:tcPr>
           <w:p>
             <w:r>
-              <w:t>$-50.00</w:t>
+              <w:t>$36.21</w:t>
             </w:r>
           </w:p>
         </w:tc>
@@ -2904,7 +2912,7 @@
           </w:tcPr>
           <w:p>
             <w:r>
-              <w:t>parent 645747</w:t>
+              <w:t>parent 645841</w:t>
             </w:r>
           </w:p>
         </w:tc>
@@ -2924,7 +2932,7 @@
           </w:tcPr>
           <w:p>
             <w:r>
-              <w:t>No</w:t>
+              <w:t>Yes</w:t>
             </w:r>
           </w:p>
         </w:tc>
@@ -2934,7 +2942,7 @@
           </w:tcPr>
           <w:p>
             <w:r>
-              <w:t>0.583</w:t>
+              <w:t>0.670</w:t>
             </w:r>
           </w:p>
         </w:tc>
@@ -2944,7 +2952,7 @@
           </w:tcPr>
           <w:p>
             <w:r>
-              <w:t>$-50.00</w:t>
+              <w:t>$24.63</w:t>
             </w:r>
           </w:p>
         </w:tc>
@@ -2966,7 +2974,7 @@
           </w:tcPr>
           <w:p>
             <w:r>
-              <w:t>parent 645717</w:t>
+              <w:t>parent 645808</w:t>
             </w:r>
           </w:p>
         </w:tc>
@@ -2996,7 +3004,7 @@
           </w:tcPr>
           <w:p>
             <w:r>
-              <w:t>0.597</w:t>
+              <w:t>0.594</w:t>
             </w:r>
           </w:p>
         </w:tc>
@@ -3028,7 +3036,7 @@
           </w:tcPr>
           <w:p>
             <w:r>
-              <w:t>parent 645693</w:t>
+              <w:t>parent 645778</w:t>
             </w:r>
           </w:p>
         </w:tc>
@@ -3058,7 +3066,7 @@
           </w:tcPr>
           <w:p>
             <w:r>
-              <w:t>0.577</w:t>
+              <w:t>0.610</w:t>
             </w:r>
           </w:p>
         </w:tc>
@@ -3090,7 +3098,7 @@
           </w:tcPr>
           <w:p>
             <w:r>
-              <w:t>parent 645658</w:t>
+              <w:t>parent 645747</w:t>
             </w:r>
           </w:p>
         </w:tc>
@@ -3120,7 +3128,7 @@
           </w:tcPr>
           <w:p>
             <w:r>
-              <w:t>0.510</w:t>
+              <w:t>0.583</w:t>
             </w:r>
           </w:p>
         </w:tc>
@@ -3152,7 +3160,7 @@
           </w:tcPr>
           <w:p>
             <w:r>
-              <w:t>parent 645617</w:t>
+              <w:t>parent 645717</w:t>
             </w:r>
           </w:p>
         </w:tc>
@@ -3172,7 +3180,7 @@
           </w:tcPr>
           <w:p>
             <w:r>
-              <w:t>Yes</w:t>
+              <w:t>No</w:t>
             </w:r>
           </w:p>
         </w:tc>
@@ -3182,7 +3190,7 @@
           </w:tcPr>
           <w:p>
             <w:r>
-              <w:t>0.550</w:t>
+              <w:t>0.597</w:t>
             </w:r>
           </w:p>
         </w:tc>
@@ -3192,7 +3200,7 @@
           </w:tcPr>
           <w:p>
             <w:r>
-              <w:t>$40.91</w:t>
+              <w:t>$-50.00</w:t>
             </w:r>
           </w:p>
         </w:tc>
@@ -3214,7 +3222,7 @@
           </w:tcPr>
           <w:p>
             <w:r>
-              <w:t>parent 645583</w:t>
+              <w:t>parent 645693</w:t>
             </w:r>
           </w:p>
         </w:tc>
@@ -3234,7 +3242,7 @@
           </w:tcPr>
           <w:p>
             <w:r>
-              <w:t>Yes</w:t>
+              <w:t>No</w:t>
             </w:r>
           </w:p>
         </w:tc>
@@ -3244,7 +3252,7 @@
           </w:tcPr>
           <w:p>
             <w:r>
-              <w:t>0.618</w:t>
+              <w:t>0.577</w:t>
             </w:r>
           </w:p>
         </w:tc>
@@ -3254,7 +3262,7 @@
           </w:tcPr>
           <w:p>
             <w:r>
-              <w:t>$30.85</w:t>
+              <w:t>$-50.00</w:t>
             </w:r>
           </w:p>
         </w:tc>
@@ -3276,7 +3284,7 @@
           </w:tcPr>
           <w:p>
             <w:r>
-              <w:t>parent 645559</w:t>
+              <w:t>parent 645658</w:t>
             </w:r>
           </w:p>
         </w:tc>
@@ -3306,7 +3314,7 @@
           </w:tcPr>
           <w:p>
             <w:r>
-              <w:t>0.110</w:t>
+              <w:t>0.510</w:t>
             </w:r>
           </w:p>
         </w:tc>
@@ -3338,7 +3346,7 @@
           </w:tcPr>
           <w:p>
             <w:r>
-              <w:t>parent 645526</w:t>
+              <w:t>parent 645617</w:t>
             </w:r>
           </w:p>
         </w:tc>
@@ -3368,7 +3376,7 @@
           </w:tcPr>
           <w:p>
             <w:r>
-              <w:t>0.530</w:t>
+              <w:t>0.550</w:t>
             </w:r>
           </w:p>
         </w:tc>
@@ -3378,7 +3386,7 @@
           </w:tcPr>
           <w:p>
             <w:r>
-              <w:t>$44.34</w:t>
+              <w:t>$40.91</w:t>
             </w:r>
           </w:p>
         </w:tc>
@@ -3400,7 +3408,7 @@
           </w:tcPr>
           <w:p>
             <w:r>
-              <w:t>parent 645484</w:t>
+              <w:t>parent 645583</w:t>
             </w:r>
           </w:p>
         </w:tc>
@@ -3420,7 +3428,7 @@
           </w:tcPr>
           <w:p>
             <w:r>
-              <w:t>No</w:t>
+              <w:t>Yes</w:t>
             </w:r>
           </w:p>
         </w:tc>
@@ -3430,7 +3438,7 @@
           </w:tcPr>
           <w:p>
             <w:r>
-              <w:t>0.315</w:t>
+              <w:t>0.618</w:t>
             </w:r>
           </w:p>
         </w:tc>
@@ -3440,7 +3448,7 @@
           </w:tcPr>
           <w:p>
             <w:r>
-              <w:t>$-50.00</w:t>
+              <w:t>$30.85</w:t>
             </w:r>
           </w:p>
         </w:tc>
@@ -3462,7 +3470,7 @@
           </w:tcPr>
           <w:p>
             <w:r>
-              <w:t>parent 645429</w:t>
+              <w:t>parent 645559</w:t>
             </w:r>
           </w:p>
         </w:tc>
@@ -3482,7 +3490,7 @@
           </w:tcPr>
           <w:p>
             <w:r>
-              <w:t>Yes</w:t>
+              <w:t>No</w:t>
             </w:r>
           </w:p>
         </w:tc>
@@ -3492,7 +3500,7 @@
           </w:tcPr>
           <w:p>
             <w:r>
-              <w:t>0.582</w:t>
+              <w:t>0.110</w:t>
             </w:r>
           </w:p>
         </w:tc>
@@ -3502,7 +3510,7 @@
           </w:tcPr>
           <w:p>
             <w:r>
-              <w:t>$35.85</w:t>
+              <w:t>$-50.00</w:t>
             </w:r>
           </w:p>
         </w:tc>
@@ -3524,7 +3532,7 @@
           </w:tcPr>
           <w:p>
             <w:r>
-              <w:t>parent 645401</w:t>
+              <w:t>parent 645526</w:t>
             </w:r>
           </w:p>
         </w:tc>
@@ -3544,7 +3552,7 @@
           </w:tcPr>
           <w:p>
             <w:r>
-              <w:t>No</w:t>
+              <w:t>Yes</w:t>
             </w:r>
           </w:p>
         </w:tc>
@@ -3554,7 +3562,7 @@
           </w:tcPr>
           <w:p>
             <w:r>
-              <w:t>0.240</w:t>
+              <w:t>0.530</w:t>
             </w:r>
           </w:p>
         </w:tc>
@@ -3564,7 +3572,7 @@
           </w:tcPr>
           <w:p>
             <w:r>
-              <w:t>$-50.00</w:t>
+              <w:t>$44.34</w:t>
             </w:r>
           </w:p>
         </w:tc>
@@ -3586,7 +3594,7 @@
           </w:tcPr>
           <w:p>
             <w:r>
-              <w:t>parent 645381</w:t>
+              <w:t>parent 645484</w:t>
             </w:r>
           </w:p>
         </w:tc>
@@ -3606,7 +3614,7 @@
           </w:tcPr>
           <w:p>
             <w:r>
-              <w:t>Yes</w:t>
+              <w:t>No</w:t>
             </w:r>
           </w:p>
         </w:tc>
@@ -3616,7 +3624,7 @@
           </w:tcPr>
           <w:p>
             <w:r>
-              <w:t>0.580</w:t>
+              <w:t>0.315</w:t>
             </w:r>
           </w:p>
         </w:tc>
@@ -3626,7 +3634,7 @@
           </w:tcPr>
           <w:p>
             <w:r>
-              <w:t>$36.21</w:t>
+              <w:t>$-50.00</w:t>
             </w:r>
           </w:p>
         </w:tc>
@@ -3648,7 +3656,7 @@
           </w:tcPr>
           <w:p>
             <w:r>
-              <w:t>parent 645340</w:t>
+              <w:t>parent 645429</w:t>
             </w:r>
           </w:p>
         </w:tc>
@@ -3668,7 +3676,7 @@
           </w:tcPr>
           <w:p>
             <w:r>
-              <w:t>No</w:t>
+              <w:t>Yes</w:t>
             </w:r>
           </w:p>
         </w:tc>
@@ -3678,7 +3686,7 @@
           </w:tcPr>
           <w:p>
             <w:r>
-              <w:t>0.538</w:t>
+              <w:t>0.582</w:t>
             </w:r>
           </w:p>
         </w:tc>
@@ -3688,7 +3696,7 @@
           </w:tcPr>
           <w:p>
             <w:r>
-              <w:t>$-50.00</w:t>
+              <w:t>$35.85</w:t>
             </w:r>
           </w:p>
         </w:tc>
@@ -3710,7 +3718,7 @@
           </w:tcPr>
           <w:p>
             <w:r>
-              <w:t>parent 645281</w:t>
+              <w:t>parent 645401</w:t>
             </w:r>
           </w:p>
         </w:tc>
@@ -3730,7 +3738,7 @@
           </w:tcPr>
           <w:p>
             <w:r>
-              <w:t>Yes</w:t>
+              <w:t>No</w:t>
             </w:r>
           </w:p>
         </w:tc>
@@ -3740,7 +3748,7 @@
           </w:tcPr>
           <w:p>
             <w:r>
-              <w:t>0.118</w:t>
+              <w:t>0.240</w:t>
             </w:r>
           </w:p>
         </w:tc>
@@ -3750,7 +3758,7 @@
           </w:tcPr>
           <w:p>
             <w:r>
-              <w:t>$373.90</w:t>
+              <w:t>$-50.00</w:t>
             </w:r>
           </w:p>
         </w:tc>
@@ -3772,7 +3780,7 @@
           </w:tcPr>
           <w:p>
             <w:r>
-              <w:t>parent 645252</w:t>
+              <w:t>parent 645381</w:t>
             </w:r>
           </w:p>
         </w:tc>
@@ -3802,7 +3810,7 @@
           </w:tcPr>
           <w:p>
             <w:r>
-              <w:t>0.537</w:t>
+              <w:t>0.580</w:t>
             </w:r>
           </w:p>
         </w:tc>
@@ -3812,7 +3820,7 @@
           </w:tcPr>
           <w:p>
             <w:r>
-              <w:t>$43.06</w:t>
+              <w:t>$36.21</w:t>
             </w:r>
           </w:p>
         </w:tc>
@@ -3834,7 +3842,7 @@
           </w:tcPr>
           <w:p>
             <w:r>
-              <w:t>parent 645212</w:t>
+              <w:t>parent 645340</w:t>
             </w:r>
           </w:p>
         </w:tc>
@@ -3864,7 +3872,7 @@
           </w:tcPr>
           <w:p>
             <w:r>
-              <w:t>0.080</w:t>
+              <w:t>0.538</w:t>
             </w:r>
           </w:p>
         </w:tc>
@@ -3896,7 +3904,7 @@
           </w:tcPr>
           <w:p>
             <w:r>
-              <w:t>parent 645157</w:t>
+              <w:t>parent 645281</w:t>
             </w:r>
           </w:p>
         </w:tc>
@@ -3926,7 +3934,7 @@
           </w:tcPr>
           <w:p>
             <w:r>
-              <w:t>0.540</w:t>
+              <w:t>0.118</w:t>
             </w:r>
           </w:p>
         </w:tc>
@@ -3936,7 +3944,7 @@
           </w:tcPr>
           <w:p>
             <w:r>
-              <w:t>$42.59</w:t>
+              <w:t>$373.90</w:t>
             </w:r>
           </w:p>
         </w:tc>
@@ -4055,6 +4063,58 @@
           </w:tcPr>
           <w:p>
             <w:r>
+              <w:t>0.510</w:t>
+            </w:r>
+          </w:p>
+        </w:tc>
+        <w:tc>
+          <w:tcPr>
+            <w:tcW w:type="dxa" w:w="1728"/>
+          </w:tcPr>
+          <w:p>
+            <w:r>
+              <w:t>up</w:t>
+            </w:r>
+          </w:p>
+        </w:tc>
+        <w:tc>
+          <w:tcPr>
+            <w:tcW w:type="dxa" w:w="1728"/>
+          </w:tcPr>
+          <w:p>
+            <w:r>
+              <w:t>No</w:t>
+            </w:r>
+          </w:p>
+        </w:tc>
+        <w:tc>
+          <w:tcPr>
+            <w:tcW w:type="dxa" w:w="1728"/>
+          </w:tcPr>
+          <w:p>
+            <w:r>
+              <w:t>$-5.00</w:t>
+            </w:r>
+          </w:p>
+        </w:tc>
+      </w:tr>
+      <w:tr>
+        <w:tc>
+          <w:tcPr>
+            <w:tcW w:type="dxa" w:w="1728"/>
+          </w:tcPr>
+          <w:p>
+            <w:r>
+              <w:t>down</w:t>
+            </w:r>
+          </w:p>
+        </w:tc>
+        <w:tc>
+          <w:tcPr>
+            <w:tcW w:type="dxa" w:w="1728"/>
+          </w:tcPr>
+          <w:p>
+            <w:r>
               <w:t>0.560</w:t>
             </w:r>
           </w:p>
@@ -4314,7 +4374,7 @@
     </w:p>
     <w:p>
       <w:r>
-        <w:t>Section score: 75.6 / 100  (Grade: C+)</w:t>
+        <w:t>Section score: 61.1 / 100  (Grade: D)</w:t>
       </w:r>
     </w:p>
     <w:p>
@@ -4457,7 +4517,7 @@
           </w:tcPr>
           <w:p>
             <w:r>
-              <w:t>27.4</w:t>
+              <w:t>29.4</w:t>
             </w:r>
           </w:p>
         </w:tc>
@@ -4467,7 +4527,7 @@
           </w:tcPr>
           <w:p>
             <w:r>
-              <w:t>4.1</w:t>
+              <w:t>4.4</w:t>
             </w:r>
           </w:p>
         </w:tc>
@@ -4489,7 +4549,7 @@
           </w:tcPr>
           <w:p>
             <w:r>
-              <w:t>70.0</w:t>
+              <w:t>71.2</w:t>
             </w:r>
           </w:p>
         </w:tc>
@@ -4499,7 +4559,7 @@
           </w:tcPr>
           <w:p>
             <w:r>
-              <w:t>10.5</w:t>
+              <w:t>10.7</w:t>
             </w:r>
           </w:p>
         </w:tc>
@@ -4553,7 +4613,7 @@
           </w:tcPr>
           <w:p>
             <w:r>
-              <w:t>100.0</w:t>
+              <w:t>0.0</w:t>
             </w:r>
           </w:p>
         </w:tc>
@@ -4563,7 +4623,7 @@
           </w:tcPr>
           <w:p>
             <w:r>
-              <w:t>15.0</w:t>
+              <w:t>0.0</w:t>
             </w:r>
           </w:p>
         </w:tc>
@@ -4571,17 +4631,17 @@
     </w:tbl>
     <w:p>
       <w:r>
-        <w:t>Ticks: 778 · Reconciled: True · Readiness: not_ready</w:t>
+        <w:t>Ticks: 37 · Reconciled: True · Readiness: not_ready</w:t>
       </w:r>
     </w:p>
     <w:p>
       <w:r>
-        <w:t>Candidates created: 13176 · Terminals: {'accepted': 0, 'rejected': 1772, 'skipped': 11352, 'expired': 0, 'missing_data': 52}</w:t>
+        <w:t>Candidates created: 13533 · Terminals: {'accepted': 1, 'rejected': 1926, 'skipped': 11548, 'expired': 0, 'missing_data': 58}</w:t>
       </w:r>
     </w:p>
     <w:p>
       <w:r>
-        <w:t>Rejected by stage: {'directional': 1566, 'execution_gate': 23, 'baseline_cohort_gate': 183}</w:t>
+        <w:t>Rejected by stage: {'directional': 1717, 'execution_gate': 24, 'baseline_cohort_gate': 185}</w:t>
       </w:r>
     </w:p>
     <w:p>
@@ -4901,6 +4961,48 @@
           </w:tcPr>
           <w:p>
             <w:r>
+              <w:t>loop_synthesis</w:t>
+            </w:r>
+          </w:p>
+        </w:tc>
+        <w:tc>
+          <w:tcPr>
+            <w:tcW w:type="dxa" w:w="2160"/>
+          </w:tcPr>
+          <w:p>
+            <w:r>
+              <w:t>loop_engine(WS5)</w:t>
+            </w:r>
+          </w:p>
+        </w:tc>
+        <w:tc>
+          <w:tcPr>
+            <w:tcW w:type="dxa" w:w="2160"/>
+          </w:tcPr>
+          <w:p>
+            <w:r>
+              <w:t>per_light_report</w:t>
+            </w:r>
+          </w:p>
+        </w:tc>
+        <w:tc>
+          <w:tcPr>
+            <w:tcW w:type="dxa" w:w="2160"/>
+          </w:tcPr>
+          <w:p>
+            <w:r>
+              <w:t>evidence-gated next experiment</w:t>
+            </w:r>
+          </w:p>
+        </w:tc>
+      </w:tr>
+      <w:tr>
+        <w:tc>
+          <w:tcPr>
+            <w:tcW w:type="dxa" w:w="2160"/>
+          </w:tcPr>
+          <w:p>
+            <w:r>
               <w:t>news</w:t>
             </w:r>
           </w:p>
@@ -5156,7 +5258,7 @@
     </w:p>
     <w:p>
       <w:r>
-        <w:t>Section score: 44.5 / 100  (Grade: F)</w:t>
+        <w:t>Section score: 28.0 / 100  (Grade: F)</w:t>
       </w:r>
     </w:p>
     <w:p>
@@ -5363,7 +5465,7 @@
           </w:tcPr>
           <w:p>
             <w:r>
-              <w:t>30.0</w:t>
+              <w:t>0.0</w:t>
             </w:r>
           </w:p>
         </w:tc>
@@ -5373,7 +5475,7 @@
           </w:tcPr>
           <w:p>
             <w:r>
-              <w:t>9.0</w:t>
+              <w:t>0.0</w:t>
             </w:r>
           </w:p>
         </w:tc>
@@ -5395,7 +5497,7 @@
           </w:tcPr>
           <w:p>
             <w:r>
-              <w:t>50.0</w:t>
+              <w:t>0.0</w:t>
             </w:r>
           </w:p>
         </w:tc>
@@ -5405,7 +5507,7 @@
           </w:tcPr>
           <w:p>
             <w:r>
-              <w:t>7.5</w:t>
+              <w:t>0.0</w:t>
             </w:r>
           </w:p>
         </w:tc>
@@ -5446,7 +5548,7 @@
           </w:tcPr>
           <w:p>
             <w:r>
-              <w:t>None</w:t>
+              <w:t>0.0000</w:t>
             </w:r>
           </w:p>
         </w:tc>
@@ -5490,7 +5592,7 @@
           </w:tcPr>
           <w:p>
             <w:r>
-              <w:t>None</w:t>
+              <w:t>0.0000</w:t>
             </w:r>
           </w:p>
         </w:tc>
@@ -5534,7 +5636,7 @@
           </w:tcPr>
           <w:p>
             <w:r>
-              <w:t>0.4706</w:t>
+              <w:t>0.4737</w:t>
             </w:r>
           </w:p>
         </w:tc>
@@ -5564,7 +5666,7 @@
     </w:tbl>
     <w:p>
       <w:r>
-        <w:t>TV alerts: received 1962 · valid 1743 · rejected 219</w:t>
+        <w:t>TV alerts: received 2019 · valid 1800 · rejected 219</w:t>
       </w:r>
     </w:p>
     <w:sectPr>

</xml_diff>

<commit_message>
chore(reports): VPS full report 2026-06-30 03:22 UTC (9 settled, WR 44.4%, PF 0.7415, grade F)
</commit_message>
<xml_diff>
--- a/vps_full_reports/latest/report.docx
+++ b/vps_full_reports/latest/report.docx
@@ -20,7 +20,7 @@
           <w:color w:val="666666"/>
           <w:sz w:val="20"/>
         </w:rPr>
-        <w:t>PAPER ONLY  ·  reconciled=True  ·  ticks=37</w:t>
+        <w:t>PAPER ONLY  ·  reconciled=True  ·  ticks=716</w:t>
       </w:r>
     </w:p>
     <w:p>
@@ -33,7 +33,7 @@
     </w:p>
     <w:p>
       <w:r>
-        <w:t>Overall score: 41.7 / 100  (Grade: F)</w:t>
+        <w:t>Overall score: 37.7 / 100  (Grade: F)</w:t>
       </w:r>
     </w:p>
     <w:tbl>
@@ -107,7 +107,7 @@
           </w:tcPr>
           <w:p>
             <w:r>
-              <w:t>38.8</w:t>
+              <w:t>30.7</w:t>
             </w:r>
           </w:p>
         </w:tc>
@@ -149,7 +149,7 @@
           </w:tcPr>
           <w:p>
             <w:r>
-              <w:t>61.1</w:t>
+              <w:t>61.5</w:t>
             </w:r>
           </w:p>
         </w:tc>
@@ -319,7 +319,7 @@
           </w:tcPr>
           <w:p>
             <w:r>
-              <w:t>2026-06-29 17:32:56</w:t>
+              <w:t>2026-06-29 19:48:58</w:t>
             </w:r>
           </w:p>
         </w:tc>
@@ -328,7 +328,9 @@
             <w:tcW w:type="dxa" w:w="1234"/>
           </w:tcPr>
           <w:p>
-            <w:r/>
+            <w:r>
+              <w:t>2</w:t>
+            </w:r>
           </w:p>
         </w:tc>
         <w:tc>
@@ -337,7 +339,7 @@
           </w:tcPr>
           <w:p>
             <w:r>
-              <w:t>42.5</w:t>
+              <w:t>39.8</w:t>
             </w:r>
           </w:p>
         </w:tc>
@@ -347,7 +349,7 @@
           </w:tcPr>
           <w:p>
             <w:r>
-              <w:t>56.5</w:t>
+              <w:t>76.0</w:t>
             </w:r>
           </w:p>
         </w:tc>
@@ -357,7 +359,7 @@
           </w:tcPr>
           <w:p>
             <w:r>
-              <w:t>49.4</w:t>
+              <w:t>45.6</w:t>
             </w:r>
           </w:p>
         </w:tc>
@@ -367,7 +369,7 @@
           </w:tcPr>
           <w:p>
             <w:r>
-              <w:t>47.7</w:t>
+              <w:t>50.3</w:t>
             </w:r>
           </w:p>
         </w:tc>
@@ -377,7 +379,7 @@
           </w:tcPr>
           <w:p>
             <w:r>
-              <w:t>1</w:t>
+              <w:t>545</w:t>
             </w:r>
           </w:p>
         </w:tc>
@@ -389,7 +391,7 @@
           </w:tcPr>
           <w:p>
             <w:r>
-              <w:t>2026-06-29 18:02:58</w:t>
+              <w:t>2026-06-29 20:19:13</w:t>
             </w:r>
           </w:p>
         </w:tc>
@@ -398,7 +400,9 @@
             <w:tcW w:type="dxa" w:w="1234"/>
           </w:tcPr>
           <w:p>
-            <w:r/>
+            <w:r>
+              <w:t>2</w:t>
+            </w:r>
           </w:p>
         </w:tc>
         <w:tc>
@@ -407,7 +411,7 @@
           </w:tcPr>
           <w:p>
             <w:r>
-              <w:t>42.5</w:t>
+              <w:t>39.8</w:t>
             </w:r>
           </w:p>
         </w:tc>
@@ -417,7 +421,7 @@
           </w:tcPr>
           <w:p>
             <w:r>
-              <w:t>57.5</w:t>
+              <w:t>75.7</w:t>
             </w:r>
           </w:p>
         </w:tc>
@@ -427,7 +431,7 @@
           </w:tcPr>
           <w:p>
             <w:r>
-              <w:t>49.4</w:t>
+              <w:t>45.6</w:t>
             </w:r>
           </w:p>
         </w:tc>
@@ -437,7 +441,7 @@
           </w:tcPr>
           <w:p>
             <w:r>
-              <w:t>48.0</w:t>
+              <w:t>50.2</w:t>
             </w:r>
           </w:p>
         </w:tc>
@@ -447,7 +451,7 @@
           </w:tcPr>
           <w:p>
             <w:r>
-              <w:t>121</w:t>
+              <w:t>666</w:t>
             </w:r>
           </w:p>
         </w:tc>
@@ -459,7 +463,7 @@
           </w:tcPr>
           <w:p>
             <w:r>
-              <w:t>2026-06-29 18:33:13</w:t>
+              <w:t>2026-06-29 20:49:15</w:t>
             </w:r>
           </w:p>
         </w:tc>
@@ -468,7 +472,9 @@
             <w:tcW w:type="dxa" w:w="1234"/>
           </w:tcPr>
           <w:p>
-            <w:r/>
+            <w:r>
+              <w:t>2</w:t>
+            </w:r>
           </w:p>
         </w:tc>
         <w:tc>
@@ -477,7 +483,7 @@
           </w:tcPr>
           <w:p>
             <w:r>
-              <w:t>42.5</w:t>
+              <w:t>39.8</w:t>
             </w:r>
           </w:p>
         </w:tc>
@@ -487,7 +493,7 @@
           </w:tcPr>
           <w:p>
             <w:r>
-              <w:t>58.7</w:t>
+              <w:t>76.0</w:t>
             </w:r>
           </w:p>
         </w:tc>
@@ -507,7 +513,7 @@
           </w:tcPr>
           <w:p>
             <w:r>
-              <w:t>47.3</w:t>
+              <w:t>50.3</w:t>
             </w:r>
           </w:p>
         </w:tc>
@@ -517,7 +523,7 @@
           </w:tcPr>
           <w:p>
             <w:r>
-              <w:t>242</w:t>
+              <w:t>103</w:t>
             </w:r>
           </w:p>
         </w:tc>
@@ -529,7 +535,7 @@
           </w:tcPr>
           <w:p>
             <w:r>
-              <w:t>2026-06-29 18:48:13</w:t>
+              <w:t>2026-06-29 21:19:30</w:t>
             </w:r>
           </w:p>
         </w:tc>
@@ -539,7 +545,7 @@
           </w:tcPr>
           <w:p>
             <w:r>
-              <w:t>1</w:t>
+              <w:t>2</w:t>
             </w:r>
           </w:p>
         </w:tc>
@@ -549,7 +555,7 @@
           </w:tcPr>
           <w:p>
             <w:r>
-              <w:t>21.2</w:t>
+              <w:t>39.8</w:t>
             </w:r>
           </w:p>
         </w:tc>
@@ -559,7 +565,7 @@
           </w:tcPr>
           <w:p>
             <w:r>
-              <w:t>59.1</w:t>
+              <w:t>75.7</w:t>
             </w:r>
           </w:p>
         </w:tc>
@@ -579,7 +585,7 @@
           </w:tcPr>
           <w:p>
             <w:r>
-              <w:t>36.8</w:t>
+              <w:t>50.2</w:t>
             </w:r>
           </w:p>
         </w:tc>
@@ -589,7 +595,7 @@
           </w:tcPr>
           <w:p>
             <w:r>
-              <w:t>302</w:t>
+              <w:t>224</w:t>
             </w:r>
           </w:p>
         </w:tc>
@@ -601,7 +607,7 @@
           </w:tcPr>
           <w:p>
             <w:r>
-              <w:t>2026-06-29 19:06:58</w:t>
+              <w:t>2026-06-29 21:49:45</w:t>
             </w:r>
           </w:p>
         </w:tc>
@@ -621,7 +627,7 @@
           </w:tcPr>
           <w:p>
             <w:r>
-              <w:t>20.7</w:t>
+              <w:t>39.8</w:t>
             </w:r>
           </w:p>
         </w:tc>
@@ -631,7 +637,7 @@
           </w:tcPr>
           <w:p>
             <w:r>
-              <w:t>59.9</w:t>
+              <w:t>75.6</w:t>
             </w:r>
           </w:p>
         </w:tc>
@@ -651,7 +657,7 @@
           </w:tcPr>
           <w:p>
             <w:r>
-              <w:t>36.7</w:t>
+              <w:t>50.2</w:t>
             </w:r>
           </w:p>
         </w:tc>
@@ -661,7 +667,7 @@
           </w:tcPr>
           <w:p>
             <w:r>
-              <w:t>377</w:t>
+              <w:t>345</w:t>
             </w:r>
           </w:p>
         </w:tc>
@@ -673,7 +679,7 @@
           </w:tcPr>
           <w:p>
             <w:r>
-              <w:t>2026-06-29 19:37:13</w:t>
+              <w:t>2026-06-29 22:19:58</w:t>
             </w:r>
           </w:p>
         </w:tc>
@@ -693,7 +699,7 @@
           </w:tcPr>
           <w:p>
             <w:r>
-              <w:t>19.8</w:t>
+              <w:t>39.8</w:t>
             </w:r>
           </w:p>
         </w:tc>
@@ -703,7 +709,7 @@
           </w:tcPr>
           <w:p>
             <w:r>
-              <w:t>59.9</w:t>
+              <w:t>75.9</w:t>
             </w:r>
           </w:p>
         </w:tc>
@@ -713,7 +719,7 @@
           </w:tcPr>
           <w:p>
             <w:r>
-              <w:t>45.6</w:t>
+              <w:t>44.5</w:t>
             </w:r>
           </w:p>
         </w:tc>
@@ -723,7 +729,7 @@
           </w:tcPr>
           <w:p>
             <w:r>
-              <w:t>36.3</w:t>
+              <w:t>50.0</w:t>
             </w:r>
           </w:p>
         </w:tc>
@@ -733,7 +739,7 @@
           </w:tcPr>
           <w:p>
             <w:r>
-              <w:t>498</w:t>
+              <w:t>466</w:t>
             </w:r>
           </w:p>
         </w:tc>
@@ -745,7 +751,7 @@
           </w:tcPr>
           <w:p>
             <w:r>
-              <w:t>2026-06-29 19:48:58</w:t>
+              <w:t>2026-06-29 22:33:15</w:t>
             </w:r>
           </w:p>
         </w:tc>
@@ -755,7 +761,7 @@
           </w:tcPr>
           <w:p>
             <w:r>
-              <w:t>2</w:t>
+              <w:t>3</w:t>
             </w:r>
           </w:p>
         </w:tc>
@@ -765,7 +771,7 @@
           </w:tcPr>
           <w:p>
             <w:r>
-              <w:t>39.8</w:t>
+              <w:t>41.4</w:t>
             </w:r>
           </w:p>
         </w:tc>
@@ -775,7 +781,7 @@
           </w:tcPr>
           <w:p>
             <w:r>
-              <w:t>76.0</w:t>
+              <w:t>76.1</w:t>
             </w:r>
           </w:p>
         </w:tc>
@@ -785,7 +791,7 @@
           </w:tcPr>
           <w:p>
             <w:r>
-              <w:t>45.6</w:t>
+              <w:t>44.5</w:t>
             </w:r>
           </w:p>
         </w:tc>
@@ -795,7 +801,7 @@
           </w:tcPr>
           <w:p>
             <w:r>
-              <w:t>50.3</w:t>
+              <w:t>50.8</w:t>
             </w:r>
           </w:p>
         </w:tc>
@@ -805,7 +811,7 @@
           </w:tcPr>
           <w:p>
             <w:r>
-              <w:t>545</w:t>
+              <w:t>519</w:t>
             </w:r>
           </w:p>
         </w:tc>
@@ -817,7 +823,7 @@
           </w:tcPr>
           <w:p>
             <w:r>
-              <w:t>2026-06-29 20:19:13</w:t>
+              <w:t>2026-06-29 23:04:45</w:t>
             </w:r>
           </w:p>
         </w:tc>
@@ -827,7 +833,7 @@
           </w:tcPr>
           <w:p>
             <w:r>
-              <w:t>2</w:t>
+              <w:t>4</w:t>
             </w:r>
           </w:p>
         </w:tc>
@@ -837,7 +843,7 @@
           </w:tcPr>
           <w:p>
             <w:r>
-              <w:t>39.8</w:t>
+              <w:t>53.4</w:t>
             </w:r>
           </w:p>
         </w:tc>
@@ -847,7 +853,7 @@
           </w:tcPr>
           <w:p>
             <w:r>
-              <w:t>75.7</w:t>
+              <w:t>75.9</w:t>
             </w:r>
           </w:p>
         </w:tc>
@@ -857,7 +863,7 @@
           </w:tcPr>
           <w:p>
             <w:r>
-              <w:t>45.6</w:t>
+              <w:t>44.5</w:t>
             </w:r>
           </w:p>
         </w:tc>
@@ -867,7 +873,7 @@
           </w:tcPr>
           <w:p>
             <w:r>
-              <w:t>50.2</w:t>
+              <w:t>56.8</w:t>
             </w:r>
           </w:p>
         </w:tc>
@@ -877,7 +883,7 @@
           </w:tcPr>
           <w:p>
             <w:r>
-              <w:t>666</w:t>
+              <w:t>645</w:t>
             </w:r>
           </w:p>
         </w:tc>
@@ -889,7 +895,7 @@
           </w:tcPr>
           <w:p>
             <w:r>
-              <w:t>2026-06-29 20:49:15</w:t>
+              <w:t>2026-06-29 23:21:15</w:t>
             </w:r>
           </w:p>
         </w:tc>
@@ -899,7 +905,7 @@
           </w:tcPr>
           <w:p>
             <w:r>
-              <w:t>2</w:t>
+              <w:t>5</w:t>
             </w:r>
           </w:p>
         </w:tc>
@@ -909,7 +915,7 @@
           </w:tcPr>
           <w:p>
             <w:r>
-              <w:t>39.8</w:t>
+              <w:t>67.1</w:t>
             </w:r>
           </w:p>
         </w:tc>
@@ -919,7 +925,7 @@
           </w:tcPr>
           <w:p>
             <w:r>
-              <w:t>76.0</w:t>
+              <w:t>75.6</w:t>
             </w:r>
           </w:p>
         </w:tc>
@@ -929,7 +935,7 @@
           </w:tcPr>
           <w:p>
             <w:r>
-              <w:t>45.6</w:t>
+              <w:t>44.5</w:t>
             </w:r>
           </w:p>
         </w:tc>
@@ -939,7 +945,7 @@
           </w:tcPr>
           <w:p>
             <w:r>
-              <w:t>50.3</w:t>
+              <w:t>63.6</w:t>
             </w:r>
           </w:p>
         </w:tc>
@@ -949,7 +955,7 @@
           </w:tcPr>
           <w:p>
             <w:r>
-              <w:t>103</w:t>
+              <w:t>711</w:t>
             </w:r>
           </w:p>
         </w:tc>
@@ -961,7 +967,7 @@
           </w:tcPr>
           <w:p>
             <w:r>
-              <w:t>2026-06-29 21:19:30</w:t>
+              <w:t>2026-06-29 23:32:15</w:t>
             </w:r>
           </w:p>
         </w:tc>
@@ -971,7 +977,7 @@
           </w:tcPr>
           <w:p>
             <w:r>
-              <w:t>2</w:t>
+              <w:t>5</w:t>
             </w:r>
           </w:p>
         </w:tc>
@@ -981,7 +987,7 @@
           </w:tcPr>
           <w:p>
             <w:r>
-              <w:t>39.8</w:t>
+              <w:t>62.6</w:t>
             </w:r>
           </w:p>
         </w:tc>
@@ -991,7 +997,7 @@
           </w:tcPr>
           <w:p>
             <w:r>
-              <w:t>75.7</w:t>
+              <w:t>75.8</w:t>
             </w:r>
           </w:p>
         </w:tc>
@@ -1001,7 +1007,7 @@
           </w:tcPr>
           <w:p>
             <w:r>
-              <w:t>45.6</w:t>
+              <w:t>44.5</w:t>
             </w:r>
           </w:p>
         </w:tc>
@@ -1011,7 +1017,7 @@
           </w:tcPr>
           <w:p>
             <w:r>
-              <w:t>50.2</w:t>
+              <w:t>61.4</w:t>
             </w:r>
           </w:p>
         </w:tc>
@@ -1021,7 +1027,7 @@
           </w:tcPr>
           <w:p>
             <w:r>
-              <w:t>224</w:t>
+              <w:t>755</w:t>
             </w:r>
           </w:p>
         </w:tc>
@@ -1033,7 +1039,7 @@
           </w:tcPr>
           <w:p>
             <w:r>
-              <w:t>2026-06-29 21:49:45</w:t>
+              <w:t>2026-06-29 23:48:04</w:t>
             </w:r>
           </w:p>
         </w:tc>
@@ -1043,7 +1049,7 @@
           </w:tcPr>
           <w:p>
             <w:r>
-              <w:t>2</w:t>
+              <w:t>5</w:t>
             </w:r>
           </w:p>
         </w:tc>
@@ -1053,7 +1059,7 @@
           </w:tcPr>
           <w:p>
             <w:r>
-              <w:t>39.8</w:t>
+              <w:t>67.1</w:t>
             </w:r>
           </w:p>
         </w:tc>
@@ -1063,7 +1069,7 @@
           </w:tcPr>
           <w:p>
             <w:r>
-              <w:t>75.6</w:t>
+              <w:t>76.0</w:t>
             </w:r>
           </w:p>
         </w:tc>
@@ -1073,7 +1079,7 @@
           </w:tcPr>
           <w:p>
             <w:r>
-              <w:t>45.6</w:t>
+              <w:t>44.5</w:t>
             </w:r>
           </w:p>
         </w:tc>
@@ -1083,7 +1089,7 @@
           </w:tcPr>
           <w:p>
             <w:r>
-              <w:t>50.2</w:t>
+              <w:t>63.7</w:t>
             </w:r>
           </w:p>
         </w:tc>
@@ -1093,7 +1099,7 @@
           </w:tcPr>
           <w:p>
             <w:r>
-              <w:t>345</w:t>
+              <w:t>1</w:t>
             </w:r>
           </w:p>
         </w:tc>
@@ -1105,7 +1111,7 @@
           </w:tcPr>
           <w:p>
             <w:r>
-              <w:t>2026-06-29 22:19:58</w:t>
+              <w:t>2026-06-30 00:02:03</w:t>
             </w:r>
           </w:p>
         </w:tc>
@@ -1115,7 +1121,7 @@
           </w:tcPr>
           <w:p>
             <w:r>
-              <w:t>2</w:t>
+              <w:t>6</w:t>
             </w:r>
           </w:p>
         </w:tc>
@@ -1125,7 +1131,7 @@
           </w:tcPr>
           <w:p>
             <w:r>
-              <w:t>39.8</w:t>
+              <w:t>52.2</w:t>
             </w:r>
           </w:p>
         </w:tc>
@@ -1135,7 +1141,7 @@
           </w:tcPr>
           <w:p>
             <w:r>
-              <w:t>75.9</w:t>
+              <w:t>76.2</w:t>
             </w:r>
           </w:p>
         </w:tc>
@@ -1145,7 +1151,7 @@
           </w:tcPr>
           <w:p>
             <w:r>
-              <w:t>44.5</w:t>
+              <w:t>28.0</w:t>
             </w:r>
           </w:p>
         </w:tc>
@@ -1155,7 +1161,7 @@
           </w:tcPr>
           <w:p>
             <w:r>
-              <w:t>50.0</w:t>
+              <w:t>52.2</w:t>
             </w:r>
           </w:p>
         </w:tc>
@@ -1165,7 +1171,7 @@
           </w:tcPr>
           <w:p>
             <w:r>
-              <w:t>466</w:t>
+              <w:t>55</w:t>
             </w:r>
           </w:p>
         </w:tc>
@@ -1177,7 +1183,7 @@
           </w:tcPr>
           <w:p>
             <w:r>
-              <w:t>2026-06-29 22:33:15</w:t>
+              <w:t>2026-06-30 00:19:33</w:t>
             </w:r>
           </w:p>
         </w:tc>
@@ -1187,7 +1193,7 @@
           </w:tcPr>
           <w:p>
             <w:r>
-              <w:t>3</w:t>
+              <w:t>6</w:t>
             </w:r>
           </w:p>
         </w:tc>
@@ -1197,7 +1203,7 @@
           </w:tcPr>
           <w:p>
             <w:r>
-              <w:t>41.4</w:t>
+              <w:t>48.8</w:t>
             </w:r>
           </w:p>
         </w:tc>
@@ -1207,7 +1213,7 @@
           </w:tcPr>
           <w:p>
             <w:r>
-              <w:t>76.1</w:t>
+              <w:t>76.3</w:t>
             </w:r>
           </w:p>
         </w:tc>
@@ -1217,7 +1223,7 @@
           </w:tcPr>
           <w:p>
             <w:r>
-              <w:t>44.5</w:t>
+              <w:t>28.0</w:t>
             </w:r>
           </w:p>
         </w:tc>
@@ -1227,7 +1233,7 @@
           </w:tcPr>
           <w:p>
             <w:r>
-              <w:t>50.8</w:t>
+              <w:t>50.5</w:t>
             </w:r>
           </w:p>
         </w:tc>
@@ -1237,7 +1243,7 @@
           </w:tcPr>
           <w:p>
             <w:r>
-              <w:t>519</w:t>
+              <w:t>125</w:t>
             </w:r>
           </w:p>
         </w:tc>
@@ -1249,7 +1255,7 @@
           </w:tcPr>
           <w:p>
             <w:r>
-              <w:t>2026-06-29 23:04:45</w:t>
+              <w:t>2026-06-30 00:30:16</w:t>
             </w:r>
           </w:p>
         </w:tc>
@@ -1259,7 +1265,7 @@
           </w:tcPr>
           <w:p>
             <w:r>
-              <w:t>4</w:t>
+              <w:t>6</w:t>
             </w:r>
           </w:p>
         </w:tc>
@@ -1269,7 +1275,7 @@
           </w:tcPr>
           <w:p>
             <w:r>
-              <w:t>53.4</w:t>
+              <w:t>38.8</w:t>
             </w:r>
           </w:p>
         </w:tc>
@@ -1279,7 +1285,7 @@
           </w:tcPr>
           <w:p>
             <w:r>
-              <w:t>75.9</w:t>
+              <w:t>61.0</w:t>
             </w:r>
           </w:p>
         </w:tc>
@@ -1289,7 +1295,7 @@
           </w:tcPr>
           <w:p>
             <w:r>
-              <w:t>44.5</w:t>
+              <w:t>28.0</w:t>
             </w:r>
           </w:p>
         </w:tc>
@@ -1299,7 +1305,7 @@
           </w:tcPr>
           <w:p>
             <w:r>
-              <w:t>56.8</w:t>
+              <w:t>41.6</w:t>
             </w:r>
           </w:p>
         </w:tc>
@@ -1309,7 +1315,7 @@
           </w:tcPr>
           <w:p>
             <w:r>
-              <w:t>645</w:t>
+              <w:t>26</w:t>
             </w:r>
           </w:p>
         </w:tc>
@@ -1321,7 +1327,7 @@
           </w:tcPr>
           <w:p>
             <w:r>
-              <w:t>2026-06-29 23:21:15</w:t>
+              <w:t>2026-06-30 01:00:15</w:t>
             </w:r>
           </w:p>
         </w:tc>
@@ -1331,7 +1337,7 @@
           </w:tcPr>
           <w:p>
             <w:r>
-              <w:t>5</w:t>
+              <w:t>7</w:t>
             </w:r>
           </w:p>
         </w:tc>
@@ -1341,7 +1347,7 @@
           </w:tcPr>
           <w:p>
             <w:r>
-              <w:t>67.1</w:t>
+              <w:t>28.9</w:t>
             </w:r>
           </w:p>
         </w:tc>
@@ -1351,7 +1357,7 @@
           </w:tcPr>
           <w:p>
             <w:r>
-              <w:t>75.6</w:t>
+              <w:t>61.2</w:t>
             </w:r>
           </w:p>
         </w:tc>
@@ -1361,7 +1367,7 @@
           </w:tcPr>
           <w:p>
             <w:r>
-              <w:t>44.5</w:t>
+              <w:t>28.0</w:t>
             </w:r>
           </w:p>
         </w:tc>
@@ -1371,7 +1377,7 @@
           </w:tcPr>
           <w:p>
             <w:r>
-              <w:t>63.6</w:t>
+              <w:t>36.8</w:t>
             </w:r>
           </w:p>
         </w:tc>
@@ -1381,7 +1387,7 @@
           </w:tcPr>
           <w:p>
             <w:r>
-              <w:t>711</w:t>
+              <w:t>146</w:t>
             </w:r>
           </w:p>
         </w:tc>
@@ -1393,7 +1399,7 @@
           </w:tcPr>
           <w:p>
             <w:r>
-              <w:t>2026-06-29 23:32:15</w:t>
+              <w:t>2026-06-30 01:18:15</w:t>
             </w:r>
           </w:p>
         </w:tc>
@@ -1403,7 +1409,7 @@
           </w:tcPr>
           <w:p>
             <w:r>
-              <w:t>5</w:t>
+              <w:t>8</w:t>
             </w:r>
           </w:p>
         </w:tc>
@@ -1413,7 +1419,7 @@
           </w:tcPr>
           <w:p>
             <w:r>
-              <w:t>62.6</w:t>
+              <w:t>39.3</w:t>
             </w:r>
           </w:p>
         </w:tc>
@@ -1423,7 +1429,7 @@
           </w:tcPr>
           <w:p>
             <w:r>
-              <w:t>75.8</w:t>
+              <w:t>61.6</w:t>
             </w:r>
           </w:p>
         </w:tc>
@@ -1433,7 +1439,7 @@
           </w:tcPr>
           <w:p>
             <w:r>
-              <w:t>44.5</w:t>
+              <w:t>28.0</w:t>
             </w:r>
           </w:p>
         </w:tc>
@@ -1443,7 +1449,7 @@
           </w:tcPr>
           <w:p>
             <w:r>
-              <w:t>61.4</w:t>
+              <w:t>42.0</w:t>
             </w:r>
           </w:p>
         </w:tc>
@@ -1453,7 +1459,7 @@
           </w:tcPr>
           <w:p>
             <w:r>
-              <w:t>755</w:t>
+              <w:t>218</w:t>
             </w:r>
           </w:p>
         </w:tc>
@@ -1465,7 +1471,7 @@
           </w:tcPr>
           <w:p>
             <w:r>
-              <w:t>2026-06-29 23:48:04</w:t>
+              <w:t>2026-06-30 01:48:30</w:t>
             </w:r>
           </w:p>
         </w:tc>
@@ -1475,7 +1481,7 @@
           </w:tcPr>
           <w:p>
             <w:r>
-              <w:t>5</w:t>
+              <w:t>8</w:t>
             </w:r>
           </w:p>
         </w:tc>
@@ -1485,7 +1491,7 @@
           </w:tcPr>
           <w:p>
             <w:r>
-              <w:t>67.1</w:t>
+              <w:t>39.3</w:t>
             </w:r>
           </w:p>
         </w:tc>
@@ -1495,7 +1501,7 @@
           </w:tcPr>
           <w:p>
             <w:r>
-              <w:t>76.0</w:t>
+              <w:t>61.6</w:t>
             </w:r>
           </w:p>
         </w:tc>
@@ -1505,7 +1511,7 @@
           </w:tcPr>
           <w:p>
             <w:r>
-              <w:t>44.5</w:t>
+              <w:t>28.0</w:t>
             </w:r>
           </w:p>
         </w:tc>
@@ -1515,7 +1521,7 @@
           </w:tcPr>
           <w:p>
             <w:r>
-              <w:t>63.7</w:t>
+              <w:t>42.0</w:t>
             </w:r>
           </w:p>
         </w:tc>
@@ -1525,7 +1531,7 @@
           </w:tcPr>
           <w:p>
             <w:r>
-              <w:t>1</w:t>
+              <w:t>339</w:t>
             </w:r>
           </w:p>
         </w:tc>
@@ -1537,7 +1543,7 @@
           </w:tcPr>
           <w:p>
             <w:r>
-              <w:t>2026-06-30 00:02:03</w:t>
+              <w:t>2026-06-30 02:18:44</w:t>
             </w:r>
           </w:p>
         </w:tc>
@@ -1547,7 +1553,7 @@
           </w:tcPr>
           <w:p>
             <w:r>
-              <w:t>6</w:t>
+              <w:t>8</w:t>
             </w:r>
           </w:p>
         </w:tc>
@@ -1557,7 +1563,7 @@
           </w:tcPr>
           <w:p>
             <w:r>
-              <w:t>52.2</w:t>
+              <w:t>39.3</w:t>
             </w:r>
           </w:p>
         </w:tc>
@@ -1567,7 +1573,7 @@
           </w:tcPr>
           <w:p>
             <w:r>
-              <w:t>76.2</w:t>
+              <w:t>61.6</w:t>
             </w:r>
           </w:p>
         </w:tc>
@@ -1587,7 +1593,7 @@
           </w:tcPr>
           <w:p>
             <w:r>
-              <w:t>52.2</w:t>
+              <w:t>42.0</w:t>
             </w:r>
           </w:p>
         </w:tc>
@@ -1597,7 +1603,7 @@
           </w:tcPr>
           <w:p>
             <w:r>
-              <w:t>55</w:t>
+              <w:t>460</w:t>
             </w:r>
           </w:p>
         </w:tc>
@@ -1609,7 +1615,7 @@
           </w:tcPr>
           <w:p>
             <w:r>
-              <w:t>2026-06-30 00:19:33</w:t>
+              <w:t>2026-06-30 02:32:46</w:t>
             </w:r>
           </w:p>
         </w:tc>
@@ -1619,7 +1625,7 @@
           </w:tcPr>
           <w:p>
             <w:r>
-              <w:t>6</w:t>
+              <w:t>9</w:t>
             </w:r>
           </w:p>
         </w:tc>
@@ -1629,7 +1635,7 @@
           </w:tcPr>
           <w:p>
             <w:r>
-              <w:t>48.8</w:t>
+              <w:t>30.7</w:t>
             </w:r>
           </w:p>
         </w:tc>
@@ -1639,7 +1645,7 @@
           </w:tcPr>
           <w:p>
             <w:r>
-              <w:t>76.3</w:t>
+              <w:t>61.7</w:t>
             </w:r>
           </w:p>
         </w:tc>
@@ -1659,7 +1665,7 @@
           </w:tcPr>
           <w:p>
             <w:r>
-              <w:t>50.5</w:t>
+              <w:t>37.8</w:t>
             </w:r>
           </w:p>
         </w:tc>
@@ -1669,7 +1675,7 @@
           </w:tcPr>
           <w:p>
             <w:r>
-              <w:t>125</w:t>
+              <w:t>516</w:t>
             </w:r>
           </w:p>
         </w:tc>
@@ -1681,7 +1687,7 @@
           </w:tcPr>
           <w:p>
             <w:r>
-              <w:t>2026-06-30 00:30:16</w:t>
+              <w:t>2026-06-30 03:03:00</w:t>
             </w:r>
           </w:p>
         </w:tc>
@@ -1691,7 +1697,7 @@
           </w:tcPr>
           <w:p>
             <w:r>
-              <w:t>6</w:t>
+              <w:t>9</w:t>
             </w:r>
           </w:p>
         </w:tc>
@@ -1701,7 +1707,7 @@
           </w:tcPr>
           <w:p>
             <w:r>
-              <w:t>38.8</w:t>
+              <w:t>30.7</w:t>
             </w:r>
           </w:p>
         </w:tc>
@@ -1711,7 +1717,7 @@
           </w:tcPr>
           <w:p>
             <w:r>
-              <w:t>61.0</w:t>
+              <w:t>61.8</w:t>
             </w:r>
           </w:p>
         </w:tc>
@@ -1731,7 +1737,7 @@
           </w:tcPr>
           <w:p>
             <w:r>
-              <w:t>41.6</w:t>
+              <w:t>37.8</w:t>
             </w:r>
           </w:p>
         </w:tc>
@@ -1741,7 +1747,7 @@
           </w:tcPr>
           <w:p>
             <w:r>
-              <w:t>26</w:t>
+              <w:t>637</w:t>
             </w:r>
           </w:p>
         </w:tc>
@@ -1762,7 +1768,7 @@
     </w:p>
     <w:p>
       <w:r>
-        <w:t>Section score: 38.8 / 100  (Grade: F)</w:t>
+        <w:t>Section score: 30.7 / 100  (Grade: F)</w:t>
       </w:r>
     </w:p>
     <w:p>
@@ -1873,7 +1879,7 @@
           </w:tcPr>
           <w:p>
             <w:r>
-              <w:t>47.5</w:t>
+              <w:t>37.1</w:t>
             </w:r>
           </w:p>
         </w:tc>
@@ -1883,7 +1889,7 @@
           </w:tcPr>
           <w:p>
             <w:r>
-              <w:t>7.1</w:t>
+              <w:t>5.6</w:t>
             </w:r>
           </w:p>
         </w:tc>
@@ -1905,7 +1911,7 @@
           </w:tcPr>
           <w:p>
             <w:r>
-              <w:t>26.9</w:t>
+              <w:t>5.2</w:t>
             </w:r>
           </w:p>
         </w:tc>
@@ -1915,7 +1921,7 @@
           </w:tcPr>
           <w:p>
             <w:r>
-              <w:t>4.0</w:t>
+              <w:t>0.8</w:t>
             </w:r>
           </w:p>
         </w:tc>
@@ -1937,7 +1943,7 @@
           </w:tcPr>
           <w:p>
             <w:r>
-              <w:t>33.3</w:t>
+              <w:t>28.1</w:t>
             </w:r>
           </w:p>
         </w:tc>
@@ -1947,7 +1953,7 @@
           </w:tcPr>
           <w:p>
             <w:r>
-              <w:t>6.7</w:t>
+              <w:t>5.6</w:t>
             </w:r>
           </w:p>
         </w:tc>
@@ -1969,7 +1975,7 @@
           </w:tcPr>
           <w:p>
             <w:r>
-              <w:t>20.0</w:t>
+              <w:t>30.0</w:t>
             </w:r>
           </w:p>
         </w:tc>
@@ -1979,7 +1985,7 @@
           </w:tcPr>
           <w:p>
             <w:r>
-              <w:t>1.0</w:t>
+              <w:t>1.5</w:t>
             </w:r>
           </w:p>
         </w:tc>
@@ -2033,7 +2039,7 @@
           </w:tcPr>
           <w:p>
             <w:r>
-              <w:t>20.0</w:t>
+              <w:t>8.9</w:t>
             </w:r>
           </w:p>
         </w:tc>
@@ -2043,7 +2049,7 @@
           </w:tcPr>
           <w:p>
             <w:r>
-              <w:t>5.0</w:t>
+              <w:t>2.2</w:t>
             </w:r>
           </w:p>
         </w:tc>
@@ -2084,7 +2090,7 @@
           </w:tcPr>
           <w:p>
             <w:r>
-              <w:t>$483.30</w:t>
+              <w:t>$478.11</w:t>
             </w:r>
           </w:p>
         </w:tc>
@@ -2106,7 +2112,7 @@
           </w:tcPr>
           <w:p>
             <w:r>
-              <w:t>-3.34%</w:t>
+              <w:t>-4.38%</w:t>
             </w:r>
           </w:p>
         </w:tc>
@@ -2128,7 +2134,7 @@
           </w:tcPr>
           <w:p>
             <w:r>
-              <w:t>$-1.27</w:t>
+              <w:t>$-6.46</w:t>
             </w:r>
           </w:p>
         </w:tc>
@@ -2172,7 +2178,7 @@
           </w:tcPr>
           <w:p>
             <w:r>
-              <w:t>0.5000</w:t>
+              <w:t>0.4444</w:t>
             </w:r>
           </w:p>
         </w:tc>
@@ -2194,7 +2200,7 @@
           </w:tcPr>
           <w:p>
             <w:r>
-              <w:t>— / 0.5000</w:t>
+              <w:t>— / 0.4444</w:t>
             </w:r>
           </w:p>
         </w:tc>
@@ -2216,7 +2222,7 @@
           </w:tcPr>
           <w:p>
             <w:r>
-              <w:t>0.9155</w:t>
+              <w:t>0.7415</w:t>
             </w:r>
           </w:p>
         </w:tc>
@@ -2238,7 +2244,7 @@
           </w:tcPr>
           <w:p>
             <w:r>
-              <w:t>6 / 6</w:t>
+              <w:t>9 / 9</w:t>
             </w:r>
           </w:p>
         </w:tc>
@@ -2260,7 +2266,7 @@
           </w:tcPr>
           <w:p>
             <w:r>
-              <w:t>$-0.21</w:t>
+              <w:t>$-0.72</w:t>
             </w:r>
           </w:p>
         </w:tc>
@@ -4063,6 +4069,162 @@
           </w:tcPr>
           <w:p>
             <w:r>
+              <w:t>0.530</w:t>
+            </w:r>
+          </w:p>
+        </w:tc>
+        <w:tc>
+          <w:tcPr>
+            <w:tcW w:type="dxa" w:w="1728"/>
+          </w:tcPr>
+          <w:p>
+            <w:r>
+              <w:t>up</w:t>
+            </w:r>
+          </w:p>
+        </w:tc>
+        <w:tc>
+          <w:tcPr>
+            <w:tcW w:type="dxa" w:w="1728"/>
+          </w:tcPr>
+          <w:p>
+            <w:r>
+              <w:t>No</w:t>
+            </w:r>
+          </w:p>
+        </w:tc>
+        <w:tc>
+          <w:tcPr>
+            <w:tcW w:type="dxa" w:w="1728"/>
+          </w:tcPr>
+          <w:p>
+            <w:r>
+              <w:t>$-5.00</w:t>
+            </w:r>
+          </w:p>
+        </w:tc>
+      </w:tr>
+      <w:tr>
+        <w:tc>
+          <w:tcPr>
+            <w:tcW w:type="dxa" w:w="1728"/>
+          </w:tcPr>
+          <w:p>
+            <w:r>
+              <w:t>down</w:t>
+            </w:r>
+          </w:p>
+        </w:tc>
+        <w:tc>
+          <w:tcPr>
+            <w:tcW w:type="dxa" w:w="1728"/>
+          </w:tcPr>
+          <w:p>
+            <w:r>
+              <w:t>0.510</w:t>
+            </w:r>
+          </w:p>
+        </w:tc>
+        <w:tc>
+          <w:tcPr>
+            <w:tcW w:type="dxa" w:w="1728"/>
+          </w:tcPr>
+          <w:p>
+            <w:r>
+              <w:t>down</w:t>
+            </w:r>
+          </w:p>
+        </w:tc>
+        <w:tc>
+          <w:tcPr>
+            <w:tcW w:type="dxa" w:w="1728"/>
+          </w:tcPr>
+          <w:p>
+            <w:r>
+              <w:t>Yes</w:t>
+            </w:r>
+          </w:p>
+        </w:tc>
+        <w:tc>
+          <w:tcPr>
+            <w:tcW w:type="dxa" w:w="1728"/>
+          </w:tcPr>
+          <w:p>
+            <w:r>
+              <w:t>$4.80</w:t>
+            </w:r>
+          </w:p>
+        </w:tc>
+      </w:tr>
+      <w:tr>
+        <w:tc>
+          <w:tcPr>
+            <w:tcW w:type="dxa" w:w="1728"/>
+          </w:tcPr>
+          <w:p>
+            <w:r>
+              <w:t>down</w:t>
+            </w:r>
+          </w:p>
+        </w:tc>
+        <w:tc>
+          <w:tcPr>
+            <w:tcW w:type="dxa" w:w="1728"/>
+          </w:tcPr>
+          <w:p>
+            <w:r>
+              <w:t>0.490</w:t>
+            </w:r>
+          </w:p>
+        </w:tc>
+        <w:tc>
+          <w:tcPr>
+            <w:tcW w:type="dxa" w:w="1728"/>
+          </w:tcPr>
+          <w:p>
+            <w:r>
+              <w:t>up</w:t>
+            </w:r>
+          </w:p>
+        </w:tc>
+        <w:tc>
+          <w:tcPr>
+            <w:tcW w:type="dxa" w:w="1728"/>
+          </w:tcPr>
+          <w:p>
+            <w:r>
+              <w:t>No</w:t>
+            </w:r>
+          </w:p>
+        </w:tc>
+        <w:tc>
+          <w:tcPr>
+            <w:tcW w:type="dxa" w:w="1728"/>
+          </w:tcPr>
+          <w:p>
+            <w:r>
+              <w:t>$-5.00</w:t>
+            </w:r>
+          </w:p>
+        </w:tc>
+      </w:tr>
+      <w:tr>
+        <w:tc>
+          <w:tcPr>
+            <w:tcW w:type="dxa" w:w="1728"/>
+          </w:tcPr>
+          <w:p>
+            <w:r>
+              <w:t>down</w:t>
+            </w:r>
+          </w:p>
+        </w:tc>
+        <w:tc>
+          <w:tcPr>
+            <w:tcW w:type="dxa" w:w="1728"/>
+          </w:tcPr>
+          <w:p>
+            <w:r>
               <w:t>0.510</w:t>
             </w:r>
           </w:p>
@@ -4374,7 +4536,7 @@
     </w:p>
     <w:p>
       <w:r>
-        <w:t>Section score: 61.1 / 100  (Grade: D)</w:t>
+        <w:t>Section score: 61.5 / 100  (Grade: D)</w:t>
       </w:r>
     </w:p>
     <w:p>
@@ -4517,7 +4679,7 @@
           </w:tcPr>
           <w:p>
             <w:r>
-              <w:t>29.4</w:t>
+              <w:t>28.6</w:t>
             </w:r>
           </w:p>
         </w:tc>
@@ -4527,7 +4689,7 @@
           </w:tcPr>
           <w:p>
             <w:r>
-              <w:t>4.4</w:t>
+              <w:t>4.3</w:t>
             </w:r>
           </w:p>
         </w:tc>
@@ -4549,7 +4711,7 @@
           </w:tcPr>
           <w:p>
             <w:r>
-              <w:t>71.2</w:t>
+              <w:t>74.8</w:t>
             </w:r>
           </w:p>
         </w:tc>
@@ -4559,7 +4721,7 @@
           </w:tcPr>
           <w:p>
             <w:r>
-              <w:t>10.7</w:t>
+              <w:t>11.2</w:t>
             </w:r>
           </w:p>
         </w:tc>
@@ -4631,17 +4793,17 @@
     </w:tbl>
     <w:p>
       <w:r>
-        <w:t>Ticks: 37 · Reconciled: True · Readiness: not_ready</w:t>
+        <w:t>Ticks: 716 · Reconciled: True · Readiness: not_ready</w:t>
       </w:r>
     </w:p>
     <w:p>
       <w:r>
-        <w:t>Candidates created: 13533 · Terminals: {'accepted': 1, 'rejected': 1926, 'skipped': 11548, 'expired': 0, 'missing_data': 58}</w:t>
+        <w:t>Candidates created: 14763 · Terminals: {'accepted': 4, 'rejected': 2474, 'skipped': 12227, 'expired': 0, 'missing_data': 58}</w:t>
       </w:r>
     </w:p>
     <w:p>
       <w:r>
-        <w:t>Rejected by stage: {'directional': 1717, 'execution_gate': 24, 'baseline_cohort_gate': 185}</w:t>
+        <w:t>Rejected by stage: {'directional': 2238, 'execution_gate': 25, 'baseline_cohort_gate': 211}</w:t>
       </w:r>
     </w:p>
     <w:p>
@@ -5548,7 +5710,7 @@
           </w:tcPr>
           <w:p>
             <w:r>
-              <w:t>0.0000</w:t>
+              <w:t>0.2500</w:t>
             </w:r>
           </w:p>
         </w:tc>
@@ -5592,7 +5754,7 @@
           </w:tcPr>
           <w:p>
             <w:r>
-              <w:t>0.0000</w:t>
+              <w:t>0.2500</w:t>
             </w:r>
           </w:p>
         </w:tc>
@@ -5614,7 +5776,7 @@
           </w:tcPr>
           <w:p>
             <w:r>
-              <w:t>0.4000</w:t>
+              <w:t>0.3333</w:t>
             </w:r>
           </w:p>
         </w:tc>
@@ -5636,7 +5798,7 @@
           </w:tcPr>
           <w:p>
             <w:r>
-              <w:t>0.4737</w:t>
+              <w:t>0.4490</w:t>
             </w:r>
           </w:p>
         </w:tc>
@@ -5666,7 +5828,7 @@
     </w:tbl>
     <w:p>
       <w:r>
-        <w:t>TV alerts: received 2019 · valid 1800 · rejected 219</w:t>
+        <w:t>TV alerts: received 2203 · valid 1984 · rejected 219</w:t>
       </w:r>
     </w:p>
     <w:sectPr>

</xml_diff>

<commit_message>
chore(reports): VPS full report 2026-07-01 02:02 UTC (24 settled, WR 50.0%, PF 1.0011, grade F)
</commit_message>
<xml_diff>
--- a/vps_full_reports/latest/report.docx
+++ b/vps_full_reports/latest/report.docx
@@ -20,7 +20,7 @@
           <w:color w:val="666666"/>
           <w:sz w:val="20"/>
         </w:rPr>
-        <w:t>PAPER ONLY  ·  reconciled=True  ·  ticks=716</w:t>
+        <w:t>PAPER ONLY  ·  reconciled=True  ·  ticks=719</w:t>
       </w:r>
     </w:p>
     <w:p>
@@ -33,7 +33,7 @@
     </w:p>
     <w:p>
       <w:r>
-        <w:t>Overall score: 37.7 / 100  (Grade: F)</w:t>
+        <w:t>Overall score: 44.8 / 100  (Grade: F)</w:t>
       </w:r>
     </w:p>
     <w:tbl>
@@ -107,7 +107,7 @@
           </w:tcPr>
           <w:p>
             <w:r>
-              <w:t>30.7</w:t>
+              <w:t>37.2</w:t>
             </w:r>
           </w:p>
         </w:tc>
@@ -149,7 +149,7 @@
           </w:tcPr>
           <w:p>
             <w:r>
-              <w:t>61.5</w:t>
+              <w:t>76.8</w:t>
             </w:r>
           </w:p>
         </w:tc>
@@ -159,7 +159,7 @@
           </w:tcPr>
           <w:p>
             <w:r>
-              <w:t>D</w:t>
+              <w:t>C+</w:t>
             </w:r>
           </w:p>
         </w:tc>
@@ -319,7 +319,7 @@
           </w:tcPr>
           <w:p>
             <w:r>
-              <w:t>2026-06-29 19:48:58</w:t>
+              <w:t>2026-06-30 16:32:59</w:t>
             </w:r>
           </w:p>
         </w:tc>
@@ -329,7 +329,7 @@
           </w:tcPr>
           <w:p>
             <w:r>
-              <w:t>2</w:t>
+              <w:t>21</w:t>
             </w:r>
           </w:p>
         </w:tc>
@@ -339,7 +339,7 @@
           </w:tcPr>
           <w:p>
             <w:r>
-              <w:t>39.8</w:t>
+              <w:t>51.0</w:t>
             </w:r>
           </w:p>
         </w:tc>
@@ -349,7 +349,7 @@
           </w:tcPr>
           <w:p>
             <w:r>
-              <w:t>76.0</w:t>
+              <w:t>77.0</w:t>
             </w:r>
           </w:p>
         </w:tc>
@@ -359,7 +359,7 @@
           </w:tcPr>
           <w:p>
             <w:r>
-              <w:t>45.6</w:t>
+              <w:t>28.0</w:t>
             </w:r>
           </w:p>
         </w:tc>
@@ -369,7 +369,7 @@
           </w:tcPr>
           <w:p>
             <w:r>
-              <w:t>50.3</w:t>
+              <w:t>51.8</w:t>
             </w:r>
           </w:p>
         </w:tc>
@@ -379,7 +379,7 @@
           </w:tcPr>
           <w:p>
             <w:r>
-              <w:t>545</w:t>
+              <w:t>220</w:t>
             </w:r>
           </w:p>
         </w:tc>
@@ -391,7 +391,7 @@
           </w:tcPr>
           <w:p>
             <w:r>
-              <w:t>2026-06-29 20:19:13</w:t>
+              <w:t>2026-06-30 16:48:13</w:t>
             </w:r>
           </w:p>
         </w:tc>
@@ -401,7 +401,7 @@
           </w:tcPr>
           <w:p>
             <w:r>
-              <w:t>2</w:t>
+              <w:t>22</w:t>
             </w:r>
           </w:p>
         </w:tc>
@@ -411,7 +411,7 @@
           </w:tcPr>
           <w:p>
             <w:r>
-              <w:t>39.8</w:t>
+              <w:t>45.9</w:t>
             </w:r>
           </w:p>
         </w:tc>
@@ -421,7 +421,7 @@
           </w:tcPr>
           <w:p>
             <w:r>
-              <w:t>75.7</w:t>
+              <w:t>77.1</w:t>
             </w:r>
           </w:p>
         </w:tc>
@@ -431,7 +431,7 @@
           </w:tcPr>
           <w:p>
             <w:r>
-              <w:t>45.6</w:t>
+              <w:t>28.0</w:t>
             </w:r>
           </w:p>
         </w:tc>
@@ -441,7 +441,7 @@
           </w:tcPr>
           <w:p>
             <w:r>
-              <w:t>50.2</w:t>
+              <w:t>49.2</w:t>
             </w:r>
           </w:p>
         </w:tc>
@@ -451,7 +451,7 @@
           </w:tcPr>
           <w:p>
             <w:r>
-              <w:t>666</w:t>
+              <w:t>281</w:t>
             </w:r>
           </w:p>
         </w:tc>
@@ -463,7 +463,7 @@
           </w:tcPr>
           <w:p>
             <w:r>
-              <w:t>2026-06-29 20:49:15</w:t>
+              <w:t>2026-06-30 17:18:26</w:t>
             </w:r>
           </w:p>
         </w:tc>
@@ -473,7 +473,7 @@
           </w:tcPr>
           <w:p>
             <w:r>
-              <w:t>2</w:t>
+              <w:t>22</w:t>
             </w:r>
           </w:p>
         </w:tc>
@@ -483,7 +483,7 @@
           </w:tcPr>
           <w:p>
             <w:r>
-              <w:t>39.8</w:t>
+              <w:t>45.9</w:t>
             </w:r>
           </w:p>
         </w:tc>
@@ -493,7 +493,7 @@
           </w:tcPr>
           <w:p>
             <w:r>
-              <w:t>76.0</w:t>
+              <w:t>77.0</w:t>
             </w:r>
           </w:p>
         </w:tc>
@@ -503,7 +503,7 @@
           </w:tcPr>
           <w:p>
             <w:r>
-              <w:t>45.6</w:t>
+              <w:t>28.0</w:t>
             </w:r>
           </w:p>
         </w:tc>
@@ -513,7 +513,7 @@
           </w:tcPr>
           <w:p>
             <w:r>
-              <w:t>50.3</w:t>
+              <w:t>49.2</w:t>
             </w:r>
           </w:p>
         </w:tc>
@@ -523,7 +523,7 @@
           </w:tcPr>
           <w:p>
             <w:r>
-              <w:t>103</w:t>
+              <w:t>401</w:t>
             </w:r>
           </w:p>
         </w:tc>
@@ -535,7 +535,7 @@
           </w:tcPr>
           <w:p>
             <w:r>
-              <w:t>2026-06-29 21:19:30</w:t>
+              <w:t>2026-06-30 17:49:57</w:t>
             </w:r>
           </w:p>
         </w:tc>
@@ -545,7 +545,7 @@
           </w:tcPr>
           <w:p>
             <w:r>
-              <w:t>2</w:t>
+              <w:t>22</w:t>
             </w:r>
           </w:p>
         </w:tc>
@@ -555,7 +555,7 @@
           </w:tcPr>
           <w:p>
             <w:r>
-              <w:t>39.8</w:t>
+              <w:t>45.9</w:t>
             </w:r>
           </w:p>
         </w:tc>
@@ -565,7 +565,7 @@
           </w:tcPr>
           <w:p>
             <w:r>
-              <w:t>75.7</w:t>
+              <w:t>76.9</w:t>
             </w:r>
           </w:p>
         </w:tc>
@@ -575,7 +575,7 @@
           </w:tcPr>
           <w:p>
             <w:r>
-              <w:t>45.6</w:t>
+              <w:t>28.0</w:t>
             </w:r>
           </w:p>
         </w:tc>
@@ -585,7 +585,7 @@
           </w:tcPr>
           <w:p>
             <w:r>
-              <w:t>50.2</w:t>
+              <w:t>49.2</w:t>
             </w:r>
           </w:p>
         </w:tc>
@@ -595,7 +595,7 @@
           </w:tcPr>
           <w:p>
             <w:r>
-              <w:t>224</w:t>
+              <w:t>527</w:t>
             </w:r>
           </w:p>
         </w:tc>
@@ -607,7 +607,7 @@
           </w:tcPr>
           <w:p>
             <w:r>
-              <w:t>2026-06-29 21:49:45</w:t>
+              <w:t>2026-06-30 18:18:11</w:t>
             </w:r>
           </w:p>
         </w:tc>
@@ -617,7 +617,7 @@
           </w:tcPr>
           <w:p>
             <w:r>
-              <w:t>2</w:t>
+              <w:t>23</w:t>
             </w:r>
           </w:p>
         </w:tc>
@@ -627,7 +627,7 @@
           </w:tcPr>
           <w:p>
             <w:r>
-              <w:t>39.8</w:t>
+              <w:t>41.3</w:t>
             </w:r>
           </w:p>
         </w:tc>
@@ -637,7 +637,7 @@
           </w:tcPr>
           <w:p>
             <w:r>
-              <w:t>75.6</w:t>
+              <w:t>77.1</w:t>
             </w:r>
           </w:p>
         </w:tc>
@@ -647,7 +647,7 @@
           </w:tcPr>
           <w:p>
             <w:r>
-              <w:t>45.6</w:t>
+              <w:t>28.0</w:t>
             </w:r>
           </w:p>
         </w:tc>
@@ -657,7 +657,7 @@
           </w:tcPr>
           <w:p>
             <w:r>
-              <w:t>50.2</w:t>
+              <w:t>46.9</w:t>
             </w:r>
           </w:p>
         </w:tc>
@@ -667,7 +667,7 @@
           </w:tcPr>
           <w:p>
             <w:r>
-              <w:t>345</w:t>
+              <w:t>640</w:t>
             </w:r>
           </w:p>
         </w:tc>
@@ -679,7 +679,7 @@
           </w:tcPr>
           <w:p>
             <w:r>
-              <w:t>2026-06-29 22:19:58</w:t>
+              <w:t>2026-06-30 18:48:27</w:t>
             </w:r>
           </w:p>
         </w:tc>
@@ -689,7 +689,7 @@
           </w:tcPr>
           <w:p>
             <w:r>
-              <w:t>2</w:t>
+              <w:t>23</w:t>
             </w:r>
           </w:p>
         </w:tc>
@@ -699,7 +699,7 @@
           </w:tcPr>
           <w:p>
             <w:r>
-              <w:t>39.8</w:t>
+              <w:t>41.3</w:t>
             </w:r>
           </w:p>
         </w:tc>
@@ -709,7 +709,7 @@
           </w:tcPr>
           <w:p>
             <w:r>
-              <w:t>75.9</w:t>
+              <w:t>77.0</w:t>
             </w:r>
           </w:p>
         </w:tc>
@@ -719,7 +719,7 @@
           </w:tcPr>
           <w:p>
             <w:r>
-              <w:t>44.5</w:t>
+              <w:t>28.0</w:t>
             </w:r>
           </w:p>
         </w:tc>
@@ -729,7 +729,7 @@
           </w:tcPr>
           <w:p>
             <w:r>
-              <w:t>50.0</w:t>
+              <w:t>46.9</w:t>
             </w:r>
           </w:p>
         </w:tc>
@@ -739,7 +739,7 @@
           </w:tcPr>
           <w:p>
             <w:r>
-              <w:t>466</w:t>
+              <w:t>761</w:t>
             </w:r>
           </w:p>
         </w:tc>
@@ -751,7 +751,7 @@
           </w:tcPr>
           <w:p>
             <w:r>
-              <w:t>2026-06-29 22:33:15</w:t>
+              <w:t>2026-06-30 19:18:41</w:t>
             </w:r>
           </w:p>
         </w:tc>
@@ -761,7 +761,7 @@
           </w:tcPr>
           <w:p>
             <w:r>
-              <w:t>3</w:t>
+              <w:t>23</w:t>
             </w:r>
           </w:p>
         </w:tc>
@@ -771,7 +771,7 @@
           </w:tcPr>
           <w:p>
             <w:r>
-              <w:t>41.4</w:t>
+              <w:t>41.3</w:t>
             </w:r>
           </w:p>
         </w:tc>
@@ -781,7 +781,7 @@
           </w:tcPr>
           <w:p>
             <w:r>
-              <w:t>76.1</w:t>
+              <w:t>76.9</w:t>
             </w:r>
           </w:p>
         </w:tc>
@@ -791,7 +791,7 @@
           </w:tcPr>
           <w:p>
             <w:r>
-              <w:t>44.5</w:t>
+              <w:t>28.0</w:t>
             </w:r>
           </w:p>
         </w:tc>
@@ -801,7 +801,7 @@
           </w:tcPr>
           <w:p>
             <w:r>
-              <w:t>50.8</w:t>
+              <w:t>46.9</w:t>
             </w:r>
           </w:p>
         </w:tc>
@@ -811,7 +811,7 @@
           </w:tcPr>
           <w:p>
             <w:r>
-              <w:t>519</w:t>
+              <w:t>882</w:t>
             </w:r>
           </w:p>
         </w:tc>
@@ -823,7 +823,7 @@
           </w:tcPr>
           <w:p>
             <w:r>
-              <w:t>2026-06-29 23:04:45</w:t>
+              <w:t>2026-06-30 19:48:41</w:t>
             </w:r>
           </w:p>
         </w:tc>
@@ -833,7 +833,7 @@
           </w:tcPr>
           <w:p>
             <w:r>
-              <w:t>4</w:t>
+              <w:t>23</w:t>
             </w:r>
           </w:p>
         </w:tc>
@@ -843,7 +843,7 @@
           </w:tcPr>
           <w:p>
             <w:r>
-              <w:t>53.4</w:t>
+              <w:t>41.3</w:t>
             </w:r>
           </w:p>
         </w:tc>
@@ -853,7 +853,7 @@
           </w:tcPr>
           <w:p>
             <w:r>
-              <w:t>75.9</w:t>
+              <w:t>76.8</w:t>
             </w:r>
           </w:p>
         </w:tc>
@@ -863,7 +863,7 @@
           </w:tcPr>
           <w:p>
             <w:r>
-              <w:t>44.5</w:t>
+              <w:t>28.0</w:t>
             </w:r>
           </w:p>
         </w:tc>
@@ -873,7 +873,7 @@
           </w:tcPr>
           <w:p>
             <w:r>
-              <w:t>56.8</w:t>
+              <w:t>46.8</w:t>
             </w:r>
           </w:p>
         </w:tc>
@@ -883,7 +883,7 @@
           </w:tcPr>
           <w:p>
             <w:r>
-              <w:t>645</w:t>
+              <w:t>1002</w:t>
             </w:r>
           </w:p>
         </w:tc>
@@ -895,7 +895,7 @@
           </w:tcPr>
           <w:p>
             <w:r>
-              <w:t>2026-06-29 23:21:15</w:t>
+              <w:t>2026-06-30 20:00:57</w:t>
             </w:r>
           </w:p>
         </w:tc>
@@ -905,7 +905,7 @@
           </w:tcPr>
           <w:p>
             <w:r>
-              <w:t>5</w:t>
+              <w:t>24</w:t>
             </w:r>
           </w:p>
         </w:tc>
@@ -915,7 +915,7 @@
           </w:tcPr>
           <w:p>
             <w:r>
-              <w:t>67.1</w:t>
+              <w:t>37.2</w:t>
             </w:r>
           </w:p>
         </w:tc>
@@ -925,7 +925,7 @@
           </w:tcPr>
           <w:p>
             <w:r>
-              <w:t>75.6</w:t>
+              <w:t>77.0</w:t>
             </w:r>
           </w:p>
         </w:tc>
@@ -935,7 +935,7 @@
           </w:tcPr>
           <w:p>
             <w:r>
-              <w:t>44.5</w:t>
+              <w:t>28.0</w:t>
             </w:r>
           </w:p>
         </w:tc>
@@ -945,7 +945,7 @@
           </w:tcPr>
           <w:p>
             <w:r>
-              <w:t>63.6</w:t>
+              <w:t>44.9</w:t>
             </w:r>
           </w:p>
         </w:tc>
@@ -955,7 +955,7 @@
           </w:tcPr>
           <w:p>
             <w:r>
-              <w:t>711</w:t>
+              <w:t>1051</w:t>
             </w:r>
           </w:p>
         </w:tc>
@@ -967,7 +967,7 @@
           </w:tcPr>
           <w:p>
             <w:r>
-              <w:t>2026-06-29 23:32:15</w:t>
+              <w:t>2026-06-30 20:30:57</w:t>
             </w:r>
           </w:p>
         </w:tc>
@@ -977,7 +977,7 @@
           </w:tcPr>
           <w:p>
             <w:r>
-              <w:t>5</w:t>
+              <w:t>24</w:t>
             </w:r>
           </w:p>
         </w:tc>
@@ -987,7 +987,7 @@
           </w:tcPr>
           <w:p>
             <w:r>
-              <w:t>62.6</w:t>
+              <w:t>37.2</w:t>
             </w:r>
           </w:p>
         </w:tc>
@@ -997,7 +997,7 @@
           </w:tcPr>
           <w:p>
             <w:r>
-              <w:t>75.8</w:t>
+              <w:t>76.9</w:t>
             </w:r>
           </w:p>
         </w:tc>
@@ -1007,7 +1007,7 @@
           </w:tcPr>
           <w:p>
             <w:r>
-              <w:t>44.5</w:t>
+              <w:t>28.0</w:t>
             </w:r>
           </w:p>
         </w:tc>
@@ -1017,7 +1017,7 @@
           </w:tcPr>
           <w:p>
             <w:r>
-              <w:t>61.4</w:t>
+              <w:t>44.8</w:t>
             </w:r>
           </w:p>
         </w:tc>
@@ -1027,7 +1027,7 @@
           </w:tcPr>
           <w:p>
             <w:r>
-              <w:t>755</w:t>
+              <w:t>1171</w:t>
             </w:r>
           </w:p>
         </w:tc>
@@ -1039,7 +1039,7 @@
           </w:tcPr>
           <w:p>
             <w:r>
-              <w:t>2026-06-29 23:48:04</w:t>
+              <w:t>2026-06-30 21:01:10</w:t>
             </w:r>
           </w:p>
         </w:tc>
@@ -1049,7 +1049,7 @@
           </w:tcPr>
           <w:p>
             <w:r>
-              <w:t>5</w:t>
+              <w:t>24</w:t>
             </w:r>
           </w:p>
         </w:tc>
@@ -1059,7 +1059,7 @@
           </w:tcPr>
           <w:p>
             <w:r>
-              <w:t>67.1</w:t>
+              <w:t>37.2</w:t>
             </w:r>
           </w:p>
         </w:tc>
@@ -1069,7 +1069,7 @@
           </w:tcPr>
           <w:p>
             <w:r>
-              <w:t>76.0</w:t>
+              <w:t>76.8</w:t>
             </w:r>
           </w:p>
         </w:tc>
@@ -1079,7 +1079,7 @@
           </w:tcPr>
           <w:p>
             <w:r>
-              <w:t>44.5</w:t>
+              <w:t>28.0</w:t>
             </w:r>
           </w:p>
         </w:tc>
@@ -1089,7 +1089,7 @@
           </w:tcPr>
           <w:p>
             <w:r>
-              <w:t>63.7</w:t>
+              <w:t>44.8</w:t>
             </w:r>
           </w:p>
         </w:tc>
@@ -1099,7 +1099,7 @@
           </w:tcPr>
           <w:p>
             <w:r>
-              <w:t>1</w:t>
+              <w:t>43</w:t>
             </w:r>
           </w:p>
         </w:tc>
@@ -1111,7 +1111,7 @@
           </w:tcPr>
           <w:p>
             <w:r>
-              <w:t>2026-06-30 00:02:03</w:t>
+              <w:t>2026-06-30 21:31:10</w:t>
             </w:r>
           </w:p>
         </w:tc>
@@ -1121,7 +1121,7 @@
           </w:tcPr>
           <w:p>
             <w:r>
-              <w:t>6</w:t>
+              <w:t>24</w:t>
             </w:r>
           </w:p>
         </w:tc>
@@ -1131,7 +1131,7 @@
           </w:tcPr>
           <w:p>
             <w:r>
-              <w:t>52.2</w:t>
+              <w:t>37.2</w:t>
             </w:r>
           </w:p>
         </w:tc>
@@ -1141,7 +1141,7 @@
           </w:tcPr>
           <w:p>
             <w:r>
-              <w:t>76.2</w:t>
+              <w:t>76.8</w:t>
             </w:r>
           </w:p>
         </w:tc>
@@ -1161,7 +1161,7 @@
           </w:tcPr>
           <w:p>
             <w:r>
-              <w:t>52.2</w:t>
+              <w:t>44.8</w:t>
             </w:r>
           </w:p>
         </w:tc>
@@ -1171,7 +1171,7 @@
           </w:tcPr>
           <w:p>
             <w:r>
-              <w:t>55</w:t>
+              <w:t>163</w:t>
             </w:r>
           </w:p>
         </w:tc>
@@ -1183,7 +1183,7 @@
           </w:tcPr>
           <w:p>
             <w:r>
-              <w:t>2026-06-30 00:19:33</w:t>
+              <w:t>2026-06-30 22:01:17</w:t>
             </w:r>
           </w:p>
         </w:tc>
@@ -1193,7 +1193,7 @@
           </w:tcPr>
           <w:p>
             <w:r>
-              <w:t>6</w:t>
+              <w:t>24</w:t>
             </w:r>
           </w:p>
         </w:tc>
@@ -1203,7 +1203,7 @@
           </w:tcPr>
           <w:p>
             <w:r>
-              <w:t>48.8</w:t>
+              <w:t>37.2</w:t>
             </w:r>
           </w:p>
         </w:tc>
@@ -1213,7 +1213,7 @@
           </w:tcPr>
           <w:p>
             <w:r>
-              <w:t>76.3</w:t>
+              <w:t>76.8</w:t>
             </w:r>
           </w:p>
         </w:tc>
@@ -1233,7 +1233,7 @@
           </w:tcPr>
           <w:p>
             <w:r>
-              <w:t>50.5</w:t>
+              <w:t>44.8</w:t>
             </w:r>
           </w:p>
         </w:tc>
@@ -1243,7 +1243,7 @@
           </w:tcPr>
           <w:p>
             <w:r>
-              <w:t>125</w:t>
+              <w:t>283</w:t>
             </w:r>
           </w:p>
         </w:tc>
@@ -1255,7 +1255,7 @@
           </w:tcPr>
           <w:p>
             <w:r>
-              <w:t>2026-06-30 00:30:16</w:t>
+              <w:t>2026-06-30 22:31:33</w:t>
             </w:r>
           </w:p>
         </w:tc>
@@ -1265,7 +1265,7 @@
           </w:tcPr>
           <w:p>
             <w:r>
-              <w:t>6</w:t>
+              <w:t>24</w:t>
             </w:r>
           </w:p>
         </w:tc>
@@ -1275,7 +1275,7 @@
           </w:tcPr>
           <w:p>
             <w:r>
-              <w:t>38.8</w:t>
+              <w:t>37.2</w:t>
             </w:r>
           </w:p>
         </w:tc>
@@ -1285,7 +1285,7 @@
           </w:tcPr>
           <w:p>
             <w:r>
-              <w:t>61.0</w:t>
+              <w:t>76.8</w:t>
             </w:r>
           </w:p>
         </w:tc>
@@ -1305,7 +1305,7 @@
           </w:tcPr>
           <w:p>
             <w:r>
-              <w:t>41.6</w:t>
+              <w:t>44.8</w:t>
             </w:r>
           </w:p>
         </w:tc>
@@ -1315,7 +1315,7 @@
           </w:tcPr>
           <w:p>
             <w:r>
-              <w:t>26</w:t>
+              <w:t>404</w:t>
             </w:r>
           </w:p>
         </w:tc>
@@ -1327,7 +1327,7 @@
           </w:tcPr>
           <w:p>
             <w:r>
-              <w:t>2026-06-30 01:00:15</w:t>
+              <w:t>2026-06-30 23:03:06</w:t>
             </w:r>
           </w:p>
         </w:tc>
@@ -1337,7 +1337,7 @@
           </w:tcPr>
           <w:p>
             <w:r>
-              <w:t>7</w:t>
+              <w:t>24</w:t>
             </w:r>
           </w:p>
         </w:tc>
@@ -1347,7 +1347,7 @@
           </w:tcPr>
           <w:p>
             <w:r>
-              <w:t>28.9</w:t>
+              <w:t>37.2</w:t>
             </w:r>
           </w:p>
         </w:tc>
@@ -1357,7 +1357,7 @@
           </w:tcPr>
           <w:p>
             <w:r>
-              <w:t>61.2</w:t>
+              <w:t>76.8</w:t>
             </w:r>
           </w:p>
         </w:tc>
@@ -1377,7 +1377,7 @@
           </w:tcPr>
           <w:p>
             <w:r>
-              <w:t>36.8</w:t>
+              <w:t>44.8</w:t>
             </w:r>
           </w:p>
         </w:tc>
@@ -1387,7 +1387,7 @@
           </w:tcPr>
           <w:p>
             <w:r>
-              <w:t>146</w:t>
+              <w:t>1</w:t>
             </w:r>
           </w:p>
         </w:tc>
@@ -1399,7 +1399,7 @@
           </w:tcPr>
           <w:p>
             <w:r>
-              <w:t>2026-06-30 01:18:15</w:t>
+              <w:t>2026-06-30 23:33:06</w:t>
             </w:r>
           </w:p>
         </w:tc>
@@ -1409,7 +1409,7 @@
           </w:tcPr>
           <w:p>
             <w:r>
-              <w:t>8</w:t>
+              <w:t>24</w:t>
             </w:r>
           </w:p>
         </w:tc>
@@ -1419,7 +1419,7 @@
           </w:tcPr>
           <w:p>
             <w:r>
-              <w:t>39.3</w:t>
+              <w:t>37.2</w:t>
             </w:r>
           </w:p>
         </w:tc>
@@ -1429,7 +1429,7 @@
           </w:tcPr>
           <w:p>
             <w:r>
-              <w:t>61.6</w:t>
+              <w:t>76.8</w:t>
             </w:r>
           </w:p>
         </w:tc>
@@ -1449,7 +1449,7 @@
           </w:tcPr>
           <w:p>
             <w:r>
-              <w:t>42.0</w:t>
+              <w:t>44.8</w:t>
             </w:r>
           </w:p>
         </w:tc>
@@ -1459,7 +1459,7 @@
           </w:tcPr>
           <w:p>
             <w:r>
-              <w:t>218</w:t>
+              <w:t>121</w:t>
             </w:r>
           </w:p>
         </w:tc>
@@ -1471,7 +1471,7 @@
           </w:tcPr>
           <w:p>
             <w:r>
-              <w:t>2026-06-30 01:48:30</w:t>
+              <w:t>2026-07-01 00:03:06</w:t>
             </w:r>
           </w:p>
         </w:tc>
@@ -1481,7 +1481,7 @@
           </w:tcPr>
           <w:p>
             <w:r>
-              <w:t>8</w:t>
+              <w:t>24</w:t>
             </w:r>
           </w:p>
         </w:tc>
@@ -1491,7 +1491,7 @@
           </w:tcPr>
           <w:p>
             <w:r>
-              <w:t>39.3</w:t>
+              <w:t>37.2</w:t>
             </w:r>
           </w:p>
         </w:tc>
@@ -1501,7 +1501,7 @@
           </w:tcPr>
           <w:p>
             <w:r>
-              <w:t>61.6</w:t>
+              <w:t>76.8</w:t>
             </w:r>
           </w:p>
         </w:tc>
@@ -1521,7 +1521,7 @@
           </w:tcPr>
           <w:p>
             <w:r>
-              <w:t>42.0</w:t>
+              <w:t>44.8</w:t>
             </w:r>
           </w:p>
         </w:tc>
@@ -1531,7 +1531,7 @@
           </w:tcPr>
           <w:p>
             <w:r>
-              <w:t>339</w:t>
+              <w:t>241</w:t>
             </w:r>
           </w:p>
         </w:tc>
@@ -1543,7 +1543,7 @@
           </w:tcPr>
           <w:p>
             <w:r>
-              <w:t>2026-06-30 02:18:44</w:t>
+              <w:t>2026-07-01 00:33:08</w:t>
             </w:r>
           </w:p>
         </w:tc>
@@ -1553,7 +1553,7 @@
           </w:tcPr>
           <w:p>
             <w:r>
-              <w:t>8</w:t>
+              <w:t>24</w:t>
             </w:r>
           </w:p>
         </w:tc>
@@ -1563,7 +1563,7 @@
           </w:tcPr>
           <w:p>
             <w:r>
-              <w:t>39.3</w:t>
+              <w:t>37.2</w:t>
             </w:r>
           </w:p>
         </w:tc>
@@ -1573,7 +1573,7 @@
           </w:tcPr>
           <w:p>
             <w:r>
-              <w:t>61.6</w:t>
+              <w:t>76.8</w:t>
             </w:r>
           </w:p>
         </w:tc>
@@ -1593,7 +1593,7 @@
           </w:tcPr>
           <w:p>
             <w:r>
-              <w:t>42.0</w:t>
+              <w:t>44.8</w:t>
             </w:r>
           </w:p>
         </w:tc>
@@ -1603,7 +1603,7 @@
           </w:tcPr>
           <w:p>
             <w:r>
-              <w:t>460</w:t>
+              <w:t>361</w:t>
             </w:r>
           </w:p>
         </w:tc>
@@ -1615,7 +1615,7 @@
           </w:tcPr>
           <w:p>
             <w:r>
-              <w:t>2026-06-30 02:32:46</w:t>
+              <w:t>2026-07-01 01:03:22</w:t>
             </w:r>
           </w:p>
         </w:tc>
@@ -1625,7 +1625,7 @@
           </w:tcPr>
           <w:p>
             <w:r>
-              <w:t>9</w:t>
+              <w:t>24</w:t>
             </w:r>
           </w:p>
         </w:tc>
@@ -1635,7 +1635,7 @@
           </w:tcPr>
           <w:p>
             <w:r>
-              <w:t>30.7</w:t>
+              <w:t>37.2</w:t>
             </w:r>
           </w:p>
         </w:tc>
@@ -1645,7 +1645,7 @@
           </w:tcPr>
           <w:p>
             <w:r>
-              <w:t>61.7</w:t>
+              <w:t>76.8</w:t>
             </w:r>
           </w:p>
         </w:tc>
@@ -1665,7 +1665,7 @@
           </w:tcPr>
           <w:p>
             <w:r>
-              <w:t>37.8</w:t>
+              <w:t>44.8</w:t>
             </w:r>
           </w:p>
         </w:tc>
@@ -1675,7 +1675,7 @@
           </w:tcPr>
           <w:p>
             <w:r>
-              <w:t>516</w:t>
+              <w:t>482</w:t>
             </w:r>
           </w:p>
         </w:tc>
@@ -1687,7 +1687,7 @@
           </w:tcPr>
           <w:p>
             <w:r>
-              <w:t>2026-06-30 03:03:00</w:t>
+              <w:t>2026-07-01 01:33:37</w:t>
             </w:r>
           </w:p>
         </w:tc>
@@ -1697,7 +1697,7 @@
           </w:tcPr>
           <w:p>
             <w:r>
-              <w:t>9</w:t>
+              <w:t>24</w:t>
             </w:r>
           </w:p>
         </w:tc>
@@ -1707,7 +1707,7 @@
           </w:tcPr>
           <w:p>
             <w:r>
-              <w:t>30.7</w:t>
+              <w:t>37.2</w:t>
             </w:r>
           </w:p>
         </w:tc>
@@ -1717,7 +1717,7 @@
           </w:tcPr>
           <w:p>
             <w:r>
-              <w:t>61.8</w:t>
+              <w:t>76.8</w:t>
             </w:r>
           </w:p>
         </w:tc>
@@ -1737,7 +1737,7 @@
           </w:tcPr>
           <w:p>
             <w:r>
-              <w:t>37.8</w:t>
+              <w:t>44.8</w:t>
             </w:r>
           </w:p>
         </w:tc>
@@ -1747,7 +1747,7 @@
           </w:tcPr>
           <w:p>
             <w:r>
-              <w:t>637</w:t>
+              <w:t>603</w:t>
             </w:r>
           </w:p>
         </w:tc>
@@ -1768,7 +1768,7 @@
     </w:p>
     <w:p>
       <w:r>
-        <w:t>Section score: 30.7 / 100  (Grade: F)</w:t>
+        <w:t>Section score: 37.2 / 100  (Grade: F)</w:t>
       </w:r>
     </w:p>
     <w:p>
@@ -1879,7 +1879,7 @@
           </w:tcPr>
           <w:p>
             <w:r>
-              <w:t>37.1</w:t>
+              <w:t>50.1</w:t>
             </w:r>
           </w:p>
         </w:tc>
@@ -1889,7 +1889,7 @@
           </w:tcPr>
           <w:p>
             <w:r>
-              <w:t>5.6</w:t>
+              <w:t>7.5</w:t>
             </w:r>
           </w:p>
         </w:tc>
@@ -1911,7 +1911,7 @@
           </w:tcPr>
           <w:p>
             <w:r>
-              <w:t>5.2</w:t>
+              <w:t>37.6</w:t>
             </w:r>
           </w:p>
         </w:tc>
@@ -1921,7 +1921,7 @@
           </w:tcPr>
           <w:p>
             <w:r>
-              <w:t>0.8</w:t>
+              <w:t>5.6</w:t>
             </w:r>
           </w:p>
         </w:tc>
@@ -1943,7 +1943,7 @@
           </w:tcPr>
           <w:p>
             <w:r>
-              <w:t>28.1</w:t>
+              <w:t>0.0</w:t>
             </w:r>
           </w:p>
         </w:tc>
@@ -1953,7 +1953,7 @@
           </w:tcPr>
           <w:p>
             <w:r>
-              <w:t>5.6</w:t>
+              <w:t>0.0</w:t>
             </w:r>
           </w:p>
         </w:tc>
@@ -1975,7 +1975,7 @@
           </w:tcPr>
           <w:p>
             <w:r>
-              <w:t>30.0</w:t>
+              <w:t>79.9</w:t>
             </w:r>
           </w:p>
         </w:tc>
@@ -1985,7 +1985,7 @@
           </w:tcPr>
           <w:p>
             <w:r>
-              <w:t>1.5</w:t>
+              <w:t>4.0</w:t>
             </w:r>
           </w:p>
         </w:tc>
@@ -2039,7 +2039,7 @@
           </w:tcPr>
           <w:p>
             <w:r>
-              <w:t>8.9</w:t>
+              <w:t>20.0</w:t>
             </w:r>
           </w:p>
         </w:tc>
@@ -2049,7 +2049,7 @@
           </w:tcPr>
           <w:p>
             <w:r>
-              <w:t>2.2</w:t>
+              <w:t>5.0</w:t>
             </w:r>
           </w:p>
         </w:tc>
@@ -2090,7 +2090,7 @@
           </w:tcPr>
           <w:p>
             <w:r>
-              <w:t>$478.11</w:t>
+              <w:t>$93.49</w:t>
             </w:r>
           </w:p>
         </w:tc>
@@ -2112,7 +2112,7 @@
           </w:tcPr>
           <w:p>
             <w:r>
-              <w:t>-4.38%</w:t>
+              <w:t>-81.30%</w:t>
             </w:r>
           </w:p>
         </w:tc>
@@ -2134,7 +2134,7 @@
           </w:tcPr>
           <w:p>
             <w:r>
-              <w:t>$-6.46</w:t>
+              <w:t>$0.07</w:t>
             </w:r>
           </w:p>
         </w:tc>
@@ -2156,7 +2156,7 @@
           </w:tcPr>
           <w:p>
             <w:r>
-              <w:t>$4.23</w:t>
+              <w:t>$—</w:t>
             </w:r>
           </w:p>
         </w:tc>
@@ -2178,7 +2178,7 @@
           </w:tcPr>
           <w:p>
             <w:r>
-              <w:t>0.4444</w:t>
+              <w:t>0.5000</w:t>
             </w:r>
           </w:p>
         </w:tc>
@@ -2200,7 +2200,7 @@
           </w:tcPr>
           <w:p>
             <w:r>
-              <w:t>— / 0.4444</w:t>
+              <w:t>— / 0.5000</w:t>
             </w:r>
           </w:p>
         </w:tc>
@@ -2222,7 +2222,7 @@
           </w:tcPr>
           <w:p>
             <w:r>
-              <w:t>0.7415</w:t>
+              <w:t>1.0011</w:t>
             </w:r>
           </w:p>
         </w:tc>
@@ -2244,7 +2244,7 @@
           </w:tcPr>
           <w:p>
             <w:r>
-              <w:t>9 / 9</w:t>
+              <w:t>24 / 24</w:t>
             </w:r>
           </w:p>
         </w:tc>
@@ -2266,7 +2266,7 @@
           </w:tcPr>
           <w:p>
             <w:r>
-              <w:t>$-0.72</w:t>
+              <w:t>$0.00</w:t>
             </w:r>
           </w:p>
         </w:tc>
@@ -2304,7 +2304,7 @@
     </w:p>
     <w:p>
       <w:r>
-        <w:t>Realized $-19.6529 · Executed 118 · Settled 117 · Wins 79 · Losses 38 · Kelly active False</w:t>
+        <w:t>Realized $-406.5719 · Executed 128 · Settled 127 · Wins 79 · Losses 48 · Kelly active False</w:t>
       </w:r>
     </w:p>
     <w:p>
@@ -2397,7 +2397,7 @@
           </w:tcPr>
           <w:p>
             <w:r>
-              <w:t>1</w:t>
+              <w:t>5</w:t>
             </w:r>
           </w:p>
         </w:tc>
@@ -2427,7 +2427,7 @@
           </w:tcPr>
           <w:p>
             <w:r>
-              <w:t>$-50.00</w:t>
+              <w:t>$-42.79</w:t>
             </w:r>
           </w:p>
         </w:tc>
@@ -2449,7 +2449,7 @@
           </w:tcPr>
           <w:p>
             <w:r>
-              <w:t>5</w:t>
+              <w:t>11</w:t>
             </w:r>
           </w:p>
         </w:tc>
@@ -2459,7 +2459,7 @@
           </w:tcPr>
           <w:p>
             <w:r>
-              <w:t>0.2000</w:t>
+              <w:t>0.0909</w:t>
             </w:r>
           </w:p>
         </w:tc>
@@ -2469,7 +2469,7 @@
           </w:tcPr>
           <w:p>
             <w:r>
-              <w:t>1.8695</w:t>
+              <w:t>0.8840</w:t>
             </w:r>
           </w:p>
         </w:tc>
@@ -2479,7 +2479,7 @@
           </w:tcPr>
           <w:p>
             <w:r>
-              <w:t>$34.78</w:t>
+              <w:t>$-4.46</w:t>
             </w:r>
           </w:p>
         </w:tc>
@@ -2732,7 +2732,7 @@
           </w:tcPr>
           <w:p>
             <w:r>
-              <w:t>parent 645938</w:t>
+              <w:t>parent 648470</w:t>
             </w:r>
           </w:p>
         </w:tc>
@@ -2762,7 +2762,7 @@
           </w:tcPr>
           <w:p>
             <w:r>
-              <w:t>0.640</w:t>
+              <w:t>0.171</w:t>
             </w:r>
           </w:p>
         </w:tc>
@@ -2794,7 +2794,7 @@
           </w:tcPr>
           <w:p>
             <w:r>
-              <w:t>parent 645916</w:t>
+              <w:t>parent 648309</w:t>
             </w:r>
           </w:p>
         </w:tc>
@@ -2824,7 +2824,7 @@
           </w:tcPr>
           <w:p>
             <w:r>
-              <w:t>0.133</w:t>
+              <w:t>0.110</w:t>
             </w:r>
           </w:p>
         </w:tc>
@@ -2856,7 +2856,7 @@
           </w:tcPr>
           <w:p>
             <w:r>
-              <w:t>parent 645871</w:t>
+              <w:t>parent 648108</w:t>
             </w:r>
           </w:p>
         </w:tc>
@@ -2876,7 +2876,7 @@
           </w:tcPr>
           <w:p>
             <w:r>
-              <w:t>Yes</w:t>
+              <w:t>No</w:t>
             </w:r>
           </w:p>
         </w:tc>
@@ -2886,7 +2886,7 @@
           </w:tcPr>
           <w:p>
             <w:r>
-              <w:t>0.580</w:t>
+              <w:t>0.172</w:t>
             </w:r>
           </w:p>
         </w:tc>
@@ -2896,7 +2896,7 @@
           </w:tcPr>
           <w:p>
             <w:r>
-              <w:t>$36.21</w:t>
+              <w:t>$-50.00</w:t>
             </w:r>
           </w:p>
         </w:tc>
@@ -2918,7 +2918,7 @@
           </w:tcPr>
           <w:p>
             <w:r>
-              <w:t>parent 645841</w:t>
+              <w:t>parent 648073</w:t>
             </w:r>
           </w:p>
         </w:tc>
@@ -2938,7 +2938,7 @@
           </w:tcPr>
           <w:p>
             <w:r>
-              <w:t>Yes</w:t>
+              <w:t>No</w:t>
             </w:r>
           </w:p>
         </w:tc>
@@ -2948,7 +2948,7 @@
           </w:tcPr>
           <w:p>
             <w:r>
-              <w:t>0.670</w:t>
+              <w:t>0.154</w:t>
             </w:r>
           </w:p>
         </w:tc>
@@ -2958,7 +2958,7 @@
           </w:tcPr>
           <w:p>
             <w:r>
-              <w:t>$24.63</w:t>
+              <w:t>$-27.28</w:t>
             </w:r>
           </w:p>
         </w:tc>
@@ -2968,7 +2968,7 @@
           </w:tcPr>
           <w:p>
             <w:r>
-              <w:t>outcome</w:t>
+              <w:t>heuristic</w:t>
             </w:r>
           </w:p>
         </w:tc>
@@ -2980,7 +2980,7 @@
           </w:tcPr>
           <w:p>
             <w:r>
-              <w:t>parent 645808</w:t>
+              <w:t>parent 648031</w:t>
             </w:r>
           </w:p>
         </w:tc>
@@ -3010,7 +3010,7 @@
           </w:tcPr>
           <w:p>
             <w:r>
-              <w:t>0.594</w:t>
+              <w:t>0.105</w:t>
             </w:r>
           </w:p>
         </w:tc>
@@ -3020,7 +3020,7 @@
           </w:tcPr>
           <w:p>
             <w:r>
-              <w:t>$-50.00</w:t>
+              <w:t>$-35.75</w:t>
             </w:r>
           </w:p>
         </w:tc>
@@ -3030,7 +3030,7 @@
           </w:tcPr>
           <w:p>
             <w:r>
-              <w:t>outcome</w:t>
+              <w:t>heuristic</w:t>
             </w:r>
           </w:p>
         </w:tc>
@@ -3042,7 +3042,7 @@
           </w:tcPr>
           <w:p>
             <w:r>
-              <w:t>parent 645778</w:t>
+              <w:t>parent 648004</w:t>
             </w:r>
           </w:p>
         </w:tc>
@@ -3072,7 +3072,7 @@
           </w:tcPr>
           <w:p>
             <w:r>
-              <w:t>0.610</w:t>
+              <w:t>0.029</w:t>
             </w:r>
           </w:p>
         </w:tc>
@@ -3104,7 +3104,7 @@
           </w:tcPr>
           <w:p>
             <w:r>
-              <w:t>parent 645747</w:t>
+              <w:t>parent 647856</w:t>
             </w:r>
           </w:p>
         </w:tc>
@@ -3134,7 +3134,7 @@
           </w:tcPr>
           <w:p>
             <w:r>
-              <w:t>0.583</w:t>
+              <w:t>0.191</w:t>
             </w:r>
           </w:p>
         </w:tc>
@@ -3144,7 +3144,7 @@
           </w:tcPr>
           <w:p>
             <w:r>
-              <w:t>$-50.00</w:t>
+              <w:t>$-9.94</w:t>
             </w:r>
           </w:p>
         </w:tc>
@@ -3154,7 +3154,7 @@
           </w:tcPr>
           <w:p>
             <w:r>
-              <w:t>outcome</w:t>
+              <w:t>heuristic</w:t>
             </w:r>
           </w:p>
         </w:tc>
@@ -3166,7 +3166,7 @@
           </w:tcPr>
           <w:p>
             <w:r>
-              <w:t>parent 645717</w:t>
+              <w:t>parent 647733</w:t>
             </w:r>
           </w:p>
         </w:tc>
@@ -3196,7 +3196,7 @@
           </w:tcPr>
           <w:p>
             <w:r>
-              <w:t>0.597</w:t>
+              <w:t>0.082</w:t>
             </w:r>
           </w:p>
         </w:tc>
@@ -3206,7 +3206,7 @@
           </w:tcPr>
           <w:p>
             <w:r>
-              <w:t>$-50.00</w:t>
+              <w:t>$-34.61</w:t>
             </w:r>
           </w:p>
         </w:tc>
@@ -3216,7 +3216,7 @@
           </w:tcPr>
           <w:p>
             <w:r>
-              <w:t>outcome</w:t>
+              <w:t>heuristic</w:t>
             </w:r>
           </w:p>
         </w:tc>
@@ -3228,7 +3228,7 @@
           </w:tcPr>
           <w:p>
             <w:r>
-              <w:t>parent 645693</w:t>
+              <w:t>parent 647684</w:t>
             </w:r>
           </w:p>
         </w:tc>
@@ -3258,7 +3258,7 @@
           </w:tcPr>
           <w:p>
             <w:r>
-              <w:t>0.577</w:t>
+              <w:t>0.049</w:t>
             </w:r>
           </w:p>
         </w:tc>
@@ -3268,7 +3268,7 @@
           </w:tcPr>
           <w:p>
             <w:r>
-              <w:t>$-50.00</w:t>
+              <w:t>$-39.82</w:t>
             </w:r>
           </w:p>
         </w:tc>
@@ -3278,7 +3278,7 @@
           </w:tcPr>
           <w:p>
             <w:r>
-              <w:t>outcome</w:t>
+              <w:t>heuristic</w:t>
             </w:r>
           </w:p>
         </w:tc>
@@ -3290,7 +3290,7 @@
           </w:tcPr>
           <w:p>
             <w:r>
-              <w:t>parent 645658</w:t>
+              <w:t>parent 647655</w:t>
             </w:r>
           </w:p>
         </w:tc>
@@ -3320,7 +3320,7 @@
           </w:tcPr>
           <w:p>
             <w:r>
-              <w:t>0.510</w:t>
+              <w:t>0.060</w:t>
             </w:r>
           </w:p>
         </w:tc>
@@ -3330,7 +3330,7 @@
           </w:tcPr>
           <w:p>
             <w:r>
-              <w:t>$-50.00</w:t>
+              <w:t>$-39.51</w:t>
             </w:r>
           </w:p>
         </w:tc>
@@ -3340,7 +3340,7 @@
           </w:tcPr>
           <w:p>
             <w:r>
-              <w:t>outcome</w:t>
+              <w:t>heuristic</w:t>
             </w:r>
           </w:p>
         </w:tc>
@@ -3352,7 +3352,7 @@
           </w:tcPr>
           <w:p>
             <w:r>
-              <w:t>parent 645617</w:t>
+              <w:t>parent 645938</w:t>
             </w:r>
           </w:p>
         </w:tc>
@@ -3372,7 +3372,7 @@
           </w:tcPr>
           <w:p>
             <w:r>
-              <w:t>Yes</w:t>
+              <w:t>No</w:t>
             </w:r>
           </w:p>
         </w:tc>
@@ -3382,7 +3382,7 @@
           </w:tcPr>
           <w:p>
             <w:r>
-              <w:t>0.550</w:t>
+              <w:t>0.640</w:t>
             </w:r>
           </w:p>
         </w:tc>
@@ -3392,7 +3392,7 @@
           </w:tcPr>
           <w:p>
             <w:r>
-              <w:t>$40.91</w:t>
+              <w:t>$-50.00</w:t>
             </w:r>
           </w:p>
         </w:tc>
@@ -3414,7 +3414,7 @@
           </w:tcPr>
           <w:p>
             <w:r>
-              <w:t>parent 645583</w:t>
+              <w:t>parent 645916</w:t>
             </w:r>
           </w:p>
         </w:tc>
@@ -3434,7 +3434,7 @@
           </w:tcPr>
           <w:p>
             <w:r>
-              <w:t>Yes</w:t>
+              <w:t>No</w:t>
             </w:r>
           </w:p>
         </w:tc>
@@ -3444,7 +3444,7 @@
           </w:tcPr>
           <w:p>
             <w:r>
-              <w:t>0.618</w:t>
+              <w:t>0.133</w:t>
             </w:r>
           </w:p>
         </w:tc>
@@ -3454,7 +3454,7 @@
           </w:tcPr>
           <w:p>
             <w:r>
-              <w:t>$30.85</w:t>
+              <w:t>$-50.00</w:t>
             </w:r>
           </w:p>
         </w:tc>
@@ -3476,7 +3476,7 @@
           </w:tcPr>
           <w:p>
             <w:r>
-              <w:t>parent 645559</w:t>
+              <w:t>parent 645871</w:t>
             </w:r>
           </w:p>
         </w:tc>
@@ -3496,7 +3496,7 @@
           </w:tcPr>
           <w:p>
             <w:r>
-              <w:t>No</w:t>
+              <w:t>Yes</w:t>
             </w:r>
           </w:p>
         </w:tc>
@@ -3506,7 +3506,7 @@
           </w:tcPr>
           <w:p>
             <w:r>
-              <w:t>0.110</w:t>
+              <w:t>0.580</w:t>
             </w:r>
           </w:p>
         </w:tc>
@@ -3516,7 +3516,7 @@
           </w:tcPr>
           <w:p>
             <w:r>
-              <w:t>$-50.00</w:t>
+              <w:t>$36.21</w:t>
             </w:r>
           </w:p>
         </w:tc>
@@ -3538,7 +3538,7 @@
           </w:tcPr>
           <w:p>
             <w:r>
-              <w:t>parent 645526</w:t>
+              <w:t>parent 645841</w:t>
             </w:r>
           </w:p>
         </w:tc>
@@ -3568,7 +3568,7 @@
           </w:tcPr>
           <w:p>
             <w:r>
-              <w:t>0.530</w:t>
+              <w:t>0.670</w:t>
             </w:r>
           </w:p>
         </w:tc>
@@ -3578,7 +3578,7 @@
           </w:tcPr>
           <w:p>
             <w:r>
-              <w:t>$44.34</w:t>
+              <w:t>$24.63</w:t>
             </w:r>
           </w:p>
         </w:tc>
@@ -3600,7 +3600,7 @@
           </w:tcPr>
           <w:p>
             <w:r>
-              <w:t>parent 645484</w:t>
+              <w:t>parent 645808</w:t>
             </w:r>
           </w:p>
         </w:tc>
@@ -3630,7 +3630,7 @@
           </w:tcPr>
           <w:p>
             <w:r>
-              <w:t>0.315</w:t>
+              <w:t>0.594</w:t>
             </w:r>
           </w:p>
         </w:tc>
@@ -3662,7 +3662,7 @@
           </w:tcPr>
           <w:p>
             <w:r>
-              <w:t>parent 645429</w:t>
+              <w:t>parent 645778</w:t>
             </w:r>
           </w:p>
         </w:tc>
@@ -3682,7 +3682,7 @@
           </w:tcPr>
           <w:p>
             <w:r>
-              <w:t>Yes</w:t>
+              <w:t>No</w:t>
             </w:r>
           </w:p>
         </w:tc>
@@ -3692,7 +3692,7 @@
           </w:tcPr>
           <w:p>
             <w:r>
-              <w:t>0.582</w:t>
+              <w:t>0.610</w:t>
             </w:r>
           </w:p>
         </w:tc>
@@ -3702,7 +3702,7 @@
           </w:tcPr>
           <w:p>
             <w:r>
-              <w:t>$35.85</w:t>
+              <w:t>$-50.00</w:t>
             </w:r>
           </w:p>
         </w:tc>
@@ -3724,7 +3724,7 @@
           </w:tcPr>
           <w:p>
             <w:r>
-              <w:t>parent 645401</w:t>
+              <w:t>parent 645747</w:t>
             </w:r>
           </w:p>
         </w:tc>
@@ -3754,7 +3754,7 @@
           </w:tcPr>
           <w:p>
             <w:r>
-              <w:t>0.240</w:t>
+              <w:t>0.583</w:t>
             </w:r>
           </w:p>
         </w:tc>
@@ -3786,7 +3786,7 @@
           </w:tcPr>
           <w:p>
             <w:r>
-              <w:t>parent 645381</w:t>
+              <w:t>parent 645717</w:t>
             </w:r>
           </w:p>
         </w:tc>
@@ -3806,7 +3806,7 @@
           </w:tcPr>
           <w:p>
             <w:r>
-              <w:t>Yes</w:t>
+              <w:t>No</w:t>
             </w:r>
           </w:p>
         </w:tc>
@@ -3816,7 +3816,7 @@
           </w:tcPr>
           <w:p>
             <w:r>
-              <w:t>0.580</w:t>
+              <w:t>0.597</w:t>
             </w:r>
           </w:p>
         </w:tc>
@@ -3826,7 +3826,7 @@
           </w:tcPr>
           <w:p>
             <w:r>
-              <w:t>$36.21</w:t>
+              <w:t>$-50.00</w:t>
             </w:r>
           </w:p>
         </w:tc>
@@ -3848,7 +3848,7 @@
           </w:tcPr>
           <w:p>
             <w:r>
-              <w:t>parent 645340</w:t>
+              <w:t>parent 645693</w:t>
             </w:r>
           </w:p>
         </w:tc>
@@ -3878,7 +3878,7 @@
           </w:tcPr>
           <w:p>
             <w:r>
-              <w:t>0.538</w:t>
+              <w:t>0.577</w:t>
             </w:r>
           </w:p>
         </w:tc>
@@ -3910,7 +3910,7 @@
           </w:tcPr>
           <w:p>
             <w:r>
-              <w:t>parent 645281</w:t>
+              <w:t>parent 645658</w:t>
             </w:r>
           </w:p>
         </w:tc>
@@ -3930,7 +3930,7 @@
           </w:tcPr>
           <w:p>
             <w:r>
-              <w:t>Yes</w:t>
+              <w:t>No</w:t>
             </w:r>
           </w:p>
         </w:tc>
@@ -3940,7 +3940,7 @@
           </w:tcPr>
           <w:p>
             <w:r>
-              <w:t>0.118</w:t>
+              <w:t>0.510</w:t>
             </w:r>
           </w:p>
         </w:tc>
@@ -3950,7 +3950,7 @@
           </w:tcPr>
           <w:p>
             <w:r>
-              <w:t>$373.90</w:t>
+              <w:t>$-50.00</w:t>
             </w:r>
           </w:p>
         </w:tc>
@@ -3976,7 +3976,7 @@
     </w:p>
     <w:p>
       <w:r>
-        <w:t>Executed 1 · Settled 1 · Profit $4.2254</w:t>
+        <w:t>Executed 0 · Settled 0 · Profit $0</w:t>
       </w:r>
     </w:p>
     <w:p>
@@ -4069,7 +4069,7 @@
           </w:tcPr>
           <w:p>
             <w:r>
-              <w:t>0.530</w:t>
+              <w:t>0.480</w:t>
             </w:r>
           </w:p>
         </w:tc>
@@ -4121,7 +4121,7 @@
           </w:tcPr>
           <w:p>
             <w:r>
-              <w:t>0.510</w:t>
+              <w:t>0.500</w:t>
             </w:r>
           </w:p>
         </w:tc>
@@ -4131,7 +4131,7 @@
           </w:tcPr>
           <w:p>
             <w:r>
-              <w:t>down</w:t>
+              <w:t>up</w:t>
             </w:r>
           </w:p>
         </w:tc>
@@ -4141,7 +4141,7 @@
           </w:tcPr>
           <w:p>
             <w:r>
-              <w:t>Yes</w:t>
+              <w:t>No</w:t>
             </w:r>
           </w:p>
         </w:tc>
@@ -4151,7 +4151,7 @@
           </w:tcPr>
           <w:p>
             <w:r>
-              <w:t>$4.80</w:t>
+              <w:t>$-5.00</w:t>
             </w:r>
           </w:p>
         </w:tc>
@@ -4173,7 +4173,7 @@
           </w:tcPr>
           <w:p>
             <w:r>
-              <w:t>0.490</w:t>
+              <w:t>0.530</w:t>
             </w:r>
           </w:p>
         </w:tc>
@@ -4277,7 +4277,7 @@
           </w:tcPr>
           <w:p>
             <w:r>
-              <w:t>0.560</w:t>
+              <w:t>0.470</w:t>
             </w:r>
           </w:p>
         </w:tc>
@@ -4287,7 +4287,7 @@
           </w:tcPr>
           <w:p>
             <w:r>
-              <w:t>down</w:t>
+              <w:t>up</w:t>
             </w:r>
           </w:p>
         </w:tc>
@@ -4297,7 +4297,7 @@
           </w:tcPr>
           <w:p>
             <w:r>
-              <w:t>Yes</w:t>
+              <w:t>No</w:t>
             </w:r>
           </w:p>
         </w:tc>
@@ -4307,7 +4307,7 @@
           </w:tcPr>
           <w:p>
             <w:r>
-              <w:t>$3.93</w:t>
+              <w:t>$-5.00</w:t>
             </w:r>
           </w:p>
         </w:tc>
@@ -4381,7 +4381,7 @@
           </w:tcPr>
           <w:p>
             <w:r>
-              <w:t>0.510</w:t>
+              <w:t>0.470</w:t>
             </w:r>
           </w:p>
         </w:tc>
@@ -4411,7 +4411,7 @@
           </w:tcPr>
           <w:p>
             <w:r>
-              <w:t>$4.80</w:t>
+              <w:t>$5.64</w:t>
             </w:r>
           </w:p>
         </w:tc>
@@ -4433,7 +4433,7 @@
           </w:tcPr>
           <w:p>
             <w:r>
-              <w:t>0.530</w:t>
+              <w:t>0.470</w:t>
             </w:r>
           </w:p>
         </w:tc>
@@ -4443,7 +4443,7 @@
           </w:tcPr>
           <w:p>
             <w:r>
-              <w:t>up</w:t>
+              <w:t>down</w:t>
             </w:r>
           </w:p>
         </w:tc>
@@ -4453,7 +4453,7 @@
           </w:tcPr>
           <w:p>
             <w:r>
-              <w:t>No</w:t>
+              <w:t>Yes</w:t>
             </w:r>
           </w:p>
         </w:tc>
@@ -4463,7 +4463,7 @@
           </w:tcPr>
           <w:p>
             <w:r>
-              <w:t>$-5.00</w:t>
+              <w:t>$5.64</w:t>
             </w:r>
           </w:p>
         </w:tc>
@@ -4495,6 +4495,110 @@
           </w:tcPr>
           <w:p>
             <w:r>
+              <w:t>down</w:t>
+            </w:r>
+          </w:p>
+        </w:tc>
+        <w:tc>
+          <w:tcPr>
+            <w:tcW w:type="dxa" w:w="1728"/>
+          </w:tcPr>
+          <w:p>
+            <w:r>
+              <w:t>Yes</w:t>
+            </w:r>
+          </w:p>
+        </w:tc>
+        <w:tc>
+          <w:tcPr>
+            <w:tcW w:type="dxa" w:w="1728"/>
+          </w:tcPr>
+          <w:p>
+            <w:r>
+              <w:t>$5.00</w:t>
+            </w:r>
+          </w:p>
+        </w:tc>
+      </w:tr>
+      <w:tr>
+        <w:tc>
+          <w:tcPr>
+            <w:tcW w:type="dxa" w:w="1728"/>
+          </w:tcPr>
+          <w:p>
+            <w:r>
+              <w:t>down</w:t>
+            </w:r>
+          </w:p>
+        </w:tc>
+        <w:tc>
+          <w:tcPr>
+            <w:tcW w:type="dxa" w:w="1728"/>
+          </w:tcPr>
+          <w:p>
+            <w:r>
+              <w:t>0.500</w:t>
+            </w:r>
+          </w:p>
+        </w:tc>
+        <w:tc>
+          <w:tcPr>
+            <w:tcW w:type="dxa" w:w="1728"/>
+          </w:tcPr>
+          <w:p>
+            <w:r>
+              <w:t>down</w:t>
+            </w:r>
+          </w:p>
+        </w:tc>
+        <w:tc>
+          <w:tcPr>
+            <w:tcW w:type="dxa" w:w="1728"/>
+          </w:tcPr>
+          <w:p>
+            <w:r>
+              <w:t>Yes</w:t>
+            </w:r>
+          </w:p>
+        </w:tc>
+        <w:tc>
+          <w:tcPr>
+            <w:tcW w:type="dxa" w:w="1728"/>
+          </w:tcPr>
+          <w:p>
+            <w:r>
+              <w:t>$5.00</w:t>
+            </w:r>
+          </w:p>
+        </w:tc>
+      </w:tr>
+      <w:tr>
+        <w:tc>
+          <w:tcPr>
+            <w:tcW w:type="dxa" w:w="1728"/>
+          </w:tcPr>
+          <w:p>
+            <w:r>
+              <w:t>down</w:t>
+            </w:r>
+          </w:p>
+        </w:tc>
+        <w:tc>
+          <w:tcPr>
+            <w:tcW w:type="dxa" w:w="1728"/>
+          </w:tcPr>
+          <w:p>
+            <w:r>
+              <w:t>0.450</w:t>
+            </w:r>
+          </w:p>
+        </w:tc>
+        <w:tc>
+          <w:tcPr>
+            <w:tcW w:type="dxa" w:w="1728"/>
+          </w:tcPr>
+          <w:p>
+            <w:r>
               <w:t>up</w:t>
             </w:r>
           </w:p>
@@ -4516,6 +4620,214 @@
           <w:p>
             <w:r>
               <w:t>$-5.00</w:t>
+            </w:r>
+          </w:p>
+        </w:tc>
+      </w:tr>
+      <w:tr>
+        <w:tc>
+          <w:tcPr>
+            <w:tcW w:type="dxa" w:w="1728"/>
+          </w:tcPr>
+          <w:p>
+            <w:r>
+              <w:t>down</w:t>
+            </w:r>
+          </w:p>
+        </w:tc>
+        <w:tc>
+          <w:tcPr>
+            <w:tcW w:type="dxa" w:w="1728"/>
+          </w:tcPr>
+          <w:p>
+            <w:r>
+              <w:t>0.470</w:t>
+            </w:r>
+          </w:p>
+        </w:tc>
+        <w:tc>
+          <w:tcPr>
+            <w:tcW w:type="dxa" w:w="1728"/>
+          </w:tcPr>
+          <w:p>
+            <w:r>
+              <w:t>down</w:t>
+            </w:r>
+          </w:p>
+        </w:tc>
+        <w:tc>
+          <w:tcPr>
+            <w:tcW w:type="dxa" w:w="1728"/>
+          </w:tcPr>
+          <w:p>
+            <w:r>
+              <w:t>Yes</w:t>
+            </w:r>
+          </w:p>
+        </w:tc>
+        <w:tc>
+          <w:tcPr>
+            <w:tcW w:type="dxa" w:w="1728"/>
+          </w:tcPr>
+          <w:p>
+            <w:r>
+              <w:t>$5.64</w:t>
+            </w:r>
+          </w:p>
+        </w:tc>
+      </w:tr>
+      <w:tr>
+        <w:tc>
+          <w:tcPr>
+            <w:tcW w:type="dxa" w:w="1728"/>
+          </w:tcPr>
+          <w:p>
+            <w:r>
+              <w:t>down</w:t>
+            </w:r>
+          </w:p>
+        </w:tc>
+        <w:tc>
+          <w:tcPr>
+            <w:tcW w:type="dxa" w:w="1728"/>
+          </w:tcPr>
+          <w:p>
+            <w:r>
+              <w:t>0.490</w:t>
+            </w:r>
+          </w:p>
+        </w:tc>
+        <w:tc>
+          <w:tcPr>
+            <w:tcW w:type="dxa" w:w="1728"/>
+          </w:tcPr>
+          <w:p>
+            <w:r>
+              <w:t>up</w:t>
+            </w:r>
+          </w:p>
+        </w:tc>
+        <w:tc>
+          <w:tcPr>
+            <w:tcW w:type="dxa" w:w="1728"/>
+          </w:tcPr>
+          <w:p>
+            <w:r>
+              <w:t>No</w:t>
+            </w:r>
+          </w:p>
+        </w:tc>
+        <w:tc>
+          <w:tcPr>
+            <w:tcW w:type="dxa" w:w="1728"/>
+          </w:tcPr>
+          <w:p>
+            <w:r>
+              <w:t>$-5.00</w:t>
+            </w:r>
+          </w:p>
+        </w:tc>
+      </w:tr>
+      <w:tr>
+        <w:tc>
+          <w:tcPr>
+            <w:tcW w:type="dxa" w:w="1728"/>
+          </w:tcPr>
+          <w:p>
+            <w:r>
+              <w:t>down</w:t>
+            </w:r>
+          </w:p>
+        </w:tc>
+        <w:tc>
+          <w:tcPr>
+            <w:tcW w:type="dxa" w:w="1728"/>
+          </w:tcPr>
+          <w:p>
+            <w:r>
+              <w:t>0.500</w:t>
+            </w:r>
+          </w:p>
+        </w:tc>
+        <w:tc>
+          <w:tcPr>
+            <w:tcW w:type="dxa" w:w="1728"/>
+          </w:tcPr>
+          <w:p>
+            <w:r>
+              <w:t>down</w:t>
+            </w:r>
+          </w:p>
+        </w:tc>
+        <w:tc>
+          <w:tcPr>
+            <w:tcW w:type="dxa" w:w="1728"/>
+          </w:tcPr>
+          <w:p>
+            <w:r>
+              <w:t>Yes</w:t>
+            </w:r>
+          </w:p>
+        </w:tc>
+        <w:tc>
+          <w:tcPr>
+            <w:tcW w:type="dxa" w:w="1728"/>
+          </w:tcPr>
+          <w:p>
+            <w:r>
+              <w:t>$5.00</w:t>
+            </w:r>
+          </w:p>
+        </w:tc>
+      </w:tr>
+      <w:tr>
+        <w:tc>
+          <w:tcPr>
+            <w:tcW w:type="dxa" w:w="1728"/>
+          </w:tcPr>
+          <w:p>
+            <w:r>
+              <w:t>down</w:t>
+            </w:r>
+          </w:p>
+        </w:tc>
+        <w:tc>
+          <w:tcPr>
+            <w:tcW w:type="dxa" w:w="1728"/>
+          </w:tcPr>
+          <w:p>
+            <w:r>
+              <w:t>0.520</w:t>
+            </w:r>
+          </w:p>
+        </w:tc>
+        <w:tc>
+          <w:tcPr>
+            <w:tcW w:type="dxa" w:w="1728"/>
+          </w:tcPr>
+          <w:p>
+            <w:r>
+              <w:t>down</w:t>
+            </w:r>
+          </w:p>
+        </w:tc>
+        <w:tc>
+          <w:tcPr>
+            <w:tcW w:type="dxa" w:w="1728"/>
+          </w:tcPr>
+          <w:p>
+            <w:r>
+              <w:t>Yes</w:t>
+            </w:r>
+          </w:p>
+        </w:tc>
+        <w:tc>
+          <w:tcPr>
+            <w:tcW w:type="dxa" w:w="1728"/>
+          </w:tcPr>
+          <w:p>
+            <w:r>
+              <w:t>$4.62</w:t>
             </w:r>
           </w:p>
         </w:tc>
@@ -4536,7 +4848,7 @@
     </w:p>
     <w:p>
       <w:r>
-        <w:t>Section score: 61.5 / 100  (Grade: D)</w:t>
+        <w:t>Section score: 76.8 / 100  (Grade: C+)</w:t>
       </w:r>
     </w:p>
     <w:p>
@@ -4679,7 +4991,7 @@
           </w:tcPr>
           <w:p>
             <w:r>
-              <w:t>28.6</w:t>
+              <w:t>12.7</w:t>
             </w:r>
           </w:p>
         </w:tc>
@@ -4689,7 +5001,7 @@
           </w:tcPr>
           <w:p>
             <w:r>
-              <w:t>4.3</w:t>
+              <w:t>1.9</w:t>
             </w:r>
           </w:p>
         </w:tc>
@@ -4711,7 +5023,7 @@
           </w:tcPr>
           <w:p>
             <w:r>
-              <w:t>74.8</w:t>
+              <w:t>92.8</w:t>
             </w:r>
           </w:p>
         </w:tc>
@@ -4721,7 +5033,7 @@
           </w:tcPr>
           <w:p>
             <w:r>
-              <w:t>11.2</w:t>
+              <w:t>13.9</w:t>
             </w:r>
           </w:p>
         </w:tc>
@@ -4775,7 +5087,7 @@
           </w:tcPr>
           <w:p>
             <w:r>
-              <w:t>0.0</w:t>
+              <w:t>100.0</w:t>
             </w:r>
           </w:p>
         </w:tc>
@@ -4785,7 +5097,7 @@
           </w:tcPr>
           <w:p>
             <w:r>
-              <w:t>0.0</w:t>
+              <w:t>15.0</w:t>
             </w:r>
           </w:p>
         </w:tc>
@@ -4793,17 +5105,17 @@
     </w:tbl>
     <w:p>
       <w:r>
-        <w:t>Ticks: 716 · Reconciled: True · Readiness: not_ready</w:t>
+        <w:t>Ticks: 719 · Reconciled: True · Readiness: not_ready</w:t>
       </w:r>
     </w:p>
     <w:p>
       <w:r>
-        <w:t>Candidates created: 14763 · Terminals: {'accepted': 4, 'rejected': 2474, 'skipped': 12227, 'expired': 0, 'missing_data': 58}</w:t>
+        <w:t>Candidates created: 24881 · Terminals: {'accepted': 19, 'rejected': 5957, 'skipped': 18825, 'expired': 0, 'missing_data': 80}</w:t>
       </w:r>
     </w:p>
     <w:p>
       <w:r>
-        <w:t>Rejected by stage: {'directional': 2238, 'execution_gate': 25, 'baseline_cohort_gate': 211}</w:t>
+        <w:t>Rejected by stage: {'directional': 5392, 'execution_gate': 50, 'baseline_cohort_gate': 515}</w:t>
       </w:r>
     </w:p>
     <w:p>
@@ -4875,7 +5187,7 @@
           </w:tcPr>
           <w:p>
             <w:r>
-              <w:t>arbitrage</w:t>
+              <w:t>data_ingestion</w:t>
             </w:r>
           </w:p>
         </w:tc>
@@ -4885,7 +5197,7 @@
           </w:tcPr>
           <w:p>
             <w:r>
-              <w:t>risk_free_arb</w:t>
+              <w:t>data</w:t>
             </w:r>
           </w:p>
         </w:tc>
@@ -4895,7 +5207,7 @@
           </w:tcPr>
           <w:p>
             <w:r>
-              <w:t>per_window</w:t>
+              <w:t>tick</w:t>
             </w:r>
           </w:p>
         </w:tc>
@@ -4904,9 +5216,7 @@
             <w:tcW w:type="dxa" w:w="2160"/>
           </w:tcPr>
           <w:p>
-            <w:r>
-              <w:t>ok</w:t>
-            </w:r>
+            <w:r/>
           </w:p>
         </w:tc>
       </w:tr>
@@ -4917,7 +5227,7 @@
           </w:tcPr>
           <w:p>
             <w:r>
-              <w:t>data_ingestion</w:t>
+              <w:t>dep_arb_verifier</w:t>
             </w:r>
           </w:p>
         </w:tc>
@@ -4927,7 +5237,7 @@
           </w:tcPr>
           <w:p>
             <w:r>
-              <w:t>data</w:t>
+              <w:t>verify(dep-arb)</w:t>
             </w:r>
           </w:p>
         </w:tc>
@@ -4937,7 +5247,7 @@
           </w:tcPr>
           <w:p>
             <w:r>
-              <w:t>tick</w:t>
+              <w:t>per_conjunction_bind</w:t>
             </w:r>
           </w:p>
         </w:tc>
@@ -4946,7 +5256,9 @@
             <w:tcW w:type="dxa" w:w="2160"/>
           </w:tcPr>
           <w:p>
-            <w:r/>
+            <w:r>
+              <w:t>conjunction approve/veto</w:t>
+            </w:r>
           </w:p>
         </w:tc>
       </w:tr>
@@ -5030,6 +5342,48 @@
           <w:p>
             <w:r>
               <w:t>fill or reject</w:t>
+            </w:r>
+          </w:p>
+        </w:tc>
+      </w:tr>
+      <w:tr>
+        <w:tc>
+          <w:tcPr>
+            <w:tcW w:type="dxa" w:w="2160"/>
+          </w:tcPr>
+          <w:p>
+            <w:r>
+              <w:t>grok_dep_convergence</w:t>
+            </w:r>
+          </w:p>
+        </w:tc>
+        <w:tc>
+          <w:tcPr>
+            <w:tcW w:type="dxa" w:w="2160"/>
+          </w:tcPr>
+          <w:p>
+            <w:r>
+              <w:t>intel(dep-arb)</w:t>
+            </w:r>
+          </w:p>
+        </w:tc>
+        <w:tc>
+          <w:tcPr>
+            <w:tcW w:type="dxa" w:w="2160"/>
+          </w:tcPr>
+          <w:p>
+            <w:r>
+              <w:t>per_actionable_violation</w:t>
+            </w:r>
+          </w:p>
+        </w:tc>
+        <w:tc>
+          <w:tcPr>
+            <w:tcW w:type="dxa" w:w="2160"/>
+          </w:tcPr>
+          <w:p>
+            <w:r>
+              <w:t>accuracy_60s vs mid_observer</w:t>
             </w:r>
           </w:p>
         </w:tc>
@@ -5798,7 +6152,7 @@
           </w:tcPr>
           <w:p>
             <w:r>
-              <w:t>0.4490</w:t>
+              <w:t>0.4833</w:t>
             </w:r>
           </w:p>
         </w:tc>
@@ -5828,7 +6182,7 @@
     </w:tbl>
     <w:p>
       <w:r>
-        <w:t>TV alerts: received 2203 · valid 1984 · rejected 219</w:t>
+        <w:t>TV alerts: received 2290 · valid 2071 · rejected 219</w:t>
       </w:r>
     </w:p>
     <w:sectPr>

</xml_diff>